<commit_message>
Updated summary and tech stack
</commit_message>
<xml_diff>
--- a/file/CV_Geser_Dugarov.docx
+++ b/file/CV_Geser_Dugarov.docx
@@ -1,6 +1,6 @@
 
 <file path=word/document.xml><?xml version="1.0" encoding="utf-8"?>
-<w:document xmlns:wpc="http://schemas.microsoft.com/office/word/2010/wordprocessingCanvas" xmlns:cx="http://schemas.microsoft.com/office/drawing/2014/chartex" xmlns:cx1="http://schemas.microsoft.com/office/drawing/2015/9/8/chartex" xmlns:mc="http://schemas.openxmlformats.org/markup-compatibility/2006" xmlns:o="urn:schemas-microsoft-com:office:office" xmlns:r="http://schemas.openxmlformats.org/officeDocument/2006/relationships" xmlns:m="http://schemas.openxmlformats.org/officeDocument/2006/math" xmlns:v="urn:schemas-microsoft-com:vml" xmlns:wp14="http://schemas.microsoft.com/office/word/2010/wordprocessingDrawing" xmlns:wp="http://schemas.openxmlformats.org/drawingml/2006/wordprocessingDrawing" xmlns:w10="urn:schemas-microsoft-com:office:word" xmlns:w="http://schemas.openxmlformats.org/wordprocessingml/2006/main" xmlns:w14="http://schemas.microsoft.com/office/word/2010/wordml" xmlns:w15="http://schemas.microsoft.com/office/word/2012/wordml" xmlns:w16se="http://schemas.microsoft.com/office/word/2015/wordml/symex" xmlns:wpg="http://schemas.microsoft.com/office/word/2010/wordprocessingGroup" xmlns:wpi="http://schemas.microsoft.com/office/word/2010/wordprocessingInk" xmlns:wne="http://schemas.microsoft.com/office/word/2006/wordml" xmlns:wps="http://schemas.microsoft.com/office/word/2010/wordprocessingShape" mc:Ignorable="w14 w15 w16se wp14">
+<w:document xmlns:wpc="http://schemas.microsoft.com/office/word/2010/wordprocessingCanvas" xmlns:cx="http://schemas.microsoft.com/office/drawing/2014/chartex" xmlns:cx1="http://schemas.microsoft.com/office/drawing/2015/9/8/chartex" xmlns:cx2="http://schemas.microsoft.com/office/drawing/2015/10/21/chartex" xmlns:cx3="http://schemas.microsoft.com/office/drawing/2016/5/9/chartex" xmlns:cx4="http://schemas.microsoft.com/office/drawing/2016/5/10/chartex" xmlns:cx5="http://schemas.microsoft.com/office/drawing/2016/5/11/chartex" xmlns:cx6="http://schemas.microsoft.com/office/drawing/2016/5/12/chartex" xmlns:cx7="http://schemas.microsoft.com/office/drawing/2016/5/13/chartex" xmlns:cx8="http://schemas.microsoft.com/office/drawing/2016/5/14/chartex" xmlns:mc="http://schemas.openxmlformats.org/markup-compatibility/2006" xmlns:aink="http://schemas.microsoft.com/office/drawing/2016/ink" xmlns:am3d="http://schemas.microsoft.com/office/drawing/2017/model3d" xmlns:o="urn:schemas-microsoft-com:office:office" xmlns:r="http://schemas.openxmlformats.org/officeDocument/2006/relationships" xmlns:m="http://schemas.openxmlformats.org/officeDocument/2006/math" xmlns:v="urn:schemas-microsoft-com:vml" xmlns:wp14="http://schemas.microsoft.com/office/word/2010/wordprocessingDrawing" xmlns:wp="http://schemas.openxmlformats.org/drawingml/2006/wordprocessingDrawing" xmlns:w10="urn:schemas-microsoft-com:office:word" xmlns:w="http://schemas.openxmlformats.org/wordprocessingml/2006/main" xmlns:w14="http://schemas.microsoft.com/office/word/2010/wordml" xmlns:w15="http://schemas.microsoft.com/office/word/2012/wordml" xmlns:w16cid="http://schemas.microsoft.com/office/word/2016/wordml/cid" xmlns:w16se="http://schemas.microsoft.com/office/word/2015/wordml/symex" xmlns:wpg="http://schemas.microsoft.com/office/word/2010/wordprocessingGroup" xmlns:wpi="http://schemas.microsoft.com/office/word/2010/wordprocessingInk" xmlns:wne="http://schemas.microsoft.com/office/word/2006/wordml" xmlns:wps="http://schemas.microsoft.com/office/word/2010/wordprocessingShape" mc:Ignorable="w14 w15 w16se w16cid wp14">
   <w:body>
     <w:p>
       <w:pPr>
@@ -23,7 +23,7 @@
     </w:p>
     <w:tbl>
       <w:tblPr>
-        <w:tblStyle w:val="a9"/>
+        <w:tblStyle w:val="a3"/>
         <w:tblW w:w="7905" w:type="dxa"/>
         <w:jc w:val="center"/>
         <w:tblInd w:w="0" w:type="dxa"/>
@@ -402,18 +402,8 @@
           <w:sz w:val="24"/>
           <w:szCs w:val="24"/>
         </w:rPr>
-        <w:t xml:space="preserve"> </w:t>
-      </w:r>
-      <w:r>
-        <w:rPr>
-          <w:color w:val="000000"/>
-          <w:sz w:val="24"/>
-          <w:szCs w:val="24"/>
-        </w:rPr>
-        <w:t>platform</w:t>
-      </w:r>
-      <w:bookmarkStart w:id="0" w:name="_GoBack"/>
-      <w:bookmarkEnd w:id="0"/>
+        <w:t xml:space="preserve"> platform</w:t>
+      </w:r>
       <w:r>
         <w:rPr>
           <w:color w:val="000000"/>
@@ -428,7 +418,25 @@
           <w:sz w:val="24"/>
           <w:szCs w:val="24"/>
         </w:rPr>
-        <w:t>On a previous position developed a project of trucks monitoring by number plate recognition. Made to production, which reduced trucks downtime by 12%.</w:t>
+        <w:t xml:space="preserve">Also contributing to the </w:t>
+      </w:r>
+      <w:hyperlink r:id="rId10" w:history="1">
+        <w:r>
+          <w:rPr>
+            <w:rStyle w:val="Hyperlink"/>
+            <w:sz w:val="24"/>
+            <w:szCs w:val="24"/>
+          </w:rPr>
+          <w:t>Apache Hudi</w:t>
+        </w:r>
+      </w:hyperlink>
+      <w:r>
+        <w:rPr>
+          <w:color w:val="000000"/>
+          <w:sz w:val="24"/>
+          <w:szCs w:val="24"/>
+        </w:rPr>
+        <w:t xml:space="preserve"> project with focus on improving usability of the solution.</w:t>
       </w:r>
     </w:p>
     <w:p>
@@ -448,7 +456,35 @@
           <w:szCs w:val="24"/>
         </w:rPr>
       </w:pPr>
-      <w:bookmarkStart w:id="1" w:name="_heading=h.gjdgxs" w:colFirst="0" w:colLast="0"/>
+      <w:bookmarkStart w:id="0" w:name="_heading=h.gjdgxs" w:colFirst="0" w:colLast="0"/>
+      <w:bookmarkEnd w:id="0"/>
+      <w:r>
+        <w:rPr>
+          <w:color w:val="000000"/>
+          <w:sz w:val="24"/>
+          <w:szCs w:val="24"/>
+        </w:rPr>
+        <w:t xml:space="preserve">Wide experience in research and data analysis (13 </w:t>
+      </w:r>
+      <w:proofErr w:type="spellStart"/>
+      <w:r>
+        <w:rPr>
+          <w:color w:val="000000"/>
+          <w:sz w:val="24"/>
+          <w:szCs w:val="24"/>
+        </w:rPr>
+        <w:t>yrs</w:t>
+      </w:r>
+      <w:proofErr w:type="spellEnd"/>
+      <w:r>
+        <w:rPr>
+          <w:color w:val="000000"/>
+          <w:sz w:val="24"/>
+          <w:szCs w:val="24"/>
+        </w:rPr>
+        <w:t>, PhD). Made a</w:t>
+      </w:r>
+      <w:bookmarkStart w:id="1" w:name="_GoBack"/>
       <w:bookmarkEnd w:id="1"/>
       <w:r>
         <w:rPr>
@@ -456,25 +492,7 @@
           <w:sz w:val="24"/>
           <w:szCs w:val="24"/>
         </w:rPr>
-        <w:t xml:space="preserve">Wide experience in research and data analysis (13 </w:t>
-      </w:r>
-      <w:proofErr w:type="spellStart"/>
-      <w:r>
-        <w:rPr>
-          <w:color w:val="000000"/>
-          <w:sz w:val="24"/>
-          <w:szCs w:val="24"/>
-        </w:rPr>
-        <w:t>yrs</w:t>
-      </w:r>
-      <w:proofErr w:type="spellEnd"/>
-      <w:r>
-        <w:rPr>
-          <w:color w:val="000000"/>
-          <w:sz w:val="24"/>
-          <w:szCs w:val="24"/>
-        </w:rPr>
-        <w:t>, PhD). Made a transition from fundamental research in Oil &amp; Gas to research and development in IT due to my passion to create products that people use.</w:t>
+        <w:t xml:space="preserve"> transition from fundamental research in Oil &amp; Gas to research and development in IT due to my passion to create products that people use.</w:t>
       </w:r>
     </w:p>
     <w:p>
@@ -500,6 +518,46 @@
           <w:sz w:val="24"/>
           <w:szCs w:val="24"/>
         </w:rPr>
+        <w:t xml:space="preserve">Passionate about Big Data and </w:t>
+      </w:r>
+      <w:r>
+        <w:rPr>
+          <w:color w:val="000000"/>
+          <w:sz w:val="24"/>
+          <w:szCs w:val="24"/>
+        </w:rPr>
+        <w:t>d</w:t>
+      </w:r>
+      <w:r>
+        <w:rPr>
+          <w:color w:val="000000"/>
+          <w:sz w:val="24"/>
+          <w:szCs w:val="24"/>
+        </w:rPr>
+        <w:t xml:space="preserve">istributed </w:t>
+      </w:r>
+      <w:r>
+        <w:rPr>
+          <w:color w:val="000000"/>
+          <w:sz w:val="24"/>
+          <w:szCs w:val="24"/>
+        </w:rPr>
+        <w:t>s</w:t>
+      </w:r>
+      <w:r>
+        <w:rPr>
+          <w:color w:val="000000"/>
+          <w:sz w:val="24"/>
+          <w:szCs w:val="24"/>
+        </w:rPr>
+        <w:t xml:space="preserve">ystems. </w:t>
+      </w:r>
+      <w:r>
+        <w:rPr>
+          <w:color w:val="000000"/>
+          <w:sz w:val="24"/>
+          <w:szCs w:val="24"/>
+        </w:rPr>
         <w:t>Personal mission statement: "Living a balanced life. Helping professionals to work smarter, not harder by creating automatic systems for their routine."</w:t>
       </w:r>
     </w:p>
@@ -513,7 +571,7 @@
           <w:right w:val="nil"/>
           <w:between w:val="nil"/>
         </w:pBdr>
-        <w:spacing w:before="60" w:after="60" w:line="264" w:lineRule="auto"/>
+        <w:spacing w:before="120" w:after="120" w:line="264" w:lineRule="auto"/>
         <w:jc w:val="center"/>
         <w:rPr>
           <w:color w:val="000000"/>
@@ -555,7 +613,7 @@
           <w:sz w:val="24"/>
           <w:szCs w:val="24"/>
         </w:rPr>
-        <w:t xml:space="preserve">Python, </w:t>
+        <w:t>Java</w:t>
       </w:r>
       <w:r>
         <w:rPr>
@@ -565,7 +623,7 @@
           <w:sz w:val="24"/>
           <w:szCs w:val="24"/>
         </w:rPr>
-        <w:t>Java</w:t>
+        <w:t xml:space="preserve">, </w:t>
       </w:r>
       <w:r>
         <w:rPr>
@@ -575,7 +633,7 @@
           <w:sz w:val="24"/>
           <w:szCs w:val="24"/>
         </w:rPr>
-        <w:t xml:space="preserve">, </w:t>
+        <w:t xml:space="preserve">Python, </w:t>
       </w:r>
       <w:r>
         <w:rPr>
@@ -585,7 +643,7 @@
           <w:sz w:val="24"/>
           <w:szCs w:val="24"/>
         </w:rPr>
-        <w:t xml:space="preserve">Maven, </w:t>
+        <w:t xml:space="preserve">SQL, </w:t>
       </w:r>
       <w:r>
         <w:rPr>
@@ -595,7 +653,7 @@
           <w:sz w:val="24"/>
           <w:szCs w:val="24"/>
         </w:rPr>
-        <w:t xml:space="preserve">SQL, </w:t>
+        <w:t xml:space="preserve">Maven, </w:t>
       </w:r>
       <w:r>
         <w:rPr>
@@ -605,7 +663,7 @@
           <w:sz w:val="24"/>
           <w:szCs w:val="24"/>
         </w:rPr>
-        <w:t xml:space="preserve">Spark, Docker, </w:t>
+        <w:t xml:space="preserve">Docker, </w:t>
       </w:r>
       <w:r>
         <w:rPr>
@@ -615,7 +673,7 @@
           <w:sz w:val="24"/>
           <w:szCs w:val="24"/>
         </w:rPr>
-        <w:t>Hadoop</w:t>
+        <w:t xml:space="preserve">Spark, </w:t>
       </w:r>
       <w:r>
         <w:rPr>
@@ -625,7 +683,7 @@
           <w:sz w:val="24"/>
           <w:szCs w:val="24"/>
         </w:rPr>
-        <w:t>, Linux</w:t>
+        <w:t>Hadoop</w:t>
       </w:r>
     </w:p>
     <w:p>
@@ -638,7 +696,7 @@
           <w:right w:val="nil"/>
           <w:between w:val="nil"/>
         </w:pBdr>
-        <w:spacing w:before="60" w:after="60" w:line="264" w:lineRule="auto"/>
+        <w:spacing w:before="120" w:after="120" w:line="264" w:lineRule="auto"/>
         <w:jc w:val="center"/>
         <w:rPr>
           <w:color w:val="000000"/>
@@ -657,7 +715,7 @@
     </w:p>
     <w:tbl>
       <w:tblPr>
-        <w:tblStyle w:val="aa"/>
+        <w:tblStyle w:val="a4"/>
         <w:tblW w:w="9854" w:type="dxa"/>
         <w:tblInd w:w="-108" w:type="dxa"/>
         <w:tblLayout w:type="fixed"/>
@@ -724,7 +782,78 @@
                 <w:sz w:val="24"/>
                 <w:szCs w:val="24"/>
               </w:rPr>
-              <w:t>current</w:t>
+              <w:t>C</w:t>
+            </w:r>
+            <w:r>
+              <w:rPr>
+                <w:color w:val="000000"/>
+                <w:sz w:val="24"/>
+                <w:szCs w:val="24"/>
+              </w:rPr>
+              <w:t>urrent</w:t>
+            </w:r>
+          </w:p>
+          <w:p>
+            <w:pPr>
+              <w:pBdr>
+                <w:top w:val="nil"/>
+                <w:left w:val="nil"/>
+                <w:bottom w:val="nil"/>
+                <w:right w:val="nil"/>
+                <w:between w:val="nil"/>
+              </w:pBdr>
+              <w:spacing w:line="264" w:lineRule="auto"/>
+              <w:ind w:left="284"/>
+              <w:jc w:val="center"/>
+              <w:rPr>
+                <w:color w:val="000000"/>
+                <w:sz w:val="24"/>
+                <w:szCs w:val="24"/>
+              </w:rPr>
+            </w:pPr>
+            <w:r>
+              <w:rPr>
+                <w:color w:val="000000"/>
+                <w:sz w:val="24"/>
+                <w:szCs w:val="24"/>
+              </w:rPr>
+              <w:t>(</w:t>
+            </w:r>
+            <w:r>
+              <w:rPr>
+                <w:rFonts w:ascii="Times New Roman" w:hAnsi="Times New Roman" w:cs="Times New Roman"/>
+                <w:b/>
+                <w:color w:val="000000"/>
+                <w:sz w:val="24"/>
+                <w:szCs w:val="24"/>
+              </w:rPr>
+              <w:t>~</w:t>
+            </w:r>
+            <w:r>
+              <w:rPr>
+                <w:color w:val="000000"/>
+                <w:sz w:val="24"/>
+                <w:szCs w:val="24"/>
+              </w:rPr>
+              <w:t>1 </w:t>
+            </w:r>
+            <w:proofErr w:type="spellStart"/>
+            <w:r>
+              <w:rPr>
+                <w:color w:val="000000"/>
+                <w:sz w:val="24"/>
+                <w:szCs w:val="24"/>
+              </w:rPr>
+              <w:t>yr</w:t>
+            </w:r>
+            <w:proofErr w:type="spellEnd"/>
+            <w:r>
+              <w:rPr>
+                <w:color w:val="000000"/>
+                <w:sz w:val="24"/>
+                <w:szCs w:val="24"/>
+              </w:rPr>
+              <w:t>)</w:t>
             </w:r>
           </w:p>
         </w:tc>
@@ -783,15 +912,17 @@
                 <w:szCs w:val="24"/>
               </w:rPr>
             </w:pPr>
-            <w:r>
-              <w:rPr>
-                <w:b/>
-                <w:color w:val="000000"/>
-                <w:sz w:val="24"/>
-                <w:szCs w:val="24"/>
-              </w:rPr>
-              <w:t>Huawei Cloud</w:t>
-            </w:r>
+            <w:hyperlink r:id="rId11" w:history="1">
+              <w:r>
+                <w:rPr>
+                  <w:rStyle w:val="Hyperlink"/>
+                  <w:b/>
+                  <w:sz w:val="24"/>
+                  <w:szCs w:val="24"/>
+                </w:rPr>
+                <w:t>Huawei Cloud</w:t>
+              </w:r>
+            </w:hyperlink>
           </w:p>
         </w:tc>
       </w:tr>
@@ -882,7 +1013,7 @@
     </w:p>
     <w:tbl>
       <w:tblPr>
-        <w:tblStyle w:val="aa"/>
+        <w:tblStyle w:val="a4"/>
         <w:tblW w:w="9854" w:type="dxa"/>
         <w:tblInd w:w="-108" w:type="dxa"/>
         <w:tblLayout w:type="fixed"/>
@@ -965,7 +1096,15 @@
                 <w:sz w:val="24"/>
                 <w:szCs w:val="24"/>
               </w:rPr>
-              <w:t>.5 </w:t>
+              <w:t>+</w:t>
+            </w:r>
+            <w:r>
+              <w:rPr>
+                <w:color w:val="000000"/>
+                <w:sz w:val="24"/>
+                <w:szCs w:val="24"/>
+              </w:rPr>
+              <w:t> </w:t>
             </w:r>
             <w:proofErr w:type="spellStart"/>
             <w:r>
@@ -975,6 +1114,14 @@
                 <w:szCs w:val="24"/>
               </w:rPr>
               <w:t>yr</w:t>
+            </w:r>
+            <w:r>
+              <w:rPr>
+                <w:color w:val="000000"/>
+                <w:sz w:val="24"/>
+                <w:szCs w:val="24"/>
+              </w:rPr>
+              <w:t>s</w:t>
             </w:r>
             <w:proofErr w:type="spellEnd"/>
             <w:r>
@@ -1094,23 +1241,7 @@
           <w:sz w:val="24"/>
           <w:szCs w:val="24"/>
         </w:rPr>
-        <w:t xml:space="preserve"> In </w:t>
-      </w:r>
-      <w:proofErr w:type="gramStart"/>
-      <w:r>
-        <w:rPr>
-          <w:sz w:val="24"/>
-          <w:szCs w:val="24"/>
-        </w:rPr>
-        <w:t>production</w:t>
-      </w:r>
-      <w:proofErr w:type="gramEnd"/>
-      <w:r>
-        <w:rPr>
-          <w:sz w:val="24"/>
-          <w:szCs w:val="24"/>
-        </w:rPr>
-        <w:t xml:space="preserve"> th</w:t>
+        <w:t xml:space="preserve"> In production th</w:t>
       </w:r>
       <w:r>
         <w:rPr>
@@ -1161,7 +1292,7 @@
     </w:p>
     <w:tbl>
       <w:tblPr>
-        <w:tblStyle w:val="ab"/>
+        <w:tblStyle w:val="a5"/>
         <w:tblW w:w="9854" w:type="dxa"/>
         <w:tblInd w:w="-108" w:type="dxa"/>
         <w:tblLayout w:type="fixed"/>
@@ -1315,7 +1446,6 @@
             </w:pPr>
             <w:bookmarkStart w:id="3" w:name="_heading=h.1fob9te" w:colFirst="0" w:colLast="0"/>
             <w:bookmarkEnd w:id="3"/>
-            <w:proofErr w:type="spellStart"/>
             <w:r>
               <w:rPr>
                 <w:b/>
@@ -1323,17 +1453,7 @@
                 <w:sz w:val="24"/>
                 <w:szCs w:val="24"/>
               </w:rPr>
-              <w:t>Trofimuk</w:t>
-            </w:r>
-            <w:proofErr w:type="spellEnd"/>
-            <w:r>
-              <w:rPr>
-                <w:b/>
-                <w:color w:val="000000"/>
-                <w:sz w:val="24"/>
-                <w:szCs w:val="24"/>
-              </w:rPr>
-              <w:t xml:space="preserve"> Institute of Petroleum Geology and Geophysics</w:t>
+              <w:t>Trofimuk Institute of Petroleum Geology and Geophysics</w:t>
             </w:r>
           </w:p>
         </w:tc>
@@ -1464,25 +1584,7 @@
           <w:sz w:val="24"/>
           <w:szCs w:val="24"/>
         </w:rPr>
-        <w:t xml:space="preserve">• 5 years in a row of personal projects supported by main foundations (2017-2021), laboratory financial resources </w:t>
-      </w:r>
-      <w:proofErr w:type="gramStart"/>
-      <w:r>
-        <w:rPr>
-          <w:color w:val="000000"/>
-          <w:sz w:val="24"/>
-          <w:szCs w:val="24"/>
-        </w:rPr>
-        <w:t>have been increased</w:t>
-      </w:r>
-      <w:proofErr w:type="gramEnd"/>
-      <w:r>
-        <w:rPr>
-          <w:color w:val="000000"/>
-          <w:sz w:val="24"/>
-          <w:szCs w:val="24"/>
-        </w:rPr>
-        <w:t xml:space="preserve"> by 18% </w:t>
+        <w:t xml:space="preserve">• 5 years in a row of personal projects supported by main foundations (2017-2021), laboratory financial resources have been increased by 18% </w:t>
       </w:r>
       <w:r>
         <w:rPr>
@@ -1524,50 +1626,7 @@
           <w:sz w:val="24"/>
           <w:szCs w:val="24"/>
         </w:rPr>
-        <w:t xml:space="preserve">• 4 graduate students: </w:t>
-      </w:r>
-      <w:proofErr w:type="gramStart"/>
-      <w:r>
-        <w:rPr>
-          <w:color w:val="000000"/>
-          <w:sz w:val="24"/>
-          <w:szCs w:val="24"/>
-        </w:rPr>
-        <w:t>3</w:t>
-      </w:r>
-      <w:proofErr w:type="gramEnd"/>
-      <w:r>
-        <w:rPr>
-          <w:color w:val="000000"/>
-          <w:sz w:val="24"/>
-          <w:szCs w:val="24"/>
-        </w:rPr>
-        <w:t xml:space="preserve"> MSc (2022*2, 2020), 1 BSc (2020).</w:t>
-      </w:r>
-    </w:p>
-    <w:p>
-      <w:pPr>
-        <w:pBdr>
-          <w:top w:val="nil"/>
-          <w:left w:val="nil"/>
-          <w:bottom w:val="nil"/>
-          <w:right w:val="nil"/>
-          <w:between w:val="nil"/>
-        </w:pBdr>
-        <w:spacing w:line="264" w:lineRule="auto"/>
-        <w:ind w:left="170" w:hanging="170"/>
-        <w:jc w:val="both"/>
-        <w:rPr>
-          <w:color w:val="000000"/>
-        </w:rPr>
-      </w:pPr>
-      <w:r>
-        <w:rPr>
-          <w:color w:val="000000"/>
-          <w:sz w:val="24"/>
-          <w:szCs w:val="24"/>
-        </w:rPr>
-        <w:t>• "The best young researcher in Earth science organizations" award (2019).</w:t>
+        <w:t>• 4 graduate students: 3 MSc (2022*2, 2020), 1 BSc (2020).</w:t>
       </w:r>
     </w:p>
     <w:p>
@@ -1580,7 +1639,7 @@
           <w:right w:val="nil"/>
           <w:between w:val="nil"/>
         </w:pBdr>
-        <w:spacing w:before="60" w:after="60" w:line="264" w:lineRule="auto"/>
+        <w:spacing w:before="120" w:after="120" w:line="264" w:lineRule="auto"/>
         <w:jc w:val="center"/>
         <w:rPr>
           <w:color w:val="000000"/>
@@ -1599,7 +1658,7 @@
     </w:p>
     <w:tbl>
       <w:tblPr>
-        <w:tblStyle w:val="ac"/>
+        <w:tblStyle w:val="a6"/>
         <w:tblW w:w="9854" w:type="dxa"/>
         <w:tblInd w:w="-108" w:type="dxa"/>
         <w:tblLayout w:type="fixed"/>
@@ -1691,23 +1750,13 @@
                 <w:szCs w:val="24"/>
               </w:rPr>
             </w:pPr>
-            <w:proofErr w:type="spellStart"/>
-            <w:r>
-              <w:rPr>
-                <w:color w:val="000000"/>
-                <w:sz w:val="24"/>
-                <w:szCs w:val="24"/>
-              </w:rPr>
-              <w:t>Trofimuk</w:t>
-            </w:r>
-            <w:proofErr w:type="spellEnd"/>
-            <w:r>
-              <w:rPr>
-                <w:color w:val="000000"/>
-                <w:sz w:val="24"/>
-                <w:szCs w:val="24"/>
-              </w:rPr>
-              <w:t xml:space="preserve"> Institute of Petroleum Geology and Geophysics SB RAS</w:t>
+            <w:r>
+              <w:rPr>
+                <w:color w:val="000000"/>
+                <w:sz w:val="24"/>
+                <w:szCs w:val="24"/>
+              </w:rPr>
+              <w:t>Trofimuk Institute of Petroleum Geology and Geophysics SB RAS</w:t>
             </w:r>
           </w:p>
         </w:tc>
@@ -1816,7 +1865,7 @@
           <w:right w:val="nil"/>
           <w:between w:val="nil"/>
         </w:pBdr>
-        <w:spacing w:before="60" w:after="60" w:line="264" w:lineRule="auto"/>
+        <w:spacing w:before="120" w:after="120" w:line="264" w:lineRule="auto"/>
         <w:jc w:val="center"/>
         <w:rPr>
           <w:color w:val="000000"/>
@@ -1898,7 +1947,7 @@
           <w:right w:val="nil"/>
           <w:between w:val="nil"/>
         </w:pBdr>
-        <w:spacing w:before="60" w:after="60" w:line="264" w:lineRule="auto"/>
+        <w:spacing w:before="120" w:after="120" w:line="264" w:lineRule="auto"/>
         <w:jc w:val="center"/>
         <w:rPr>
           <w:color w:val="000000"/>
@@ -1987,7 +2036,7 @@
           <w:szCs w:val="24"/>
         </w:rPr>
       </w:pPr>
-      <w:hyperlink r:id="rId10">
+      <w:hyperlink r:id="rId12">
         <w:r>
           <w:rPr>
             <w:color w:val="0000FF"/>
@@ -1998,7 +2047,7 @@
       </w:hyperlink>
     </w:p>
     <w:sectPr>
-      <w:footerReference w:type="default" r:id="rId11"/>
+      <w:footerReference w:type="default" r:id="rId13"/>
       <w:pgSz w:w="11906" w:h="16838"/>
       <w:pgMar w:top="851" w:right="1134" w:bottom="851" w:left="1134" w:header="113" w:footer="113" w:gutter="0"/>
       <w:pgNumType w:start="1"/>
@@ -2009,7 +2058,7 @@
 </file>
 
 <file path=word/endnotes.xml><?xml version="1.0" encoding="utf-8"?>
-<w:endnotes xmlns:wpc="http://schemas.microsoft.com/office/word/2010/wordprocessingCanvas" xmlns:cx="http://schemas.microsoft.com/office/drawing/2014/chartex" xmlns:cx1="http://schemas.microsoft.com/office/drawing/2015/9/8/chartex" xmlns:mc="http://schemas.openxmlformats.org/markup-compatibility/2006" xmlns:o="urn:schemas-microsoft-com:office:office" xmlns:r="http://schemas.openxmlformats.org/officeDocument/2006/relationships" xmlns:m="http://schemas.openxmlformats.org/officeDocument/2006/math" xmlns:v="urn:schemas-microsoft-com:vml" xmlns:wp14="http://schemas.microsoft.com/office/word/2010/wordprocessingDrawing" xmlns:wp="http://schemas.openxmlformats.org/drawingml/2006/wordprocessingDrawing" xmlns:w10="urn:schemas-microsoft-com:office:word" xmlns:w="http://schemas.openxmlformats.org/wordprocessingml/2006/main" xmlns:w14="http://schemas.microsoft.com/office/word/2010/wordml" xmlns:w15="http://schemas.microsoft.com/office/word/2012/wordml" xmlns:w16se="http://schemas.microsoft.com/office/word/2015/wordml/symex" xmlns:wpg="http://schemas.microsoft.com/office/word/2010/wordprocessingGroup" xmlns:wpi="http://schemas.microsoft.com/office/word/2010/wordprocessingInk" xmlns:wne="http://schemas.microsoft.com/office/word/2006/wordml" xmlns:wps="http://schemas.microsoft.com/office/word/2010/wordprocessingShape" mc:Ignorable="w14 w15 w16se wp14">
+<w:endnotes xmlns:wpc="http://schemas.microsoft.com/office/word/2010/wordprocessingCanvas" xmlns:cx="http://schemas.microsoft.com/office/drawing/2014/chartex" xmlns:cx1="http://schemas.microsoft.com/office/drawing/2015/9/8/chartex" xmlns:cx2="http://schemas.microsoft.com/office/drawing/2015/10/21/chartex" xmlns:cx3="http://schemas.microsoft.com/office/drawing/2016/5/9/chartex" xmlns:cx4="http://schemas.microsoft.com/office/drawing/2016/5/10/chartex" xmlns:cx5="http://schemas.microsoft.com/office/drawing/2016/5/11/chartex" xmlns:cx6="http://schemas.microsoft.com/office/drawing/2016/5/12/chartex" xmlns:cx7="http://schemas.microsoft.com/office/drawing/2016/5/13/chartex" xmlns:cx8="http://schemas.microsoft.com/office/drawing/2016/5/14/chartex" xmlns:mc="http://schemas.openxmlformats.org/markup-compatibility/2006" xmlns:aink="http://schemas.microsoft.com/office/drawing/2016/ink" xmlns:am3d="http://schemas.microsoft.com/office/drawing/2017/model3d" xmlns:o="urn:schemas-microsoft-com:office:office" xmlns:r="http://schemas.openxmlformats.org/officeDocument/2006/relationships" xmlns:m="http://schemas.openxmlformats.org/officeDocument/2006/math" xmlns:v="urn:schemas-microsoft-com:vml" xmlns:wp14="http://schemas.microsoft.com/office/word/2010/wordprocessingDrawing" xmlns:wp="http://schemas.openxmlformats.org/drawingml/2006/wordprocessingDrawing" xmlns:w10="urn:schemas-microsoft-com:office:word" xmlns:w="http://schemas.openxmlformats.org/wordprocessingml/2006/main" xmlns:w14="http://schemas.microsoft.com/office/word/2010/wordml" xmlns:w15="http://schemas.microsoft.com/office/word/2012/wordml" xmlns:w16cid="http://schemas.microsoft.com/office/word/2016/wordml/cid" xmlns:w16se="http://schemas.microsoft.com/office/word/2015/wordml/symex" xmlns:wpg="http://schemas.microsoft.com/office/word/2010/wordprocessingGroup" xmlns:wpi="http://schemas.microsoft.com/office/word/2010/wordprocessingInk" xmlns:wne="http://schemas.microsoft.com/office/word/2006/wordml" xmlns:wps="http://schemas.microsoft.com/office/word/2010/wordprocessingShape" mc:Ignorable="w14 w15 w16se w16cid wp14">
   <w:endnote w:type="separator" w:id="-1">
     <w:p>
       <w:r>
@@ -2028,7 +2077,7 @@
 </file>
 
 <file path=word/footer1.xml><?xml version="1.0" encoding="utf-8"?>
-<w:ftr xmlns:wpc="http://schemas.microsoft.com/office/word/2010/wordprocessingCanvas" xmlns:cx="http://schemas.microsoft.com/office/drawing/2014/chartex" xmlns:cx1="http://schemas.microsoft.com/office/drawing/2015/9/8/chartex" xmlns:mc="http://schemas.openxmlformats.org/markup-compatibility/2006" xmlns:o="urn:schemas-microsoft-com:office:office" xmlns:r="http://schemas.openxmlformats.org/officeDocument/2006/relationships" xmlns:m="http://schemas.openxmlformats.org/officeDocument/2006/math" xmlns:v="urn:schemas-microsoft-com:vml" xmlns:wp14="http://schemas.microsoft.com/office/word/2010/wordprocessingDrawing" xmlns:wp="http://schemas.openxmlformats.org/drawingml/2006/wordprocessingDrawing" xmlns:w10="urn:schemas-microsoft-com:office:word" xmlns:w="http://schemas.openxmlformats.org/wordprocessingml/2006/main" xmlns:w14="http://schemas.microsoft.com/office/word/2010/wordml" xmlns:w15="http://schemas.microsoft.com/office/word/2012/wordml" xmlns:w16se="http://schemas.microsoft.com/office/word/2015/wordml/symex" xmlns:wpg="http://schemas.microsoft.com/office/word/2010/wordprocessingGroup" xmlns:wpi="http://schemas.microsoft.com/office/word/2010/wordprocessingInk" xmlns:wne="http://schemas.microsoft.com/office/word/2006/wordml" xmlns:wps="http://schemas.microsoft.com/office/word/2010/wordprocessingShape" mc:Ignorable="w14 w15 w16se wp14">
+<w:ftr xmlns:wpc="http://schemas.microsoft.com/office/word/2010/wordprocessingCanvas" xmlns:cx="http://schemas.microsoft.com/office/drawing/2014/chartex" xmlns:cx1="http://schemas.microsoft.com/office/drawing/2015/9/8/chartex" xmlns:cx2="http://schemas.microsoft.com/office/drawing/2015/10/21/chartex" xmlns:cx3="http://schemas.microsoft.com/office/drawing/2016/5/9/chartex" xmlns:cx4="http://schemas.microsoft.com/office/drawing/2016/5/10/chartex" xmlns:cx5="http://schemas.microsoft.com/office/drawing/2016/5/11/chartex" xmlns:cx6="http://schemas.microsoft.com/office/drawing/2016/5/12/chartex" xmlns:cx7="http://schemas.microsoft.com/office/drawing/2016/5/13/chartex" xmlns:cx8="http://schemas.microsoft.com/office/drawing/2016/5/14/chartex" xmlns:mc="http://schemas.openxmlformats.org/markup-compatibility/2006" xmlns:aink="http://schemas.microsoft.com/office/drawing/2016/ink" xmlns:am3d="http://schemas.microsoft.com/office/drawing/2017/model3d" xmlns:o="urn:schemas-microsoft-com:office:office" xmlns:r="http://schemas.openxmlformats.org/officeDocument/2006/relationships" xmlns:m="http://schemas.openxmlformats.org/officeDocument/2006/math" xmlns:v="urn:schemas-microsoft-com:vml" xmlns:wp14="http://schemas.microsoft.com/office/word/2010/wordprocessingDrawing" xmlns:wp="http://schemas.openxmlformats.org/drawingml/2006/wordprocessingDrawing" xmlns:w10="urn:schemas-microsoft-com:office:word" xmlns:w="http://schemas.openxmlformats.org/wordprocessingml/2006/main" xmlns:w14="http://schemas.microsoft.com/office/word/2010/wordml" xmlns:w15="http://schemas.microsoft.com/office/word/2012/wordml" xmlns:w16cid="http://schemas.microsoft.com/office/word/2016/wordml/cid" xmlns:w16se="http://schemas.microsoft.com/office/word/2015/wordml/symex" xmlns:wpg="http://schemas.microsoft.com/office/word/2010/wordprocessingGroup" xmlns:wpi="http://schemas.microsoft.com/office/word/2010/wordprocessingInk" xmlns:wne="http://schemas.microsoft.com/office/word/2006/wordml" xmlns:wps="http://schemas.microsoft.com/office/word/2010/wordprocessingShape" mc:Ignorable="w14 w15 w16se w16cid wp14">
   <w:p>
     <w:pPr>
       <w:pBdr>
@@ -2074,7 +2123,7 @@
 </file>
 
 <file path=word/footnotes.xml><?xml version="1.0" encoding="utf-8"?>
-<w:footnotes xmlns:wpc="http://schemas.microsoft.com/office/word/2010/wordprocessingCanvas" xmlns:cx="http://schemas.microsoft.com/office/drawing/2014/chartex" xmlns:cx1="http://schemas.microsoft.com/office/drawing/2015/9/8/chartex" xmlns:mc="http://schemas.openxmlformats.org/markup-compatibility/2006" xmlns:o="urn:schemas-microsoft-com:office:office" xmlns:r="http://schemas.openxmlformats.org/officeDocument/2006/relationships" xmlns:m="http://schemas.openxmlformats.org/officeDocument/2006/math" xmlns:v="urn:schemas-microsoft-com:vml" xmlns:wp14="http://schemas.microsoft.com/office/word/2010/wordprocessingDrawing" xmlns:wp="http://schemas.openxmlformats.org/drawingml/2006/wordprocessingDrawing" xmlns:w10="urn:schemas-microsoft-com:office:word" xmlns:w="http://schemas.openxmlformats.org/wordprocessingml/2006/main" xmlns:w14="http://schemas.microsoft.com/office/word/2010/wordml" xmlns:w15="http://schemas.microsoft.com/office/word/2012/wordml" xmlns:w16se="http://schemas.microsoft.com/office/word/2015/wordml/symex" xmlns:wpg="http://schemas.microsoft.com/office/word/2010/wordprocessingGroup" xmlns:wpi="http://schemas.microsoft.com/office/word/2010/wordprocessingInk" xmlns:wne="http://schemas.microsoft.com/office/word/2006/wordml" xmlns:wps="http://schemas.microsoft.com/office/word/2010/wordprocessingShape" mc:Ignorable="w14 w15 w16se wp14">
+<w:footnotes xmlns:wpc="http://schemas.microsoft.com/office/word/2010/wordprocessingCanvas" xmlns:cx="http://schemas.microsoft.com/office/drawing/2014/chartex" xmlns:cx1="http://schemas.microsoft.com/office/drawing/2015/9/8/chartex" xmlns:cx2="http://schemas.microsoft.com/office/drawing/2015/10/21/chartex" xmlns:cx3="http://schemas.microsoft.com/office/drawing/2016/5/9/chartex" xmlns:cx4="http://schemas.microsoft.com/office/drawing/2016/5/10/chartex" xmlns:cx5="http://schemas.microsoft.com/office/drawing/2016/5/11/chartex" xmlns:cx6="http://schemas.microsoft.com/office/drawing/2016/5/12/chartex" xmlns:cx7="http://schemas.microsoft.com/office/drawing/2016/5/13/chartex" xmlns:cx8="http://schemas.microsoft.com/office/drawing/2016/5/14/chartex" xmlns:mc="http://schemas.openxmlformats.org/markup-compatibility/2006" xmlns:aink="http://schemas.microsoft.com/office/drawing/2016/ink" xmlns:am3d="http://schemas.microsoft.com/office/drawing/2017/model3d" xmlns:o="urn:schemas-microsoft-com:office:office" xmlns:r="http://schemas.openxmlformats.org/officeDocument/2006/relationships" xmlns:m="http://schemas.openxmlformats.org/officeDocument/2006/math" xmlns:v="urn:schemas-microsoft-com:vml" xmlns:wp14="http://schemas.microsoft.com/office/word/2010/wordprocessingDrawing" xmlns:wp="http://schemas.openxmlformats.org/drawingml/2006/wordprocessingDrawing" xmlns:w10="urn:schemas-microsoft-com:office:word" xmlns:w="http://schemas.openxmlformats.org/wordprocessingml/2006/main" xmlns:w14="http://schemas.microsoft.com/office/word/2010/wordml" xmlns:w15="http://schemas.microsoft.com/office/word/2012/wordml" xmlns:w16cid="http://schemas.microsoft.com/office/word/2016/wordml/cid" xmlns:w16se="http://schemas.microsoft.com/office/word/2015/wordml/symex" xmlns:wpg="http://schemas.microsoft.com/office/word/2010/wordprocessingGroup" xmlns:wpi="http://schemas.microsoft.com/office/word/2010/wordprocessingInk" xmlns:wne="http://schemas.microsoft.com/office/word/2006/wordml" xmlns:wps="http://schemas.microsoft.com/office/word/2010/wordprocessingShape" mc:Ignorable="w14 w15 w16se w16cid wp14">
   <w:footnote w:type="separator" w:id="-1">
     <w:p>
       <w:r>
@@ -2093,7 +2142,7 @@
 </file>
 
 <file path=word/styles.xml><?xml version="1.0" encoding="utf-8"?>
-<w:styles xmlns:mc="http://schemas.openxmlformats.org/markup-compatibility/2006" xmlns:r="http://schemas.openxmlformats.org/officeDocument/2006/relationships" xmlns:w="http://schemas.openxmlformats.org/wordprocessingml/2006/main" xmlns:w14="http://schemas.microsoft.com/office/word/2010/wordml" xmlns:w15="http://schemas.microsoft.com/office/word/2012/wordml" xmlns:w16se="http://schemas.microsoft.com/office/word/2015/wordml/symex" mc:Ignorable="w14 w15 w16se">
+<w:styles xmlns:mc="http://schemas.openxmlformats.org/markup-compatibility/2006" xmlns:r="http://schemas.openxmlformats.org/officeDocument/2006/relationships" xmlns:w="http://schemas.openxmlformats.org/wordprocessingml/2006/main" xmlns:w14="http://schemas.microsoft.com/office/word/2010/wordml" xmlns:w15="http://schemas.microsoft.com/office/word/2012/wordml" xmlns:w16cid="http://schemas.microsoft.com/office/word/2016/wordml/cid" xmlns:w16se="http://schemas.microsoft.com/office/word/2015/wordml/symex" mc:Ignorable="w14 w15 w16se w16cid">
   <w:docDefaults>
     <w:rPrDefault>
       <w:rPr>
@@ -2103,7 +2152,7 @@
     </w:rPrDefault>
     <w:pPrDefault/>
   </w:docDefaults>
-  <w:latentStyles w:defLockedState="0" w:defUIPriority="99" w:defSemiHidden="0" w:defUnhideWhenUsed="0" w:defQFormat="0" w:count="371">
+  <w:latentStyles w:defLockedState="0" w:defUIPriority="99" w:defSemiHidden="0" w:defUnhideWhenUsed="0" w:defQFormat="0" w:count="375">
     <w:lsdException w:name="Normal" w:uiPriority="0" w:qFormat="1"/>
     <w:lsdException w:name="heading 1" w:uiPriority="9" w:qFormat="1"/>
     <w:lsdException w:name="heading 2" w:semiHidden="1" w:uiPriority="9" w:unhideWhenUsed="1" w:qFormat="1"/>
@@ -2475,14 +2524,18 @@
     <w:lsdException w:name="List Table 5 Dark Accent 6" w:uiPriority="50"/>
     <w:lsdException w:name="List Table 6 Colorful Accent 6" w:uiPriority="51"/>
     <w:lsdException w:name="List Table 7 Colorful Accent 6" w:uiPriority="52"/>
+    <w:lsdException w:name="Mention" w:semiHidden="1" w:unhideWhenUsed="1"/>
+    <w:lsdException w:name="Smart Hyperlink" w:semiHidden="1" w:unhideWhenUsed="1"/>
+    <w:lsdException w:name="Hashtag" w:semiHidden="1" w:unhideWhenUsed="1"/>
+    <w:lsdException w:name="Unresolved Mention" w:semiHidden="1" w:unhideWhenUsed="1"/>
   </w:latentStyles>
-  <w:style w:type="paragraph" w:default="1" w:styleId="a">
+  <w:style w:type="paragraph" w:default="1" w:styleId="Normal">
     <w:name w:val="Normal"/>
   </w:style>
-  <w:style w:type="paragraph" w:styleId="1">
+  <w:style w:type="paragraph" w:styleId="Heading1">
     <w:name w:val="heading 1"/>
-    <w:basedOn w:val="a"/>
-    <w:next w:val="a"/>
+    <w:basedOn w:val="Normal"/>
+    <w:next w:val="Normal"/>
     <w:pPr>
       <w:keepNext/>
       <w:keepLines/>
@@ -2495,10 +2548,10 @@
       <w:szCs w:val="48"/>
     </w:rPr>
   </w:style>
-  <w:style w:type="paragraph" w:styleId="2">
+  <w:style w:type="paragraph" w:styleId="Heading2">
     <w:name w:val="heading 2"/>
-    <w:basedOn w:val="a"/>
-    <w:next w:val="a"/>
+    <w:basedOn w:val="Normal"/>
+    <w:next w:val="Normal"/>
     <w:pPr>
       <w:keepNext/>
       <w:keepLines/>
@@ -2511,10 +2564,10 @@
       <w:szCs w:val="36"/>
     </w:rPr>
   </w:style>
-  <w:style w:type="paragraph" w:styleId="3">
+  <w:style w:type="paragraph" w:styleId="Heading3">
     <w:name w:val="heading 3"/>
-    <w:basedOn w:val="a"/>
-    <w:next w:val="a"/>
+    <w:basedOn w:val="Normal"/>
+    <w:next w:val="Normal"/>
     <w:pPr>
       <w:keepNext/>
       <w:keepLines/>
@@ -2527,10 +2580,10 @@
       <w:szCs w:val="28"/>
     </w:rPr>
   </w:style>
-  <w:style w:type="paragraph" w:styleId="4">
+  <w:style w:type="paragraph" w:styleId="Heading4">
     <w:name w:val="heading 4"/>
-    <w:basedOn w:val="a"/>
-    <w:next w:val="a"/>
+    <w:basedOn w:val="Normal"/>
+    <w:next w:val="Normal"/>
     <w:pPr>
       <w:keepNext/>
       <w:keepLines/>
@@ -2543,10 +2596,10 @@
       <w:szCs w:val="24"/>
     </w:rPr>
   </w:style>
-  <w:style w:type="paragraph" w:styleId="5">
+  <w:style w:type="paragraph" w:styleId="Heading5">
     <w:name w:val="heading 5"/>
-    <w:basedOn w:val="a"/>
-    <w:next w:val="a"/>
+    <w:basedOn w:val="Normal"/>
+    <w:next w:val="Normal"/>
     <w:pPr>
       <w:keepNext/>
       <w:keepLines/>
@@ -2559,10 +2612,10 @@
       <w:szCs w:val="22"/>
     </w:rPr>
   </w:style>
-  <w:style w:type="paragraph" w:styleId="6">
+  <w:style w:type="paragraph" w:styleId="Heading6">
     <w:name w:val="heading 6"/>
-    <w:basedOn w:val="a"/>
-    <w:next w:val="a"/>
+    <w:basedOn w:val="Normal"/>
+    <w:next w:val="Normal"/>
     <w:pPr>
       <w:keepNext/>
       <w:keepLines/>
@@ -2573,13 +2626,13 @@
       <w:b/>
     </w:rPr>
   </w:style>
-  <w:style w:type="character" w:default="1" w:styleId="a0">
+  <w:style w:type="character" w:default="1" w:styleId="DefaultParagraphFont">
     <w:name w:val="Default Paragraph Font"/>
     <w:uiPriority w:val="1"/>
     <w:semiHidden/>
     <w:unhideWhenUsed/>
   </w:style>
-  <w:style w:type="table" w:default="1" w:styleId="a1">
+  <w:style w:type="table" w:default="1" w:styleId="TableNormal">
     <w:name w:val="Normal Table"/>
     <w:uiPriority w:val="99"/>
     <w:semiHidden/>
@@ -2594,14 +2647,14 @@
       </w:tblCellMar>
     </w:tblPr>
   </w:style>
-  <w:style w:type="numbering" w:default="1" w:styleId="a2">
+  <w:style w:type="numbering" w:default="1" w:styleId="NoList">
     <w:name w:val="No List"/>
     <w:uiPriority w:val="99"/>
     <w:semiHidden/>
     <w:unhideWhenUsed/>
   </w:style>
-  <w:style w:type="table" w:customStyle="1" w:styleId="TableNormal">
-    <w:name w:val="Table Normal"/>
+  <w:style w:type="table" w:customStyle="1" w:styleId="TableNormal1">
+    <w:name w:val="Table Normal1"/>
     <w:tblPr>
       <w:tblCellMar>
         <w:top w:w="0" w:type="dxa"/>
@@ -2611,10 +2664,10 @@
       </w:tblCellMar>
     </w:tblPr>
   </w:style>
-  <w:style w:type="paragraph" w:styleId="a3">
+  <w:style w:type="paragraph" w:styleId="Title">
     <w:name w:val="Title"/>
-    <w:basedOn w:val="a"/>
-    <w:next w:val="a"/>
+    <w:basedOn w:val="Normal"/>
+    <w:next w:val="Normal"/>
     <w:pPr>
       <w:keepNext/>
       <w:keepLines/>
@@ -2626,8 +2679,8 @@
       <w:szCs w:val="72"/>
     </w:rPr>
   </w:style>
-  <w:style w:type="table" w:customStyle="1" w:styleId="TableNormal0">
-    <w:name w:val="Table Normal"/>
+  <w:style w:type="table" w:customStyle="1" w:styleId="TableNormal2">
+    <w:name w:val="Table Normal2"/>
     <w:tblPr>
       <w:tblCellMar>
         <w:top w:w="0" w:type="dxa"/>
@@ -2637,10 +2690,10 @@
       </w:tblCellMar>
     </w:tblPr>
   </w:style>
-  <w:style w:type="paragraph" w:styleId="a4">
+  <w:style w:type="paragraph" w:styleId="Subtitle">
     <w:name w:val="Subtitle"/>
-    <w:basedOn w:val="a"/>
-    <w:next w:val="a"/>
+    <w:basedOn w:val="Normal"/>
+    <w:next w:val="Normal"/>
     <w:pPr>
       <w:keepNext/>
       <w:keepLines/>
@@ -2654,8 +2707,74 @@
       <w:szCs w:val="48"/>
     </w:rPr>
   </w:style>
+  <w:style w:type="table" w:customStyle="1" w:styleId="a">
+    <w:basedOn w:val="TableNormal2"/>
+    <w:tblPr>
+      <w:tblStyleRowBandSize w:val="1"/>
+      <w:tblStyleColBandSize w:val="1"/>
+      <w:tblCellMar>
+        <w:left w:w="108" w:type="dxa"/>
+        <w:right w:w="108" w:type="dxa"/>
+      </w:tblCellMar>
+    </w:tblPr>
+  </w:style>
+  <w:style w:type="table" w:customStyle="1" w:styleId="a0">
+    <w:basedOn w:val="TableNormal2"/>
+    <w:tblPr>
+      <w:tblStyleRowBandSize w:val="1"/>
+      <w:tblStyleColBandSize w:val="1"/>
+      <w:tblCellMar>
+        <w:left w:w="108" w:type="dxa"/>
+        <w:right w:w="108" w:type="dxa"/>
+      </w:tblCellMar>
+    </w:tblPr>
+  </w:style>
+  <w:style w:type="table" w:customStyle="1" w:styleId="a1">
+    <w:basedOn w:val="TableNormal2"/>
+    <w:tblPr>
+      <w:tblStyleRowBandSize w:val="1"/>
+      <w:tblStyleColBandSize w:val="1"/>
+      <w:tblCellMar>
+        <w:left w:w="108" w:type="dxa"/>
+        <w:right w:w="108" w:type="dxa"/>
+      </w:tblCellMar>
+    </w:tblPr>
+  </w:style>
+  <w:style w:type="table" w:customStyle="1" w:styleId="a2">
+    <w:basedOn w:val="TableNormal2"/>
+    <w:tblPr>
+      <w:tblStyleRowBandSize w:val="1"/>
+      <w:tblStyleColBandSize w:val="1"/>
+      <w:tblCellMar>
+        <w:left w:w="108" w:type="dxa"/>
+        <w:right w:w="108" w:type="dxa"/>
+      </w:tblCellMar>
+    </w:tblPr>
+  </w:style>
+  <w:style w:type="table" w:customStyle="1" w:styleId="a3">
+    <w:basedOn w:val="TableNormal2"/>
+    <w:tblPr>
+      <w:tblStyleRowBandSize w:val="1"/>
+      <w:tblStyleColBandSize w:val="1"/>
+      <w:tblCellMar>
+        <w:left w:w="108" w:type="dxa"/>
+        <w:right w:w="108" w:type="dxa"/>
+      </w:tblCellMar>
+    </w:tblPr>
+  </w:style>
+  <w:style w:type="table" w:customStyle="1" w:styleId="a4">
+    <w:basedOn w:val="TableNormal2"/>
+    <w:tblPr>
+      <w:tblStyleRowBandSize w:val="1"/>
+      <w:tblStyleColBandSize w:val="1"/>
+      <w:tblCellMar>
+        <w:left w:w="108" w:type="dxa"/>
+        <w:right w:w="108" w:type="dxa"/>
+      </w:tblCellMar>
+    </w:tblPr>
+  </w:style>
   <w:style w:type="table" w:customStyle="1" w:styleId="a5">
-    <w:basedOn w:val="TableNormal0"/>
+    <w:basedOn w:val="TableNormal2"/>
     <w:tblPr>
       <w:tblStyleRowBandSize w:val="1"/>
       <w:tblStyleColBandSize w:val="1"/>
@@ -2666,7 +2785,7 @@
     </w:tblPr>
   </w:style>
   <w:style w:type="table" w:customStyle="1" w:styleId="a6">
-    <w:basedOn w:val="TableNormal0"/>
+    <w:basedOn w:val="TableNormal2"/>
     <w:tblPr>
       <w:tblStyleRowBandSize w:val="1"/>
       <w:tblStyleColBandSize w:val="1"/>
@@ -2676,71 +2795,40 @@
       </w:tblCellMar>
     </w:tblPr>
   </w:style>
-  <w:style w:type="table" w:customStyle="1" w:styleId="a7">
-    <w:basedOn w:val="TableNormal0"/>
-    <w:tblPr>
-      <w:tblStyleRowBandSize w:val="1"/>
-      <w:tblStyleColBandSize w:val="1"/>
-      <w:tblCellMar>
-        <w:left w:w="108" w:type="dxa"/>
-        <w:right w:w="108" w:type="dxa"/>
-      </w:tblCellMar>
-    </w:tblPr>
+  <w:style w:type="character" w:styleId="Hyperlink">
+    <w:name w:val="Hyperlink"/>
+    <w:basedOn w:val="DefaultParagraphFont"/>
+    <w:uiPriority w:val="99"/>
+    <w:unhideWhenUsed/>
+    <w:rsid w:val="00AF24F0"/>
+    <w:rPr>
+      <w:color w:val="0000FF" w:themeColor="hyperlink"/>
+      <w:u w:val="single"/>
+    </w:rPr>
   </w:style>
-  <w:style w:type="table" w:customStyle="1" w:styleId="a8">
-    <w:basedOn w:val="TableNormal0"/>
-    <w:tblPr>
-      <w:tblStyleRowBandSize w:val="1"/>
-      <w:tblStyleColBandSize w:val="1"/>
-      <w:tblCellMar>
-        <w:left w:w="108" w:type="dxa"/>
-        <w:right w:w="108" w:type="dxa"/>
-      </w:tblCellMar>
-    </w:tblPr>
+  <w:style w:type="character" w:styleId="UnresolvedMention">
+    <w:name w:val="Unresolved Mention"/>
+    <w:basedOn w:val="DefaultParagraphFont"/>
+    <w:uiPriority w:val="99"/>
+    <w:semiHidden/>
+    <w:unhideWhenUsed/>
+    <w:rsid w:val="00AF24F0"/>
+    <w:rPr>
+      <w:color w:val="605E5C"/>
+      <w:shd w:val="clear" w:color="auto" w:fill="E1DFDD"/>
+    </w:rPr>
   </w:style>
-  <w:style w:type="table" w:customStyle="1" w:styleId="a9">
-    <w:basedOn w:val="TableNormal0"/>
-    <w:tblPr>
-      <w:tblStyleRowBandSize w:val="1"/>
-      <w:tblStyleColBandSize w:val="1"/>
-      <w:tblCellMar>
-        <w:left w:w="108" w:type="dxa"/>
-        <w:right w:w="108" w:type="dxa"/>
-      </w:tblCellMar>
-    </w:tblPr>
-  </w:style>
-  <w:style w:type="table" w:customStyle="1" w:styleId="aa">
-    <w:basedOn w:val="TableNormal0"/>
-    <w:tblPr>
-      <w:tblStyleRowBandSize w:val="1"/>
-      <w:tblStyleColBandSize w:val="1"/>
-      <w:tblCellMar>
-        <w:left w:w="108" w:type="dxa"/>
-        <w:right w:w="108" w:type="dxa"/>
-      </w:tblCellMar>
-    </w:tblPr>
-  </w:style>
-  <w:style w:type="table" w:customStyle="1" w:styleId="ab">
-    <w:basedOn w:val="TableNormal0"/>
-    <w:tblPr>
-      <w:tblStyleRowBandSize w:val="1"/>
-      <w:tblStyleColBandSize w:val="1"/>
-      <w:tblCellMar>
-        <w:left w:w="108" w:type="dxa"/>
-        <w:right w:w="108" w:type="dxa"/>
-      </w:tblCellMar>
-    </w:tblPr>
-  </w:style>
-  <w:style w:type="table" w:customStyle="1" w:styleId="ac">
-    <w:basedOn w:val="TableNormal0"/>
-    <w:tblPr>
-      <w:tblStyleRowBandSize w:val="1"/>
-      <w:tblStyleColBandSize w:val="1"/>
-      <w:tblCellMar>
-        <w:left w:w="108" w:type="dxa"/>
-        <w:right w:w="108" w:type="dxa"/>
-      </w:tblCellMar>
-    </w:tblPr>
+  <w:style w:type="character" w:styleId="FollowedHyperlink">
+    <w:name w:val="FollowedHyperlink"/>
+    <w:basedOn w:val="DefaultParagraphFont"/>
+    <w:uiPriority w:val="99"/>
+    <w:semiHidden/>
+    <w:unhideWhenUsed/>
+    <w:rsid w:val="00503B3D"/>
+    <w:rPr>
+      <w:color w:val="800080" w:themeColor="followedHyperlink"/>
+      <w:u w:val="single"/>
+    </w:rPr>
   </w:style>
 </w:styles>
 </file>

</xml_diff>

<commit_message>
Added info about open source conribution
</commit_message>
<xml_diff>
--- a/file/CV_Geser_Dugarov.docx
+++ b/file/CV_Geser_Dugarov.docx
@@ -1,6 +1,6 @@
 
 <file path=word/document.xml><?xml version="1.0" encoding="utf-8"?>
-<w:document xmlns:wpc="http://schemas.microsoft.com/office/word/2010/wordprocessingCanvas" xmlns:cx="http://schemas.microsoft.com/office/drawing/2014/chartex" xmlns:cx1="http://schemas.microsoft.com/office/drawing/2015/9/8/chartex" xmlns:mc="http://schemas.openxmlformats.org/markup-compatibility/2006" xmlns:o="urn:schemas-microsoft-com:office:office" xmlns:r="http://schemas.openxmlformats.org/officeDocument/2006/relationships" xmlns:m="http://schemas.openxmlformats.org/officeDocument/2006/math" xmlns:v="urn:schemas-microsoft-com:vml" xmlns:wp14="http://schemas.microsoft.com/office/word/2010/wordprocessingDrawing" xmlns:wp="http://schemas.openxmlformats.org/drawingml/2006/wordprocessingDrawing" xmlns:w10="urn:schemas-microsoft-com:office:word" xmlns:w="http://schemas.openxmlformats.org/wordprocessingml/2006/main" xmlns:w14="http://schemas.microsoft.com/office/word/2010/wordml" xmlns:w15="http://schemas.microsoft.com/office/word/2012/wordml" xmlns:w16se="http://schemas.microsoft.com/office/word/2015/wordml/symex" xmlns:wpg="http://schemas.microsoft.com/office/word/2010/wordprocessingGroup" xmlns:wpi="http://schemas.microsoft.com/office/word/2010/wordprocessingInk" xmlns:wne="http://schemas.microsoft.com/office/word/2006/wordml" xmlns:wps="http://schemas.microsoft.com/office/word/2010/wordprocessingShape" mc:Ignorable="w14 w15 w16se wp14">
+<w:document xmlns:wpc="http://schemas.microsoft.com/office/word/2010/wordprocessingCanvas" xmlns:cx="http://schemas.microsoft.com/office/drawing/2014/chartex" xmlns:cx1="http://schemas.microsoft.com/office/drawing/2015/9/8/chartex" xmlns:cx2="http://schemas.microsoft.com/office/drawing/2015/10/21/chartex" xmlns:cx3="http://schemas.microsoft.com/office/drawing/2016/5/9/chartex" xmlns:cx4="http://schemas.microsoft.com/office/drawing/2016/5/10/chartex" xmlns:cx5="http://schemas.microsoft.com/office/drawing/2016/5/11/chartex" xmlns:cx6="http://schemas.microsoft.com/office/drawing/2016/5/12/chartex" xmlns:cx7="http://schemas.microsoft.com/office/drawing/2016/5/13/chartex" xmlns:cx8="http://schemas.microsoft.com/office/drawing/2016/5/14/chartex" xmlns:mc="http://schemas.openxmlformats.org/markup-compatibility/2006" xmlns:aink="http://schemas.microsoft.com/office/drawing/2016/ink" xmlns:am3d="http://schemas.microsoft.com/office/drawing/2017/model3d" xmlns:o="urn:schemas-microsoft-com:office:office" xmlns:r="http://schemas.openxmlformats.org/officeDocument/2006/relationships" xmlns:m="http://schemas.openxmlformats.org/officeDocument/2006/math" xmlns:v="urn:schemas-microsoft-com:vml" xmlns:wp14="http://schemas.microsoft.com/office/word/2010/wordprocessingDrawing" xmlns:wp="http://schemas.openxmlformats.org/drawingml/2006/wordprocessingDrawing" xmlns:w10="urn:schemas-microsoft-com:office:word" xmlns:w="http://schemas.openxmlformats.org/wordprocessingml/2006/main" xmlns:w14="http://schemas.microsoft.com/office/word/2010/wordml" xmlns:w15="http://schemas.microsoft.com/office/word/2012/wordml" xmlns:w16cid="http://schemas.microsoft.com/office/word/2016/wordml/cid" xmlns:w16se="http://schemas.microsoft.com/office/word/2015/wordml/symex" xmlns:wpg="http://schemas.microsoft.com/office/word/2010/wordprocessingGroup" xmlns:wpi="http://schemas.microsoft.com/office/word/2010/wordprocessingInk" xmlns:wne="http://schemas.microsoft.com/office/word/2006/wordml" xmlns:wps="http://schemas.microsoft.com/office/word/2010/wordprocessingShape" mc:Ignorable="w14 w15 w16se w16cid wp14">
   <w:body>
     <w:p>
       <w:pPr>
@@ -23,7 +23,7 @@
     </w:p>
     <w:tbl>
       <w:tblPr>
-        <w:tblStyle w:val="a9"/>
+        <w:tblStyle w:val="a3"/>
         <w:tblW w:w="8614" w:type="dxa"/>
         <w:jc w:val="center"/>
         <w:tblInd w:w="0" w:type="dxa"/>
@@ -71,18 +71,7 @@
                 <w:sz w:val="28"/>
                 <w:szCs w:val="28"/>
               </w:rPr>
-              <w:t xml:space="preserve">GESER DUGAROV, Ph.D. </w:t>
-            </w:r>
-            <w:bookmarkStart w:id="0" w:name="_GoBack"/>
-            <w:bookmarkEnd w:id="0"/>
-            <w:r>
-              <w:rPr>
-                <w:b/>
-                <w:color w:val="000000"/>
-                <w:sz w:val="28"/>
-                <w:szCs w:val="28"/>
-              </w:rPr>
-              <w:t xml:space="preserve"> |  </w:t>
+              <w:t xml:space="preserve">GESER DUGAROV, Ph.D.  |  </w:t>
             </w:r>
             <w:r>
               <w:rPr>
@@ -428,34 +417,49 @@
           <w:sz w:val="24"/>
           <w:szCs w:val="24"/>
         </w:rPr>
-        <w:t>Also contributing to the</w:t>
-      </w:r>
-      <w:r>
-        <w:rPr>
-          <w:color w:val="000000"/>
-          <w:sz w:val="24"/>
-          <w:szCs w:val="24"/>
-        </w:rPr>
-        <w:t xml:space="preserve"> open source,</w:t>
-      </w:r>
-      <w:r>
-        <w:rPr>
-          <w:color w:val="000000"/>
-          <w:sz w:val="24"/>
-          <w:szCs w:val="24"/>
-        </w:rPr>
-        <w:t xml:space="preserve"> </w:t>
+        <w:t xml:space="preserve">Also </w:t>
       </w:r>
       <w:hyperlink r:id="rId10" w:history="1">
         <w:r>
           <w:rPr>
-            <w:rStyle w:val="ad"/>
+            <w:rStyle w:val="Hyperlink"/>
             <w:sz w:val="24"/>
             <w:szCs w:val="24"/>
           </w:rPr>
-          <w:t>Apache Hudi</w:t>
+          <w:t>contributing to the</w:t>
+        </w:r>
+        <w:r>
+          <w:rPr>
+            <w:rStyle w:val="Hyperlink"/>
+            <w:sz w:val="24"/>
+            <w:szCs w:val="24"/>
+          </w:rPr>
+          <w:t xml:space="preserve"> open source</w:t>
         </w:r>
       </w:hyperlink>
+      <w:r>
+        <w:rPr>
+          <w:color w:val="000000"/>
+          <w:sz w:val="24"/>
+          <w:szCs w:val="24"/>
+        </w:rPr>
+        <w:t>,</w:t>
+      </w:r>
+      <w:r>
+        <w:rPr>
+          <w:color w:val="000000"/>
+          <w:sz w:val="24"/>
+          <w:szCs w:val="24"/>
+        </w:rPr>
+        <w:t xml:space="preserve"> </w:t>
+      </w:r>
+      <w:r>
+        <w:rPr>
+          <w:sz w:val="24"/>
+          <w:szCs w:val="24"/>
+        </w:rPr>
+        <w:t>Apache Hudi</w:t>
+      </w:r>
       <w:r>
         <w:rPr>
           <w:color w:val="000000"/>
@@ -498,8 +502,8 @@
           <w:szCs w:val="24"/>
         </w:rPr>
       </w:pPr>
-      <w:bookmarkStart w:id="1" w:name="_heading=h.gjdgxs" w:colFirst="0" w:colLast="0"/>
-      <w:bookmarkEnd w:id="1"/>
+      <w:bookmarkStart w:id="0" w:name="_heading=h.gjdgxs" w:colFirst="0" w:colLast="0"/>
+      <w:bookmarkEnd w:id="0"/>
       <w:r>
         <w:rPr>
           <w:color w:val="000000"/>
@@ -747,7 +751,894 @@
     </w:p>
     <w:tbl>
       <w:tblPr>
-        <w:tblStyle w:val="aa"/>
+        <w:tblStyle w:val="a4"/>
+        <w:tblW w:w="9854" w:type="dxa"/>
+        <w:tblInd w:w="-108" w:type="dxa"/>
+        <w:tblLayout w:type="fixed"/>
+        <w:tblLook w:val="0000" w:firstRow="0" w:lastRow="0" w:firstColumn="0" w:lastColumn="0" w:noHBand="0" w:noVBand="0"/>
+      </w:tblPr>
+      <w:tblGrid>
+        <w:gridCol w:w="2235"/>
+        <w:gridCol w:w="7619"/>
+      </w:tblGrid>
+      <w:tr>
+        <w:tc>
+          <w:tcPr>
+            <w:tcW w:w="2235" w:type="dxa"/>
+            <w:vAlign w:val="center"/>
+          </w:tcPr>
+          <w:p>
+            <w:pPr>
+              <w:pBdr>
+                <w:top w:val="nil"/>
+                <w:left w:val="nil"/>
+                <w:bottom w:val="nil"/>
+                <w:right w:val="nil"/>
+                <w:between w:val="nil"/>
+              </w:pBdr>
+              <w:spacing w:line="264" w:lineRule="auto"/>
+              <w:ind w:left="284"/>
+              <w:jc w:val="center"/>
+              <w:rPr>
+                <w:color w:val="000000"/>
+                <w:sz w:val="24"/>
+                <w:szCs w:val="24"/>
+              </w:rPr>
+            </w:pPr>
+            <w:r>
+              <w:rPr>
+                <w:color w:val="000000"/>
+                <w:sz w:val="24"/>
+                <w:szCs w:val="24"/>
+              </w:rPr>
+              <w:t>May 23 -</w:t>
+            </w:r>
+            <w:r>
+              <w:rPr>
+                <w:color w:val="000000"/>
+                <w:sz w:val="24"/>
+                <w:szCs w:val="24"/>
+              </w:rPr>
+              <w:t xml:space="preserve"> </w:t>
+            </w:r>
+            <w:r>
+              <w:rPr>
+                <w:color w:val="000000"/>
+                <w:sz w:val="24"/>
+                <w:szCs w:val="24"/>
+              </w:rPr>
+              <w:t>C</w:t>
+            </w:r>
+            <w:r>
+              <w:rPr>
+                <w:color w:val="000000"/>
+                <w:sz w:val="24"/>
+                <w:szCs w:val="24"/>
+              </w:rPr>
+              <w:t>urrent</w:t>
+            </w:r>
+          </w:p>
+          <w:p>
+            <w:pPr>
+              <w:pBdr>
+                <w:top w:val="nil"/>
+                <w:left w:val="nil"/>
+                <w:bottom w:val="nil"/>
+                <w:right w:val="nil"/>
+                <w:between w:val="nil"/>
+              </w:pBdr>
+              <w:spacing w:line="264" w:lineRule="auto"/>
+              <w:ind w:left="284"/>
+              <w:jc w:val="center"/>
+              <w:rPr>
+                <w:color w:val="000000"/>
+                <w:sz w:val="24"/>
+                <w:szCs w:val="24"/>
+              </w:rPr>
+            </w:pPr>
+            <w:r>
+              <w:rPr>
+                <w:color w:val="000000"/>
+                <w:sz w:val="24"/>
+                <w:szCs w:val="24"/>
+              </w:rPr>
+              <w:t>(1</w:t>
+            </w:r>
+            <w:r>
+              <w:rPr>
+                <w:color w:val="000000"/>
+                <w:sz w:val="24"/>
+                <w:szCs w:val="24"/>
+              </w:rPr>
+              <w:t>+</w:t>
+            </w:r>
+            <w:r>
+              <w:rPr>
+                <w:color w:val="000000"/>
+                <w:sz w:val="24"/>
+                <w:szCs w:val="24"/>
+              </w:rPr>
+              <w:t> </w:t>
+            </w:r>
+            <w:proofErr w:type="spellStart"/>
+            <w:r>
+              <w:rPr>
+                <w:color w:val="000000"/>
+                <w:sz w:val="24"/>
+                <w:szCs w:val="24"/>
+              </w:rPr>
+              <w:t>yr</w:t>
+            </w:r>
+            <w:proofErr w:type="spellEnd"/>
+            <w:r>
+              <w:rPr>
+                <w:color w:val="000000"/>
+                <w:sz w:val="24"/>
+                <w:szCs w:val="24"/>
+              </w:rPr>
+              <w:t>)</w:t>
+            </w:r>
+          </w:p>
+        </w:tc>
+        <w:tc>
+          <w:tcPr>
+            <w:tcW w:w="7619" w:type="dxa"/>
+            <w:vAlign w:val="center"/>
+          </w:tcPr>
+          <w:p>
+            <w:pPr>
+              <w:pBdr>
+                <w:top w:val="nil"/>
+                <w:left w:val="nil"/>
+                <w:bottom w:val="nil"/>
+                <w:right w:val="nil"/>
+                <w:between w:val="nil"/>
+              </w:pBdr>
+              <w:spacing w:line="264" w:lineRule="auto"/>
+              <w:rPr>
+                <w:color w:val="000000"/>
+                <w:sz w:val="24"/>
+                <w:szCs w:val="24"/>
+              </w:rPr>
+            </w:pPr>
+            <w:r>
+              <w:rPr>
+                <w:b/>
+                <w:color w:val="000000"/>
+                <w:sz w:val="24"/>
+                <w:szCs w:val="24"/>
+              </w:rPr>
+              <w:t>Software</w:t>
+            </w:r>
+            <w:r>
+              <w:rPr>
+                <w:b/>
+                <w:color w:val="000000"/>
+                <w:sz w:val="24"/>
+                <w:szCs w:val="24"/>
+              </w:rPr>
+              <w:t xml:space="preserve"> Engineer</w:t>
+            </w:r>
+            <w:r>
+              <w:rPr>
+                <w:color w:val="000000"/>
+                <w:sz w:val="24"/>
+                <w:szCs w:val="24"/>
+              </w:rPr>
+              <w:t>,</w:t>
+            </w:r>
+          </w:p>
+          <w:p>
+            <w:pPr>
+              <w:pBdr>
+                <w:top w:val="nil"/>
+                <w:left w:val="nil"/>
+                <w:bottom w:val="nil"/>
+                <w:right w:val="nil"/>
+                <w:between w:val="nil"/>
+              </w:pBdr>
+              <w:spacing w:before="60" w:after="60" w:line="264" w:lineRule="auto"/>
+              <w:rPr>
+                <w:color w:val="000000"/>
+                <w:sz w:val="24"/>
+                <w:szCs w:val="24"/>
+              </w:rPr>
+            </w:pPr>
+            <w:hyperlink r:id="rId11" w:history="1">
+              <w:r>
+                <w:rPr>
+                  <w:rStyle w:val="Hyperlink"/>
+                  <w:b/>
+                  <w:sz w:val="24"/>
+                  <w:szCs w:val="24"/>
+                </w:rPr>
+                <w:t>Huawei Cloud</w:t>
+              </w:r>
+            </w:hyperlink>
+          </w:p>
+        </w:tc>
+      </w:tr>
+    </w:tbl>
+    <w:p>
+      <w:pPr>
+        <w:pBdr>
+          <w:top w:val="nil"/>
+          <w:left w:val="nil"/>
+          <w:bottom w:val="nil"/>
+          <w:right w:val="nil"/>
+          <w:between w:val="nil"/>
+        </w:pBdr>
+        <w:spacing w:before="60" w:after="60" w:line="264" w:lineRule="auto"/>
+        <w:ind w:left="170" w:hanging="170"/>
+        <w:jc w:val="both"/>
+        <w:rPr>
+          <w:color w:val="000000"/>
+          <w:sz w:val="24"/>
+          <w:szCs w:val="24"/>
+        </w:rPr>
+      </w:pPr>
+      <w:r>
+        <w:rPr>
+          <w:sz w:val="24"/>
+          <w:szCs w:val="24"/>
+        </w:rPr>
+        <w:t>• </w:t>
+      </w:r>
+      <w:r>
+        <w:rPr>
+          <w:color w:val="000000"/>
+          <w:sz w:val="24"/>
+          <w:szCs w:val="24"/>
+        </w:rPr>
+        <w:t>Development of</w:t>
+      </w:r>
+      <w:r>
+        <w:rPr>
+          <w:color w:val="000000"/>
+          <w:sz w:val="24"/>
+          <w:szCs w:val="24"/>
+        </w:rPr>
+        <w:t xml:space="preserve"> </w:t>
+      </w:r>
+      <w:r>
+        <w:rPr>
+          <w:color w:val="000000"/>
+          <w:sz w:val="24"/>
+          <w:szCs w:val="24"/>
+        </w:rPr>
+        <w:t xml:space="preserve">core functionality </w:t>
+      </w:r>
+      <w:r>
+        <w:rPr>
+          <w:color w:val="000000"/>
+          <w:sz w:val="24"/>
+          <w:szCs w:val="24"/>
+        </w:rPr>
+        <w:t>of</w:t>
+      </w:r>
+      <w:r>
+        <w:rPr>
+          <w:color w:val="000000"/>
+          <w:sz w:val="24"/>
+          <w:szCs w:val="24"/>
+        </w:rPr>
+        <w:t xml:space="preserve"> a </w:t>
+      </w:r>
+      <w:r>
+        <w:rPr>
+          <w:color w:val="000000"/>
+          <w:sz w:val="24"/>
+          <w:szCs w:val="24"/>
+        </w:rPr>
+        <w:t>D</w:t>
+      </w:r>
+      <w:r>
+        <w:rPr>
+          <w:color w:val="000000"/>
+          <w:sz w:val="24"/>
+          <w:szCs w:val="24"/>
+        </w:rPr>
+        <w:t xml:space="preserve">ata </w:t>
+      </w:r>
+      <w:r>
+        <w:rPr>
+          <w:color w:val="000000"/>
+          <w:sz w:val="24"/>
+          <w:szCs w:val="24"/>
+        </w:rPr>
+        <w:t>L</w:t>
+      </w:r>
+      <w:r>
+        <w:rPr>
+          <w:color w:val="000000"/>
+          <w:sz w:val="24"/>
+          <w:szCs w:val="24"/>
+        </w:rPr>
+        <w:t>akehouse</w:t>
+      </w:r>
+      <w:r>
+        <w:rPr>
+          <w:color w:val="000000"/>
+          <w:sz w:val="24"/>
+          <w:szCs w:val="24"/>
+        </w:rPr>
+        <w:t xml:space="preserve"> platform</w:t>
+      </w:r>
+      <w:r>
+        <w:rPr>
+          <w:color w:val="000000"/>
+          <w:sz w:val="24"/>
+          <w:szCs w:val="24"/>
+        </w:rPr>
+        <w:t>.</w:t>
+      </w:r>
+    </w:p>
+    <w:tbl>
+      <w:tblPr>
+        <w:tblStyle w:val="a4"/>
+        <w:tblW w:w="9854" w:type="dxa"/>
+        <w:tblInd w:w="-108" w:type="dxa"/>
+        <w:tblLayout w:type="fixed"/>
+        <w:tblLook w:val="0000" w:firstRow="0" w:lastRow="0" w:firstColumn="0" w:lastColumn="0" w:noHBand="0" w:noVBand="0"/>
+      </w:tblPr>
+      <w:tblGrid>
+        <w:gridCol w:w="2235"/>
+        <w:gridCol w:w="7619"/>
+      </w:tblGrid>
+      <w:tr>
+        <w:tc>
+          <w:tcPr>
+            <w:tcW w:w="2235" w:type="dxa"/>
+            <w:vAlign w:val="center"/>
+          </w:tcPr>
+          <w:p>
+            <w:pPr>
+              <w:pBdr>
+                <w:top w:val="nil"/>
+                <w:left w:val="nil"/>
+                <w:bottom w:val="nil"/>
+                <w:right w:val="nil"/>
+                <w:between w:val="nil"/>
+              </w:pBdr>
+              <w:spacing w:line="264" w:lineRule="auto"/>
+              <w:ind w:left="284"/>
+              <w:jc w:val="center"/>
+              <w:rPr>
+                <w:color w:val="000000"/>
+                <w:sz w:val="24"/>
+                <w:szCs w:val="24"/>
+              </w:rPr>
+            </w:pPr>
+            <w:r>
+              <w:rPr>
+                <w:color w:val="000000"/>
+                <w:sz w:val="24"/>
+                <w:szCs w:val="24"/>
+              </w:rPr>
+              <w:t>Jan</w:t>
+            </w:r>
+            <w:r>
+              <w:rPr>
+                <w:color w:val="000000"/>
+                <w:sz w:val="24"/>
+                <w:szCs w:val="24"/>
+              </w:rPr>
+              <w:t xml:space="preserve"> 2</w:t>
+            </w:r>
+            <w:r>
+              <w:rPr>
+                <w:color w:val="000000"/>
+                <w:sz w:val="24"/>
+                <w:szCs w:val="24"/>
+              </w:rPr>
+              <w:t>4</w:t>
+            </w:r>
+            <w:r>
+              <w:rPr>
+                <w:color w:val="000000"/>
+                <w:sz w:val="24"/>
+                <w:szCs w:val="24"/>
+              </w:rPr>
+              <w:t xml:space="preserve"> -</w:t>
+            </w:r>
+            <w:r>
+              <w:rPr>
+                <w:color w:val="000000"/>
+                <w:sz w:val="24"/>
+                <w:szCs w:val="24"/>
+              </w:rPr>
+              <w:t xml:space="preserve"> </w:t>
+            </w:r>
+            <w:r>
+              <w:rPr>
+                <w:color w:val="000000"/>
+                <w:sz w:val="24"/>
+                <w:szCs w:val="24"/>
+              </w:rPr>
+              <w:t>Current</w:t>
+            </w:r>
+          </w:p>
+          <w:p>
+            <w:pPr>
+              <w:pBdr>
+                <w:top w:val="nil"/>
+                <w:left w:val="nil"/>
+                <w:bottom w:val="nil"/>
+                <w:right w:val="nil"/>
+                <w:between w:val="nil"/>
+              </w:pBdr>
+              <w:spacing w:line="264" w:lineRule="auto"/>
+              <w:ind w:left="284"/>
+              <w:jc w:val="center"/>
+              <w:rPr>
+                <w:color w:val="000000"/>
+                <w:sz w:val="24"/>
+                <w:szCs w:val="24"/>
+              </w:rPr>
+            </w:pPr>
+            <w:r>
+              <w:rPr>
+                <w:color w:val="000000"/>
+                <w:sz w:val="24"/>
+                <w:szCs w:val="24"/>
+              </w:rPr>
+              <w:t>(</w:t>
+            </w:r>
+            <w:r>
+              <w:rPr>
+                <w:rFonts w:ascii="Times New Roman" w:hAnsi="Times New Roman" w:cs="Times New Roman"/>
+                <w:b/>
+                <w:color w:val="000000"/>
+                <w:sz w:val="24"/>
+                <w:szCs w:val="24"/>
+              </w:rPr>
+              <w:t>~</w:t>
+            </w:r>
+            <w:r>
+              <w:rPr>
+                <w:rFonts w:ascii="Times New Roman" w:hAnsi="Times New Roman" w:cs="Times New Roman"/>
+                <w:b/>
+                <w:color w:val="000000"/>
+                <w:sz w:val="24"/>
+                <w:szCs w:val="24"/>
+              </w:rPr>
+              <w:t> </w:t>
+            </w:r>
+            <w:r>
+              <w:rPr>
+                <w:color w:val="000000"/>
+                <w:sz w:val="24"/>
+                <w:szCs w:val="24"/>
+              </w:rPr>
+              <w:t>0.5</w:t>
+            </w:r>
+            <w:r>
+              <w:rPr>
+                <w:color w:val="000000"/>
+                <w:sz w:val="24"/>
+                <w:szCs w:val="24"/>
+              </w:rPr>
+              <w:t> </w:t>
+            </w:r>
+            <w:proofErr w:type="spellStart"/>
+            <w:r>
+              <w:rPr>
+                <w:color w:val="000000"/>
+                <w:sz w:val="24"/>
+                <w:szCs w:val="24"/>
+              </w:rPr>
+              <w:t>yr</w:t>
+            </w:r>
+            <w:r>
+              <w:rPr>
+                <w:color w:val="000000"/>
+                <w:sz w:val="24"/>
+                <w:szCs w:val="24"/>
+              </w:rPr>
+              <w:t>s</w:t>
+            </w:r>
+            <w:proofErr w:type="spellEnd"/>
+            <w:r>
+              <w:rPr>
+                <w:color w:val="000000"/>
+                <w:sz w:val="24"/>
+                <w:szCs w:val="24"/>
+              </w:rPr>
+              <w:t>)</w:t>
+            </w:r>
+          </w:p>
+        </w:tc>
+        <w:tc>
+          <w:tcPr>
+            <w:tcW w:w="7619" w:type="dxa"/>
+            <w:vAlign w:val="center"/>
+          </w:tcPr>
+          <w:p>
+            <w:pPr>
+              <w:pBdr>
+                <w:top w:val="nil"/>
+                <w:left w:val="nil"/>
+                <w:bottom w:val="nil"/>
+                <w:right w:val="nil"/>
+                <w:between w:val="nil"/>
+              </w:pBdr>
+              <w:spacing w:line="264" w:lineRule="auto"/>
+              <w:rPr>
+                <w:color w:val="000000"/>
+                <w:sz w:val="24"/>
+                <w:szCs w:val="24"/>
+              </w:rPr>
+            </w:pPr>
+            <w:hyperlink r:id="rId12" w:history="1">
+              <w:r>
+                <w:rPr>
+                  <w:rStyle w:val="Hyperlink"/>
+                  <w:b/>
+                  <w:sz w:val="24"/>
+                  <w:szCs w:val="24"/>
+                </w:rPr>
+                <w:t>Apache Hudi</w:t>
+              </w:r>
+            </w:hyperlink>
+            <w:r>
+              <w:rPr>
+                <w:b/>
+                <w:color w:val="000000"/>
+                <w:sz w:val="24"/>
+                <w:szCs w:val="24"/>
+              </w:rPr>
+              <w:t xml:space="preserve"> Contributor</w:t>
+            </w:r>
+            <w:r>
+              <w:rPr>
+                <w:color w:val="000000"/>
+                <w:sz w:val="24"/>
+                <w:szCs w:val="24"/>
+              </w:rPr>
+              <w:t>,</w:t>
+            </w:r>
+          </w:p>
+          <w:p>
+            <w:pPr>
+              <w:pBdr>
+                <w:top w:val="nil"/>
+                <w:left w:val="nil"/>
+                <w:bottom w:val="nil"/>
+                <w:right w:val="nil"/>
+                <w:between w:val="nil"/>
+              </w:pBdr>
+              <w:spacing w:before="60" w:after="60" w:line="264" w:lineRule="auto"/>
+              <w:rPr>
+                <w:color w:val="000000"/>
+                <w:sz w:val="24"/>
+                <w:szCs w:val="24"/>
+              </w:rPr>
+            </w:pPr>
+            <w:r>
+              <w:rPr>
+                <w:b/>
+                <w:sz w:val="24"/>
+                <w:szCs w:val="24"/>
+              </w:rPr>
+              <w:t>The Apache Software Foundation</w:t>
+            </w:r>
+          </w:p>
+        </w:tc>
+      </w:tr>
+    </w:tbl>
+    <w:p>
+      <w:pPr>
+        <w:pBdr>
+          <w:top w:val="nil"/>
+          <w:left w:val="nil"/>
+          <w:bottom w:val="nil"/>
+          <w:right w:val="nil"/>
+          <w:between w:val="nil"/>
+        </w:pBdr>
+        <w:spacing w:before="60" w:after="60" w:line="264" w:lineRule="auto"/>
+        <w:ind w:left="170" w:hanging="170"/>
+        <w:jc w:val="both"/>
+        <w:rPr>
+          <w:color w:val="000000"/>
+          <w:sz w:val="24"/>
+          <w:szCs w:val="24"/>
+        </w:rPr>
+      </w:pPr>
+      <w:r>
+        <w:rPr>
+          <w:sz w:val="24"/>
+          <w:szCs w:val="24"/>
+        </w:rPr>
+        <w:t>• </w:t>
+      </w:r>
+      <w:r>
+        <w:rPr>
+          <w:color w:val="000000"/>
+          <w:sz w:val="24"/>
+          <w:szCs w:val="24"/>
+        </w:rPr>
+        <w:t>Contributing with focus on</w:t>
+      </w:r>
+      <w:r>
+        <w:rPr>
+          <w:color w:val="000000"/>
+          <w:sz w:val="24"/>
+          <w:szCs w:val="24"/>
+        </w:rPr>
+        <w:t xml:space="preserve"> usability of the solution</w:t>
+      </w:r>
+      <w:r>
+        <w:rPr>
+          <w:color w:val="000000"/>
+          <w:sz w:val="24"/>
+          <w:szCs w:val="24"/>
+        </w:rPr>
+        <w:t>.</w:t>
+      </w:r>
+    </w:p>
+    <w:tbl>
+      <w:tblPr>
+        <w:tblStyle w:val="a4"/>
+        <w:tblW w:w="9854" w:type="dxa"/>
+        <w:tblInd w:w="-108" w:type="dxa"/>
+        <w:tblLayout w:type="fixed"/>
+        <w:tblLook w:val="0000" w:firstRow="0" w:lastRow="0" w:firstColumn="0" w:lastColumn="0" w:noHBand="0" w:noVBand="0"/>
+      </w:tblPr>
+      <w:tblGrid>
+        <w:gridCol w:w="2235"/>
+        <w:gridCol w:w="7619"/>
+      </w:tblGrid>
+      <w:tr>
+        <w:tc>
+          <w:tcPr>
+            <w:tcW w:w="2235" w:type="dxa"/>
+            <w:vAlign w:val="center"/>
+          </w:tcPr>
+          <w:p>
+            <w:pPr>
+              <w:pBdr>
+                <w:top w:val="nil"/>
+                <w:left w:val="nil"/>
+                <w:bottom w:val="nil"/>
+                <w:right w:val="nil"/>
+                <w:between w:val="nil"/>
+              </w:pBdr>
+              <w:spacing w:line="264" w:lineRule="auto"/>
+              <w:ind w:left="284"/>
+              <w:jc w:val="center"/>
+              <w:rPr>
+                <w:color w:val="000000"/>
+                <w:sz w:val="24"/>
+                <w:szCs w:val="24"/>
+              </w:rPr>
+            </w:pPr>
+            <w:r>
+              <w:rPr>
+                <w:color w:val="000000"/>
+                <w:sz w:val="24"/>
+                <w:szCs w:val="24"/>
+              </w:rPr>
+              <w:t>Feb 22 -</w:t>
+            </w:r>
+            <w:r>
+              <w:rPr>
+                <w:color w:val="000000"/>
+                <w:sz w:val="24"/>
+                <w:szCs w:val="24"/>
+              </w:rPr>
+              <w:t xml:space="preserve"> </w:t>
+            </w:r>
+            <w:r>
+              <w:rPr>
+                <w:color w:val="000000"/>
+                <w:sz w:val="24"/>
+                <w:szCs w:val="24"/>
+              </w:rPr>
+              <w:t>May 23</w:t>
+            </w:r>
+            <w:r>
+              <w:rPr>
+                <w:color w:val="000000"/>
+                <w:sz w:val="24"/>
+                <w:szCs w:val="24"/>
+              </w:rPr>
+              <w:t xml:space="preserve"> (1</w:t>
+            </w:r>
+            <w:r>
+              <w:rPr>
+                <w:color w:val="000000"/>
+                <w:sz w:val="24"/>
+                <w:szCs w:val="24"/>
+              </w:rPr>
+              <w:t>+</w:t>
+            </w:r>
+            <w:r>
+              <w:rPr>
+                <w:color w:val="000000"/>
+                <w:sz w:val="24"/>
+                <w:szCs w:val="24"/>
+              </w:rPr>
+              <w:t> </w:t>
+            </w:r>
+            <w:proofErr w:type="spellStart"/>
+            <w:r>
+              <w:rPr>
+                <w:color w:val="000000"/>
+                <w:sz w:val="24"/>
+                <w:szCs w:val="24"/>
+              </w:rPr>
+              <w:t>yr</w:t>
+            </w:r>
+            <w:proofErr w:type="spellEnd"/>
+            <w:r>
+              <w:rPr>
+                <w:color w:val="000000"/>
+                <w:sz w:val="24"/>
+                <w:szCs w:val="24"/>
+              </w:rPr>
+              <w:t>)</w:t>
+            </w:r>
+          </w:p>
+        </w:tc>
+        <w:tc>
+          <w:tcPr>
+            <w:tcW w:w="7619" w:type="dxa"/>
+            <w:vAlign w:val="center"/>
+          </w:tcPr>
+          <w:p>
+            <w:pPr>
+              <w:pBdr>
+                <w:top w:val="nil"/>
+                <w:left w:val="nil"/>
+                <w:bottom w:val="nil"/>
+                <w:right w:val="nil"/>
+                <w:between w:val="nil"/>
+              </w:pBdr>
+              <w:spacing w:line="264" w:lineRule="auto"/>
+              <w:rPr>
+                <w:color w:val="000000"/>
+                <w:sz w:val="24"/>
+                <w:szCs w:val="24"/>
+              </w:rPr>
+            </w:pPr>
+            <w:r>
+              <w:rPr>
+                <w:b/>
+                <w:color w:val="000000"/>
+                <w:sz w:val="24"/>
+                <w:szCs w:val="24"/>
+              </w:rPr>
+              <w:t>Software Engineer</w:t>
+            </w:r>
+            <w:r>
+              <w:rPr>
+                <w:color w:val="000000"/>
+                <w:sz w:val="24"/>
+                <w:szCs w:val="24"/>
+              </w:rPr>
+              <w:t>,</w:t>
+            </w:r>
+          </w:p>
+          <w:p>
+            <w:pPr>
+              <w:pBdr>
+                <w:top w:val="nil"/>
+                <w:left w:val="nil"/>
+                <w:bottom w:val="nil"/>
+                <w:right w:val="nil"/>
+                <w:between w:val="nil"/>
+              </w:pBdr>
+              <w:spacing w:before="60" w:after="60" w:line="264" w:lineRule="auto"/>
+              <w:rPr>
+                <w:color w:val="000000"/>
+                <w:sz w:val="24"/>
+                <w:szCs w:val="24"/>
+              </w:rPr>
+            </w:pPr>
+            <w:bookmarkStart w:id="1" w:name="_heading=h.30j0zll" w:colFirst="0" w:colLast="0"/>
+            <w:bookmarkEnd w:id="1"/>
+            <w:r>
+              <w:rPr>
+                <w:b/>
+                <w:color w:val="000000"/>
+                <w:sz w:val="24"/>
+                <w:szCs w:val="24"/>
+              </w:rPr>
+              <w:t>Digital Research</w:t>
+            </w:r>
+            <w:r>
+              <w:rPr>
+                <w:color w:val="000000"/>
+                <w:sz w:val="24"/>
+                <w:szCs w:val="24"/>
+              </w:rPr>
+              <w:t xml:space="preserve"> (computer vision startup)</w:t>
+            </w:r>
+          </w:p>
+        </w:tc>
+      </w:tr>
+    </w:tbl>
+    <w:p>
+      <w:pPr>
+        <w:pBdr>
+          <w:top w:val="nil"/>
+          <w:left w:val="nil"/>
+          <w:bottom w:val="nil"/>
+          <w:right w:val="nil"/>
+          <w:between w:val="nil"/>
+        </w:pBdr>
+        <w:spacing w:before="60" w:after="60" w:line="264" w:lineRule="auto"/>
+        <w:ind w:left="170" w:hanging="170"/>
+        <w:jc w:val="both"/>
+        <w:rPr>
+          <w:sz w:val="24"/>
+          <w:szCs w:val="24"/>
+        </w:rPr>
+      </w:pPr>
+      <w:r>
+        <w:rPr>
+          <w:sz w:val="24"/>
+          <w:szCs w:val="24"/>
+        </w:rPr>
+        <w:t>• Created an event-based architecture for a system of batch image processing (~20k images / day). Developed server-side image processing.</w:t>
+      </w:r>
+      <w:r>
+        <w:rPr>
+          <w:sz w:val="24"/>
+          <w:szCs w:val="24"/>
+        </w:rPr>
+        <w:t xml:space="preserve"> In production th</w:t>
+      </w:r>
+      <w:r>
+        <w:rPr>
+          <w:sz w:val="24"/>
+          <w:szCs w:val="24"/>
+        </w:rPr>
+        <w:t>e system reduced downtime of trucks by 12%.</w:t>
+      </w:r>
+    </w:p>
+    <w:p>
+      <w:pPr>
+        <w:pBdr>
+          <w:top w:val="nil"/>
+          <w:left w:val="nil"/>
+          <w:bottom w:val="nil"/>
+          <w:right w:val="nil"/>
+          <w:between w:val="nil"/>
+        </w:pBdr>
+        <w:spacing w:before="60" w:after="60" w:line="264" w:lineRule="auto"/>
+        <w:ind w:left="170" w:hanging="170"/>
+        <w:jc w:val="both"/>
+        <w:rPr>
+          <w:sz w:val="24"/>
+          <w:szCs w:val="24"/>
+        </w:rPr>
+      </w:pPr>
+      <w:r>
+        <w:rPr>
+          <w:sz w:val="24"/>
+          <w:szCs w:val="24"/>
+        </w:rPr>
+        <w:t xml:space="preserve">• Created a customer-facing web UI with reports and data visualization. Also created an internal web UI </w:t>
+      </w:r>
+      <w:r>
+        <w:rPr>
+          <w:sz w:val="24"/>
+          <w:szCs w:val="24"/>
+        </w:rPr>
+        <w:t>for system monitoring</w:t>
+      </w:r>
+      <w:r>
+        <w:rPr>
+          <w:sz w:val="24"/>
+          <w:szCs w:val="24"/>
+        </w:rPr>
+        <w:t>.</w:t>
+      </w:r>
+    </w:p>
+    <w:tbl>
+      <w:tblPr>
+        <w:tblStyle w:val="a5"/>
         <w:tblW w:w="9854" w:type="dxa"/>
         <w:tblInd w:w="-108" w:type="dxa"/>
         <w:tblLayout w:type="fixed"/>
@@ -787,594 +1678,6 @@
                 <w:sz w:val="24"/>
                 <w:szCs w:val="24"/>
               </w:rPr>
-              <w:t>May 2023 -</w:t>
-            </w:r>
-          </w:p>
-          <w:p>
-            <w:pPr>
-              <w:pBdr>
-                <w:top w:val="nil"/>
-                <w:left w:val="nil"/>
-                <w:bottom w:val="nil"/>
-                <w:right w:val="nil"/>
-                <w:between w:val="nil"/>
-              </w:pBdr>
-              <w:spacing w:line="264" w:lineRule="auto"/>
-              <w:ind w:left="284"/>
-              <w:jc w:val="center"/>
-              <w:rPr>
-                <w:color w:val="000000"/>
-                <w:sz w:val="24"/>
-                <w:szCs w:val="24"/>
-              </w:rPr>
-            </w:pPr>
-            <w:r>
-              <w:rPr>
-                <w:color w:val="000000"/>
-                <w:sz w:val="24"/>
-                <w:szCs w:val="24"/>
-              </w:rPr>
-              <w:t>C</w:t>
-            </w:r>
-            <w:r>
-              <w:rPr>
-                <w:color w:val="000000"/>
-                <w:sz w:val="24"/>
-                <w:szCs w:val="24"/>
-              </w:rPr>
-              <w:t>urrent</w:t>
-            </w:r>
-          </w:p>
-          <w:p>
-            <w:pPr>
-              <w:pBdr>
-                <w:top w:val="nil"/>
-                <w:left w:val="nil"/>
-                <w:bottom w:val="nil"/>
-                <w:right w:val="nil"/>
-                <w:between w:val="nil"/>
-              </w:pBdr>
-              <w:spacing w:line="264" w:lineRule="auto"/>
-              <w:ind w:left="284"/>
-              <w:jc w:val="center"/>
-              <w:rPr>
-                <w:color w:val="000000"/>
-                <w:sz w:val="24"/>
-                <w:szCs w:val="24"/>
-              </w:rPr>
-            </w:pPr>
-            <w:r>
-              <w:rPr>
-                <w:color w:val="000000"/>
-                <w:sz w:val="24"/>
-                <w:szCs w:val="24"/>
-              </w:rPr>
-              <w:t>(</w:t>
-            </w:r>
-            <w:r>
-              <w:rPr>
-                <w:rFonts w:ascii="Times New Roman" w:hAnsi="Times New Roman" w:cs="Times New Roman"/>
-                <w:b/>
-                <w:color w:val="000000"/>
-                <w:sz w:val="24"/>
-                <w:szCs w:val="24"/>
-              </w:rPr>
-              <w:t>~</w:t>
-            </w:r>
-            <w:r>
-              <w:rPr>
-                <w:rFonts w:ascii="Times New Roman" w:hAnsi="Times New Roman" w:cs="Times New Roman"/>
-                <w:b/>
-                <w:color w:val="000000"/>
-                <w:sz w:val="24"/>
-                <w:szCs w:val="24"/>
-              </w:rPr>
-              <w:t> </w:t>
-            </w:r>
-            <w:r>
-              <w:rPr>
-                <w:color w:val="000000"/>
-                <w:sz w:val="24"/>
-                <w:szCs w:val="24"/>
-              </w:rPr>
-              <w:t>1 </w:t>
-            </w:r>
-            <w:proofErr w:type="spellStart"/>
-            <w:r>
-              <w:rPr>
-                <w:color w:val="000000"/>
-                <w:sz w:val="24"/>
-                <w:szCs w:val="24"/>
-              </w:rPr>
-              <w:t>yr</w:t>
-            </w:r>
-            <w:proofErr w:type="spellEnd"/>
-            <w:r>
-              <w:rPr>
-                <w:color w:val="000000"/>
-                <w:sz w:val="24"/>
-                <w:szCs w:val="24"/>
-              </w:rPr>
-              <w:t>)</w:t>
-            </w:r>
-          </w:p>
-        </w:tc>
-        <w:tc>
-          <w:tcPr>
-            <w:tcW w:w="7903" w:type="dxa"/>
-            <w:vAlign w:val="center"/>
-          </w:tcPr>
-          <w:p>
-            <w:pPr>
-              <w:pBdr>
-                <w:top w:val="nil"/>
-                <w:left w:val="nil"/>
-                <w:bottom w:val="nil"/>
-                <w:right w:val="nil"/>
-                <w:between w:val="nil"/>
-              </w:pBdr>
-              <w:spacing w:line="264" w:lineRule="auto"/>
-              <w:rPr>
-                <w:color w:val="000000"/>
-                <w:sz w:val="24"/>
-                <w:szCs w:val="24"/>
-              </w:rPr>
-            </w:pPr>
-            <w:r>
-              <w:rPr>
-                <w:b/>
-                <w:color w:val="000000"/>
-                <w:sz w:val="24"/>
-                <w:szCs w:val="24"/>
-              </w:rPr>
-              <w:t>Software</w:t>
-            </w:r>
-            <w:r>
-              <w:rPr>
-                <w:b/>
-                <w:color w:val="000000"/>
-                <w:sz w:val="24"/>
-                <w:szCs w:val="24"/>
-              </w:rPr>
-              <w:t xml:space="preserve"> Engineer</w:t>
-            </w:r>
-            <w:r>
-              <w:rPr>
-                <w:color w:val="000000"/>
-                <w:sz w:val="24"/>
-                <w:szCs w:val="24"/>
-              </w:rPr>
-              <w:t>,</w:t>
-            </w:r>
-          </w:p>
-          <w:p>
-            <w:pPr>
-              <w:pBdr>
-                <w:top w:val="nil"/>
-                <w:left w:val="nil"/>
-                <w:bottom w:val="nil"/>
-                <w:right w:val="nil"/>
-                <w:between w:val="nil"/>
-              </w:pBdr>
-              <w:spacing w:before="60" w:after="60" w:line="264" w:lineRule="auto"/>
-              <w:rPr>
-                <w:color w:val="000000"/>
-                <w:sz w:val="24"/>
-                <w:szCs w:val="24"/>
-              </w:rPr>
-            </w:pPr>
-            <w:hyperlink r:id="rId11" w:history="1">
-              <w:r>
-                <w:rPr>
-                  <w:rStyle w:val="ad"/>
-                  <w:b/>
-                  <w:sz w:val="24"/>
-                  <w:szCs w:val="24"/>
-                </w:rPr>
-                <w:t>Huawei Cloud</w:t>
-              </w:r>
-            </w:hyperlink>
-          </w:p>
-        </w:tc>
-      </w:tr>
-    </w:tbl>
-    <w:p>
-      <w:pPr>
-        <w:pBdr>
-          <w:top w:val="nil"/>
-          <w:left w:val="nil"/>
-          <w:bottom w:val="nil"/>
-          <w:right w:val="nil"/>
-          <w:between w:val="nil"/>
-        </w:pBdr>
-        <w:spacing w:before="60" w:after="60" w:line="264" w:lineRule="auto"/>
-        <w:ind w:left="170" w:hanging="170"/>
-        <w:jc w:val="both"/>
-        <w:rPr>
-          <w:color w:val="000000"/>
-          <w:sz w:val="24"/>
-          <w:szCs w:val="24"/>
-        </w:rPr>
-      </w:pPr>
-      <w:r>
-        <w:rPr>
-          <w:sz w:val="24"/>
-          <w:szCs w:val="24"/>
-        </w:rPr>
-        <w:t>• </w:t>
-      </w:r>
-      <w:r>
-        <w:rPr>
-          <w:color w:val="000000"/>
-          <w:sz w:val="24"/>
-          <w:szCs w:val="24"/>
-        </w:rPr>
-        <w:t>Development of</w:t>
-      </w:r>
-      <w:r>
-        <w:rPr>
-          <w:color w:val="000000"/>
-          <w:sz w:val="24"/>
-          <w:szCs w:val="24"/>
-        </w:rPr>
-        <w:t xml:space="preserve"> </w:t>
-      </w:r>
-      <w:r>
-        <w:rPr>
-          <w:color w:val="000000"/>
-          <w:sz w:val="24"/>
-          <w:szCs w:val="24"/>
-        </w:rPr>
-        <w:t xml:space="preserve">core functionality in a </w:t>
-      </w:r>
-      <w:r>
-        <w:rPr>
-          <w:color w:val="000000"/>
-          <w:sz w:val="24"/>
-          <w:szCs w:val="24"/>
-        </w:rPr>
-        <w:t xml:space="preserve">data </w:t>
-      </w:r>
-      <w:proofErr w:type="spellStart"/>
-      <w:r>
-        <w:rPr>
-          <w:color w:val="000000"/>
-          <w:sz w:val="24"/>
-          <w:szCs w:val="24"/>
-        </w:rPr>
-        <w:t>lakehouse</w:t>
-      </w:r>
-      <w:proofErr w:type="spellEnd"/>
-      <w:r>
-        <w:rPr>
-          <w:color w:val="000000"/>
-          <w:sz w:val="24"/>
-          <w:szCs w:val="24"/>
-        </w:rPr>
-        <w:t xml:space="preserve"> platform</w:t>
-      </w:r>
-      <w:r>
-        <w:rPr>
-          <w:color w:val="000000"/>
-          <w:sz w:val="24"/>
-          <w:szCs w:val="24"/>
-        </w:rPr>
-        <w:t>.</w:t>
-      </w:r>
-    </w:p>
-    <w:tbl>
-      <w:tblPr>
-        <w:tblStyle w:val="aa"/>
-        <w:tblW w:w="9854" w:type="dxa"/>
-        <w:tblInd w:w="-108" w:type="dxa"/>
-        <w:tblLayout w:type="fixed"/>
-        <w:tblLook w:val="0000" w:firstRow="0" w:lastRow="0" w:firstColumn="0" w:lastColumn="0" w:noHBand="0" w:noVBand="0"/>
-      </w:tblPr>
-      <w:tblGrid>
-        <w:gridCol w:w="1951"/>
-        <w:gridCol w:w="7903"/>
-      </w:tblGrid>
-      <w:tr>
-        <w:tc>
-          <w:tcPr>
-            <w:tcW w:w="1951" w:type="dxa"/>
-            <w:vAlign w:val="center"/>
-          </w:tcPr>
-          <w:p>
-            <w:pPr>
-              <w:pBdr>
-                <w:top w:val="nil"/>
-                <w:left w:val="nil"/>
-                <w:bottom w:val="nil"/>
-                <w:right w:val="nil"/>
-                <w:between w:val="nil"/>
-              </w:pBdr>
-              <w:spacing w:line="264" w:lineRule="auto"/>
-              <w:ind w:left="284"/>
-              <w:jc w:val="center"/>
-              <w:rPr>
-                <w:color w:val="000000"/>
-                <w:sz w:val="24"/>
-                <w:szCs w:val="24"/>
-              </w:rPr>
-            </w:pPr>
-            <w:r>
-              <w:rPr>
-                <w:color w:val="000000"/>
-                <w:sz w:val="24"/>
-                <w:szCs w:val="24"/>
-              </w:rPr>
-              <w:t>Feb 2022 -</w:t>
-            </w:r>
-          </w:p>
-          <w:p>
-            <w:pPr>
-              <w:pBdr>
-                <w:top w:val="nil"/>
-                <w:left w:val="nil"/>
-                <w:bottom w:val="nil"/>
-                <w:right w:val="nil"/>
-                <w:between w:val="nil"/>
-              </w:pBdr>
-              <w:spacing w:line="264" w:lineRule="auto"/>
-              <w:ind w:left="284"/>
-              <w:jc w:val="center"/>
-              <w:rPr>
-                <w:color w:val="000000"/>
-                <w:sz w:val="24"/>
-                <w:szCs w:val="24"/>
-              </w:rPr>
-            </w:pPr>
-            <w:r>
-              <w:rPr>
-                <w:color w:val="000000"/>
-                <w:sz w:val="24"/>
-                <w:szCs w:val="24"/>
-              </w:rPr>
-              <w:t>May 2023</w:t>
-            </w:r>
-            <w:r>
-              <w:rPr>
-                <w:color w:val="000000"/>
-                <w:sz w:val="24"/>
-                <w:szCs w:val="24"/>
-              </w:rPr>
-              <w:t xml:space="preserve"> (1</w:t>
-            </w:r>
-            <w:r>
-              <w:rPr>
-                <w:color w:val="000000"/>
-                <w:sz w:val="24"/>
-                <w:szCs w:val="24"/>
-              </w:rPr>
-              <w:t>+</w:t>
-            </w:r>
-            <w:r>
-              <w:rPr>
-                <w:color w:val="000000"/>
-                <w:sz w:val="24"/>
-                <w:szCs w:val="24"/>
-              </w:rPr>
-              <w:t> </w:t>
-            </w:r>
-            <w:proofErr w:type="spellStart"/>
-            <w:r>
-              <w:rPr>
-                <w:color w:val="000000"/>
-                <w:sz w:val="24"/>
-                <w:szCs w:val="24"/>
-              </w:rPr>
-              <w:t>yr</w:t>
-            </w:r>
-            <w:proofErr w:type="spellEnd"/>
-            <w:r>
-              <w:rPr>
-                <w:color w:val="000000"/>
-                <w:sz w:val="24"/>
-                <w:szCs w:val="24"/>
-              </w:rPr>
-              <w:t>)</w:t>
-            </w:r>
-          </w:p>
-        </w:tc>
-        <w:tc>
-          <w:tcPr>
-            <w:tcW w:w="7903" w:type="dxa"/>
-            <w:vAlign w:val="center"/>
-          </w:tcPr>
-          <w:p>
-            <w:pPr>
-              <w:pBdr>
-                <w:top w:val="nil"/>
-                <w:left w:val="nil"/>
-                <w:bottom w:val="nil"/>
-                <w:right w:val="nil"/>
-                <w:between w:val="nil"/>
-              </w:pBdr>
-              <w:spacing w:line="264" w:lineRule="auto"/>
-              <w:rPr>
-                <w:color w:val="000000"/>
-                <w:sz w:val="24"/>
-                <w:szCs w:val="24"/>
-              </w:rPr>
-            </w:pPr>
-            <w:r>
-              <w:rPr>
-                <w:b/>
-                <w:color w:val="000000"/>
-                <w:sz w:val="24"/>
-                <w:szCs w:val="24"/>
-              </w:rPr>
-              <w:t>Software Engineer</w:t>
-            </w:r>
-            <w:r>
-              <w:rPr>
-                <w:color w:val="000000"/>
-                <w:sz w:val="24"/>
-                <w:szCs w:val="24"/>
-              </w:rPr>
-              <w:t>,</w:t>
-            </w:r>
-          </w:p>
-          <w:p>
-            <w:pPr>
-              <w:pBdr>
-                <w:top w:val="nil"/>
-                <w:left w:val="nil"/>
-                <w:bottom w:val="nil"/>
-                <w:right w:val="nil"/>
-                <w:between w:val="nil"/>
-              </w:pBdr>
-              <w:spacing w:before="60" w:after="60" w:line="264" w:lineRule="auto"/>
-              <w:rPr>
-                <w:color w:val="000000"/>
-                <w:sz w:val="24"/>
-                <w:szCs w:val="24"/>
-              </w:rPr>
-            </w:pPr>
-            <w:bookmarkStart w:id="2" w:name="_heading=h.30j0zll" w:colFirst="0" w:colLast="0"/>
-            <w:bookmarkEnd w:id="2"/>
-            <w:r>
-              <w:rPr>
-                <w:b/>
-                <w:color w:val="000000"/>
-                <w:sz w:val="24"/>
-                <w:szCs w:val="24"/>
-              </w:rPr>
-              <w:t>Digital Research</w:t>
-            </w:r>
-            <w:r>
-              <w:rPr>
-                <w:color w:val="000000"/>
-                <w:sz w:val="24"/>
-                <w:szCs w:val="24"/>
-              </w:rPr>
-              <w:t xml:space="preserve"> (computer vision startup)</w:t>
-            </w:r>
-          </w:p>
-        </w:tc>
-      </w:tr>
-    </w:tbl>
-    <w:p>
-      <w:pPr>
-        <w:pBdr>
-          <w:top w:val="nil"/>
-          <w:left w:val="nil"/>
-          <w:bottom w:val="nil"/>
-          <w:right w:val="nil"/>
-          <w:between w:val="nil"/>
-        </w:pBdr>
-        <w:spacing w:before="60" w:after="60" w:line="264" w:lineRule="auto"/>
-        <w:ind w:left="170" w:hanging="170"/>
-        <w:jc w:val="both"/>
-        <w:rPr>
-          <w:sz w:val="24"/>
-          <w:szCs w:val="24"/>
-        </w:rPr>
-      </w:pPr>
-      <w:r>
-        <w:rPr>
-          <w:sz w:val="24"/>
-          <w:szCs w:val="24"/>
-        </w:rPr>
-        <w:t>• Created an event-based architecture for a system of batch image processing (~20k images / day). Developed server-side image processing.</w:t>
-      </w:r>
-      <w:r>
-        <w:rPr>
-          <w:sz w:val="24"/>
-          <w:szCs w:val="24"/>
-        </w:rPr>
-        <w:t xml:space="preserve"> In production th</w:t>
-      </w:r>
-      <w:r>
-        <w:rPr>
-          <w:sz w:val="24"/>
-          <w:szCs w:val="24"/>
-        </w:rPr>
-        <w:t>e system reduced downtime of trucks by 12%.</w:t>
-      </w:r>
-    </w:p>
-    <w:p>
-      <w:pPr>
-        <w:pBdr>
-          <w:top w:val="nil"/>
-          <w:left w:val="nil"/>
-          <w:bottom w:val="nil"/>
-          <w:right w:val="nil"/>
-          <w:between w:val="nil"/>
-        </w:pBdr>
-        <w:spacing w:before="60" w:after="60" w:line="264" w:lineRule="auto"/>
-        <w:ind w:left="170" w:hanging="170"/>
-        <w:jc w:val="both"/>
-        <w:rPr>
-          <w:sz w:val="24"/>
-          <w:szCs w:val="24"/>
-        </w:rPr>
-      </w:pPr>
-      <w:r>
-        <w:rPr>
-          <w:sz w:val="24"/>
-          <w:szCs w:val="24"/>
-        </w:rPr>
-        <w:t xml:space="preserve">• Created a customer-facing web UI with reports and data visualization. Also created an internal web UI </w:t>
-      </w:r>
-      <w:r>
-        <w:rPr>
-          <w:sz w:val="24"/>
-          <w:szCs w:val="24"/>
-        </w:rPr>
-        <w:t>for system monitoring</w:t>
-      </w:r>
-      <w:r>
-        <w:rPr>
-          <w:sz w:val="24"/>
-          <w:szCs w:val="24"/>
-        </w:rPr>
-        <w:t>.</w:t>
-      </w:r>
-    </w:p>
-    <w:tbl>
-      <w:tblPr>
-        <w:tblStyle w:val="ab"/>
-        <w:tblW w:w="9854" w:type="dxa"/>
-        <w:tblInd w:w="-108" w:type="dxa"/>
-        <w:tblLayout w:type="fixed"/>
-        <w:tblLook w:val="0000" w:firstRow="0" w:lastRow="0" w:firstColumn="0" w:lastColumn="0" w:noHBand="0" w:noVBand="0"/>
-      </w:tblPr>
-      <w:tblGrid>
-        <w:gridCol w:w="1951"/>
-        <w:gridCol w:w="7903"/>
-      </w:tblGrid>
-      <w:tr>
-        <w:tc>
-          <w:tcPr>
-            <w:tcW w:w="1951" w:type="dxa"/>
-            <w:vAlign w:val="center"/>
-          </w:tcPr>
-          <w:p>
-            <w:pPr>
-              <w:pBdr>
-                <w:top w:val="nil"/>
-                <w:left w:val="nil"/>
-                <w:bottom w:val="nil"/>
-                <w:right w:val="nil"/>
-                <w:between w:val="nil"/>
-              </w:pBdr>
-              <w:spacing w:line="264" w:lineRule="auto"/>
-              <w:ind w:left="284"/>
-              <w:jc w:val="center"/>
-              <w:rPr>
-                <w:color w:val="000000"/>
-                <w:sz w:val="24"/>
-                <w:szCs w:val="24"/>
-              </w:rPr>
-            </w:pPr>
-            <w:r>
-              <w:rPr>
-                <w:color w:val="000000"/>
-                <w:sz w:val="24"/>
-                <w:szCs w:val="24"/>
-              </w:rPr>
               <w:t>2009 – 2022</w:t>
             </w:r>
           </w:p>
@@ -1487,8 +1790,8 @@
                 <w:szCs w:val="24"/>
               </w:rPr>
             </w:pPr>
-            <w:bookmarkStart w:id="3" w:name="_heading=h.1fob9te" w:colFirst="0" w:colLast="0"/>
-            <w:bookmarkEnd w:id="3"/>
+            <w:bookmarkStart w:id="2" w:name="_heading=h.1fob9te" w:colFirst="0" w:colLast="0"/>
+            <w:bookmarkEnd w:id="2"/>
             <w:r>
               <w:rPr>
                 <w:b/>
@@ -1560,39 +1863,39 @@
           <w:sz w:val="24"/>
           <w:szCs w:val="24"/>
         </w:rPr>
-        <w:t>combined from</w:t>
-      </w:r>
-      <w:r>
-        <w:rPr>
-          <w:color w:val="000000"/>
-          <w:sz w:val="24"/>
-          <w:szCs w:val="24"/>
-        </w:rPr>
-        <w:t xml:space="preserve"> </w:t>
-      </w:r>
-      <w:r>
-        <w:rPr>
-          <w:color w:val="000000"/>
-          <w:sz w:val="24"/>
-          <w:szCs w:val="24"/>
-        </w:rPr>
-        <w:t xml:space="preserve">cross -dependent </w:t>
-      </w:r>
-      <w:r>
-        <w:rPr>
-          <w:color w:val="000000"/>
-          <w:sz w:val="24"/>
-          <w:szCs w:val="24"/>
-        </w:rPr>
-        <w:t xml:space="preserve">research and software development </w:t>
-      </w:r>
-      <w:r>
-        <w:rPr>
-          <w:color w:val="000000"/>
-          <w:sz w:val="24"/>
-          <w:szCs w:val="24"/>
-        </w:rPr>
-        <w:t>parts</w:t>
+        <w:t xml:space="preserve">with </w:t>
+      </w:r>
+      <w:r>
+        <w:rPr>
+          <w:color w:val="000000"/>
+          <w:sz w:val="24"/>
+          <w:szCs w:val="24"/>
+        </w:rPr>
+        <w:t xml:space="preserve">research and </w:t>
+      </w:r>
+      <w:r>
+        <w:rPr>
+          <w:color w:val="000000"/>
+          <w:sz w:val="24"/>
+          <w:szCs w:val="24"/>
+        </w:rPr>
+        <w:t xml:space="preserve">software </w:t>
+      </w:r>
+      <w:r>
+        <w:rPr>
+          <w:color w:val="000000"/>
+          <w:sz w:val="24"/>
+          <w:szCs w:val="24"/>
+        </w:rPr>
+        <w:t xml:space="preserve">development </w:t>
+      </w:r>
+      <w:r>
+        <w:rPr>
+          <w:color w:val="000000"/>
+          <w:sz w:val="24"/>
+          <w:szCs w:val="24"/>
+        </w:rPr>
+        <w:t>stages</w:t>
       </w:r>
       <w:r>
         <w:rPr>
@@ -1701,7 +2004,7 @@
     </w:p>
     <w:tbl>
       <w:tblPr>
-        <w:tblStyle w:val="ac"/>
+        <w:tblStyle w:val="a6"/>
         <w:tblW w:w="9854" w:type="dxa"/>
         <w:tblInd w:w="-108" w:type="dxa"/>
         <w:tblLayout w:type="fixed"/>
@@ -1834,6 +2137,7 @@
                 <w:sz w:val="24"/>
                 <w:szCs w:val="24"/>
               </w:rPr>
+              <w:lastRenderedPageBreak/>
               <w:t>2009</w:t>
             </w:r>
           </w:p>
@@ -1845,6 +2149,7 @@
           </w:tcPr>
           <w:p>
             <w:pPr>
+              <w:keepNext/>
               <w:pBdr>
                 <w:top w:val="nil"/>
                 <w:left w:val="nil"/>
@@ -1868,6 +2173,8 @@
               </w:rPr>
               <w:t>MSc, Computational and Applied Mathematics,</w:t>
             </w:r>
+            <w:bookmarkStart w:id="3" w:name="_GoBack"/>
+            <w:bookmarkEnd w:id="3"/>
           </w:p>
           <w:p>
             <w:pPr>
@@ -1922,7 +2229,6 @@
           <w:sz w:val="24"/>
           <w:szCs w:val="24"/>
         </w:rPr>
-        <w:lastRenderedPageBreak/>
         <w:t>CERTIFICATES</w:t>
       </w:r>
     </w:p>
@@ -2079,7 +2385,7 @@
           <w:szCs w:val="24"/>
         </w:rPr>
       </w:pPr>
-      <w:hyperlink r:id="rId12">
+      <w:hyperlink r:id="rId13">
         <w:r>
           <w:rPr>
             <w:color w:val="0000FF"/>
@@ -2090,7 +2396,7 @@
       </w:hyperlink>
     </w:p>
     <w:sectPr>
-      <w:footerReference w:type="default" r:id="rId13"/>
+      <w:footerReference w:type="default" r:id="rId14"/>
       <w:pgSz w:w="11906" w:h="16838"/>
       <w:pgMar w:top="680" w:right="1134" w:bottom="680" w:left="1134" w:header="113" w:footer="113" w:gutter="0"/>
       <w:pgNumType w:start="1"/>
@@ -2101,7 +2407,7 @@
 </file>
 
 <file path=word/endnotes.xml><?xml version="1.0" encoding="utf-8"?>
-<w:endnotes xmlns:wpc="http://schemas.microsoft.com/office/word/2010/wordprocessingCanvas" xmlns:cx="http://schemas.microsoft.com/office/drawing/2014/chartex" xmlns:cx1="http://schemas.microsoft.com/office/drawing/2015/9/8/chartex" xmlns:mc="http://schemas.openxmlformats.org/markup-compatibility/2006" xmlns:o="urn:schemas-microsoft-com:office:office" xmlns:r="http://schemas.openxmlformats.org/officeDocument/2006/relationships" xmlns:m="http://schemas.openxmlformats.org/officeDocument/2006/math" xmlns:v="urn:schemas-microsoft-com:vml" xmlns:wp14="http://schemas.microsoft.com/office/word/2010/wordprocessingDrawing" xmlns:wp="http://schemas.openxmlformats.org/drawingml/2006/wordprocessingDrawing" xmlns:w10="urn:schemas-microsoft-com:office:word" xmlns:w="http://schemas.openxmlformats.org/wordprocessingml/2006/main" xmlns:w14="http://schemas.microsoft.com/office/word/2010/wordml" xmlns:w15="http://schemas.microsoft.com/office/word/2012/wordml" xmlns:w16se="http://schemas.microsoft.com/office/word/2015/wordml/symex" xmlns:wpg="http://schemas.microsoft.com/office/word/2010/wordprocessingGroup" xmlns:wpi="http://schemas.microsoft.com/office/word/2010/wordprocessingInk" xmlns:wne="http://schemas.microsoft.com/office/word/2006/wordml" xmlns:wps="http://schemas.microsoft.com/office/word/2010/wordprocessingShape" mc:Ignorable="w14 w15 w16se wp14">
+<w:endnotes xmlns:wpc="http://schemas.microsoft.com/office/word/2010/wordprocessingCanvas" xmlns:cx="http://schemas.microsoft.com/office/drawing/2014/chartex" xmlns:cx1="http://schemas.microsoft.com/office/drawing/2015/9/8/chartex" xmlns:cx2="http://schemas.microsoft.com/office/drawing/2015/10/21/chartex" xmlns:cx3="http://schemas.microsoft.com/office/drawing/2016/5/9/chartex" xmlns:cx4="http://schemas.microsoft.com/office/drawing/2016/5/10/chartex" xmlns:cx5="http://schemas.microsoft.com/office/drawing/2016/5/11/chartex" xmlns:cx6="http://schemas.microsoft.com/office/drawing/2016/5/12/chartex" xmlns:cx7="http://schemas.microsoft.com/office/drawing/2016/5/13/chartex" xmlns:cx8="http://schemas.microsoft.com/office/drawing/2016/5/14/chartex" xmlns:mc="http://schemas.openxmlformats.org/markup-compatibility/2006" xmlns:aink="http://schemas.microsoft.com/office/drawing/2016/ink" xmlns:am3d="http://schemas.microsoft.com/office/drawing/2017/model3d" xmlns:o="urn:schemas-microsoft-com:office:office" xmlns:r="http://schemas.openxmlformats.org/officeDocument/2006/relationships" xmlns:m="http://schemas.openxmlformats.org/officeDocument/2006/math" xmlns:v="urn:schemas-microsoft-com:vml" xmlns:wp14="http://schemas.microsoft.com/office/word/2010/wordprocessingDrawing" xmlns:wp="http://schemas.openxmlformats.org/drawingml/2006/wordprocessingDrawing" xmlns:w10="urn:schemas-microsoft-com:office:word" xmlns:w="http://schemas.openxmlformats.org/wordprocessingml/2006/main" xmlns:w14="http://schemas.microsoft.com/office/word/2010/wordml" xmlns:w15="http://schemas.microsoft.com/office/word/2012/wordml" xmlns:w16cid="http://schemas.microsoft.com/office/word/2016/wordml/cid" xmlns:w16se="http://schemas.microsoft.com/office/word/2015/wordml/symex" xmlns:wpg="http://schemas.microsoft.com/office/word/2010/wordprocessingGroup" xmlns:wpi="http://schemas.microsoft.com/office/word/2010/wordprocessingInk" xmlns:wne="http://schemas.microsoft.com/office/word/2006/wordml" xmlns:wps="http://schemas.microsoft.com/office/word/2010/wordprocessingShape" mc:Ignorable="w14 w15 w16se w16cid wp14">
   <w:endnote w:type="separator" w:id="-1">
     <w:p>
       <w:r>
@@ -2120,7 +2426,7 @@
 </file>
 
 <file path=word/footer1.xml><?xml version="1.0" encoding="utf-8"?>
-<w:ftr xmlns:wpc="http://schemas.microsoft.com/office/word/2010/wordprocessingCanvas" xmlns:cx="http://schemas.microsoft.com/office/drawing/2014/chartex" xmlns:cx1="http://schemas.microsoft.com/office/drawing/2015/9/8/chartex" xmlns:mc="http://schemas.openxmlformats.org/markup-compatibility/2006" xmlns:o="urn:schemas-microsoft-com:office:office" xmlns:r="http://schemas.openxmlformats.org/officeDocument/2006/relationships" xmlns:m="http://schemas.openxmlformats.org/officeDocument/2006/math" xmlns:v="urn:schemas-microsoft-com:vml" xmlns:wp14="http://schemas.microsoft.com/office/word/2010/wordprocessingDrawing" xmlns:wp="http://schemas.openxmlformats.org/drawingml/2006/wordprocessingDrawing" xmlns:w10="urn:schemas-microsoft-com:office:word" xmlns:w="http://schemas.openxmlformats.org/wordprocessingml/2006/main" xmlns:w14="http://schemas.microsoft.com/office/word/2010/wordml" xmlns:w15="http://schemas.microsoft.com/office/word/2012/wordml" xmlns:w16se="http://schemas.microsoft.com/office/word/2015/wordml/symex" xmlns:wpg="http://schemas.microsoft.com/office/word/2010/wordprocessingGroup" xmlns:wpi="http://schemas.microsoft.com/office/word/2010/wordprocessingInk" xmlns:wne="http://schemas.microsoft.com/office/word/2006/wordml" xmlns:wps="http://schemas.microsoft.com/office/word/2010/wordprocessingShape" mc:Ignorable="w14 w15 w16se wp14">
+<w:ftr xmlns:wpc="http://schemas.microsoft.com/office/word/2010/wordprocessingCanvas" xmlns:cx="http://schemas.microsoft.com/office/drawing/2014/chartex" xmlns:cx1="http://schemas.microsoft.com/office/drawing/2015/9/8/chartex" xmlns:cx2="http://schemas.microsoft.com/office/drawing/2015/10/21/chartex" xmlns:cx3="http://schemas.microsoft.com/office/drawing/2016/5/9/chartex" xmlns:cx4="http://schemas.microsoft.com/office/drawing/2016/5/10/chartex" xmlns:cx5="http://schemas.microsoft.com/office/drawing/2016/5/11/chartex" xmlns:cx6="http://schemas.microsoft.com/office/drawing/2016/5/12/chartex" xmlns:cx7="http://schemas.microsoft.com/office/drawing/2016/5/13/chartex" xmlns:cx8="http://schemas.microsoft.com/office/drawing/2016/5/14/chartex" xmlns:mc="http://schemas.openxmlformats.org/markup-compatibility/2006" xmlns:aink="http://schemas.microsoft.com/office/drawing/2016/ink" xmlns:am3d="http://schemas.microsoft.com/office/drawing/2017/model3d" xmlns:o="urn:schemas-microsoft-com:office:office" xmlns:r="http://schemas.openxmlformats.org/officeDocument/2006/relationships" xmlns:m="http://schemas.openxmlformats.org/officeDocument/2006/math" xmlns:v="urn:schemas-microsoft-com:vml" xmlns:wp14="http://schemas.microsoft.com/office/word/2010/wordprocessingDrawing" xmlns:wp="http://schemas.openxmlformats.org/drawingml/2006/wordprocessingDrawing" xmlns:w10="urn:schemas-microsoft-com:office:word" xmlns:w="http://schemas.openxmlformats.org/wordprocessingml/2006/main" xmlns:w14="http://schemas.microsoft.com/office/word/2010/wordml" xmlns:w15="http://schemas.microsoft.com/office/word/2012/wordml" xmlns:w16cid="http://schemas.microsoft.com/office/word/2016/wordml/cid" xmlns:w16se="http://schemas.microsoft.com/office/word/2015/wordml/symex" xmlns:wpg="http://schemas.microsoft.com/office/word/2010/wordprocessingGroup" xmlns:wpi="http://schemas.microsoft.com/office/word/2010/wordprocessingInk" xmlns:wne="http://schemas.microsoft.com/office/word/2006/wordml" xmlns:wps="http://schemas.microsoft.com/office/word/2010/wordprocessingShape" mc:Ignorable="w14 w15 w16se w16cid wp14">
   <w:p>
     <w:pPr>
       <w:pBdr>
@@ -2166,7 +2472,7 @@
 </file>
 
 <file path=word/footnotes.xml><?xml version="1.0" encoding="utf-8"?>
-<w:footnotes xmlns:wpc="http://schemas.microsoft.com/office/word/2010/wordprocessingCanvas" xmlns:cx="http://schemas.microsoft.com/office/drawing/2014/chartex" xmlns:cx1="http://schemas.microsoft.com/office/drawing/2015/9/8/chartex" xmlns:mc="http://schemas.openxmlformats.org/markup-compatibility/2006" xmlns:o="urn:schemas-microsoft-com:office:office" xmlns:r="http://schemas.openxmlformats.org/officeDocument/2006/relationships" xmlns:m="http://schemas.openxmlformats.org/officeDocument/2006/math" xmlns:v="urn:schemas-microsoft-com:vml" xmlns:wp14="http://schemas.microsoft.com/office/word/2010/wordprocessingDrawing" xmlns:wp="http://schemas.openxmlformats.org/drawingml/2006/wordprocessingDrawing" xmlns:w10="urn:schemas-microsoft-com:office:word" xmlns:w="http://schemas.openxmlformats.org/wordprocessingml/2006/main" xmlns:w14="http://schemas.microsoft.com/office/word/2010/wordml" xmlns:w15="http://schemas.microsoft.com/office/word/2012/wordml" xmlns:w16se="http://schemas.microsoft.com/office/word/2015/wordml/symex" xmlns:wpg="http://schemas.microsoft.com/office/word/2010/wordprocessingGroup" xmlns:wpi="http://schemas.microsoft.com/office/word/2010/wordprocessingInk" xmlns:wne="http://schemas.microsoft.com/office/word/2006/wordml" xmlns:wps="http://schemas.microsoft.com/office/word/2010/wordprocessingShape" mc:Ignorable="w14 w15 w16se wp14">
+<w:footnotes xmlns:wpc="http://schemas.microsoft.com/office/word/2010/wordprocessingCanvas" xmlns:cx="http://schemas.microsoft.com/office/drawing/2014/chartex" xmlns:cx1="http://schemas.microsoft.com/office/drawing/2015/9/8/chartex" xmlns:cx2="http://schemas.microsoft.com/office/drawing/2015/10/21/chartex" xmlns:cx3="http://schemas.microsoft.com/office/drawing/2016/5/9/chartex" xmlns:cx4="http://schemas.microsoft.com/office/drawing/2016/5/10/chartex" xmlns:cx5="http://schemas.microsoft.com/office/drawing/2016/5/11/chartex" xmlns:cx6="http://schemas.microsoft.com/office/drawing/2016/5/12/chartex" xmlns:cx7="http://schemas.microsoft.com/office/drawing/2016/5/13/chartex" xmlns:cx8="http://schemas.microsoft.com/office/drawing/2016/5/14/chartex" xmlns:mc="http://schemas.openxmlformats.org/markup-compatibility/2006" xmlns:aink="http://schemas.microsoft.com/office/drawing/2016/ink" xmlns:am3d="http://schemas.microsoft.com/office/drawing/2017/model3d" xmlns:o="urn:schemas-microsoft-com:office:office" xmlns:r="http://schemas.openxmlformats.org/officeDocument/2006/relationships" xmlns:m="http://schemas.openxmlformats.org/officeDocument/2006/math" xmlns:v="urn:schemas-microsoft-com:vml" xmlns:wp14="http://schemas.microsoft.com/office/word/2010/wordprocessingDrawing" xmlns:wp="http://schemas.openxmlformats.org/drawingml/2006/wordprocessingDrawing" xmlns:w10="urn:schemas-microsoft-com:office:word" xmlns:w="http://schemas.openxmlformats.org/wordprocessingml/2006/main" xmlns:w14="http://schemas.microsoft.com/office/word/2010/wordml" xmlns:w15="http://schemas.microsoft.com/office/word/2012/wordml" xmlns:w16cid="http://schemas.microsoft.com/office/word/2016/wordml/cid" xmlns:w16se="http://schemas.microsoft.com/office/word/2015/wordml/symex" xmlns:wpg="http://schemas.microsoft.com/office/word/2010/wordprocessingGroup" xmlns:wpi="http://schemas.microsoft.com/office/word/2010/wordprocessingInk" xmlns:wne="http://schemas.microsoft.com/office/word/2006/wordml" xmlns:wps="http://schemas.microsoft.com/office/word/2010/wordprocessingShape" mc:Ignorable="w14 w15 w16se w16cid wp14">
   <w:footnote w:type="separator" w:id="-1">
     <w:p>
       <w:r>
@@ -2185,7 +2491,7 @@
 </file>
 
 <file path=word/styles.xml><?xml version="1.0" encoding="utf-8"?>
-<w:styles xmlns:mc="http://schemas.openxmlformats.org/markup-compatibility/2006" xmlns:r="http://schemas.openxmlformats.org/officeDocument/2006/relationships" xmlns:w="http://schemas.openxmlformats.org/wordprocessingml/2006/main" xmlns:w14="http://schemas.microsoft.com/office/word/2010/wordml" xmlns:w15="http://schemas.microsoft.com/office/word/2012/wordml" xmlns:w16se="http://schemas.microsoft.com/office/word/2015/wordml/symex" mc:Ignorable="w14 w15 w16se">
+<w:styles xmlns:mc="http://schemas.openxmlformats.org/markup-compatibility/2006" xmlns:r="http://schemas.openxmlformats.org/officeDocument/2006/relationships" xmlns:w="http://schemas.openxmlformats.org/wordprocessingml/2006/main" xmlns:w14="http://schemas.microsoft.com/office/word/2010/wordml" xmlns:w15="http://schemas.microsoft.com/office/word/2012/wordml" xmlns:w16cid="http://schemas.microsoft.com/office/word/2016/wordml/cid" xmlns:w16se="http://schemas.microsoft.com/office/word/2015/wordml/symex" mc:Ignorable="w14 w15 w16se w16cid">
   <w:docDefaults>
     <w:rPrDefault>
       <w:rPr>
@@ -2195,7 +2501,7 @@
     </w:rPrDefault>
     <w:pPrDefault/>
   </w:docDefaults>
-  <w:latentStyles w:defLockedState="0" w:defUIPriority="99" w:defSemiHidden="0" w:defUnhideWhenUsed="0" w:defQFormat="0" w:count="371">
+  <w:latentStyles w:defLockedState="0" w:defUIPriority="99" w:defSemiHidden="0" w:defUnhideWhenUsed="0" w:defQFormat="0" w:count="375">
     <w:lsdException w:name="Normal" w:uiPriority="0" w:qFormat="1"/>
     <w:lsdException w:name="heading 1" w:uiPriority="9" w:qFormat="1"/>
     <w:lsdException w:name="heading 2" w:semiHidden="1" w:uiPriority="9" w:unhideWhenUsed="1" w:qFormat="1"/>
@@ -2301,7 +2607,6 @@
     <w:lsdException w:name="HTML Sample" w:semiHidden="1" w:unhideWhenUsed="1"/>
     <w:lsdException w:name="HTML Typewriter" w:semiHidden="1" w:unhideWhenUsed="1"/>
     <w:lsdException w:name="HTML Variable" w:semiHidden="1" w:unhideWhenUsed="1"/>
-    <w:lsdException w:name="Normal Table" w:semiHidden="1" w:unhideWhenUsed="1"/>
     <w:lsdException w:name="annotation subject" w:semiHidden="1" w:unhideWhenUsed="1"/>
     <w:lsdException w:name="No List" w:semiHidden="1" w:unhideWhenUsed="1"/>
     <w:lsdException w:name="Outline List 1" w:semiHidden="1" w:unhideWhenUsed="1"/>
@@ -2345,10 +2650,8 @@
     <w:lsdException w:name="Table Elegant" w:semiHidden="1" w:unhideWhenUsed="1"/>
     <w:lsdException w:name="Table Professional" w:semiHidden="1" w:unhideWhenUsed="1"/>
     <w:lsdException w:name="Table Subtle 1" w:semiHidden="1" w:unhideWhenUsed="1"/>
-    <w:lsdException w:name="Table Subtle 2" w:semiHidden="1" w:unhideWhenUsed="1"/>
     <w:lsdException w:name="Table Web 1" w:semiHidden="1" w:unhideWhenUsed="1"/>
     <w:lsdException w:name="Table Web 2" w:semiHidden="1" w:unhideWhenUsed="1"/>
-    <w:lsdException w:name="Table Web 3" w:semiHidden="1" w:unhideWhenUsed="1"/>
     <w:lsdException w:name="Balloon Text" w:semiHidden="1" w:unhideWhenUsed="1"/>
     <w:lsdException w:name="Table Grid" w:uiPriority="39"/>
     <w:lsdException w:name="Table Theme" w:semiHidden="1" w:unhideWhenUsed="1"/>
@@ -2567,14 +2870,18 @@
     <w:lsdException w:name="List Table 5 Dark Accent 6" w:uiPriority="50"/>
     <w:lsdException w:name="List Table 6 Colorful Accent 6" w:uiPriority="51"/>
     <w:lsdException w:name="List Table 7 Colorful Accent 6" w:uiPriority="52"/>
+    <w:lsdException w:name="Mention" w:semiHidden="1" w:unhideWhenUsed="1"/>
+    <w:lsdException w:name="Smart Hyperlink" w:semiHidden="1" w:unhideWhenUsed="1"/>
+    <w:lsdException w:name="Hashtag" w:semiHidden="1" w:unhideWhenUsed="1"/>
+    <w:lsdException w:name="Unresolved Mention" w:semiHidden="1" w:unhideWhenUsed="1"/>
   </w:latentStyles>
-  <w:style w:type="paragraph" w:default="1" w:styleId="a">
+  <w:style w:type="paragraph" w:default="1" w:styleId="Normal">
     <w:name w:val="Normal"/>
   </w:style>
-  <w:style w:type="paragraph" w:styleId="1">
+  <w:style w:type="paragraph" w:styleId="Heading1">
     <w:name w:val="heading 1"/>
-    <w:basedOn w:val="a"/>
-    <w:next w:val="a"/>
+    <w:basedOn w:val="Normal"/>
+    <w:next w:val="Normal"/>
     <w:pPr>
       <w:keepNext/>
       <w:keepLines/>
@@ -2587,10 +2894,10 @@
       <w:szCs w:val="48"/>
     </w:rPr>
   </w:style>
-  <w:style w:type="paragraph" w:styleId="2">
+  <w:style w:type="paragraph" w:styleId="Heading2">
     <w:name w:val="heading 2"/>
-    <w:basedOn w:val="a"/>
-    <w:next w:val="a"/>
+    <w:basedOn w:val="Normal"/>
+    <w:next w:val="Normal"/>
     <w:pPr>
       <w:keepNext/>
       <w:keepLines/>
@@ -2603,10 +2910,10 @@
       <w:szCs w:val="36"/>
     </w:rPr>
   </w:style>
-  <w:style w:type="paragraph" w:styleId="3">
+  <w:style w:type="paragraph" w:styleId="Heading3">
     <w:name w:val="heading 3"/>
-    <w:basedOn w:val="a"/>
-    <w:next w:val="a"/>
+    <w:basedOn w:val="Normal"/>
+    <w:next w:val="Normal"/>
     <w:pPr>
       <w:keepNext/>
       <w:keepLines/>
@@ -2619,10 +2926,10 @@
       <w:szCs w:val="28"/>
     </w:rPr>
   </w:style>
-  <w:style w:type="paragraph" w:styleId="4">
+  <w:style w:type="paragraph" w:styleId="Heading4">
     <w:name w:val="heading 4"/>
-    <w:basedOn w:val="a"/>
-    <w:next w:val="a"/>
+    <w:basedOn w:val="Normal"/>
+    <w:next w:val="Normal"/>
     <w:pPr>
       <w:keepNext/>
       <w:keepLines/>
@@ -2635,10 +2942,10 @@
       <w:szCs w:val="24"/>
     </w:rPr>
   </w:style>
-  <w:style w:type="paragraph" w:styleId="5">
+  <w:style w:type="paragraph" w:styleId="Heading5">
     <w:name w:val="heading 5"/>
-    <w:basedOn w:val="a"/>
-    <w:next w:val="a"/>
+    <w:basedOn w:val="Normal"/>
+    <w:next w:val="Normal"/>
     <w:pPr>
       <w:keepNext/>
       <w:keepLines/>
@@ -2651,10 +2958,10 @@
       <w:szCs w:val="22"/>
     </w:rPr>
   </w:style>
-  <w:style w:type="paragraph" w:styleId="6">
+  <w:style w:type="paragraph" w:styleId="Heading6">
     <w:name w:val="heading 6"/>
-    <w:basedOn w:val="a"/>
-    <w:next w:val="a"/>
+    <w:basedOn w:val="Normal"/>
+    <w:next w:val="Normal"/>
     <w:pPr>
       <w:keepNext/>
       <w:keepLines/>
@@ -2665,13 +2972,13 @@
       <w:b/>
     </w:rPr>
   </w:style>
-  <w:style w:type="character" w:default="1" w:styleId="a0">
+  <w:style w:type="character" w:default="1" w:styleId="DefaultParagraphFont">
     <w:name w:val="Default Paragraph Font"/>
     <w:uiPriority w:val="1"/>
     <w:semiHidden/>
     <w:unhideWhenUsed/>
   </w:style>
-  <w:style w:type="table" w:default="1" w:styleId="a1">
+  <w:style w:type="table" w:default="1" w:styleId="TableNormal">
     <w:name w:val="Normal Table"/>
     <w:uiPriority w:val="99"/>
     <w:semiHidden/>
@@ -2686,7 +2993,7 @@
       </w:tblCellMar>
     </w:tblPr>
   </w:style>
-  <w:style w:type="numbering" w:default="1" w:styleId="a2">
+  <w:style w:type="numbering" w:default="1" w:styleId="NoList">
     <w:name w:val="No List"/>
     <w:uiPriority w:val="99"/>
     <w:semiHidden/>
@@ -2703,10 +3010,10 @@
       </w:tblCellMar>
     </w:tblPr>
   </w:style>
-  <w:style w:type="paragraph" w:styleId="a3">
+  <w:style w:type="paragraph" w:styleId="Title">
     <w:name w:val="Title"/>
-    <w:basedOn w:val="a"/>
-    <w:next w:val="a"/>
+    <w:basedOn w:val="Normal"/>
+    <w:next w:val="Normal"/>
     <w:pPr>
       <w:keepNext/>
       <w:keepLines/>
@@ -2729,10 +3036,10 @@
       </w:tblCellMar>
     </w:tblPr>
   </w:style>
-  <w:style w:type="paragraph" w:styleId="a4">
+  <w:style w:type="paragraph" w:styleId="Subtitle">
     <w:name w:val="Subtitle"/>
-    <w:basedOn w:val="a"/>
-    <w:next w:val="a"/>
+    <w:basedOn w:val="Normal"/>
+    <w:next w:val="Normal"/>
     <w:pPr>
       <w:keepNext/>
       <w:keepLines/>
@@ -2745,6 +3052,72 @@
       <w:sz w:val="48"/>
       <w:szCs w:val="48"/>
     </w:rPr>
+  </w:style>
+  <w:style w:type="table" w:customStyle="1" w:styleId="a">
+    <w:basedOn w:val="TableNormal2"/>
+    <w:tblPr>
+      <w:tblStyleRowBandSize w:val="1"/>
+      <w:tblStyleColBandSize w:val="1"/>
+      <w:tblCellMar>
+        <w:left w:w="108" w:type="dxa"/>
+        <w:right w:w="108" w:type="dxa"/>
+      </w:tblCellMar>
+    </w:tblPr>
+  </w:style>
+  <w:style w:type="table" w:customStyle="1" w:styleId="a0">
+    <w:basedOn w:val="TableNormal2"/>
+    <w:tblPr>
+      <w:tblStyleRowBandSize w:val="1"/>
+      <w:tblStyleColBandSize w:val="1"/>
+      <w:tblCellMar>
+        <w:left w:w="108" w:type="dxa"/>
+        <w:right w:w="108" w:type="dxa"/>
+      </w:tblCellMar>
+    </w:tblPr>
+  </w:style>
+  <w:style w:type="table" w:customStyle="1" w:styleId="a1">
+    <w:basedOn w:val="TableNormal2"/>
+    <w:tblPr>
+      <w:tblStyleRowBandSize w:val="1"/>
+      <w:tblStyleColBandSize w:val="1"/>
+      <w:tblCellMar>
+        <w:left w:w="108" w:type="dxa"/>
+        <w:right w:w="108" w:type="dxa"/>
+      </w:tblCellMar>
+    </w:tblPr>
+  </w:style>
+  <w:style w:type="table" w:customStyle="1" w:styleId="a2">
+    <w:basedOn w:val="TableNormal2"/>
+    <w:tblPr>
+      <w:tblStyleRowBandSize w:val="1"/>
+      <w:tblStyleColBandSize w:val="1"/>
+      <w:tblCellMar>
+        <w:left w:w="108" w:type="dxa"/>
+        <w:right w:w="108" w:type="dxa"/>
+      </w:tblCellMar>
+    </w:tblPr>
+  </w:style>
+  <w:style w:type="table" w:customStyle="1" w:styleId="a3">
+    <w:basedOn w:val="TableNormal2"/>
+    <w:tblPr>
+      <w:tblStyleRowBandSize w:val="1"/>
+      <w:tblStyleColBandSize w:val="1"/>
+      <w:tblCellMar>
+        <w:left w:w="108" w:type="dxa"/>
+        <w:right w:w="108" w:type="dxa"/>
+      </w:tblCellMar>
+    </w:tblPr>
+  </w:style>
+  <w:style w:type="table" w:customStyle="1" w:styleId="a4">
+    <w:basedOn w:val="TableNormal2"/>
+    <w:tblPr>
+      <w:tblStyleRowBandSize w:val="1"/>
+      <w:tblStyleColBandSize w:val="1"/>
+      <w:tblCellMar>
+        <w:left w:w="108" w:type="dxa"/>
+        <w:right w:w="108" w:type="dxa"/>
+      </w:tblCellMar>
+    </w:tblPr>
   </w:style>
   <w:style w:type="table" w:customStyle="1" w:styleId="a5">
     <w:basedOn w:val="TableNormal2"/>
@@ -2768,75 +3141,9 @@
       </w:tblCellMar>
     </w:tblPr>
   </w:style>
-  <w:style w:type="table" w:customStyle="1" w:styleId="a7">
-    <w:basedOn w:val="TableNormal2"/>
-    <w:tblPr>
-      <w:tblStyleRowBandSize w:val="1"/>
-      <w:tblStyleColBandSize w:val="1"/>
-      <w:tblCellMar>
-        <w:left w:w="108" w:type="dxa"/>
-        <w:right w:w="108" w:type="dxa"/>
-      </w:tblCellMar>
-    </w:tblPr>
-  </w:style>
-  <w:style w:type="table" w:customStyle="1" w:styleId="a8">
-    <w:basedOn w:val="TableNormal2"/>
-    <w:tblPr>
-      <w:tblStyleRowBandSize w:val="1"/>
-      <w:tblStyleColBandSize w:val="1"/>
-      <w:tblCellMar>
-        <w:left w:w="108" w:type="dxa"/>
-        <w:right w:w="108" w:type="dxa"/>
-      </w:tblCellMar>
-    </w:tblPr>
-  </w:style>
-  <w:style w:type="table" w:customStyle="1" w:styleId="a9">
-    <w:basedOn w:val="TableNormal2"/>
-    <w:tblPr>
-      <w:tblStyleRowBandSize w:val="1"/>
-      <w:tblStyleColBandSize w:val="1"/>
-      <w:tblCellMar>
-        <w:left w:w="108" w:type="dxa"/>
-        <w:right w:w="108" w:type="dxa"/>
-      </w:tblCellMar>
-    </w:tblPr>
-  </w:style>
-  <w:style w:type="table" w:customStyle="1" w:styleId="aa">
-    <w:basedOn w:val="TableNormal2"/>
-    <w:tblPr>
-      <w:tblStyleRowBandSize w:val="1"/>
-      <w:tblStyleColBandSize w:val="1"/>
-      <w:tblCellMar>
-        <w:left w:w="108" w:type="dxa"/>
-        <w:right w:w="108" w:type="dxa"/>
-      </w:tblCellMar>
-    </w:tblPr>
-  </w:style>
-  <w:style w:type="table" w:customStyle="1" w:styleId="ab">
-    <w:basedOn w:val="TableNormal2"/>
-    <w:tblPr>
-      <w:tblStyleRowBandSize w:val="1"/>
-      <w:tblStyleColBandSize w:val="1"/>
-      <w:tblCellMar>
-        <w:left w:w="108" w:type="dxa"/>
-        <w:right w:w="108" w:type="dxa"/>
-      </w:tblCellMar>
-    </w:tblPr>
-  </w:style>
-  <w:style w:type="table" w:customStyle="1" w:styleId="ac">
-    <w:basedOn w:val="TableNormal2"/>
-    <w:tblPr>
-      <w:tblStyleRowBandSize w:val="1"/>
-      <w:tblStyleColBandSize w:val="1"/>
-      <w:tblCellMar>
-        <w:left w:w="108" w:type="dxa"/>
-        <w:right w:w="108" w:type="dxa"/>
-      </w:tblCellMar>
-    </w:tblPr>
-  </w:style>
-  <w:style w:type="character" w:styleId="ad">
+  <w:style w:type="character" w:styleId="Hyperlink">
     <w:name w:val="Hyperlink"/>
-    <w:basedOn w:val="a0"/>
+    <w:basedOn w:val="DefaultParagraphFont"/>
     <w:uiPriority w:val="99"/>
     <w:unhideWhenUsed/>
     <w:rsid w:val="00AF24F0"/>
@@ -2845,9 +3152,9 @@
       <w:u w:val="single"/>
     </w:rPr>
   </w:style>
-  <w:style w:type="character" w:customStyle="1" w:styleId="UnresolvedMention">
-    <w:name w:val="Unresolved Mention"/>
-    <w:basedOn w:val="a0"/>
+  <w:style w:type="character" w:customStyle="1" w:styleId="UnresolvedMention1">
+    <w:name w:val="Unresolved Mention1"/>
+    <w:basedOn w:val="DefaultParagraphFont"/>
     <w:uiPriority w:val="99"/>
     <w:semiHidden/>
     <w:unhideWhenUsed/>
@@ -2857,9 +3164,9 @@
       <w:shd w:val="clear" w:color="auto" w:fill="E1DFDD"/>
     </w:rPr>
   </w:style>
-  <w:style w:type="character" w:styleId="ae">
+  <w:style w:type="character" w:styleId="FollowedHyperlink">
     <w:name w:val="FollowedHyperlink"/>
-    <w:basedOn w:val="a0"/>
+    <w:basedOn w:val="DefaultParagraphFont"/>
     <w:uiPriority w:val="99"/>
     <w:semiHidden/>
     <w:unhideWhenUsed/>
@@ -2867,6 +3174,18 @@
     <w:rPr>
       <w:color w:val="800080" w:themeColor="followedHyperlink"/>
       <w:u w:val="single"/>
+    </w:rPr>
+  </w:style>
+  <w:style w:type="character" w:styleId="UnresolvedMention">
+    <w:name w:val="Unresolved Mention"/>
+    <w:basedOn w:val="DefaultParagraphFont"/>
+    <w:uiPriority w:val="99"/>
+    <w:semiHidden/>
+    <w:unhideWhenUsed/>
+    <w:rsid w:val="00D374EE"/>
+    <w:rPr>
+      <w:color w:val="605E5C"/>
+      <w:shd w:val="clear" w:color="auto" w:fill="E1DFDD"/>
     </w:rPr>
   </w:style>
 </w:styles>

</xml_diff>

<commit_message>
Add serde optimization task in open source
</commit_message>
<xml_diff>
--- a/file/CV_Geser_Dugarov.docx
+++ b/file/CV_Geser_Dugarov.docx
@@ -1,6 +1,6 @@
 
 <file path=word/document.xml><?xml version="1.0" encoding="utf-8"?>
-<w:document xmlns:wpc="http://schemas.microsoft.com/office/word/2010/wordprocessingCanvas" xmlns:cx="http://schemas.microsoft.com/office/drawing/2014/chartex" xmlns:cx1="http://schemas.microsoft.com/office/drawing/2015/9/8/chartex" xmlns:mc="http://schemas.openxmlformats.org/markup-compatibility/2006" xmlns:o="urn:schemas-microsoft-com:office:office" xmlns:r="http://schemas.openxmlformats.org/officeDocument/2006/relationships" xmlns:m="http://schemas.openxmlformats.org/officeDocument/2006/math" xmlns:v="urn:schemas-microsoft-com:vml" xmlns:wp14="http://schemas.microsoft.com/office/word/2010/wordprocessingDrawing" xmlns:wp="http://schemas.openxmlformats.org/drawingml/2006/wordprocessingDrawing" xmlns:w10="urn:schemas-microsoft-com:office:word" xmlns:w="http://schemas.openxmlformats.org/wordprocessingml/2006/main" xmlns:w14="http://schemas.microsoft.com/office/word/2010/wordml" xmlns:w15="http://schemas.microsoft.com/office/word/2012/wordml" xmlns:w16se="http://schemas.microsoft.com/office/word/2015/wordml/symex" xmlns:wpg="http://schemas.microsoft.com/office/word/2010/wordprocessingGroup" xmlns:wpi="http://schemas.microsoft.com/office/word/2010/wordprocessingInk" xmlns:wne="http://schemas.microsoft.com/office/word/2006/wordml" xmlns:wps="http://schemas.microsoft.com/office/word/2010/wordprocessingShape" mc:Ignorable="w14 w15 w16se wp14">
+<w:document xmlns:wpc="http://schemas.microsoft.com/office/word/2010/wordprocessingCanvas" xmlns:cx="http://schemas.microsoft.com/office/drawing/2014/chartex" xmlns:cx1="http://schemas.microsoft.com/office/drawing/2015/9/8/chartex" xmlns:cx2="http://schemas.microsoft.com/office/drawing/2015/10/21/chartex" xmlns:cx3="http://schemas.microsoft.com/office/drawing/2016/5/9/chartex" xmlns:cx4="http://schemas.microsoft.com/office/drawing/2016/5/10/chartex" xmlns:cx5="http://schemas.microsoft.com/office/drawing/2016/5/11/chartex" xmlns:cx6="http://schemas.microsoft.com/office/drawing/2016/5/12/chartex" xmlns:cx7="http://schemas.microsoft.com/office/drawing/2016/5/13/chartex" xmlns:cx8="http://schemas.microsoft.com/office/drawing/2016/5/14/chartex" xmlns:mc="http://schemas.openxmlformats.org/markup-compatibility/2006" xmlns:aink="http://schemas.microsoft.com/office/drawing/2016/ink" xmlns:am3d="http://schemas.microsoft.com/office/drawing/2017/model3d" xmlns:o="urn:schemas-microsoft-com:office:office" xmlns:r="http://schemas.openxmlformats.org/officeDocument/2006/relationships" xmlns:m="http://schemas.openxmlformats.org/officeDocument/2006/math" xmlns:v="urn:schemas-microsoft-com:vml" xmlns:wp14="http://schemas.microsoft.com/office/word/2010/wordprocessingDrawing" xmlns:wp="http://schemas.openxmlformats.org/drawingml/2006/wordprocessingDrawing" xmlns:w10="urn:schemas-microsoft-com:office:word" xmlns:w="http://schemas.openxmlformats.org/wordprocessingml/2006/main" xmlns:w14="http://schemas.microsoft.com/office/word/2010/wordml" xmlns:w15="http://schemas.microsoft.com/office/word/2012/wordml" xmlns:w16cid="http://schemas.microsoft.com/office/word/2016/wordml/cid" xmlns:w16se="http://schemas.microsoft.com/office/word/2015/wordml/symex" xmlns:wpg="http://schemas.microsoft.com/office/word/2010/wordprocessingGroup" xmlns:wpi="http://schemas.microsoft.com/office/word/2010/wordprocessingInk" xmlns:wne="http://schemas.microsoft.com/office/word/2006/wordml" xmlns:wps="http://schemas.microsoft.com/office/word/2010/wordprocessingShape" mc:Ignorable="w14 w15 w16se w16cid wp14">
   <w:body>
     <w:p>
       <w:pPr>
@@ -23,7 +23,7 @@
     </w:p>
     <w:tbl>
       <w:tblPr>
-        <w:tblStyle w:val="a9"/>
+        <w:tblStyle w:val="a3"/>
         <w:tblW w:w="8614" w:type="dxa"/>
         <w:jc w:val="center"/>
         <w:tblInd w:w="0" w:type="dxa"/>
@@ -402,21 +402,7 @@
           <w:sz w:val="24"/>
           <w:szCs w:val="24"/>
         </w:rPr>
-        <w:t>contributing to o</w:t>
-      </w:r>
-      <w:r>
-        <w:rPr>
-          <w:sz w:val="24"/>
-          <w:szCs w:val="24"/>
-        </w:rPr>
-        <w:t>p</w:t>
-      </w:r>
-      <w:r>
-        <w:rPr>
-          <w:sz w:val="24"/>
-          <w:szCs w:val="24"/>
-        </w:rPr>
-        <w:t>en source</w:t>
+        <w:t>contributing to open source</w:t>
       </w:r>
       <w:r>
         <w:rPr>
@@ -437,7 +423,7 @@
       <w:hyperlink r:id="rId10" w:history="1">
         <w:r>
           <w:rPr>
-            <w:rStyle w:val="ad"/>
+            <w:rStyle w:val="Hyperlink"/>
             <w:sz w:val="24"/>
             <w:szCs w:val="24"/>
           </w:rPr>
@@ -611,7 +597,17 @@
           <w:sz w:val="24"/>
           <w:szCs w:val="24"/>
         </w:rPr>
-        <w:t>Personal mission: "Living a balanced life. Helping professionals to work smarter, not harder by creating automatic systems for their routine."</w:t>
+        <w:t>Personal mission: "Living a bal</w:t>
+      </w:r>
+      <w:bookmarkStart w:id="1" w:name="_GoBack"/>
+      <w:bookmarkEnd w:id="1"/>
+      <w:r>
+        <w:rPr>
+          <w:color w:val="000000"/>
+          <w:sz w:val="24"/>
+          <w:szCs w:val="24"/>
+        </w:rPr>
+        <w:t>anced life. Helping professionals to work smarter, not harder by creating automatic systems for their routine."</w:t>
       </w:r>
     </w:p>
     <w:p>
@@ -738,7 +734,7 @@
     </w:p>
     <w:tbl>
       <w:tblPr>
-        <w:tblStyle w:val="aa"/>
+        <w:tblStyle w:val="a4"/>
         <w:tblW w:w="9854" w:type="dxa"/>
         <w:tblInd w:w="-108" w:type="dxa"/>
         <w:tblLayout w:type="fixed"/>
@@ -933,7 +929,7 @@
             <w:hyperlink r:id="rId11" w:history="1">
               <w:r>
                 <w:rPr>
-                  <w:rStyle w:val="ad"/>
+                  <w:rStyle w:val="Hyperlink"/>
                   <w:b/>
                   <w:sz w:val="24"/>
                   <w:szCs w:val="24"/>
@@ -1093,7 +1089,7 @@
     </w:p>
     <w:tbl>
       <w:tblPr>
-        <w:tblStyle w:val="aa"/>
+        <w:tblStyle w:val="a4"/>
         <w:tblW w:w="9854" w:type="dxa"/>
         <w:tblInd w:w="-108" w:type="dxa"/>
         <w:tblLayout w:type="fixed"/>
@@ -1231,23 +1227,7 @@
                 <w:sz w:val="24"/>
                 <w:szCs w:val="24"/>
               </w:rPr>
-              <w:t xml:space="preserve">Apache </w:t>
-            </w:r>
-            <w:r>
-              <w:rPr>
-                <w:b/>
-                <w:sz w:val="24"/>
-                <w:szCs w:val="24"/>
-              </w:rPr>
-              <w:t>H</w:t>
-            </w:r>
-            <w:r>
-              <w:rPr>
-                <w:b/>
-                <w:sz w:val="24"/>
-                <w:szCs w:val="24"/>
-              </w:rPr>
-              <w:t>udi</w:t>
+              <w:t>Apache Hudi</w:t>
             </w:r>
             <w:r>
               <w:rPr>
@@ -1314,7 +1294,7 @@
       <w:hyperlink r:id="rId12" w:history="1">
         <w:r>
           <w:rPr>
-            <w:rStyle w:val="ad"/>
+            <w:rStyle w:val="Hyperlink"/>
             <w:sz w:val="24"/>
             <w:szCs w:val="24"/>
           </w:rPr>
@@ -1418,6 +1398,179 @@
           <w:szCs w:val="24"/>
         </w:rPr>
         <w:t>.</w:t>
+      </w:r>
+    </w:p>
+    <w:p>
+      <w:pPr>
+        <w:pBdr>
+          <w:top w:val="nil"/>
+          <w:left w:val="nil"/>
+          <w:bottom w:val="nil"/>
+          <w:right w:val="nil"/>
+          <w:between w:val="nil"/>
+        </w:pBdr>
+        <w:spacing w:before="120" w:after="60" w:line="264" w:lineRule="auto"/>
+        <w:jc w:val="both"/>
+        <w:rPr>
+          <w:sz w:val="24"/>
+          <w:szCs w:val="24"/>
+        </w:rPr>
+      </w:pPr>
+      <w:r>
+        <w:rPr>
+          <w:sz w:val="24"/>
+          <w:szCs w:val="24"/>
+        </w:rPr>
+        <w:t xml:space="preserve">• Optimized serialization/deserialization of data stream records </w:t>
+      </w:r>
+      <w:r>
+        <w:rPr>
+          <w:sz w:val="24"/>
+          <w:szCs w:val="24"/>
+        </w:rPr>
+        <w:t>in</w:t>
+      </w:r>
+      <w:r>
+        <w:rPr>
+          <w:sz w:val="24"/>
+          <w:szCs w:val="24"/>
+        </w:rPr>
+        <w:t xml:space="preserve"> Flink </w:t>
+      </w:r>
+      <w:r>
+        <w:rPr>
+          <w:sz w:val="24"/>
+          <w:szCs w:val="24"/>
+        </w:rPr>
+        <w:t>stream writing</w:t>
+      </w:r>
+      <w:r>
+        <w:rPr>
+          <w:sz w:val="24"/>
+          <w:szCs w:val="24"/>
+        </w:rPr>
+        <w:t xml:space="preserve">, which </w:t>
+      </w:r>
+      <w:r>
+        <w:rPr>
+          <w:sz w:val="24"/>
+          <w:szCs w:val="24"/>
+        </w:rPr>
+        <w:t>accelerated</w:t>
+      </w:r>
+      <w:r>
+        <w:rPr>
+          <w:sz w:val="24"/>
+          <w:szCs w:val="24"/>
+        </w:rPr>
+        <w:t xml:space="preserve"> processing speed by 30%, and </w:t>
+      </w:r>
+      <w:r>
+        <w:rPr>
+          <w:sz w:val="24"/>
+          <w:szCs w:val="24"/>
+        </w:rPr>
+        <w:t xml:space="preserve">reduced amount of </w:t>
+      </w:r>
+      <w:r>
+        <w:rPr>
+          <w:sz w:val="24"/>
+          <w:szCs w:val="24"/>
+        </w:rPr>
+        <w:t>allocated memory</w:t>
+      </w:r>
+      <w:r>
+        <w:rPr>
+          <w:sz w:val="24"/>
+          <w:szCs w:val="24"/>
+        </w:rPr>
+        <w:t xml:space="preserve"> </w:t>
+      </w:r>
+      <w:r>
+        <w:rPr>
+          <w:sz w:val="24"/>
+          <w:szCs w:val="24"/>
+        </w:rPr>
+        <w:t>twice</w:t>
+      </w:r>
+      <w:r>
+        <w:rPr>
+          <w:sz w:val="24"/>
+          <w:szCs w:val="24"/>
+        </w:rPr>
+        <w:t xml:space="preserve"> (</w:t>
+      </w:r>
+      <w:hyperlink r:id="rId13" w:history="1">
+        <w:r>
+          <w:rPr>
+            <w:rStyle w:val="Hyperlink"/>
+            <w:sz w:val="24"/>
+            <w:szCs w:val="24"/>
+          </w:rPr>
+          <w:t>design doc</w:t>
+        </w:r>
+      </w:hyperlink>
+      <w:r>
+        <w:rPr>
+          <w:sz w:val="24"/>
+          <w:szCs w:val="24"/>
+        </w:rPr>
+        <w:t xml:space="preserve">, </w:t>
+      </w:r>
+      <w:hyperlink r:id="rId14" w:history="1">
+        <w:r>
+          <w:rPr>
+            <w:rStyle w:val="Hyperlink"/>
+            <w:sz w:val="24"/>
+            <w:szCs w:val="24"/>
+          </w:rPr>
+          <w:t>main changes</w:t>
+        </w:r>
+      </w:hyperlink>
+      <w:r>
+        <w:rPr>
+          <w:sz w:val="24"/>
+          <w:szCs w:val="24"/>
+        </w:rPr>
+        <w:t xml:space="preserve">, </w:t>
+      </w:r>
+      <w:hyperlink r:id="rId15" w:history="1">
+        <w:r>
+          <w:rPr>
+            <w:rStyle w:val="Hyperlink"/>
+            <w:sz w:val="24"/>
+            <w:szCs w:val="24"/>
+          </w:rPr>
+          <w:t>umbrella ticket</w:t>
+        </w:r>
+      </w:hyperlink>
+      <w:r>
+        <w:rPr>
+          <w:sz w:val="24"/>
+          <w:szCs w:val="24"/>
+        </w:rPr>
+        <w:t>).</w:t>
+      </w:r>
+      <w:r>
+        <w:rPr>
+          <w:sz w:val="24"/>
+          <w:szCs w:val="24"/>
+        </w:rPr>
+        <w:t xml:space="preserve"> </w:t>
+      </w:r>
+      <w:r>
+        <w:rPr>
+          <w:sz w:val="24"/>
+          <w:szCs w:val="24"/>
+        </w:rPr>
+        <w:t>Released in Apache Hudi 1.</w:t>
+      </w:r>
+      <w:r>
+        <w:rPr>
+          <w:sz w:val="24"/>
+          <w:szCs w:val="24"/>
+        </w:rPr>
+        <w:t>1.</w:t>
       </w:r>
     </w:p>
     <w:p>
@@ -1445,58 +1598,23 @@
         </w:rPr>
         <w:t>• </w:t>
       </w:r>
-      <w:hyperlink r:id="rId13" w:history="1">
+      <w:r>
+        <w:rPr>
+          <w:sz w:val="24"/>
+          <w:szCs w:val="24"/>
+        </w:rPr>
+        <w:t xml:space="preserve">40+ </w:t>
+      </w:r>
+      <w:hyperlink r:id="rId16" w:history="1">
         <w:r>
           <w:rPr>
-            <w:rStyle w:val="ad"/>
+            <w:rStyle w:val="Hyperlink"/>
             <w:sz w:val="24"/>
             <w:szCs w:val="24"/>
           </w:rPr>
-          <w:t>30+ merged PRs</w:t>
+          <w:t>merged PRs</w:t>
         </w:r>
       </w:hyperlink>
-      <w:r>
-        <w:rPr>
-          <w:color w:val="000000"/>
-          <w:sz w:val="24"/>
-          <w:szCs w:val="24"/>
-        </w:rPr>
-        <w:t xml:space="preserve"> </w:t>
-      </w:r>
-      <w:r>
-        <w:rPr>
-          <w:color w:val="000000"/>
-          <w:sz w:val="24"/>
-          <w:szCs w:val="24"/>
-        </w:rPr>
-        <w:t xml:space="preserve">with a focus on </w:t>
-      </w:r>
-      <w:r>
-        <w:rPr>
-          <w:color w:val="000000"/>
-          <w:sz w:val="24"/>
-          <w:szCs w:val="24"/>
-        </w:rPr>
-        <w:t xml:space="preserve">stream processing </w:t>
-      </w:r>
-      <w:r>
-        <w:rPr>
-          <w:color w:val="000000"/>
-          <w:sz w:val="24"/>
-          <w:szCs w:val="24"/>
-        </w:rPr>
-        <w:t>p</w:t>
-      </w:r>
-      <w:bookmarkStart w:id="1" w:name="_GoBack"/>
-      <w:bookmarkEnd w:id="1"/>
-      <w:r>
-        <w:rPr>
-          <w:color w:val="000000"/>
-          <w:sz w:val="24"/>
-          <w:szCs w:val="24"/>
-        </w:rPr>
-        <w:t>erformance and usability of solution</w:t>
-      </w:r>
       <w:r>
         <w:rPr>
           <w:color w:val="000000"/>
@@ -1508,7 +1626,7 @@
     </w:p>
     <w:tbl>
       <w:tblPr>
-        <w:tblStyle w:val="aa"/>
+        <w:tblStyle w:val="a4"/>
         <w:tblW w:w="9854" w:type="dxa"/>
         <w:tblInd w:w="-108" w:type="dxa"/>
         <w:tblLayout w:type="fixed"/>
@@ -1857,7 +1975,7 @@
     </w:p>
     <w:tbl>
       <w:tblPr>
-        <w:tblStyle w:val="ac"/>
+        <w:tblStyle w:val="a6"/>
         <w:tblW w:w="8753" w:type="dxa"/>
         <w:tblInd w:w="-108" w:type="dxa"/>
         <w:tblLayout w:type="fixed"/>
@@ -1980,7 +2098,7 @@
           <w:szCs w:val="24"/>
         </w:rPr>
       </w:pPr>
-      <w:hyperlink r:id="rId14">
+      <w:hyperlink r:id="rId17">
         <w:r>
           <w:rPr>
             <w:color w:val="0000FF"/>
@@ -1991,7 +2109,7 @@
       </w:hyperlink>
     </w:p>
     <w:sectPr>
-      <w:footerReference w:type="default" r:id="rId15"/>
+      <w:footerReference w:type="default" r:id="rId18"/>
       <w:pgSz w:w="11906" w:h="16838"/>
       <w:pgMar w:top="851" w:right="1134" w:bottom="851" w:left="1134" w:header="113" w:footer="113" w:gutter="0"/>
       <w:pgNumType w:start="1"/>
@@ -2002,7 +2120,7 @@
 </file>
 
 <file path=word/endnotes.xml><?xml version="1.0" encoding="utf-8"?>
-<w:endnotes xmlns:wpc="http://schemas.microsoft.com/office/word/2010/wordprocessingCanvas" xmlns:cx="http://schemas.microsoft.com/office/drawing/2014/chartex" xmlns:cx1="http://schemas.microsoft.com/office/drawing/2015/9/8/chartex" xmlns:mc="http://schemas.openxmlformats.org/markup-compatibility/2006" xmlns:o="urn:schemas-microsoft-com:office:office" xmlns:r="http://schemas.openxmlformats.org/officeDocument/2006/relationships" xmlns:m="http://schemas.openxmlformats.org/officeDocument/2006/math" xmlns:v="urn:schemas-microsoft-com:vml" xmlns:wp14="http://schemas.microsoft.com/office/word/2010/wordprocessingDrawing" xmlns:wp="http://schemas.openxmlformats.org/drawingml/2006/wordprocessingDrawing" xmlns:w10="urn:schemas-microsoft-com:office:word" xmlns:w="http://schemas.openxmlformats.org/wordprocessingml/2006/main" xmlns:w14="http://schemas.microsoft.com/office/word/2010/wordml" xmlns:w15="http://schemas.microsoft.com/office/word/2012/wordml" xmlns:w16se="http://schemas.microsoft.com/office/word/2015/wordml/symex" xmlns:wpg="http://schemas.microsoft.com/office/word/2010/wordprocessingGroup" xmlns:wpi="http://schemas.microsoft.com/office/word/2010/wordprocessingInk" xmlns:wne="http://schemas.microsoft.com/office/word/2006/wordml" xmlns:wps="http://schemas.microsoft.com/office/word/2010/wordprocessingShape" mc:Ignorable="w14 w15 w16se wp14">
+<w:endnotes xmlns:wpc="http://schemas.microsoft.com/office/word/2010/wordprocessingCanvas" xmlns:cx="http://schemas.microsoft.com/office/drawing/2014/chartex" xmlns:cx1="http://schemas.microsoft.com/office/drawing/2015/9/8/chartex" xmlns:cx2="http://schemas.microsoft.com/office/drawing/2015/10/21/chartex" xmlns:cx3="http://schemas.microsoft.com/office/drawing/2016/5/9/chartex" xmlns:cx4="http://schemas.microsoft.com/office/drawing/2016/5/10/chartex" xmlns:cx5="http://schemas.microsoft.com/office/drawing/2016/5/11/chartex" xmlns:cx6="http://schemas.microsoft.com/office/drawing/2016/5/12/chartex" xmlns:cx7="http://schemas.microsoft.com/office/drawing/2016/5/13/chartex" xmlns:cx8="http://schemas.microsoft.com/office/drawing/2016/5/14/chartex" xmlns:mc="http://schemas.openxmlformats.org/markup-compatibility/2006" xmlns:aink="http://schemas.microsoft.com/office/drawing/2016/ink" xmlns:am3d="http://schemas.microsoft.com/office/drawing/2017/model3d" xmlns:o="urn:schemas-microsoft-com:office:office" xmlns:r="http://schemas.openxmlformats.org/officeDocument/2006/relationships" xmlns:m="http://schemas.openxmlformats.org/officeDocument/2006/math" xmlns:v="urn:schemas-microsoft-com:vml" xmlns:wp14="http://schemas.microsoft.com/office/word/2010/wordprocessingDrawing" xmlns:wp="http://schemas.openxmlformats.org/drawingml/2006/wordprocessingDrawing" xmlns:w10="urn:schemas-microsoft-com:office:word" xmlns:w="http://schemas.openxmlformats.org/wordprocessingml/2006/main" xmlns:w14="http://schemas.microsoft.com/office/word/2010/wordml" xmlns:w15="http://schemas.microsoft.com/office/word/2012/wordml" xmlns:w16cid="http://schemas.microsoft.com/office/word/2016/wordml/cid" xmlns:w16se="http://schemas.microsoft.com/office/word/2015/wordml/symex" xmlns:wpg="http://schemas.microsoft.com/office/word/2010/wordprocessingGroup" xmlns:wpi="http://schemas.microsoft.com/office/word/2010/wordprocessingInk" xmlns:wne="http://schemas.microsoft.com/office/word/2006/wordml" xmlns:wps="http://schemas.microsoft.com/office/word/2010/wordprocessingShape" mc:Ignorable="w14 w15 w16se w16cid wp14">
   <w:endnote w:type="separator" w:id="-1">
     <w:p>
       <w:r>
@@ -2021,7 +2139,7 @@
 </file>
 
 <file path=word/footer1.xml><?xml version="1.0" encoding="utf-8"?>
-<w:ftr xmlns:wpc="http://schemas.microsoft.com/office/word/2010/wordprocessingCanvas" xmlns:cx="http://schemas.microsoft.com/office/drawing/2014/chartex" xmlns:cx1="http://schemas.microsoft.com/office/drawing/2015/9/8/chartex" xmlns:mc="http://schemas.openxmlformats.org/markup-compatibility/2006" xmlns:o="urn:schemas-microsoft-com:office:office" xmlns:r="http://schemas.openxmlformats.org/officeDocument/2006/relationships" xmlns:m="http://schemas.openxmlformats.org/officeDocument/2006/math" xmlns:v="urn:schemas-microsoft-com:vml" xmlns:wp14="http://schemas.microsoft.com/office/word/2010/wordprocessingDrawing" xmlns:wp="http://schemas.openxmlformats.org/drawingml/2006/wordprocessingDrawing" xmlns:w10="urn:schemas-microsoft-com:office:word" xmlns:w="http://schemas.openxmlformats.org/wordprocessingml/2006/main" xmlns:w14="http://schemas.microsoft.com/office/word/2010/wordml" xmlns:w15="http://schemas.microsoft.com/office/word/2012/wordml" xmlns:w16se="http://schemas.microsoft.com/office/word/2015/wordml/symex" xmlns:wpg="http://schemas.microsoft.com/office/word/2010/wordprocessingGroup" xmlns:wpi="http://schemas.microsoft.com/office/word/2010/wordprocessingInk" xmlns:wne="http://schemas.microsoft.com/office/word/2006/wordml" xmlns:wps="http://schemas.microsoft.com/office/word/2010/wordprocessingShape" mc:Ignorable="w14 w15 w16se wp14">
+<w:ftr xmlns:wpc="http://schemas.microsoft.com/office/word/2010/wordprocessingCanvas" xmlns:cx="http://schemas.microsoft.com/office/drawing/2014/chartex" xmlns:cx1="http://schemas.microsoft.com/office/drawing/2015/9/8/chartex" xmlns:cx2="http://schemas.microsoft.com/office/drawing/2015/10/21/chartex" xmlns:cx3="http://schemas.microsoft.com/office/drawing/2016/5/9/chartex" xmlns:cx4="http://schemas.microsoft.com/office/drawing/2016/5/10/chartex" xmlns:cx5="http://schemas.microsoft.com/office/drawing/2016/5/11/chartex" xmlns:cx6="http://schemas.microsoft.com/office/drawing/2016/5/12/chartex" xmlns:cx7="http://schemas.microsoft.com/office/drawing/2016/5/13/chartex" xmlns:cx8="http://schemas.microsoft.com/office/drawing/2016/5/14/chartex" xmlns:mc="http://schemas.openxmlformats.org/markup-compatibility/2006" xmlns:aink="http://schemas.microsoft.com/office/drawing/2016/ink" xmlns:am3d="http://schemas.microsoft.com/office/drawing/2017/model3d" xmlns:o="urn:schemas-microsoft-com:office:office" xmlns:r="http://schemas.openxmlformats.org/officeDocument/2006/relationships" xmlns:m="http://schemas.openxmlformats.org/officeDocument/2006/math" xmlns:v="urn:schemas-microsoft-com:vml" xmlns:wp14="http://schemas.microsoft.com/office/word/2010/wordprocessingDrawing" xmlns:wp="http://schemas.openxmlformats.org/drawingml/2006/wordprocessingDrawing" xmlns:w10="urn:schemas-microsoft-com:office:word" xmlns:w="http://schemas.openxmlformats.org/wordprocessingml/2006/main" xmlns:w14="http://schemas.microsoft.com/office/word/2010/wordml" xmlns:w15="http://schemas.microsoft.com/office/word/2012/wordml" xmlns:w16cid="http://schemas.microsoft.com/office/word/2016/wordml/cid" xmlns:w16se="http://schemas.microsoft.com/office/word/2015/wordml/symex" xmlns:wpg="http://schemas.microsoft.com/office/word/2010/wordprocessingGroup" xmlns:wpi="http://schemas.microsoft.com/office/word/2010/wordprocessingInk" xmlns:wne="http://schemas.microsoft.com/office/word/2006/wordml" xmlns:wps="http://schemas.microsoft.com/office/word/2010/wordprocessingShape" mc:Ignorable="w14 w15 w16se w16cid wp14">
   <w:p>
     <w:pPr>
       <w:pBdr>
@@ -2067,7 +2185,7 @@
 </file>
 
 <file path=word/footnotes.xml><?xml version="1.0" encoding="utf-8"?>
-<w:footnotes xmlns:wpc="http://schemas.microsoft.com/office/word/2010/wordprocessingCanvas" xmlns:cx="http://schemas.microsoft.com/office/drawing/2014/chartex" xmlns:cx1="http://schemas.microsoft.com/office/drawing/2015/9/8/chartex" xmlns:mc="http://schemas.openxmlformats.org/markup-compatibility/2006" xmlns:o="urn:schemas-microsoft-com:office:office" xmlns:r="http://schemas.openxmlformats.org/officeDocument/2006/relationships" xmlns:m="http://schemas.openxmlformats.org/officeDocument/2006/math" xmlns:v="urn:schemas-microsoft-com:vml" xmlns:wp14="http://schemas.microsoft.com/office/word/2010/wordprocessingDrawing" xmlns:wp="http://schemas.openxmlformats.org/drawingml/2006/wordprocessingDrawing" xmlns:w10="urn:schemas-microsoft-com:office:word" xmlns:w="http://schemas.openxmlformats.org/wordprocessingml/2006/main" xmlns:w14="http://schemas.microsoft.com/office/word/2010/wordml" xmlns:w15="http://schemas.microsoft.com/office/word/2012/wordml" xmlns:w16se="http://schemas.microsoft.com/office/word/2015/wordml/symex" xmlns:wpg="http://schemas.microsoft.com/office/word/2010/wordprocessingGroup" xmlns:wpi="http://schemas.microsoft.com/office/word/2010/wordprocessingInk" xmlns:wne="http://schemas.microsoft.com/office/word/2006/wordml" xmlns:wps="http://schemas.microsoft.com/office/word/2010/wordprocessingShape" mc:Ignorable="w14 w15 w16se wp14">
+<w:footnotes xmlns:wpc="http://schemas.microsoft.com/office/word/2010/wordprocessingCanvas" xmlns:cx="http://schemas.microsoft.com/office/drawing/2014/chartex" xmlns:cx1="http://schemas.microsoft.com/office/drawing/2015/9/8/chartex" xmlns:cx2="http://schemas.microsoft.com/office/drawing/2015/10/21/chartex" xmlns:cx3="http://schemas.microsoft.com/office/drawing/2016/5/9/chartex" xmlns:cx4="http://schemas.microsoft.com/office/drawing/2016/5/10/chartex" xmlns:cx5="http://schemas.microsoft.com/office/drawing/2016/5/11/chartex" xmlns:cx6="http://schemas.microsoft.com/office/drawing/2016/5/12/chartex" xmlns:cx7="http://schemas.microsoft.com/office/drawing/2016/5/13/chartex" xmlns:cx8="http://schemas.microsoft.com/office/drawing/2016/5/14/chartex" xmlns:mc="http://schemas.openxmlformats.org/markup-compatibility/2006" xmlns:aink="http://schemas.microsoft.com/office/drawing/2016/ink" xmlns:am3d="http://schemas.microsoft.com/office/drawing/2017/model3d" xmlns:o="urn:schemas-microsoft-com:office:office" xmlns:r="http://schemas.openxmlformats.org/officeDocument/2006/relationships" xmlns:m="http://schemas.openxmlformats.org/officeDocument/2006/math" xmlns:v="urn:schemas-microsoft-com:vml" xmlns:wp14="http://schemas.microsoft.com/office/word/2010/wordprocessingDrawing" xmlns:wp="http://schemas.openxmlformats.org/drawingml/2006/wordprocessingDrawing" xmlns:w10="urn:schemas-microsoft-com:office:word" xmlns:w="http://schemas.openxmlformats.org/wordprocessingml/2006/main" xmlns:w14="http://schemas.microsoft.com/office/word/2010/wordml" xmlns:w15="http://schemas.microsoft.com/office/word/2012/wordml" xmlns:w16cid="http://schemas.microsoft.com/office/word/2016/wordml/cid" xmlns:w16se="http://schemas.microsoft.com/office/word/2015/wordml/symex" xmlns:wpg="http://schemas.microsoft.com/office/word/2010/wordprocessingGroup" xmlns:wpi="http://schemas.microsoft.com/office/word/2010/wordprocessingInk" xmlns:wne="http://schemas.microsoft.com/office/word/2006/wordml" xmlns:wps="http://schemas.microsoft.com/office/word/2010/wordprocessingShape" mc:Ignorable="w14 w15 w16se w16cid wp14">
   <w:footnote w:type="separator" w:id="-1">
     <w:p>
       <w:r>
@@ -2086,7 +2204,7 @@
 </file>
 
 <file path=word/styles.xml><?xml version="1.0" encoding="utf-8"?>
-<w:styles xmlns:mc="http://schemas.openxmlformats.org/markup-compatibility/2006" xmlns:r="http://schemas.openxmlformats.org/officeDocument/2006/relationships" xmlns:w="http://schemas.openxmlformats.org/wordprocessingml/2006/main" xmlns:w14="http://schemas.microsoft.com/office/word/2010/wordml" xmlns:w15="http://schemas.microsoft.com/office/word/2012/wordml" xmlns:w16se="http://schemas.microsoft.com/office/word/2015/wordml/symex" mc:Ignorable="w14 w15 w16se">
+<w:styles xmlns:mc="http://schemas.openxmlformats.org/markup-compatibility/2006" xmlns:r="http://schemas.openxmlformats.org/officeDocument/2006/relationships" xmlns:w="http://schemas.openxmlformats.org/wordprocessingml/2006/main" xmlns:w14="http://schemas.microsoft.com/office/word/2010/wordml" xmlns:w15="http://schemas.microsoft.com/office/word/2012/wordml" xmlns:w16cid="http://schemas.microsoft.com/office/word/2016/wordml/cid" xmlns:w16se="http://schemas.microsoft.com/office/word/2015/wordml/symex" mc:Ignorable="w14 w15 w16se w16cid">
   <w:docDefaults>
     <w:rPrDefault>
       <w:rPr>
@@ -2096,7 +2214,7 @@
     </w:rPrDefault>
     <w:pPrDefault/>
   </w:docDefaults>
-  <w:latentStyles w:defLockedState="0" w:defUIPriority="99" w:defSemiHidden="0" w:defUnhideWhenUsed="0" w:defQFormat="0" w:count="371">
+  <w:latentStyles w:defLockedState="0" w:defUIPriority="99" w:defSemiHidden="0" w:defUnhideWhenUsed="0" w:defQFormat="0" w:count="375">
     <w:lsdException w:name="Normal" w:uiPriority="0" w:qFormat="1"/>
     <w:lsdException w:name="heading 1" w:uiPriority="9" w:qFormat="1"/>
     <w:lsdException w:name="heading 2" w:semiHidden="1" w:uiPriority="9" w:unhideWhenUsed="1" w:qFormat="1"/>
@@ -2202,7 +2320,6 @@
     <w:lsdException w:name="HTML Sample" w:semiHidden="1" w:unhideWhenUsed="1"/>
     <w:lsdException w:name="HTML Typewriter" w:semiHidden="1" w:unhideWhenUsed="1"/>
     <w:lsdException w:name="HTML Variable" w:semiHidden="1" w:unhideWhenUsed="1"/>
-    <w:lsdException w:name="Normal Table" w:semiHidden="1" w:unhideWhenUsed="1"/>
     <w:lsdException w:name="annotation subject" w:semiHidden="1" w:unhideWhenUsed="1"/>
     <w:lsdException w:name="No List" w:semiHidden="1" w:unhideWhenUsed="1"/>
     <w:lsdException w:name="Outline List 1" w:semiHidden="1" w:unhideWhenUsed="1"/>
@@ -2246,10 +2363,8 @@
     <w:lsdException w:name="Table Elegant" w:semiHidden="1" w:unhideWhenUsed="1"/>
     <w:lsdException w:name="Table Professional" w:semiHidden="1" w:unhideWhenUsed="1"/>
     <w:lsdException w:name="Table Subtle 1" w:semiHidden="1" w:unhideWhenUsed="1"/>
-    <w:lsdException w:name="Table Subtle 2" w:semiHidden="1" w:unhideWhenUsed="1"/>
     <w:lsdException w:name="Table Web 1" w:semiHidden="1" w:unhideWhenUsed="1"/>
     <w:lsdException w:name="Table Web 2" w:semiHidden="1" w:unhideWhenUsed="1"/>
-    <w:lsdException w:name="Table Web 3" w:semiHidden="1" w:unhideWhenUsed="1"/>
     <w:lsdException w:name="Balloon Text" w:semiHidden="1" w:unhideWhenUsed="1"/>
     <w:lsdException w:name="Table Grid" w:uiPriority="39"/>
     <w:lsdException w:name="Table Theme" w:semiHidden="1" w:unhideWhenUsed="1"/>
@@ -2468,14 +2583,18 @@
     <w:lsdException w:name="List Table 5 Dark Accent 6" w:uiPriority="50"/>
     <w:lsdException w:name="List Table 6 Colorful Accent 6" w:uiPriority="51"/>
     <w:lsdException w:name="List Table 7 Colorful Accent 6" w:uiPriority="52"/>
+    <w:lsdException w:name="Mention" w:semiHidden="1" w:unhideWhenUsed="1"/>
+    <w:lsdException w:name="Smart Hyperlink" w:semiHidden="1" w:unhideWhenUsed="1"/>
+    <w:lsdException w:name="Hashtag" w:semiHidden="1" w:unhideWhenUsed="1"/>
+    <w:lsdException w:name="Unresolved Mention" w:semiHidden="1" w:unhideWhenUsed="1"/>
   </w:latentStyles>
-  <w:style w:type="paragraph" w:default="1" w:styleId="a">
+  <w:style w:type="paragraph" w:default="1" w:styleId="Normal">
     <w:name w:val="Normal"/>
   </w:style>
-  <w:style w:type="paragraph" w:styleId="1">
+  <w:style w:type="paragraph" w:styleId="Heading1">
     <w:name w:val="heading 1"/>
-    <w:basedOn w:val="a"/>
-    <w:next w:val="a"/>
+    <w:basedOn w:val="Normal"/>
+    <w:next w:val="Normal"/>
     <w:pPr>
       <w:keepNext/>
       <w:keepLines/>
@@ -2488,10 +2607,10 @@
       <w:szCs w:val="48"/>
     </w:rPr>
   </w:style>
-  <w:style w:type="paragraph" w:styleId="2">
+  <w:style w:type="paragraph" w:styleId="Heading2">
     <w:name w:val="heading 2"/>
-    <w:basedOn w:val="a"/>
-    <w:next w:val="a"/>
+    <w:basedOn w:val="Normal"/>
+    <w:next w:val="Normal"/>
     <w:pPr>
       <w:keepNext/>
       <w:keepLines/>
@@ -2504,10 +2623,10 @@
       <w:szCs w:val="36"/>
     </w:rPr>
   </w:style>
-  <w:style w:type="paragraph" w:styleId="3">
+  <w:style w:type="paragraph" w:styleId="Heading3">
     <w:name w:val="heading 3"/>
-    <w:basedOn w:val="a"/>
-    <w:next w:val="a"/>
+    <w:basedOn w:val="Normal"/>
+    <w:next w:val="Normal"/>
     <w:pPr>
       <w:keepNext/>
       <w:keepLines/>
@@ -2520,10 +2639,10 @@
       <w:szCs w:val="28"/>
     </w:rPr>
   </w:style>
-  <w:style w:type="paragraph" w:styleId="4">
+  <w:style w:type="paragraph" w:styleId="Heading4">
     <w:name w:val="heading 4"/>
-    <w:basedOn w:val="a"/>
-    <w:next w:val="a"/>
+    <w:basedOn w:val="Normal"/>
+    <w:next w:val="Normal"/>
     <w:pPr>
       <w:keepNext/>
       <w:keepLines/>
@@ -2536,10 +2655,10 @@
       <w:szCs w:val="24"/>
     </w:rPr>
   </w:style>
-  <w:style w:type="paragraph" w:styleId="5">
+  <w:style w:type="paragraph" w:styleId="Heading5">
     <w:name w:val="heading 5"/>
-    <w:basedOn w:val="a"/>
-    <w:next w:val="a"/>
+    <w:basedOn w:val="Normal"/>
+    <w:next w:val="Normal"/>
     <w:pPr>
       <w:keepNext/>
       <w:keepLines/>
@@ -2552,10 +2671,10 @@
       <w:szCs w:val="22"/>
     </w:rPr>
   </w:style>
-  <w:style w:type="paragraph" w:styleId="6">
+  <w:style w:type="paragraph" w:styleId="Heading6">
     <w:name w:val="heading 6"/>
-    <w:basedOn w:val="a"/>
-    <w:next w:val="a"/>
+    <w:basedOn w:val="Normal"/>
+    <w:next w:val="Normal"/>
     <w:pPr>
       <w:keepNext/>
       <w:keepLines/>
@@ -2566,13 +2685,13 @@
       <w:b/>
     </w:rPr>
   </w:style>
-  <w:style w:type="character" w:default="1" w:styleId="a0">
+  <w:style w:type="character" w:default="1" w:styleId="DefaultParagraphFont">
     <w:name w:val="Default Paragraph Font"/>
     <w:uiPriority w:val="1"/>
     <w:semiHidden/>
     <w:unhideWhenUsed/>
   </w:style>
-  <w:style w:type="table" w:default="1" w:styleId="a1">
+  <w:style w:type="table" w:default="1" w:styleId="TableNormal">
     <w:name w:val="Normal Table"/>
     <w:uiPriority w:val="99"/>
     <w:semiHidden/>
@@ -2587,7 +2706,7 @@
       </w:tblCellMar>
     </w:tblPr>
   </w:style>
-  <w:style w:type="numbering" w:default="1" w:styleId="a2">
+  <w:style w:type="numbering" w:default="1" w:styleId="NoList">
     <w:name w:val="No List"/>
     <w:uiPriority w:val="99"/>
     <w:semiHidden/>
@@ -2604,10 +2723,10 @@
       </w:tblCellMar>
     </w:tblPr>
   </w:style>
-  <w:style w:type="paragraph" w:styleId="a3">
+  <w:style w:type="paragraph" w:styleId="Title">
     <w:name w:val="Title"/>
-    <w:basedOn w:val="a"/>
-    <w:next w:val="a"/>
+    <w:basedOn w:val="Normal"/>
+    <w:next w:val="Normal"/>
     <w:pPr>
       <w:keepNext/>
       <w:keepLines/>
@@ -2630,10 +2749,10 @@
       </w:tblCellMar>
     </w:tblPr>
   </w:style>
-  <w:style w:type="paragraph" w:styleId="a4">
+  <w:style w:type="paragraph" w:styleId="Subtitle">
     <w:name w:val="Subtitle"/>
-    <w:basedOn w:val="a"/>
-    <w:next w:val="a"/>
+    <w:basedOn w:val="Normal"/>
+    <w:next w:val="Normal"/>
     <w:pPr>
       <w:keepNext/>
       <w:keepLines/>
@@ -2646,6 +2765,72 @@
       <w:sz w:val="48"/>
       <w:szCs w:val="48"/>
     </w:rPr>
+  </w:style>
+  <w:style w:type="table" w:customStyle="1" w:styleId="a">
+    <w:basedOn w:val="TableNormal2"/>
+    <w:tblPr>
+      <w:tblStyleRowBandSize w:val="1"/>
+      <w:tblStyleColBandSize w:val="1"/>
+      <w:tblCellMar>
+        <w:left w:w="108" w:type="dxa"/>
+        <w:right w:w="108" w:type="dxa"/>
+      </w:tblCellMar>
+    </w:tblPr>
+  </w:style>
+  <w:style w:type="table" w:customStyle="1" w:styleId="a0">
+    <w:basedOn w:val="TableNormal2"/>
+    <w:tblPr>
+      <w:tblStyleRowBandSize w:val="1"/>
+      <w:tblStyleColBandSize w:val="1"/>
+      <w:tblCellMar>
+        <w:left w:w="108" w:type="dxa"/>
+        <w:right w:w="108" w:type="dxa"/>
+      </w:tblCellMar>
+    </w:tblPr>
+  </w:style>
+  <w:style w:type="table" w:customStyle="1" w:styleId="a1">
+    <w:basedOn w:val="TableNormal2"/>
+    <w:tblPr>
+      <w:tblStyleRowBandSize w:val="1"/>
+      <w:tblStyleColBandSize w:val="1"/>
+      <w:tblCellMar>
+        <w:left w:w="108" w:type="dxa"/>
+        <w:right w:w="108" w:type="dxa"/>
+      </w:tblCellMar>
+    </w:tblPr>
+  </w:style>
+  <w:style w:type="table" w:customStyle="1" w:styleId="a2">
+    <w:basedOn w:val="TableNormal2"/>
+    <w:tblPr>
+      <w:tblStyleRowBandSize w:val="1"/>
+      <w:tblStyleColBandSize w:val="1"/>
+      <w:tblCellMar>
+        <w:left w:w="108" w:type="dxa"/>
+        <w:right w:w="108" w:type="dxa"/>
+      </w:tblCellMar>
+    </w:tblPr>
+  </w:style>
+  <w:style w:type="table" w:customStyle="1" w:styleId="a3">
+    <w:basedOn w:val="TableNormal2"/>
+    <w:tblPr>
+      <w:tblStyleRowBandSize w:val="1"/>
+      <w:tblStyleColBandSize w:val="1"/>
+      <w:tblCellMar>
+        <w:left w:w="108" w:type="dxa"/>
+        <w:right w:w="108" w:type="dxa"/>
+      </w:tblCellMar>
+    </w:tblPr>
+  </w:style>
+  <w:style w:type="table" w:customStyle="1" w:styleId="a4">
+    <w:basedOn w:val="TableNormal2"/>
+    <w:tblPr>
+      <w:tblStyleRowBandSize w:val="1"/>
+      <w:tblStyleColBandSize w:val="1"/>
+      <w:tblCellMar>
+        <w:left w:w="108" w:type="dxa"/>
+        <w:right w:w="108" w:type="dxa"/>
+      </w:tblCellMar>
+    </w:tblPr>
   </w:style>
   <w:style w:type="table" w:customStyle="1" w:styleId="a5">
     <w:basedOn w:val="TableNormal2"/>
@@ -2669,75 +2854,9 @@
       </w:tblCellMar>
     </w:tblPr>
   </w:style>
-  <w:style w:type="table" w:customStyle="1" w:styleId="a7">
-    <w:basedOn w:val="TableNormal2"/>
-    <w:tblPr>
-      <w:tblStyleRowBandSize w:val="1"/>
-      <w:tblStyleColBandSize w:val="1"/>
-      <w:tblCellMar>
-        <w:left w:w="108" w:type="dxa"/>
-        <w:right w:w="108" w:type="dxa"/>
-      </w:tblCellMar>
-    </w:tblPr>
-  </w:style>
-  <w:style w:type="table" w:customStyle="1" w:styleId="a8">
-    <w:basedOn w:val="TableNormal2"/>
-    <w:tblPr>
-      <w:tblStyleRowBandSize w:val="1"/>
-      <w:tblStyleColBandSize w:val="1"/>
-      <w:tblCellMar>
-        <w:left w:w="108" w:type="dxa"/>
-        <w:right w:w="108" w:type="dxa"/>
-      </w:tblCellMar>
-    </w:tblPr>
-  </w:style>
-  <w:style w:type="table" w:customStyle="1" w:styleId="a9">
-    <w:basedOn w:val="TableNormal2"/>
-    <w:tblPr>
-      <w:tblStyleRowBandSize w:val="1"/>
-      <w:tblStyleColBandSize w:val="1"/>
-      <w:tblCellMar>
-        <w:left w:w="108" w:type="dxa"/>
-        <w:right w:w="108" w:type="dxa"/>
-      </w:tblCellMar>
-    </w:tblPr>
-  </w:style>
-  <w:style w:type="table" w:customStyle="1" w:styleId="aa">
-    <w:basedOn w:val="TableNormal2"/>
-    <w:tblPr>
-      <w:tblStyleRowBandSize w:val="1"/>
-      <w:tblStyleColBandSize w:val="1"/>
-      <w:tblCellMar>
-        <w:left w:w="108" w:type="dxa"/>
-        <w:right w:w="108" w:type="dxa"/>
-      </w:tblCellMar>
-    </w:tblPr>
-  </w:style>
-  <w:style w:type="table" w:customStyle="1" w:styleId="ab">
-    <w:basedOn w:val="TableNormal2"/>
-    <w:tblPr>
-      <w:tblStyleRowBandSize w:val="1"/>
-      <w:tblStyleColBandSize w:val="1"/>
-      <w:tblCellMar>
-        <w:left w:w="108" w:type="dxa"/>
-        <w:right w:w="108" w:type="dxa"/>
-      </w:tblCellMar>
-    </w:tblPr>
-  </w:style>
-  <w:style w:type="table" w:customStyle="1" w:styleId="ac">
-    <w:basedOn w:val="TableNormal2"/>
-    <w:tblPr>
-      <w:tblStyleRowBandSize w:val="1"/>
-      <w:tblStyleColBandSize w:val="1"/>
-      <w:tblCellMar>
-        <w:left w:w="108" w:type="dxa"/>
-        <w:right w:w="108" w:type="dxa"/>
-      </w:tblCellMar>
-    </w:tblPr>
-  </w:style>
-  <w:style w:type="character" w:styleId="ad">
+  <w:style w:type="character" w:styleId="Hyperlink">
     <w:name w:val="Hyperlink"/>
-    <w:basedOn w:val="a0"/>
+    <w:basedOn w:val="DefaultParagraphFont"/>
     <w:uiPriority w:val="99"/>
     <w:unhideWhenUsed/>
     <w:rsid w:val="00AF24F0"/>
@@ -2748,7 +2867,7 @@
   </w:style>
   <w:style w:type="character" w:customStyle="1" w:styleId="UnresolvedMention1">
     <w:name w:val="Unresolved Mention1"/>
-    <w:basedOn w:val="a0"/>
+    <w:basedOn w:val="DefaultParagraphFont"/>
     <w:uiPriority w:val="99"/>
     <w:semiHidden/>
     <w:unhideWhenUsed/>
@@ -2758,9 +2877,9 @@
       <w:shd w:val="clear" w:color="auto" w:fill="E1DFDD"/>
     </w:rPr>
   </w:style>
-  <w:style w:type="character" w:styleId="ae">
+  <w:style w:type="character" w:styleId="FollowedHyperlink">
     <w:name w:val="FollowedHyperlink"/>
-    <w:basedOn w:val="a0"/>
+    <w:basedOn w:val="DefaultParagraphFont"/>
     <w:uiPriority w:val="99"/>
     <w:semiHidden/>
     <w:unhideWhenUsed/>
@@ -2770,13 +2889,25 @@
       <w:u w:val="single"/>
     </w:rPr>
   </w:style>
-  <w:style w:type="character" w:customStyle="1" w:styleId="UnresolvedMention">
-    <w:name w:val="Unresolved Mention"/>
-    <w:basedOn w:val="a0"/>
+  <w:style w:type="character" w:customStyle="1" w:styleId="UnresolvedMention2">
+    <w:name w:val="Unresolved Mention2"/>
+    <w:basedOn w:val="DefaultParagraphFont"/>
     <w:uiPriority w:val="99"/>
     <w:semiHidden/>
     <w:unhideWhenUsed/>
     <w:rsid w:val="00D374EE"/>
+    <w:rPr>
+      <w:color w:val="605E5C"/>
+      <w:shd w:val="clear" w:color="auto" w:fill="E1DFDD"/>
+    </w:rPr>
+  </w:style>
+  <w:style w:type="character" w:styleId="UnresolvedMention">
+    <w:name w:val="Unresolved Mention"/>
+    <w:basedOn w:val="DefaultParagraphFont"/>
+    <w:uiPriority w:val="99"/>
+    <w:semiHidden/>
+    <w:unhideWhenUsed/>
+    <w:rsid w:val="005160CD"/>
     <w:rPr>
       <w:color w:val="605E5C"/>
       <w:shd w:val="clear" w:color="auto" w:fill="E1DFDD"/>

</xml_diff>

<commit_message>
Update OS achievements and add award
</commit_message>
<xml_diff>
--- a/file/CV_Geser_Dugarov.docx
+++ b/file/CV_Geser_Dugarov.docx
@@ -447,23 +447,57 @@
           <w:sz w:val="24"/>
           <w:szCs w:val="24"/>
         </w:rPr>
-        <w:t xml:space="preserve">with a focus on </w:t>
-      </w:r>
-      <w:r>
-        <w:rPr>
-          <w:color w:val="000000"/>
-          <w:sz w:val="24"/>
-          <w:szCs w:val="24"/>
-        </w:rPr>
-        <w:t xml:space="preserve">stream processing </w:t>
-      </w:r>
-      <w:r>
-        <w:rPr>
-          <w:color w:val="000000"/>
-          <w:sz w:val="24"/>
-          <w:szCs w:val="24"/>
-        </w:rPr>
-        <w:t>performance and usability of solution</w:t>
+        <w:t>with a focus on performance and usability of solution</w:t>
+      </w:r>
+      <w:r>
+        <w:rPr>
+          <w:color w:val="000000"/>
+          <w:sz w:val="24"/>
+          <w:szCs w:val="24"/>
+        </w:rPr>
+        <w:t>.</w:t>
+      </w:r>
+      <w:bookmarkStart w:id="0" w:name="_heading=h.gjdgxs" w:colFirst="0" w:colLast="0"/>
+      <w:bookmarkEnd w:id="0"/>
+      <w:r>
+        <w:rPr>
+          <w:color w:val="000000"/>
+          <w:sz w:val="24"/>
+          <w:szCs w:val="24"/>
+        </w:rPr>
+        <w:t xml:space="preserve"> </w:t>
+      </w:r>
+      <w:r>
+        <w:rPr>
+          <w:color w:val="000000"/>
+          <w:sz w:val="24"/>
+          <w:szCs w:val="24"/>
+        </w:rPr>
+        <w:t>Wide experience</w:t>
+      </w:r>
+      <w:r>
+        <w:rPr>
+          <w:color w:val="000000"/>
+          <w:sz w:val="24"/>
+          <w:szCs w:val="24"/>
+        </w:rPr>
+        <w:t xml:space="preserve"> in research and data analysis,</w:t>
+      </w:r>
+      <w:r>
+        <w:rPr>
+          <w:color w:val="000000"/>
+          <w:sz w:val="24"/>
+          <w:szCs w:val="24"/>
+        </w:rPr>
+        <w:t xml:space="preserve"> </w:t>
+      </w:r>
+      <w:r>
+        <w:rPr>
+          <w:color w:val="000000"/>
+          <w:sz w:val="24"/>
+          <w:szCs w:val="24"/>
+        </w:rPr>
+        <w:t>PhD</w:t>
       </w:r>
       <w:r>
         <w:rPr>
@@ -491,66 +525,6 @@
           <w:szCs w:val="24"/>
         </w:rPr>
       </w:pPr>
-      <w:bookmarkStart w:id="0" w:name="_heading=h.gjdgxs" w:colFirst="0" w:colLast="0"/>
-      <w:bookmarkEnd w:id="0"/>
-      <w:r>
-        <w:rPr>
-          <w:color w:val="000000"/>
-          <w:sz w:val="24"/>
-          <w:szCs w:val="24"/>
-        </w:rPr>
-        <w:t>Wide experience</w:t>
-      </w:r>
-      <w:r>
-        <w:rPr>
-          <w:color w:val="000000"/>
-          <w:sz w:val="24"/>
-          <w:szCs w:val="24"/>
-        </w:rPr>
-        <w:t xml:space="preserve"> in research and data analysis,</w:t>
-      </w:r>
-      <w:r>
-        <w:rPr>
-          <w:color w:val="000000"/>
-          <w:sz w:val="24"/>
-          <w:szCs w:val="24"/>
-        </w:rPr>
-        <w:t xml:space="preserve"> </w:t>
-      </w:r>
-      <w:r>
-        <w:rPr>
-          <w:color w:val="000000"/>
-          <w:sz w:val="24"/>
-          <w:szCs w:val="24"/>
-        </w:rPr>
-        <w:t>PhD</w:t>
-      </w:r>
-      <w:r>
-        <w:rPr>
-          <w:color w:val="000000"/>
-          <w:sz w:val="24"/>
-          <w:szCs w:val="24"/>
-        </w:rPr>
-        <w:t>. Made a transition from fundamental research in Oil &amp; Gas to research and development in IT.</w:t>
-      </w:r>
-    </w:p>
-    <w:p>
-      <w:pPr>
-        <w:pBdr>
-          <w:top w:val="nil"/>
-          <w:left w:val="nil"/>
-          <w:bottom w:val="nil"/>
-          <w:right w:val="nil"/>
-          <w:between w:val="nil"/>
-        </w:pBdr>
-        <w:spacing w:line="264" w:lineRule="auto"/>
-        <w:jc w:val="both"/>
-        <w:rPr>
-          <w:color w:val="000000"/>
-          <w:sz w:val="24"/>
-          <w:szCs w:val="24"/>
-        </w:rPr>
-      </w:pPr>
       <w:r>
         <w:rPr>
           <w:color w:val="000000"/>
@@ -597,7 +571,7 @@
           <w:sz w:val="24"/>
           <w:szCs w:val="24"/>
         </w:rPr>
-        <w:t>Personal mission: "Living a bal</w:t>
+        <w:t>Personal mission: "Living a balanc</w:t>
       </w:r>
       <w:bookmarkStart w:id="1" w:name="_GoBack"/>
       <w:bookmarkEnd w:id="1"/>
@@ -607,7 +581,7 @@
           <w:sz w:val="24"/>
           <w:szCs w:val="24"/>
         </w:rPr>
-        <w:t>anced life. Helping professionals to work smarter, not harder by creating automatic systems for their routine."</w:t>
+        <w:t>ed life. Helping professionals to work smarter, not harder by creating automatic systems for their routine."</w:t>
       </w:r>
     </w:p>
     <w:p>
@@ -829,21 +803,19 @@
             </w:r>
             <w:r>
               <w:rPr>
-                <w:rFonts w:ascii="Times New Roman" w:hAnsi="Times New Roman" w:cs="Times New Roman"/>
-                <w:b/>
-                <w:color w:val="000000"/>
-                <w:sz w:val="24"/>
-                <w:szCs w:val="24"/>
-              </w:rPr>
-              <w:t>~</w:t>
-            </w:r>
-            <w:r>
-              <w:rPr>
                 <w:color w:val="000000"/>
                 <w:sz w:val="24"/>
                 <w:szCs w:val="24"/>
               </w:rPr>
               <w:t>2</w:t>
+            </w:r>
+            <w:r>
+              <w:rPr>
+                <w:color w:val="000000"/>
+                <w:sz w:val="24"/>
+                <w:szCs w:val="24"/>
+              </w:rPr>
+              <w:t>+</w:t>
             </w:r>
             <w:r>
               <w:rPr>
@@ -950,6 +922,152 @@
           <w:right w:val="nil"/>
           <w:between w:val="nil"/>
         </w:pBdr>
+        <w:spacing w:before="120" w:after="60" w:line="264" w:lineRule="auto"/>
+        <w:ind w:left="170" w:hanging="170"/>
+        <w:jc w:val="both"/>
+        <w:rPr>
+          <w:color w:val="000000"/>
+          <w:sz w:val="24"/>
+          <w:szCs w:val="24"/>
+        </w:rPr>
+      </w:pPr>
+      <w:r>
+        <w:rPr>
+          <w:sz w:val="24"/>
+          <w:szCs w:val="24"/>
+        </w:rPr>
+        <w:t>• </w:t>
+      </w:r>
+      <w:r>
+        <w:rPr>
+          <w:color w:val="000000"/>
+          <w:sz w:val="24"/>
+          <w:szCs w:val="24"/>
+        </w:rPr>
+        <w:t>Development of</w:t>
+      </w:r>
+      <w:r>
+        <w:rPr>
+          <w:color w:val="000000"/>
+          <w:sz w:val="24"/>
+          <w:szCs w:val="24"/>
+        </w:rPr>
+        <w:t xml:space="preserve"> </w:t>
+      </w:r>
+      <w:r>
+        <w:rPr>
+          <w:color w:val="000000"/>
+          <w:sz w:val="24"/>
+          <w:szCs w:val="24"/>
+        </w:rPr>
+        <w:t xml:space="preserve">core functionality </w:t>
+      </w:r>
+      <w:r>
+        <w:rPr>
+          <w:color w:val="000000"/>
+          <w:sz w:val="24"/>
+          <w:szCs w:val="24"/>
+        </w:rPr>
+        <w:t>of</w:t>
+      </w:r>
+      <w:r>
+        <w:rPr>
+          <w:color w:val="000000"/>
+          <w:sz w:val="24"/>
+          <w:szCs w:val="24"/>
+        </w:rPr>
+        <w:t xml:space="preserve"> a </w:t>
+      </w:r>
+      <w:r>
+        <w:rPr>
+          <w:color w:val="000000"/>
+          <w:sz w:val="24"/>
+          <w:szCs w:val="24"/>
+        </w:rPr>
+        <w:t>D</w:t>
+      </w:r>
+      <w:r>
+        <w:rPr>
+          <w:color w:val="000000"/>
+          <w:sz w:val="24"/>
+          <w:szCs w:val="24"/>
+        </w:rPr>
+        <w:t xml:space="preserve">ata </w:t>
+      </w:r>
+      <w:r>
+        <w:rPr>
+          <w:color w:val="000000"/>
+          <w:sz w:val="24"/>
+          <w:szCs w:val="24"/>
+        </w:rPr>
+        <w:t>L</w:t>
+      </w:r>
+      <w:r>
+        <w:rPr>
+          <w:color w:val="000000"/>
+          <w:sz w:val="24"/>
+          <w:szCs w:val="24"/>
+        </w:rPr>
+        <w:t>akehouse</w:t>
+      </w:r>
+      <w:r>
+        <w:rPr>
+          <w:color w:val="000000"/>
+          <w:sz w:val="24"/>
+          <w:szCs w:val="24"/>
+        </w:rPr>
+        <w:t xml:space="preserve"> platform</w:t>
+      </w:r>
+      <w:r>
+        <w:rPr>
+          <w:color w:val="000000"/>
+          <w:sz w:val="24"/>
+          <w:szCs w:val="24"/>
+        </w:rPr>
+        <w:t xml:space="preserve"> </w:t>
+      </w:r>
+      <w:r>
+        <w:rPr>
+          <w:color w:val="000000"/>
+          <w:sz w:val="24"/>
+          <w:szCs w:val="24"/>
+        </w:rPr>
+        <w:t>for Big Data processing on enterprise-level</w:t>
+      </w:r>
+      <w:r>
+        <w:rPr>
+          <w:color w:val="000000"/>
+          <w:sz w:val="24"/>
+          <w:szCs w:val="24"/>
+        </w:rPr>
+        <w:t xml:space="preserve"> scalable</w:t>
+      </w:r>
+      <w:r>
+        <w:rPr>
+          <w:color w:val="000000"/>
+          <w:sz w:val="24"/>
+          <w:szCs w:val="24"/>
+        </w:rPr>
+        <w:t xml:space="preserve"> clusters</w:t>
+      </w:r>
+      <w:r>
+        <w:rPr>
+          <w:color w:val="000000"/>
+          <w:sz w:val="24"/>
+          <w:szCs w:val="24"/>
+        </w:rPr>
+        <w:t>.</w:t>
+      </w:r>
+    </w:p>
+    <w:p>
+      <w:pPr>
+        <w:pBdr>
+          <w:top w:val="nil"/>
+          <w:left w:val="nil"/>
+          <w:bottom w:val="nil"/>
+          <w:right w:val="nil"/>
+          <w:between w:val="nil"/>
+        </w:pBdr>
         <w:spacing w:before="60" w:after="120" w:line="264" w:lineRule="auto"/>
         <w:ind w:left="170" w:hanging="170"/>
         <w:jc w:val="both"/>
@@ -964,127 +1082,14 @@
           <w:sz w:val="24"/>
           <w:szCs w:val="24"/>
         </w:rPr>
-        <w:t>• </w:t>
-      </w:r>
-      <w:r>
-        <w:rPr>
-          <w:color w:val="000000"/>
-          <w:sz w:val="24"/>
-          <w:szCs w:val="24"/>
-        </w:rPr>
-        <w:t>Development of</w:t>
-      </w:r>
-      <w:r>
-        <w:rPr>
-          <w:color w:val="000000"/>
-          <w:sz w:val="24"/>
-          <w:szCs w:val="24"/>
-        </w:rPr>
-        <w:t xml:space="preserve"> </w:t>
-      </w:r>
-      <w:r>
-        <w:rPr>
-          <w:color w:val="000000"/>
-          <w:sz w:val="24"/>
-          <w:szCs w:val="24"/>
-        </w:rPr>
-        <w:t xml:space="preserve">core functionality </w:t>
-      </w:r>
-      <w:r>
-        <w:rPr>
-          <w:color w:val="000000"/>
-          <w:sz w:val="24"/>
-          <w:szCs w:val="24"/>
-        </w:rPr>
-        <w:t>of</w:t>
-      </w:r>
-      <w:r>
-        <w:rPr>
-          <w:color w:val="000000"/>
-          <w:sz w:val="24"/>
-          <w:szCs w:val="24"/>
-        </w:rPr>
-        <w:t xml:space="preserve"> a </w:t>
-      </w:r>
-      <w:r>
-        <w:rPr>
-          <w:color w:val="000000"/>
-          <w:sz w:val="24"/>
-          <w:szCs w:val="24"/>
-        </w:rPr>
-        <w:t>D</w:t>
-      </w:r>
-      <w:r>
-        <w:rPr>
-          <w:color w:val="000000"/>
-          <w:sz w:val="24"/>
-          <w:szCs w:val="24"/>
-        </w:rPr>
-        <w:t xml:space="preserve">ata </w:t>
-      </w:r>
-      <w:r>
-        <w:rPr>
-          <w:color w:val="000000"/>
-          <w:sz w:val="24"/>
-          <w:szCs w:val="24"/>
-        </w:rPr>
-        <w:t>L</w:t>
-      </w:r>
-      <w:r>
-        <w:rPr>
-          <w:color w:val="000000"/>
-          <w:sz w:val="24"/>
-          <w:szCs w:val="24"/>
-        </w:rPr>
-        <w:t>akehouse</w:t>
-      </w:r>
-      <w:r>
-        <w:rPr>
-          <w:color w:val="000000"/>
-          <w:sz w:val="24"/>
-          <w:szCs w:val="24"/>
-        </w:rPr>
-        <w:t xml:space="preserve"> platform</w:t>
-      </w:r>
-      <w:r>
-        <w:rPr>
-          <w:color w:val="000000"/>
-          <w:sz w:val="24"/>
-          <w:szCs w:val="24"/>
-        </w:rPr>
-        <w:t xml:space="preserve"> </w:t>
-      </w:r>
-      <w:r>
-        <w:rPr>
-          <w:color w:val="000000"/>
-          <w:sz w:val="24"/>
-          <w:szCs w:val="24"/>
-        </w:rPr>
-        <w:t>for Big Data processing on enterprise-level</w:t>
-      </w:r>
-      <w:r>
-        <w:rPr>
-          <w:color w:val="000000"/>
-          <w:sz w:val="24"/>
-          <w:szCs w:val="24"/>
-        </w:rPr>
-        <w:t xml:space="preserve"> scalable</w:t>
-      </w:r>
-      <w:r>
-        <w:rPr>
-          <w:color w:val="000000"/>
-          <w:sz w:val="24"/>
-          <w:szCs w:val="24"/>
-        </w:rPr>
-        <w:t xml:space="preserve"> clusters</w:t>
-      </w:r>
-      <w:r>
-        <w:rPr>
-          <w:color w:val="000000"/>
-          <w:sz w:val="24"/>
-          <w:szCs w:val="24"/>
-        </w:rPr>
-        <w:t>.</w:t>
+        <w:t>•</w:t>
+      </w:r>
+      <w:r>
+        <w:rPr>
+          <w:sz w:val="24"/>
+          <w:szCs w:val="24"/>
+        </w:rPr>
+        <w:t> Future Star Award (2024).</w:t>
       </w:r>
     </w:p>
     <w:tbl>
@@ -1334,7 +1339,49 @@
           <w:sz w:val="24"/>
           <w:szCs w:val="24"/>
         </w:rPr>
-        <w:t>, which</w:t>
+        <w:t xml:space="preserve"> that brings </w:t>
+      </w:r>
+      <w:r>
+        <w:rPr>
+          <w:sz w:val="24"/>
+          <w:szCs w:val="24"/>
+        </w:rPr>
+        <w:t xml:space="preserve">database functionality </w:t>
+      </w:r>
+      <w:r>
+        <w:rPr>
+          <w:sz w:val="24"/>
+          <w:szCs w:val="24"/>
+        </w:rPr>
+        <w:t>to d</w:t>
+      </w:r>
+      <w:r>
+        <w:rPr>
+          <w:sz w:val="24"/>
+          <w:szCs w:val="24"/>
+        </w:rPr>
+        <w:t xml:space="preserve">ata </w:t>
+      </w:r>
+      <w:r>
+        <w:rPr>
+          <w:sz w:val="24"/>
+          <w:szCs w:val="24"/>
+        </w:rPr>
+        <w:t>l</w:t>
+      </w:r>
+      <w:r>
+        <w:rPr>
+          <w:sz w:val="24"/>
+          <w:szCs w:val="24"/>
+        </w:rPr>
+        <w:t>ake</w:t>
+      </w:r>
+      <w:r>
+        <w:rPr>
+          <w:sz w:val="24"/>
+          <w:szCs w:val="24"/>
+        </w:rPr>
+        <w:t>s</w:t>
       </w:r>
       <w:r>
         <w:rPr>
@@ -1348,49 +1395,35 @@
           <w:sz w:val="24"/>
           <w:szCs w:val="24"/>
         </w:rPr>
-        <w:t>brought</w:t>
-      </w:r>
-      <w:r>
-        <w:rPr>
-          <w:sz w:val="24"/>
-          <w:szCs w:val="24"/>
-        </w:rPr>
-        <w:t xml:space="preserve"> </w:t>
-      </w:r>
-      <w:r>
-        <w:rPr>
-          <w:sz w:val="24"/>
-          <w:szCs w:val="24"/>
-        </w:rPr>
-        <w:t xml:space="preserve">database functionality </w:t>
-      </w:r>
-      <w:r>
-        <w:rPr>
-          <w:sz w:val="24"/>
-          <w:szCs w:val="24"/>
-        </w:rPr>
-        <w:t>in</w:t>
-      </w:r>
-      <w:r>
-        <w:rPr>
-          <w:sz w:val="24"/>
-          <w:szCs w:val="24"/>
-        </w:rPr>
-        <w:t xml:space="preserve">to </w:t>
-      </w:r>
-      <w:r>
-        <w:rPr>
-          <w:sz w:val="24"/>
-          <w:szCs w:val="24"/>
-        </w:rPr>
-        <w:t xml:space="preserve">Data Lake, </w:t>
-      </w:r>
-      <w:r>
-        <w:rPr>
-          <w:sz w:val="24"/>
-          <w:szCs w:val="24"/>
-        </w:rPr>
-        <w:t>and provided incremental processing for low latency analytics</w:t>
+        <w:t xml:space="preserve">and </w:t>
+      </w:r>
+      <w:r>
+        <w:rPr>
+          <w:sz w:val="24"/>
+          <w:szCs w:val="24"/>
+        </w:rPr>
+        <w:t xml:space="preserve">enables </w:t>
+      </w:r>
+      <w:r>
+        <w:rPr>
+          <w:sz w:val="24"/>
+          <w:szCs w:val="24"/>
+        </w:rPr>
+        <w:t>incremental processing for low</w:t>
+      </w:r>
+      <w:r>
+        <w:rPr>
+          <w:sz w:val="24"/>
+          <w:szCs w:val="24"/>
+        </w:rPr>
+        <w:t>-</w:t>
+      </w:r>
+      <w:r>
+        <w:rPr>
+          <w:sz w:val="24"/>
+          <w:szCs w:val="24"/>
+        </w:rPr>
+        <w:t>latency analytics</w:t>
       </w:r>
       <w:r>
         <w:rPr>
@@ -1410,6 +1443,7 @@
           <w:between w:val="nil"/>
         </w:pBdr>
         <w:spacing w:before="120" w:after="60" w:line="264" w:lineRule="auto"/>
+        <w:ind w:left="170" w:hanging="170"/>
         <w:jc w:val="both"/>
         <w:rPr>
           <w:sz w:val="24"/>
@@ -1421,77 +1455,14 @@
           <w:sz w:val="24"/>
           <w:szCs w:val="24"/>
         </w:rPr>
-        <w:t xml:space="preserve">• Optimized serialization/deserialization of data stream records </w:t>
-      </w:r>
-      <w:r>
-        <w:rPr>
-          <w:sz w:val="24"/>
-          <w:szCs w:val="24"/>
-        </w:rPr>
-        <w:t>in</w:t>
-      </w:r>
-      <w:r>
-        <w:rPr>
-          <w:sz w:val="24"/>
-          <w:szCs w:val="24"/>
-        </w:rPr>
-        <w:t xml:space="preserve"> Flink </w:t>
-      </w:r>
-      <w:r>
-        <w:rPr>
-          <w:sz w:val="24"/>
-          <w:szCs w:val="24"/>
-        </w:rPr>
-        <w:t>stream writing</w:t>
-      </w:r>
-      <w:r>
-        <w:rPr>
-          <w:sz w:val="24"/>
-          <w:szCs w:val="24"/>
-        </w:rPr>
-        <w:t xml:space="preserve">, which </w:t>
-      </w:r>
-      <w:r>
-        <w:rPr>
-          <w:sz w:val="24"/>
-          <w:szCs w:val="24"/>
-        </w:rPr>
-        <w:t>accelerated</w:t>
-      </w:r>
-      <w:r>
-        <w:rPr>
-          <w:sz w:val="24"/>
-          <w:szCs w:val="24"/>
-        </w:rPr>
-        <w:t xml:space="preserve"> processing speed by 30%, and </w:t>
-      </w:r>
-      <w:r>
-        <w:rPr>
-          <w:sz w:val="24"/>
-          <w:szCs w:val="24"/>
-        </w:rPr>
-        <w:t xml:space="preserve">reduced amount of </w:t>
-      </w:r>
-      <w:r>
-        <w:rPr>
-          <w:sz w:val="24"/>
-          <w:szCs w:val="24"/>
-        </w:rPr>
-        <w:t>allocated memory</w:t>
-      </w:r>
-      <w:r>
-        <w:rPr>
-          <w:sz w:val="24"/>
-          <w:szCs w:val="24"/>
-        </w:rPr>
-        <w:t xml:space="preserve"> </w:t>
-      </w:r>
-      <w:r>
-        <w:rPr>
-          <w:sz w:val="24"/>
-          <w:szCs w:val="24"/>
-        </w:rPr>
-        <w:t>twice</w:t>
+        <w:t xml:space="preserve">• </w:t>
+      </w:r>
+      <w:r>
+        <w:rPr>
+          <w:sz w:val="24"/>
+          <w:szCs w:val="24"/>
+        </w:rPr>
+        <w:t>Optimized serialization and deserialization of data stream records in Flink stream writing, resulting in a 30% increase in processing speed and 2x reduction in memory usage</w:t>
       </w:r>
       <w:r>
         <w:rPr>
@@ -1556,6 +1527,159 @@
           <w:sz w:val="24"/>
           <w:szCs w:val="24"/>
         </w:rPr>
+        <w:t xml:space="preserve"> Released in </w:t>
+      </w:r>
+      <w:hyperlink r:id="rId16" w:history="1">
+        <w:r>
+          <w:rPr>
+            <w:rStyle w:val="Hyperlink"/>
+            <w:sz w:val="24"/>
+            <w:szCs w:val="24"/>
+          </w:rPr>
+          <w:t>Apache Hudi 1.</w:t>
+        </w:r>
+        <w:r>
+          <w:rPr>
+            <w:rStyle w:val="Hyperlink"/>
+            <w:sz w:val="24"/>
+            <w:szCs w:val="24"/>
+          </w:rPr>
+          <w:t>0.2</w:t>
+        </w:r>
+      </w:hyperlink>
+      <w:r>
+        <w:rPr>
+          <w:sz w:val="24"/>
+          <w:szCs w:val="24"/>
+        </w:rPr>
+        <w:t>.</w:t>
+      </w:r>
+    </w:p>
+    <w:p>
+      <w:pPr>
+        <w:pBdr>
+          <w:top w:val="nil"/>
+          <w:left w:val="nil"/>
+          <w:bottom w:val="nil"/>
+          <w:right w:val="nil"/>
+          <w:between w:val="nil"/>
+        </w:pBdr>
+        <w:spacing w:before="60" w:after="60" w:line="264" w:lineRule="auto"/>
+        <w:ind w:left="170" w:hanging="170"/>
+        <w:jc w:val="both"/>
+        <w:rPr>
+          <w:sz w:val="24"/>
+          <w:szCs w:val="24"/>
+        </w:rPr>
+      </w:pPr>
+      <w:r>
+        <w:rPr>
+          <w:sz w:val="24"/>
+          <w:szCs w:val="24"/>
+        </w:rPr>
+        <w:t>• </w:t>
+      </w:r>
+      <w:r>
+        <w:rPr>
+          <w:sz w:val="24"/>
+          <w:szCs w:val="24"/>
+        </w:rPr>
+        <w:t xml:space="preserve">Implemented </w:t>
+      </w:r>
+      <w:r>
+        <w:rPr>
+          <w:sz w:val="24"/>
+          <w:szCs w:val="24"/>
+        </w:rPr>
+        <w:t>4 local optimizations (</w:t>
+      </w:r>
+      <w:hyperlink r:id="rId17" w:history="1">
+        <w:r>
+          <w:rPr>
+            <w:rStyle w:val="Hyperlink"/>
+            <w:sz w:val="24"/>
+            <w:szCs w:val="24"/>
+          </w:rPr>
+          <w:t>[1]</w:t>
+        </w:r>
+      </w:hyperlink>
+      <w:r>
+        <w:rPr>
+          <w:sz w:val="24"/>
+          <w:szCs w:val="24"/>
+        </w:rPr>
+        <w:t xml:space="preserve">, </w:t>
+      </w:r>
+      <w:hyperlink r:id="rId18" w:history="1">
+        <w:r>
+          <w:rPr>
+            <w:rStyle w:val="Hyperlink"/>
+            <w:sz w:val="24"/>
+            <w:szCs w:val="24"/>
+          </w:rPr>
+          <w:t>[2]</w:t>
+        </w:r>
+      </w:hyperlink>
+      <w:r>
+        <w:rPr>
+          <w:sz w:val="24"/>
+          <w:szCs w:val="24"/>
+        </w:rPr>
+        <w:t xml:space="preserve">, </w:t>
+      </w:r>
+      <w:hyperlink r:id="rId19" w:history="1">
+        <w:r>
+          <w:rPr>
+            <w:rStyle w:val="Hyperlink"/>
+            <w:sz w:val="24"/>
+            <w:szCs w:val="24"/>
+          </w:rPr>
+          <w:t>[3]</w:t>
+        </w:r>
+      </w:hyperlink>
+      <w:r>
+        <w:rPr>
+          <w:sz w:val="24"/>
+          <w:szCs w:val="24"/>
+        </w:rPr>
+        <w:t xml:space="preserve">, </w:t>
+      </w:r>
+      <w:hyperlink r:id="rId20" w:history="1">
+        <w:r>
+          <w:rPr>
+            <w:rStyle w:val="Hyperlink"/>
+            <w:sz w:val="24"/>
+            <w:szCs w:val="24"/>
+          </w:rPr>
+          <w:t>[4]</w:t>
+        </w:r>
+      </w:hyperlink>
+      <w:r>
+        <w:rPr>
+          <w:sz w:val="24"/>
+          <w:szCs w:val="24"/>
+        </w:rPr>
+        <w:t>) in Flink stream writing, resulting in a 1</w:t>
+      </w:r>
+      <w:r>
+        <w:rPr>
+          <w:sz w:val="24"/>
+          <w:szCs w:val="24"/>
+        </w:rPr>
+        <w:t>0% increase in processing speed</w:t>
+      </w:r>
+      <w:r>
+        <w:rPr>
+          <w:sz w:val="24"/>
+          <w:szCs w:val="24"/>
+        </w:rPr>
+        <w:t xml:space="preserve"> and 30% reduction in garbage collection overhead.</w:t>
+      </w:r>
+      <w:r>
+        <w:rPr>
+          <w:sz w:val="24"/>
+          <w:szCs w:val="24"/>
+        </w:rPr>
         <w:t xml:space="preserve"> </w:t>
       </w:r>
       <w:r>
@@ -1563,14 +1687,24 @@
           <w:sz w:val="24"/>
           <w:szCs w:val="24"/>
         </w:rPr>
-        <w:t>Released in Apache Hudi 1.</w:t>
-      </w:r>
-      <w:r>
-        <w:rPr>
-          <w:sz w:val="24"/>
-          <w:szCs w:val="24"/>
-        </w:rPr>
-        <w:t>1.</w:t>
+        <w:t xml:space="preserve">Released in </w:t>
+      </w:r>
+      <w:hyperlink r:id="rId21" w:history="1">
+        <w:r>
+          <w:rPr>
+            <w:rStyle w:val="Hyperlink"/>
+            <w:sz w:val="24"/>
+            <w:szCs w:val="24"/>
+          </w:rPr>
+          <w:t>Apache Hudi 1.0.1</w:t>
+        </w:r>
+      </w:hyperlink>
+      <w:r>
+        <w:rPr>
+          <w:sz w:val="24"/>
+          <w:szCs w:val="24"/>
+        </w:rPr>
+        <w:t>.</w:t>
       </w:r>
     </w:p>
     <w:p>
@@ -1603,16 +1737,23 @@
           <w:sz w:val="24"/>
           <w:szCs w:val="24"/>
         </w:rPr>
+        <w:t xml:space="preserve">Contributed </w:t>
+      </w:r>
+      <w:r>
+        <w:rPr>
+          <w:sz w:val="24"/>
+          <w:szCs w:val="24"/>
+        </w:rPr>
         <w:t xml:space="preserve">40+ </w:t>
       </w:r>
-      <w:hyperlink r:id="rId16" w:history="1">
+      <w:hyperlink r:id="rId22" w:history="1">
         <w:r>
           <w:rPr>
             <w:rStyle w:val="Hyperlink"/>
             <w:sz w:val="24"/>
             <w:szCs w:val="24"/>
           </w:rPr>
-          <w:t>merged PRs</w:t>
+          <w:t>merged pull requests</w:t>
         </w:r>
       </w:hyperlink>
       <w:r>
@@ -1818,7 +1959,21 @@
           <w:sz w:val="24"/>
           <w:szCs w:val="24"/>
         </w:rPr>
-        <w:t xml:space="preserve">• Created an event-based architecture for a system </w:t>
+        <w:t>• </w:t>
+      </w:r>
+      <w:r>
+        <w:rPr>
+          <w:sz w:val="24"/>
+          <w:szCs w:val="24"/>
+        </w:rPr>
+        <w:t>Designed and implemented</w:t>
+      </w:r>
+      <w:r>
+        <w:rPr>
+          <w:sz w:val="24"/>
+          <w:szCs w:val="24"/>
+        </w:rPr>
+        <w:t xml:space="preserve"> an event-based architecture for a system </w:t>
       </w:r>
       <w:r>
         <w:rPr>
@@ -1839,7 +1994,14 @@
           <w:sz w:val="24"/>
           <w:szCs w:val="24"/>
         </w:rPr>
-        <w:t xml:space="preserve"> (</w:t>
+        <w:t xml:space="preserve"> </w:t>
+      </w:r>
+      <w:r>
+        <w:rPr>
+          <w:sz w:val="24"/>
+          <w:szCs w:val="24"/>
+        </w:rPr>
+        <w:t xml:space="preserve">handling </w:t>
       </w:r>
       <w:r>
         <w:rPr>
@@ -1854,7 +2016,35 @@
           <w:sz w:val="24"/>
           <w:szCs w:val="24"/>
         </w:rPr>
-        <w:t>20K images/day)</w:t>
+        <w:t>20</w:t>
+      </w:r>
+      <w:r>
+        <w:rPr>
+          <w:sz w:val="24"/>
+          <w:szCs w:val="24"/>
+        </w:rPr>
+        <w:t>,000</w:t>
+      </w:r>
+      <w:r>
+        <w:rPr>
+          <w:sz w:val="24"/>
+          <w:szCs w:val="24"/>
+        </w:rPr>
+        <w:t xml:space="preserve"> images</w:t>
+      </w:r>
+      <w:r>
+        <w:rPr>
+          <w:sz w:val="24"/>
+          <w:szCs w:val="24"/>
+        </w:rPr>
+        <w:t xml:space="preserve"> per </w:t>
+      </w:r>
+      <w:r>
+        <w:rPr>
+          <w:sz w:val="24"/>
+          <w:szCs w:val="24"/>
+        </w:rPr>
+        <w:t>day</w:t>
       </w:r>
       <w:r>
         <w:rPr>
@@ -1915,7 +2105,7 @@
           <w:right w:val="nil"/>
           <w:between w:val="nil"/>
         </w:pBdr>
-        <w:spacing w:before="60" w:after="60" w:line="264" w:lineRule="auto"/>
+        <w:spacing w:before="60" w:after="120" w:line="264" w:lineRule="auto"/>
         <w:ind w:left="170" w:hanging="170"/>
         <w:jc w:val="both"/>
         <w:rPr>
@@ -1929,7 +2119,63 @@
           <w:sz w:val="24"/>
           <w:szCs w:val="24"/>
         </w:rPr>
-        <w:t xml:space="preserve">• Created a customer-facing web UI with reports and data visualization. Also created an internal web UI </w:t>
+        <w:t>• </w:t>
+      </w:r>
+      <w:r>
+        <w:rPr>
+          <w:sz w:val="24"/>
+          <w:szCs w:val="24"/>
+        </w:rPr>
+        <w:t xml:space="preserve">Built </w:t>
+      </w:r>
+      <w:r>
+        <w:rPr>
+          <w:sz w:val="24"/>
+          <w:szCs w:val="24"/>
+        </w:rPr>
+        <w:t xml:space="preserve">a customer-facing web UI </w:t>
+      </w:r>
+      <w:r>
+        <w:rPr>
+          <w:sz w:val="24"/>
+          <w:szCs w:val="24"/>
+        </w:rPr>
+        <w:t xml:space="preserve">featuring </w:t>
+      </w:r>
+      <w:r>
+        <w:rPr>
+          <w:sz w:val="24"/>
+          <w:szCs w:val="24"/>
+        </w:rPr>
+        <w:t>reports and data visualization</w:t>
+      </w:r>
+      <w:r>
+        <w:rPr>
+          <w:sz w:val="24"/>
+          <w:szCs w:val="24"/>
+        </w:rPr>
+        <w:t>s</w:t>
+      </w:r>
+      <w:r>
+        <w:rPr>
+          <w:sz w:val="24"/>
+          <w:szCs w:val="24"/>
+        </w:rPr>
+        <w:t xml:space="preserve">. Also </w:t>
+      </w:r>
+      <w:r>
+        <w:rPr>
+          <w:sz w:val="24"/>
+          <w:szCs w:val="24"/>
+        </w:rPr>
+        <w:t xml:space="preserve">developed </w:t>
+      </w:r>
+      <w:r>
+        <w:rPr>
+          <w:sz w:val="24"/>
+          <w:szCs w:val="24"/>
+        </w:rPr>
+        <w:t xml:space="preserve">an internal web UI </w:t>
       </w:r>
       <w:r>
         <w:rPr>
@@ -2098,7 +2344,7 @@
           <w:szCs w:val="24"/>
         </w:rPr>
       </w:pPr>
-      <w:hyperlink r:id="rId17">
+      <w:hyperlink r:id="rId23">
         <w:r>
           <w:rPr>
             <w:color w:val="0000FF"/>
@@ -2109,7 +2355,7 @@
       </w:hyperlink>
     </w:p>
     <w:sectPr>
-      <w:footerReference w:type="default" r:id="rId18"/>
+      <w:footerReference w:type="default" r:id="rId24"/>
       <w:pgSz w:w="11906" w:h="16838"/>
       <w:pgMar w:top="851" w:right="1134" w:bottom="851" w:left="1134" w:header="113" w:footer="113" w:gutter="0"/>
       <w:pgNumType w:start="1"/>
@@ -2320,6 +2566,7 @@
     <w:lsdException w:name="HTML Sample" w:semiHidden="1" w:unhideWhenUsed="1"/>
     <w:lsdException w:name="HTML Typewriter" w:semiHidden="1" w:unhideWhenUsed="1"/>
     <w:lsdException w:name="HTML Variable" w:semiHidden="1" w:unhideWhenUsed="1"/>
+    <w:lsdException w:name="Normal Table" w:semiHidden="1" w:unhideWhenUsed="1"/>
     <w:lsdException w:name="annotation subject" w:semiHidden="1" w:unhideWhenUsed="1"/>
     <w:lsdException w:name="No List" w:semiHidden="1" w:unhideWhenUsed="1"/>
     <w:lsdException w:name="Outline List 1" w:semiHidden="1" w:unhideWhenUsed="1"/>
@@ -2363,8 +2610,10 @@
     <w:lsdException w:name="Table Elegant" w:semiHidden="1" w:unhideWhenUsed="1"/>
     <w:lsdException w:name="Table Professional" w:semiHidden="1" w:unhideWhenUsed="1"/>
     <w:lsdException w:name="Table Subtle 1" w:semiHidden="1" w:unhideWhenUsed="1"/>
+    <w:lsdException w:name="Table Subtle 2" w:semiHidden="1" w:unhideWhenUsed="1"/>
     <w:lsdException w:name="Table Web 1" w:semiHidden="1" w:unhideWhenUsed="1"/>
     <w:lsdException w:name="Table Web 2" w:semiHidden="1" w:unhideWhenUsed="1"/>
+    <w:lsdException w:name="Table Web 3" w:semiHidden="1" w:unhideWhenUsed="1"/>
     <w:lsdException w:name="Balloon Text" w:semiHidden="1" w:unhideWhenUsed="1"/>
     <w:lsdException w:name="Table Grid" w:uiPriority="39"/>
     <w:lsdException w:name="Table Theme" w:semiHidden="1" w:unhideWhenUsed="1"/>

</xml_diff>

<commit_message>
data: Update remained files with agentic development experience
</commit_message>
<xml_diff>
--- a/file/CV_Geser_Dugarov.docx
+++ b/file/CV_Geser_Dugarov.docx
@@ -326,17 +326,7 @@
           <w:sz w:val="24"/>
           <w:szCs w:val="24"/>
         </w:rPr>
-        <w:t>Software Engineer deve</w:t>
-      </w:r>
-      <w:bookmarkStart w:id="1" w:name="_GoBack"/>
-      <w:bookmarkEnd w:id="1"/>
-      <w:r>
-        <w:rPr>
-          <w:color w:val="000000"/>
-          <w:sz w:val="24"/>
-          <w:szCs w:val="24"/>
-        </w:rPr>
-        <w:t xml:space="preserve">loping core functionality on a data lakehouse platform to extract value from </w:t>
+        <w:t xml:space="preserve">Software Engineer developing core functionality on a data lakehouse platform to extract value from </w:t>
       </w:r>
       <w:r>
         <w:rPr>
@@ -495,6 +485,38 @@
           <w:szCs w:val="24"/>
         </w:rPr>
       </w:pPr>
+      <w:r>
+        <w:rPr>
+          <w:color w:val="000000"/>
+          <w:sz w:val="24"/>
+          <w:szCs w:val="24"/>
+        </w:rPr>
+        <w:t xml:space="preserve">Building open-source tooling for agentic software development </w:t>
+      </w:r>
+      <w:r>
+        <w:rPr>
+          <w:color w:val="000000"/>
+          <w:sz w:val="24"/>
+          <w:szCs w:val="24"/>
+        </w:rPr>
+        <w:t xml:space="preserve">– </w:t>
+      </w:r>
+      <w:r>
+        <w:rPr>
+          <w:color w:val="000000"/>
+          <w:sz w:val="24"/>
+          <w:szCs w:val="24"/>
+        </w:rPr>
+        <w:t>issue-driven orchestrators and develop-review loops that turn coding-agent CLIs into reproducible engineering pipelines.</w:t>
+      </w:r>
+      <w:r>
+        <w:rPr>
+          <w:color w:val="000000"/>
+          <w:sz w:val="24"/>
+          <w:szCs w:val="24"/>
+        </w:rPr>
+        <w:t xml:space="preserve"> </w:t>
+      </w:r>
       <w:r>
         <w:rPr>
           <w:color w:val="000000"/>
@@ -669,6 +691,46 @@
           <w:szCs w:val="24"/>
         </w:rPr>
         <w:t>, Hadoop Ecosystem</w:t>
+      </w:r>
+      <w:r>
+        <w:rPr>
+          <w:b/>
+          <w:i/>
+          <w:color w:val="000000"/>
+          <w:sz w:val="24"/>
+          <w:szCs w:val="24"/>
+        </w:rPr>
+        <w:t xml:space="preserve">, </w:t>
+      </w:r>
+      <w:r>
+        <w:rPr>
+          <w:b/>
+          <w:i/>
+          <w:color w:val="000000"/>
+          <w:sz w:val="24"/>
+          <w:szCs w:val="24"/>
+        </w:rPr>
+        <w:t>Claude Code / Codex</w:t>
+      </w:r>
+      <w:r>
+        <w:rPr>
+          <w:b/>
+          <w:i/>
+          <w:color w:val="000000"/>
+          <w:sz w:val="24"/>
+          <w:szCs w:val="24"/>
+        </w:rPr>
+        <w:t xml:space="preserve">, </w:t>
+      </w:r>
+      <w:r>
+        <w:rPr>
+          <w:b/>
+          <w:i/>
+          <w:color w:val="000000"/>
+          <w:sz w:val="24"/>
+          <w:szCs w:val="24"/>
+        </w:rPr>
+        <w:t>Agentic workflows</w:t>
       </w:r>
     </w:p>
     <w:p>
@@ -1054,7 +1116,6 @@
         <w:ind w:left="170" w:hanging="170"/>
         <w:jc w:val="both"/>
         <w:rPr>
-          <w:color w:val="000000"/>
           <w:sz w:val="24"/>
           <w:szCs w:val="24"/>
         </w:rPr>
@@ -1116,31 +1177,31 @@
                 <w:sz w:val="24"/>
                 <w:szCs w:val="24"/>
               </w:rPr>
-              <w:t xml:space="preserve">Jan 24 </w:t>
-            </w:r>
-            <w:r>
-              <w:rPr>
-                <w:color w:val="000000"/>
-                <w:sz w:val="24"/>
-                <w:szCs w:val="24"/>
-              </w:rPr>
-              <w:t>–</w:t>
-            </w:r>
-            <w:r>
-              <w:rPr>
-                <w:color w:val="000000"/>
-                <w:sz w:val="24"/>
-                <w:szCs w:val="24"/>
-              </w:rPr>
-              <w:t xml:space="preserve"> </w:t>
-            </w:r>
-            <w:r>
-              <w:rPr>
-                <w:color w:val="000000"/>
-                <w:sz w:val="24"/>
-                <w:szCs w:val="24"/>
-              </w:rPr>
-              <w:t>Current</w:t>
+              <w:t>Apr</w:t>
+            </w:r>
+            <w:r>
+              <w:rPr>
+                <w:color w:val="000000"/>
+                <w:sz w:val="24"/>
+                <w:szCs w:val="24"/>
+              </w:rPr>
+              <w:t xml:space="preserve"> 2</w:t>
+            </w:r>
+            <w:r>
+              <w:rPr>
+                <w:color w:val="000000"/>
+                <w:sz w:val="24"/>
+                <w:szCs w:val="24"/>
+              </w:rPr>
+              <w:t>6</w:t>
+            </w:r>
+            <w:r>
+              <w:rPr>
+                <w:color w:val="000000"/>
+                <w:sz w:val="24"/>
+                <w:szCs w:val="24"/>
+              </w:rPr>
+              <w:t xml:space="preserve"> – Current</w:t>
             </w:r>
           </w:p>
           <w:p>
@@ -1175,32 +1236,33 @@
                 <w:sz w:val="24"/>
                 <w:szCs w:val="24"/>
               </w:rPr>
-              <w:t>2</w:t>
-            </w:r>
-            <w:r>
-              <w:rPr>
-                <w:color w:val="000000"/>
-                <w:sz w:val="24"/>
-                <w:szCs w:val="24"/>
-              </w:rPr>
-              <w:t>+</w:t>
-            </w:r>
-            <w:r>
-              <w:rPr>
-                <w:color w:val="000000"/>
-                <w:sz w:val="24"/>
-                <w:szCs w:val="24"/>
-              </w:rPr>
-              <w:t> yr</w:t>
-            </w:r>
-            <w:r>
-              <w:rPr>
-                <w:color w:val="000000"/>
-                <w:sz w:val="24"/>
-                <w:szCs w:val="24"/>
-              </w:rPr>
-              <w:t>s</w:t>
-            </w:r>
+              <w:t>0.5</w:t>
+            </w:r>
+            <w:r>
+              <w:rPr>
+                <w:sz w:val="24"/>
+                <w:szCs w:val="24"/>
+              </w:rPr>
+              <w:t>–</w:t>
+            </w:r>
+            <w:r>
+              <w:rPr>
+                <w:color w:val="000000"/>
+                <w:sz w:val="24"/>
+                <w:szCs w:val="24"/>
+              </w:rPr>
+              <w:t> </w:t>
+            </w:r>
+            <w:proofErr w:type="spellStart"/>
+            <w:r>
+              <w:rPr>
+                <w:color w:val="000000"/>
+                <w:sz w:val="24"/>
+                <w:szCs w:val="24"/>
+              </w:rPr>
+              <w:t>yr</w:t>
+            </w:r>
+            <w:proofErr w:type="spellEnd"/>
             <w:r>
               <w:rPr>
                 <w:color w:val="000000"/>
@@ -1238,16 +1300,7 @@
                 <w:sz w:val="24"/>
                 <w:szCs w:val="24"/>
               </w:rPr>
-              <w:t>Apache Hudi</w:t>
-            </w:r>
-            <w:r>
-              <w:rPr>
-                <w:b/>
-                <w:color w:val="000000"/>
-                <w:sz w:val="24"/>
-                <w:szCs w:val="24"/>
-              </w:rPr>
-              <w:t xml:space="preserve"> Contributor</w:t>
+              <w:t>Open-source: Agentic development tooling</w:t>
             </w:r>
             <w:r>
               <w:rPr>
@@ -1280,7 +1333,7 @@
                 <w:sz w:val="24"/>
                 <w:szCs w:val="24"/>
               </w:rPr>
-              <w:t>The Apache Software Foundation</w:t>
+              <w:t>Personal projects</w:t>
             </w:r>
           </w:p>
         </w:tc>
@@ -1298,148 +1351,38 @@
         <w:spacing w:before="120" w:after="60" w:line="264" w:lineRule="auto"/>
         <w:jc w:val="both"/>
         <w:rPr>
+          <w:color w:val="000000"/>
           <w:sz w:val="24"/>
           <w:szCs w:val="24"/>
         </w:rPr>
       </w:pPr>
-      <w:hyperlink r:id="rId12" w:history="1">
-        <w:r>
-          <w:rPr>
-            <w:rStyle w:val="Hyperlink"/>
-            <w:sz w:val="24"/>
-            <w:szCs w:val="24"/>
-          </w:rPr>
-          <w:t>Apache Hudi</w:t>
-        </w:r>
-      </w:hyperlink>
-      <w:r>
-        <w:rPr>
-          <w:sz w:val="24"/>
-          <w:szCs w:val="24"/>
-        </w:rPr>
-        <w:t xml:space="preserve"> is</w:t>
-      </w:r>
-      <w:r>
-        <w:rPr>
-          <w:sz w:val="24"/>
-          <w:szCs w:val="24"/>
-        </w:rPr>
-        <w:t xml:space="preserve"> a</w:t>
-      </w:r>
-      <w:r>
-        <w:rPr>
-          <w:sz w:val="24"/>
-          <w:szCs w:val="24"/>
-        </w:rPr>
-        <w:t xml:space="preserve"> </w:t>
-      </w:r>
-      <w:r>
-        <w:rPr>
-          <w:sz w:val="24"/>
-          <w:szCs w:val="24"/>
-        </w:rPr>
-        <w:t>data l</w:t>
-      </w:r>
-      <w:r>
-        <w:rPr>
-          <w:sz w:val="24"/>
-          <w:szCs w:val="24"/>
-        </w:rPr>
-        <w:t>akehouse platform</w:t>
-      </w:r>
-      <w:r>
-        <w:rPr>
-          <w:sz w:val="24"/>
-          <w:szCs w:val="24"/>
-        </w:rPr>
-        <w:t xml:space="preserve"> that brings </w:t>
-      </w:r>
-      <w:r>
-        <w:rPr>
-          <w:sz w:val="24"/>
-          <w:szCs w:val="24"/>
-        </w:rPr>
-        <w:t xml:space="preserve">database functionality </w:t>
-      </w:r>
-      <w:r>
-        <w:rPr>
-          <w:sz w:val="24"/>
-          <w:szCs w:val="24"/>
-        </w:rPr>
-        <w:t>to d</w:t>
-      </w:r>
-      <w:r>
-        <w:rPr>
-          <w:sz w:val="24"/>
-          <w:szCs w:val="24"/>
-        </w:rPr>
-        <w:t xml:space="preserve">ata </w:t>
-      </w:r>
-      <w:r>
-        <w:rPr>
-          <w:sz w:val="24"/>
-          <w:szCs w:val="24"/>
-        </w:rPr>
-        <w:t>l</w:t>
-      </w:r>
-      <w:r>
-        <w:rPr>
-          <w:sz w:val="24"/>
-          <w:szCs w:val="24"/>
-        </w:rPr>
-        <w:t>ake</w:t>
-      </w:r>
-      <w:r>
-        <w:rPr>
-          <w:sz w:val="24"/>
-          <w:szCs w:val="24"/>
-        </w:rPr>
-        <w:t>s</w:t>
-      </w:r>
-      <w:r>
-        <w:rPr>
-          <w:sz w:val="24"/>
-          <w:szCs w:val="24"/>
-        </w:rPr>
-        <w:t xml:space="preserve"> </w:t>
-      </w:r>
-      <w:r>
-        <w:rPr>
-          <w:sz w:val="24"/>
-          <w:szCs w:val="24"/>
-        </w:rPr>
-        <w:t xml:space="preserve">and </w:t>
-      </w:r>
-      <w:r>
-        <w:rPr>
-          <w:sz w:val="24"/>
-          <w:szCs w:val="24"/>
-        </w:rPr>
-        <w:t xml:space="preserve">enables </w:t>
-      </w:r>
-      <w:r>
-        <w:rPr>
-          <w:sz w:val="24"/>
-          <w:szCs w:val="24"/>
-        </w:rPr>
-        <w:t>incremental processing for low</w:t>
-      </w:r>
-      <w:r>
-        <w:rPr>
-          <w:sz w:val="24"/>
-          <w:szCs w:val="24"/>
-        </w:rPr>
-        <w:t>-</w:t>
-      </w:r>
-      <w:r>
-        <w:rPr>
-          <w:sz w:val="24"/>
-          <w:szCs w:val="24"/>
-        </w:rPr>
-        <w:t>latency analytics</w:t>
-      </w:r>
-      <w:r>
-        <w:rPr>
+      <w:r>
+        <w:rPr>
+          <w:color w:val="000000"/>
+          <w:sz w:val="24"/>
+          <w:szCs w:val="24"/>
+        </w:rPr>
+        <w:t xml:space="preserve">Self-directed work on agent-augmented engineering workflows </w:t>
+      </w:r>
+      <w:r>
+        <w:rPr>
+          <w:color w:val="000000"/>
+          <w:sz w:val="24"/>
+          <w:szCs w:val="24"/>
+        </w:rPr>
+        <w:t>–</w:t>
+      </w:r>
+      <w:r>
+        <w:rPr>
+          <w:color w:val="000000"/>
+          <w:sz w:val="24"/>
+          <w:szCs w:val="24"/>
+        </w:rPr>
+        <w:t xml:space="preserve"> treating coding-agent CLIs (Claude Code, Codex) as bounded executors inside reproducible pipelines</w:t>
+      </w:r>
+      <w:r>
+        <w:rPr>
+          <w:color w:val="000000"/>
           <w:sz w:val="24"/>
           <w:szCs w:val="24"/>
         </w:rPr>
@@ -1470,42 +1413,14 @@
         </w:rPr>
         <w:t>• </w:t>
       </w:r>
-      <w:r>
-        <w:rPr>
-          <w:sz w:val="24"/>
-          <w:szCs w:val="24"/>
-        </w:rPr>
-        <w:t>Optimized serialization and deserialization of records in Flink stream writing</w:t>
-      </w:r>
-      <w:r>
-        <w:rPr>
-          <w:sz w:val="24"/>
-          <w:szCs w:val="24"/>
-        </w:rPr>
-        <w:t xml:space="preserve"> to Hudi table</w:t>
-      </w:r>
-      <w:r>
-        <w:rPr>
-          <w:sz w:val="24"/>
-          <w:szCs w:val="24"/>
-        </w:rPr>
-        <w:t>, resulting in a 30% increase in processing speed and 2x reduction in memory usage</w:t>
-      </w:r>
-      <w:r>
-        <w:rPr>
-          <w:sz w:val="24"/>
-          <w:szCs w:val="24"/>
-        </w:rPr>
-        <w:t xml:space="preserve"> (</w:t>
-      </w:r>
-      <w:hyperlink r:id="rId13" w:history="1">
+      <w:hyperlink r:id="rId12" w:history="1">
         <w:r>
           <w:rPr>
             <w:rStyle w:val="Hyperlink"/>
             <w:sz w:val="24"/>
             <w:szCs w:val="24"/>
           </w:rPr>
-          <w:t>design doc</w:t>
+          <w:t>agent-orchestrator</w:t>
         </w:r>
       </w:hyperlink>
       <w:r>
@@ -1513,187 +1428,61 @@
           <w:sz w:val="24"/>
           <w:szCs w:val="24"/>
         </w:rPr>
-        <w:t xml:space="preserve">, </w:t>
-      </w:r>
-      <w:hyperlink r:id="rId14" w:history="1">
-        <w:r>
-          <w:rPr>
-            <w:rStyle w:val="Hyperlink"/>
-            <w:sz w:val="24"/>
-            <w:szCs w:val="24"/>
-          </w:rPr>
-          <w:t>main changes</w:t>
-        </w:r>
-      </w:hyperlink>
-      <w:r>
-        <w:rPr>
-          <w:sz w:val="24"/>
-          <w:szCs w:val="24"/>
-        </w:rPr>
-        <w:t>).</w:t>
-      </w:r>
-      <w:r>
-        <w:rPr>
-          <w:sz w:val="24"/>
-          <w:szCs w:val="24"/>
-        </w:rPr>
-        <w:t xml:space="preserve"> Released in </w:t>
-      </w:r>
-      <w:hyperlink r:id="rId15" w:history="1">
-        <w:r>
-          <w:rPr>
-            <w:rStyle w:val="Hyperlink"/>
-            <w:sz w:val="24"/>
-            <w:szCs w:val="24"/>
-          </w:rPr>
-          <w:t>Hudi 1.0.2</w:t>
-        </w:r>
-      </w:hyperlink>
-      <w:r>
-        <w:rPr>
-          <w:sz w:val="24"/>
-          <w:szCs w:val="24"/>
-        </w:rPr>
-        <w:t>.</w:t>
-      </w:r>
-    </w:p>
-    <w:p>
-      <w:pPr>
-        <w:pBdr>
-          <w:top w:val="nil"/>
-          <w:left w:val="nil"/>
-          <w:bottom w:val="nil"/>
-          <w:right w:val="nil"/>
-          <w:between w:val="nil"/>
-        </w:pBdr>
-        <w:spacing w:before="60" w:after="60" w:line="264" w:lineRule="auto"/>
-        <w:ind w:left="170" w:hanging="170"/>
-        <w:jc w:val="both"/>
-        <w:rPr>
-          <w:sz w:val="24"/>
-          <w:szCs w:val="24"/>
-        </w:rPr>
-      </w:pPr>
-      <w:r>
-        <w:rPr>
-          <w:sz w:val="24"/>
-          <w:szCs w:val="24"/>
-        </w:rPr>
-        <w:t>• </w:t>
-      </w:r>
-      <w:r>
-        <w:rPr>
-          <w:sz w:val="24"/>
-          <w:szCs w:val="24"/>
-        </w:rPr>
-        <w:t xml:space="preserve">Implemented </w:t>
-      </w:r>
-      <w:r>
-        <w:rPr>
-          <w:sz w:val="24"/>
-          <w:szCs w:val="24"/>
-        </w:rPr>
-        <w:t>4 local optimizations (</w:t>
-      </w:r>
-      <w:hyperlink r:id="rId16" w:history="1">
-        <w:r>
-          <w:rPr>
-            <w:rStyle w:val="Hyperlink"/>
-            <w:sz w:val="24"/>
-            <w:szCs w:val="24"/>
-          </w:rPr>
-          <w:t>[1]</w:t>
-        </w:r>
-      </w:hyperlink>
-      <w:r>
-        <w:rPr>
-          <w:sz w:val="24"/>
-          <w:szCs w:val="24"/>
-        </w:rPr>
-        <w:t xml:space="preserve">, </w:t>
-      </w:r>
-      <w:hyperlink r:id="rId17" w:history="1">
-        <w:r>
-          <w:rPr>
-            <w:rStyle w:val="Hyperlink"/>
-            <w:sz w:val="24"/>
-            <w:szCs w:val="24"/>
-          </w:rPr>
-          <w:t>[2]</w:t>
-        </w:r>
-      </w:hyperlink>
-      <w:r>
-        <w:rPr>
-          <w:sz w:val="24"/>
-          <w:szCs w:val="24"/>
-        </w:rPr>
-        <w:t xml:space="preserve">, </w:t>
-      </w:r>
-      <w:hyperlink r:id="rId18" w:history="1">
-        <w:r>
-          <w:rPr>
-            <w:rStyle w:val="Hyperlink"/>
-            <w:sz w:val="24"/>
-            <w:szCs w:val="24"/>
-          </w:rPr>
-          <w:t>[3]</w:t>
-        </w:r>
-      </w:hyperlink>
-      <w:r>
-        <w:rPr>
-          <w:sz w:val="24"/>
-          <w:szCs w:val="24"/>
-        </w:rPr>
-        <w:t xml:space="preserve">, </w:t>
-      </w:r>
-      <w:hyperlink r:id="rId19" w:history="1">
-        <w:r>
-          <w:rPr>
-            <w:rStyle w:val="Hyperlink"/>
-            <w:sz w:val="24"/>
-            <w:szCs w:val="24"/>
-          </w:rPr>
-          <w:t>[4]</w:t>
-        </w:r>
-      </w:hyperlink>
-      <w:r>
-        <w:rPr>
-          <w:sz w:val="24"/>
-          <w:szCs w:val="24"/>
-        </w:rPr>
-        <w:t>) resulting in a 1</w:t>
-      </w:r>
-      <w:r>
-        <w:rPr>
-          <w:sz w:val="24"/>
-          <w:szCs w:val="24"/>
-        </w:rPr>
-        <w:t>0% increase in processing speed</w:t>
-      </w:r>
-      <w:r>
-        <w:rPr>
-          <w:sz w:val="24"/>
-          <w:szCs w:val="24"/>
-        </w:rPr>
-        <w:t xml:space="preserve"> and 30% reduction in garbage collection overhead.</w:t>
-      </w:r>
-      <w:r>
-        <w:rPr>
-          <w:sz w:val="24"/>
-          <w:szCs w:val="24"/>
-        </w:rPr>
-        <w:t xml:space="preserve"> Released in </w:t>
-      </w:r>
-      <w:hyperlink r:id="rId20" w:history="1">
-        <w:r>
-          <w:rPr>
-            <w:rStyle w:val="Hyperlink"/>
-            <w:sz w:val="24"/>
-            <w:szCs w:val="24"/>
-          </w:rPr>
-          <w:t>Hudi 1.0.1</w:t>
-        </w:r>
-      </w:hyperlink>
+        <w:t xml:space="preserve"> – </w:t>
+      </w:r>
+      <w:r>
+        <w:rPr>
+          <w:sz w:val="24"/>
+          <w:szCs w:val="24"/>
+        </w:rPr>
+        <w:t>GitHub-Issue-driven workflow runner.</w:t>
+      </w:r>
+      <w:r>
+        <w:rPr>
+          <w:sz w:val="24"/>
+          <w:szCs w:val="24"/>
+        </w:rPr>
+        <w:t xml:space="preserve"> </w:t>
+      </w:r>
+      <w:bookmarkStart w:id="1" w:name="_GoBack"/>
+      <w:bookmarkEnd w:id="1"/>
+      <w:r>
+        <w:rPr>
+          <w:sz w:val="24"/>
+          <w:szCs w:val="24"/>
+        </w:rPr>
+        <w:t xml:space="preserve">Decomposes an issue, runs an implementer agent in an isolated git </w:t>
+      </w:r>
+      <w:proofErr w:type="spellStart"/>
+      <w:r>
+        <w:rPr>
+          <w:sz w:val="24"/>
+          <w:szCs w:val="24"/>
+        </w:rPr>
+        <w:t>worktree</w:t>
+      </w:r>
+      <w:proofErr w:type="spellEnd"/>
+      <w:r>
+        <w:rPr>
+          <w:sz w:val="24"/>
+          <w:szCs w:val="24"/>
+        </w:rPr>
+        <w:t>, opens a PR, runs an independent reviewer agent, notifies a human when ready to merge.</w:t>
+      </w:r>
+      <w:r>
+        <w:rPr>
+          <w:sz w:val="24"/>
+          <w:szCs w:val="24"/>
+        </w:rPr>
+        <w:t xml:space="preserve"> </w:t>
+      </w:r>
+      <w:r>
+        <w:rPr>
+          <w:sz w:val="24"/>
+          <w:szCs w:val="24"/>
+        </w:rPr>
+        <w:t>State persists in the issue itself</w:t>
+      </w:r>
       <w:r>
         <w:rPr>
           <w:sz w:val="24"/>
@@ -1727,37 +1516,29 @@
         </w:rPr>
         <w:t>• </w:t>
       </w:r>
-      <w:r>
-        <w:rPr>
-          <w:sz w:val="24"/>
-          <w:szCs w:val="24"/>
-        </w:rPr>
-        <w:t xml:space="preserve">Contributed </w:t>
-      </w:r>
-      <w:r>
-        <w:rPr>
-          <w:sz w:val="24"/>
-          <w:szCs w:val="24"/>
-        </w:rPr>
-        <w:t xml:space="preserve">40+ </w:t>
-      </w:r>
-      <w:hyperlink r:id="rId21" w:history="1">
+      <w:hyperlink r:id="rId13" w:history="1">
         <w:r>
           <w:rPr>
             <w:rStyle w:val="Hyperlink"/>
             <w:sz w:val="24"/>
             <w:szCs w:val="24"/>
           </w:rPr>
-          <w:t>merged pull requests</w:t>
+          <w:t>agent-develop-review-loop</w:t>
         </w:r>
       </w:hyperlink>
       <w:r>
         <w:rPr>
-          <w:color w:val="000000"/>
-          <w:sz w:val="24"/>
-          <w:szCs w:val="24"/>
-        </w:rPr>
-        <w:t>.</w:t>
+          <w:sz w:val="24"/>
+          <w:szCs w:val="24"/>
+        </w:rPr>
+        <w:t xml:space="preserve"> – </w:t>
+      </w:r>
+      <w:r>
+        <w:rPr>
+          <w:sz w:val="24"/>
+          <w:szCs w:val="24"/>
+        </w:rPr>
+        <w:t>shell-only develop-review loop with HITL handoff, resumable runs, and cost telemetry parsed from agent usage metadata.</w:t>
       </w:r>
     </w:p>
     <w:tbl>
@@ -1802,7 +1583,15 @@
                 <w:sz w:val="24"/>
                 <w:szCs w:val="24"/>
               </w:rPr>
-              <w:t>Feb 22 -</w:t>
+              <w:t xml:space="preserve">Jan 24 </w:t>
+            </w:r>
+            <w:r>
+              <w:rPr>
+                <w:color w:val="000000"/>
+                <w:sz w:val="24"/>
+                <w:szCs w:val="24"/>
+              </w:rPr>
+              <w:t>–</w:t>
             </w:r>
             <w:r>
               <w:rPr>
@@ -1818,15 +1607,42 @@
                 <w:sz w:val="24"/>
                 <w:szCs w:val="24"/>
               </w:rPr>
-              <w:t>May 23</w:t>
-            </w:r>
-            <w:r>
-              <w:rPr>
-                <w:color w:val="000000"/>
-                <w:sz w:val="24"/>
-                <w:szCs w:val="24"/>
-              </w:rPr>
-              <w:t xml:space="preserve"> (1</w:t>
+              <w:t>Current</w:t>
+            </w:r>
+          </w:p>
+          <w:p>
+            <w:pPr>
+              <w:pBdr>
+                <w:top w:val="nil"/>
+                <w:left w:val="nil"/>
+                <w:bottom w:val="nil"/>
+                <w:right w:val="nil"/>
+                <w:between w:val="nil"/>
+              </w:pBdr>
+              <w:spacing w:line="264" w:lineRule="auto"/>
+              <w:ind w:left="284"/>
+              <w:jc w:val="center"/>
+              <w:rPr>
+                <w:color w:val="000000"/>
+                <w:sz w:val="24"/>
+                <w:szCs w:val="24"/>
+              </w:rPr>
+            </w:pPr>
+            <w:r>
+              <w:rPr>
+                <w:color w:val="000000"/>
+                <w:sz w:val="24"/>
+                <w:szCs w:val="24"/>
+              </w:rPr>
+              <w:t>(</w:t>
+            </w:r>
+            <w:r>
+              <w:rPr>
+                <w:color w:val="000000"/>
+                <w:sz w:val="24"/>
+                <w:szCs w:val="24"/>
+              </w:rPr>
+              <w:t>2</w:t>
             </w:r>
             <w:r>
               <w:rPr>
@@ -1842,15 +1658,23 @@
                 <w:sz w:val="24"/>
                 <w:szCs w:val="24"/>
               </w:rPr>
-              <w:t> </w:t>
-            </w:r>
-            <w:r>
-              <w:rPr>
-                <w:color w:val="000000"/>
-                <w:sz w:val="24"/>
-                <w:szCs w:val="24"/>
-              </w:rPr>
-              <w:t>yr)</w:t>
+              <w:t> yr</w:t>
+            </w:r>
+            <w:r>
+              <w:rPr>
+                <w:color w:val="000000"/>
+                <w:sz w:val="24"/>
+                <w:szCs w:val="24"/>
+              </w:rPr>
+              <w:t>s</w:t>
+            </w:r>
+            <w:r>
+              <w:rPr>
+                <w:color w:val="000000"/>
+                <w:sz w:val="24"/>
+                <w:szCs w:val="24"/>
+              </w:rPr>
+              <w:t>)</w:t>
             </w:r>
           </w:p>
         </w:tc>
@@ -1878,6 +1702,650 @@
             <w:r>
               <w:rPr>
                 <w:b/>
+                <w:sz w:val="24"/>
+                <w:szCs w:val="24"/>
+              </w:rPr>
+              <w:t>Apache Hudi</w:t>
+            </w:r>
+            <w:r>
+              <w:rPr>
+                <w:b/>
+                <w:color w:val="000000"/>
+                <w:sz w:val="24"/>
+                <w:szCs w:val="24"/>
+              </w:rPr>
+              <w:t xml:space="preserve"> Contributor</w:t>
+            </w:r>
+            <w:r>
+              <w:rPr>
+                <w:color w:val="000000"/>
+                <w:sz w:val="24"/>
+                <w:szCs w:val="24"/>
+              </w:rPr>
+              <w:t>,</w:t>
+            </w:r>
+          </w:p>
+          <w:p>
+            <w:pPr>
+              <w:pBdr>
+                <w:top w:val="nil"/>
+                <w:left w:val="nil"/>
+                <w:bottom w:val="nil"/>
+                <w:right w:val="nil"/>
+                <w:between w:val="nil"/>
+              </w:pBdr>
+              <w:spacing w:line="264" w:lineRule="auto"/>
+              <w:rPr>
+                <w:color w:val="000000"/>
+                <w:sz w:val="24"/>
+                <w:szCs w:val="24"/>
+              </w:rPr>
+            </w:pPr>
+            <w:r>
+              <w:rPr>
+                <w:b/>
+                <w:sz w:val="24"/>
+                <w:szCs w:val="24"/>
+              </w:rPr>
+              <w:t>The Apache Software Foundation</w:t>
+            </w:r>
+          </w:p>
+        </w:tc>
+      </w:tr>
+    </w:tbl>
+    <w:p>
+      <w:pPr>
+        <w:pBdr>
+          <w:top w:val="nil"/>
+          <w:left w:val="nil"/>
+          <w:bottom w:val="nil"/>
+          <w:right w:val="nil"/>
+          <w:between w:val="nil"/>
+        </w:pBdr>
+        <w:spacing w:before="120" w:after="60" w:line="264" w:lineRule="auto"/>
+        <w:jc w:val="both"/>
+        <w:rPr>
+          <w:sz w:val="24"/>
+          <w:szCs w:val="24"/>
+        </w:rPr>
+      </w:pPr>
+      <w:hyperlink r:id="rId14" w:history="1">
+        <w:r>
+          <w:rPr>
+            <w:rStyle w:val="Hyperlink"/>
+            <w:sz w:val="24"/>
+            <w:szCs w:val="24"/>
+          </w:rPr>
+          <w:t>Apache Hudi</w:t>
+        </w:r>
+      </w:hyperlink>
+      <w:r>
+        <w:rPr>
+          <w:sz w:val="24"/>
+          <w:szCs w:val="24"/>
+        </w:rPr>
+        <w:t xml:space="preserve"> is</w:t>
+      </w:r>
+      <w:r>
+        <w:rPr>
+          <w:sz w:val="24"/>
+          <w:szCs w:val="24"/>
+        </w:rPr>
+        <w:t xml:space="preserve"> a</w:t>
+      </w:r>
+      <w:r>
+        <w:rPr>
+          <w:sz w:val="24"/>
+          <w:szCs w:val="24"/>
+        </w:rPr>
+        <w:t xml:space="preserve"> </w:t>
+      </w:r>
+      <w:r>
+        <w:rPr>
+          <w:sz w:val="24"/>
+          <w:szCs w:val="24"/>
+        </w:rPr>
+        <w:t>data l</w:t>
+      </w:r>
+      <w:r>
+        <w:rPr>
+          <w:sz w:val="24"/>
+          <w:szCs w:val="24"/>
+        </w:rPr>
+        <w:t>akehouse platform</w:t>
+      </w:r>
+      <w:r>
+        <w:rPr>
+          <w:sz w:val="24"/>
+          <w:szCs w:val="24"/>
+        </w:rPr>
+        <w:t xml:space="preserve"> that brings </w:t>
+      </w:r>
+      <w:r>
+        <w:rPr>
+          <w:sz w:val="24"/>
+          <w:szCs w:val="24"/>
+        </w:rPr>
+        <w:t xml:space="preserve">database functionality </w:t>
+      </w:r>
+      <w:r>
+        <w:rPr>
+          <w:sz w:val="24"/>
+          <w:szCs w:val="24"/>
+        </w:rPr>
+        <w:t>to d</w:t>
+      </w:r>
+      <w:r>
+        <w:rPr>
+          <w:sz w:val="24"/>
+          <w:szCs w:val="24"/>
+        </w:rPr>
+        <w:t xml:space="preserve">ata </w:t>
+      </w:r>
+      <w:r>
+        <w:rPr>
+          <w:sz w:val="24"/>
+          <w:szCs w:val="24"/>
+        </w:rPr>
+        <w:t>l</w:t>
+      </w:r>
+      <w:r>
+        <w:rPr>
+          <w:sz w:val="24"/>
+          <w:szCs w:val="24"/>
+        </w:rPr>
+        <w:t>ake</w:t>
+      </w:r>
+      <w:r>
+        <w:rPr>
+          <w:sz w:val="24"/>
+          <w:szCs w:val="24"/>
+        </w:rPr>
+        <w:t>s</w:t>
+      </w:r>
+      <w:r>
+        <w:rPr>
+          <w:sz w:val="24"/>
+          <w:szCs w:val="24"/>
+        </w:rPr>
+        <w:t xml:space="preserve"> </w:t>
+      </w:r>
+      <w:r>
+        <w:rPr>
+          <w:sz w:val="24"/>
+          <w:szCs w:val="24"/>
+        </w:rPr>
+        <w:t xml:space="preserve">and </w:t>
+      </w:r>
+      <w:r>
+        <w:rPr>
+          <w:sz w:val="24"/>
+          <w:szCs w:val="24"/>
+        </w:rPr>
+        <w:t xml:space="preserve">enables </w:t>
+      </w:r>
+      <w:r>
+        <w:rPr>
+          <w:sz w:val="24"/>
+          <w:szCs w:val="24"/>
+        </w:rPr>
+        <w:t>incremental processing for low</w:t>
+      </w:r>
+      <w:r>
+        <w:rPr>
+          <w:sz w:val="24"/>
+          <w:szCs w:val="24"/>
+        </w:rPr>
+        <w:t>-</w:t>
+      </w:r>
+      <w:r>
+        <w:rPr>
+          <w:sz w:val="24"/>
+          <w:szCs w:val="24"/>
+        </w:rPr>
+        <w:t>latency analytics</w:t>
+      </w:r>
+      <w:r>
+        <w:rPr>
+          <w:sz w:val="24"/>
+          <w:szCs w:val="24"/>
+        </w:rPr>
+        <w:t>.</w:t>
+      </w:r>
+    </w:p>
+    <w:p>
+      <w:pPr>
+        <w:pBdr>
+          <w:top w:val="nil"/>
+          <w:left w:val="nil"/>
+          <w:bottom w:val="nil"/>
+          <w:right w:val="nil"/>
+          <w:between w:val="nil"/>
+        </w:pBdr>
+        <w:spacing w:before="120" w:after="60" w:line="264" w:lineRule="auto"/>
+        <w:ind w:left="170" w:hanging="170"/>
+        <w:jc w:val="both"/>
+        <w:rPr>
+          <w:sz w:val="24"/>
+          <w:szCs w:val="24"/>
+        </w:rPr>
+      </w:pPr>
+      <w:r>
+        <w:rPr>
+          <w:sz w:val="24"/>
+          <w:szCs w:val="24"/>
+        </w:rPr>
+        <w:t>• </w:t>
+      </w:r>
+      <w:r>
+        <w:rPr>
+          <w:sz w:val="24"/>
+          <w:szCs w:val="24"/>
+        </w:rPr>
+        <w:t>Optimized serialization and deserialization of records in Flink stream writing</w:t>
+      </w:r>
+      <w:r>
+        <w:rPr>
+          <w:sz w:val="24"/>
+          <w:szCs w:val="24"/>
+        </w:rPr>
+        <w:t xml:space="preserve"> to Hudi table</w:t>
+      </w:r>
+      <w:r>
+        <w:rPr>
+          <w:sz w:val="24"/>
+          <w:szCs w:val="24"/>
+        </w:rPr>
+        <w:t>, resulting in a 30% increase in processing speed and 2x reduction in memory usage</w:t>
+      </w:r>
+      <w:r>
+        <w:rPr>
+          <w:sz w:val="24"/>
+          <w:szCs w:val="24"/>
+        </w:rPr>
+        <w:t xml:space="preserve"> (</w:t>
+      </w:r>
+      <w:hyperlink r:id="rId15" w:history="1">
+        <w:r>
+          <w:rPr>
+            <w:rStyle w:val="Hyperlink"/>
+            <w:sz w:val="24"/>
+            <w:szCs w:val="24"/>
+          </w:rPr>
+          <w:t>design doc</w:t>
+        </w:r>
+      </w:hyperlink>
+      <w:r>
+        <w:rPr>
+          <w:sz w:val="24"/>
+          <w:szCs w:val="24"/>
+        </w:rPr>
+        <w:t xml:space="preserve">, </w:t>
+      </w:r>
+      <w:hyperlink r:id="rId16" w:history="1">
+        <w:r>
+          <w:rPr>
+            <w:rStyle w:val="Hyperlink"/>
+            <w:sz w:val="24"/>
+            <w:szCs w:val="24"/>
+          </w:rPr>
+          <w:t>main changes</w:t>
+        </w:r>
+      </w:hyperlink>
+      <w:r>
+        <w:rPr>
+          <w:sz w:val="24"/>
+          <w:szCs w:val="24"/>
+        </w:rPr>
+        <w:t>).</w:t>
+      </w:r>
+      <w:r>
+        <w:rPr>
+          <w:sz w:val="24"/>
+          <w:szCs w:val="24"/>
+        </w:rPr>
+        <w:t xml:space="preserve"> Released in </w:t>
+      </w:r>
+      <w:hyperlink r:id="rId17" w:history="1">
+        <w:r>
+          <w:rPr>
+            <w:rStyle w:val="Hyperlink"/>
+            <w:sz w:val="24"/>
+            <w:szCs w:val="24"/>
+          </w:rPr>
+          <w:t>Hudi 1.0.2</w:t>
+        </w:r>
+      </w:hyperlink>
+      <w:r>
+        <w:rPr>
+          <w:sz w:val="24"/>
+          <w:szCs w:val="24"/>
+        </w:rPr>
+        <w:t>.</w:t>
+      </w:r>
+    </w:p>
+    <w:p>
+      <w:pPr>
+        <w:pBdr>
+          <w:top w:val="nil"/>
+          <w:left w:val="nil"/>
+          <w:bottom w:val="nil"/>
+          <w:right w:val="nil"/>
+          <w:between w:val="nil"/>
+        </w:pBdr>
+        <w:spacing w:before="60" w:after="60" w:line="264" w:lineRule="auto"/>
+        <w:ind w:left="170" w:hanging="170"/>
+        <w:jc w:val="both"/>
+        <w:rPr>
+          <w:sz w:val="24"/>
+          <w:szCs w:val="24"/>
+        </w:rPr>
+      </w:pPr>
+      <w:r>
+        <w:rPr>
+          <w:sz w:val="24"/>
+          <w:szCs w:val="24"/>
+        </w:rPr>
+        <w:lastRenderedPageBreak/>
+        <w:t>• </w:t>
+      </w:r>
+      <w:r>
+        <w:rPr>
+          <w:sz w:val="24"/>
+          <w:szCs w:val="24"/>
+        </w:rPr>
+        <w:t xml:space="preserve">Implemented </w:t>
+      </w:r>
+      <w:r>
+        <w:rPr>
+          <w:sz w:val="24"/>
+          <w:szCs w:val="24"/>
+        </w:rPr>
+        <w:t>4 local optimizations (</w:t>
+      </w:r>
+      <w:hyperlink r:id="rId18" w:history="1">
+        <w:r>
+          <w:rPr>
+            <w:rStyle w:val="Hyperlink"/>
+            <w:sz w:val="24"/>
+            <w:szCs w:val="24"/>
+          </w:rPr>
+          <w:t>[1]</w:t>
+        </w:r>
+      </w:hyperlink>
+      <w:r>
+        <w:rPr>
+          <w:sz w:val="24"/>
+          <w:szCs w:val="24"/>
+        </w:rPr>
+        <w:t xml:space="preserve">, </w:t>
+      </w:r>
+      <w:hyperlink r:id="rId19" w:history="1">
+        <w:r>
+          <w:rPr>
+            <w:rStyle w:val="Hyperlink"/>
+            <w:sz w:val="24"/>
+            <w:szCs w:val="24"/>
+          </w:rPr>
+          <w:t>[2]</w:t>
+        </w:r>
+      </w:hyperlink>
+      <w:r>
+        <w:rPr>
+          <w:sz w:val="24"/>
+          <w:szCs w:val="24"/>
+        </w:rPr>
+        <w:t xml:space="preserve">, </w:t>
+      </w:r>
+      <w:hyperlink r:id="rId20" w:history="1">
+        <w:r>
+          <w:rPr>
+            <w:rStyle w:val="Hyperlink"/>
+            <w:sz w:val="24"/>
+            <w:szCs w:val="24"/>
+          </w:rPr>
+          <w:t>[3]</w:t>
+        </w:r>
+      </w:hyperlink>
+      <w:r>
+        <w:rPr>
+          <w:sz w:val="24"/>
+          <w:szCs w:val="24"/>
+        </w:rPr>
+        <w:t xml:space="preserve">, </w:t>
+      </w:r>
+      <w:hyperlink r:id="rId21" w:history="1">
+        <w:r>
+          <w:rPr>
+            <w:rStyle w:val="Hyperlink"/>
+            <w:sz w:val="24"/>
+            <w:szCs w:val="24"/>
+          </w:rPr>
+          <w:t>[4]</w:t>
+        </w:r>
+      </w:hyperlink>
+      <w:r>
+        <w:rPr>
+          <w:sz w:val="24"/>
+          <w:szCs w:val="24"/>
+        </w:rPr>
+        <w:t>) resulting in a 1</w:t>
+      </w:r>
+      <w:r>
+        <w:rPr>
+          <w:sz w:val="24"/>
+          <w:szCs w:val="24"/>
+        </w:rPr>
+        <w:t>0% increase in processing speed</w:t>
+      </w:r>
+      <w:r>
+        <w:rPr>
+          <w:sz w:val="24"/>
+          <w:szCs w:val="24"/>
+        </w:rPr>
+        <w:t xml:space="preserve"> and 30% reduction in garbage collection overhead.</w:t>
+      </w:r>
+      <w:r>
+        <w:rPr>
+          <w:sz w:val="24"/>
+          <w:szCs w:val="24"/>
+        </w:rPr>
+        <w:t xml:space="preserve"> Released in </w:t>
+      </w:r>
+      <w:hyperlink r:id="rId22" w:history="1">
+        <w:r>
+          <w:rPr>
+            <w:rStyle w:val="Hyperlink"/>
+            <w:sz w:val="24"/>
+            <w:szCs w:val="24"/>
+          </w:rPr>
+          <w:t>Hudi 1.0.1</w:t>
+        </w:r>
+      </w:hyperlink>
+      <w:r>
+        <w:rPr>
+          <w:sz w:val="24"/>
+          <w:szCs w:val="24"/>
+        </w:rPr>
+        <w:t>.</w:t>
+      </w:r>
+    </w:p>
+    <w:p>
+      <w:pPr>
+        <w:pBdr>
+          <w:top w:val="nil"/>
+          <w:left w:val="nil"/>
+          <w:bottom w:val="nil"/>
+          <w:right w:val="nil"/>
+          <w:between w:val="nil"/>
+        </w:pBdr>
+        <w:spacing w:before="60" w:after="120" w:line="264" w:lineRule="auto"/>
+        <w:ind w:left="170" w:hanging="170"/>
+        <w:jc w:val="both"/>
+        <w:rPr>
+          <w:color w:val="000000"/>
+          <w:sz w:val="24"/>
+          <w:szCs w:val="24"/>
+        </w:rPr>
+      </w:pPr>
+      <w:r>
+        <w:rPr>
+          <w:sz w:val="24"/>
+          <w:szCs w:val="24"/>
+        </w:rPr>
+        <w:t>• </w:t>
+      </w:r>
+      <w:r>
+        <w:rPr>
+          <w:sz w:val="24"/>
+          <w:szCs w:val="24"/>
+        </w:rPr>
+        <w:t xml:space="preserve">Contributed </w:t>
+      </w:r>
+      <w:r>
+        <w:rPr>
+          <w:sz w:val="24"/>
+          <w:szCs w:val="24"/>
+        </w:rPr>
+        <w:t xml:space="preserve">40+ </w:t>
+      </w:r>
+      <w:hyperlink r:id="rId23" w:history="1">
+        <w:r>
+          <w:rPr>
+            <w:rStyle w:val="Hyperlink"/>
+            <w:sz w:val="24"/>
+            <w:szCs w:val="24"/>
+          </w:rPr>
+          <w:t>merged pull requests</w:t>
+        </w:r>
+      </w:hyperlink>
+      <w:r>
+        <w:rPr>
+          <w:color w:val="000000"/>
+          <w:sz w:val="24"/>
+          <w:szCs w:val="24"/>
+        </w:rPr>
+        <w:t>.</w:t>
+      </w:r>
+    </w:p>
+    <w:tbl>
+      <w:tblPr>
+        <w:tblStyle w:val="a4"/>
+        <w:tblW w:w="9854" w:type="dxa"/>
+        <w:tblInd w:w="-108" w:type="dxa"/>
+        <w:tblLayout w:type="fixed"/>
+        <w:tblLook w:val="0000" w:firstRow="0" w:lastRow="0" w:firstColumn="0" w:lastColumn="0" w:noHBand="0" w:noVBand="0"/>
+      </w:tblPr>
+      <w:tblGrid>
+        <w:gridCol w:w="2235"/>
+        <w:gridCol w:w="7619"/>
+      </w:tblGrid>
+      <w:tr>
+        <w:tc>
+          <w:tcPr>
+            <w:tcW w:w="2235" w:type="dxa"/>
+            <w:vAlign w:val="center"/>
+          </w:tcPr>
+          <w:p>
+            <w:pPr>
+              <w:pBdr>
+                <w:top w:val="nil"/>
+                <w:left w:val="nil"/>
+                <w:bottom w:val="nil"/>
+                <w:right w:val="nil"/>
+                <w:between w:val="nil"/>
+              </w:pBdr>
+              <w:spacing w:line="264" w:lineRule="auto"/>
+              <w:ind w:left="284"/>
+              <w:jc w:val="center"/>
+              <w:rPr>
+                <w:color w:val="000000"/>
+                <w:sz w:val="24"/>
+                <w:szCs w:val="24"/>
+              </w:rPr>
+            </w:pPr>
+            <w:r>
+              <w:rPr>
+                <w:color w:val="000000"/>
+                <w:sz w:val="24"/>
+                <w:szCs w:val="24"/>
+              </w:rPr>
+              <w:t>Feb 22 -</w:t>
+            </w:r>
+            <w:r>
+              <w:rPr>
+                <w:color w:val="000000"/>
+                <w:sz w:val="24"/>
+                <w:szCs w:val="24"/>
+              </w:rPr>
+              <w:t xml:space="preserve"> </w:t>
+            </w:r>
+            <w:r>
+              <w:rPr>
+                <w:color w:val="000000"/>
+                <w:sz w:val="24"/>
+                <w:szCs w:val="24"/>
+              </w:rPr>
+              <w:t>May 23</w:t>
+            </w:r>
+            <w:r>
+              <w:rPr>
+                <w:color w:val="000000"/>
+                <w:sz w:val="24"/>
+                <w:szCs w:val="24"/>
+              </w:rPr>
+              <w:t xml:space="preserve"> (1</w:t>
+            </w:r>
+            <w:r>
+              <w:rPr>
+                <w:color w:val="000000"/>
+                <w:sz w:val="24"/>
+                <w:szCs w:val="24"/>
+              </w:rPr>
+              <w:t>+</w:t>
+            </w:r>
+            <w:r>
+              <w:rPr>
+                <w:color w:val="000000"/>
+                <w:sz w:val="24"/>
+                <w:szCs w:val="24"/>
+              </w:rPr>
+              <w:t> </w:t>
+            </w:r>
+            <w:r>
+              <w:rPr>
+                <w:color w:val="000000"/>
+                <w:sz w:val="24"/>
+                <w:szCs w:val="24"/>
+              </w:rPr>
+              <w:t>yr)</w:t>
+            </w:r>
+          </w:p>
+        </w:tc>
+        <w:tc>
+          <w:tcPr>
+            <w:tcW w:w="7619" w:type="dxa"/>
+            <w:vAlign w:val="center"/>
+          </w:tcPr>
+          <w:p>
+            <w:pPr>
+              <w:pBdr>
+                <w:top w:val="nil"/>
+                <w:left w:val="nil"/>
+                <w:bottom w:val="nil"/>
+                <w:right w:val="nil"/>
+                <w:between w:val="nil"/>
+              </w:pBdr>
+              <w:spacing w:line="264" w:lineRule="auto"/>
+              <w:rPr>
+                <w:color w:val="000000"/>
+                <w:sz w:val="24"/>
+                <w:szCs w:val="24"/>
+              </w:rPr>
+            </w:pPr>
+            <w:r>
+              <w:rPr>
+                <w:b/>
                 <w:color w:val="000000"/>
                 <w:sz w:val="24"/>
                 <w:szCs w:val="24"/>
@@ -2220,7 +2688,6 @@
           <w:sz w:val="24"/>
           <w:szCs w:val="24"/>
         </w:rPr>
-        <w:lastRenderedPageBreak/>
         <w:t>EDUCATION</w:t>
       </w:r>
     </w:p>
@@ -2349,7 +2816,7 @@
           <w:szCs w:val="24"/>
         </w:rPr>
       </w:pPr>
-      <w:hyperlink r:id="rId22">
+      <w:hyperlink r:id="rId24">
         <w:r>
           <w:rPr>
             <w:color w:val="0000FF"/>
@@ -2360,7 +2827,7 @@
       </w:hyperlink>
     </w:p>
     <w:sectPr>
-      <w:footerReference w:type="default" r:id="rId23"/>
+      <w:footerReference w:type="default" r:id="rId25"/>
       <w:pgSz w:w="11906" w:h="16838"/>
       <w:pgMar w:top="851" w:right="1134" w:bottom="851" w:left="1134" w:header="113" w:footer="113" w:gutter="0"/>
       <w:pgNumType w:start="1"/>
@@ -2571,6 +3038,7 @@
     <w:lsdException w:name="HTML Sample" w:semiHidden="1" w:unhideWhenUsed="1"/>
     <w:lsdException w:name="HTML Typewriter" w:semiHidden="1" w:unhideWhenUsed="1"/>
     <w:lsdException w:name="HTML Variable" w:semiHidden="1" w:unhideWhenUsed="1"/>
+    <w:lsdException w:name="Normal Table" w:semiHidden="1" w:unhideWhenUsed="1"/>
     <w:lsdException w:name="annotation subject" w:semiHidden="1" w:unhideWhenUsed="1"/>
     <w:lsdException w:name="No List" w:semiHidden="1" w:unhideWhenUsed="1"/>
     <w:lsdException w:name="Outline List 1" w:semiHidden="1" w:unhideWhenUsed="1"/>
@@ -2614,8 +3082,10 @@
     <w:lsdException w:name="Table Elegant" w:semiHidden="1" w:unhideWhenUsed="1"/>
     <w:lsdException w:name="Table Professional" w:semiHidden="1" w:unhideWhenUsed="1"/>
     <w:lsdException w:name="Table Subtle 1" w:semiHidden="1" w:unhideWhenUsed="1"/>
+    <w:lsdException w:name="Table Subtle 2" w:semiHidden="1" w:unhideWhenUsed="1"/>
     <w:lsdException w:name="Table Web 1" w:semiHidden="1" w:unhideWhenUsed="1"/>
     <w:lsdException w:name="Table Web 2" w:semiHidden="1" w:unhideWhenUsed="1"/>
+    <w:lsdException w:name="Table Web 3" w:semiHidden="1" w:unhideWhenUsed="1"/>
     <w:lsdException w:name="Balloon Text" w:semiHidden="1" w:unhideWhenUsed="1"/>
     <w:lsdException w:name="Table Grid" w:uiPriority="39"/>
     <w:lsdException w:name="Table Theme" w:semiHidden="1" w:unhideWhenUsed="1"/>
@@ -3176,6 +3646,18 @@
       <w:shd w:val="clear" w:color="auto" w:fill="E1DFDD"/>
     </w:rPr>
   </w:style>
+  <w:style w:type="character" w:styleId="UnresolvedMention">
+    <w:name w:val="Unresolved Mention"/>
+    <w:basedOn w:val="DefaultParagraphFont"/>
+    <w:uiPriority w:val="99"/>
+    <w:semiHidden/>
+    <w:unhideWhenUsed/>
+    <w:rsid w:val="007504EC"/>
+    <w:rPr>
+      <w:color w:val="605E5C"/>
+      <w:shd w:val="clear" w:color="auto" w:fill="E1DFDD"/>
+    </w:rPr>
+  </w:style>
 </w:styles>
 </file>
 

</xml_diff>

<commit_message>
files: update years counters
</commit_message>
<xml_diff>
--- a/file/CV_Geser_Dugarov.docx
+++ b/file/CV_Geser_Dugarov.docx
@@ -869,15 +869,7 @@
                 <w:sz w:val="24"/>
                 <w:szCs w:val="24"/>
               </w:rPr>
-              <w:t>2</w:t>
-            </w:r>
-            <w:r>
-              <w:rPr>
-                <w:color w:val="000000"/>
-                <w:sz w:val="24"/>
-                <w:szCs w:val="24"/>
-              </w:rPr>
-              <w:t>.5</w:t>
+              <w:t>3</w:t>
             </w:r>
             <w:r>
               <w:rPr>
@@ -1177,31 +1169,7 @@
                 <w:sz w:val="24"/>
                 <w:szCs w:val="24"/>
               </w:rPr>
-              <w:t>Apr</w:t>
-            </w:r>
-            <w:r>
-              <w:rPr>
-                <w:color w:val="000000"/>
-                <w:sz w:val="24"/>
-                <w:szCs w:val="24"/>
-              </w:rPr>
-              <w:t xml:space="preserve"> 2</w:t>
-            </w:r>
-            <w:r>
-              <w:rPr>
-                <w:color w:val="000000"/>
-                <w:sz w:val="24"/>
-                <w:szCs w:val="24"/>
-              </w:rPr>
-              <w:t>6</w:t>
-            </w:r>
-            <w:r>
-              <w:rPr>
-                <w:color w:val="000000"/>
-                <w:sz w:val="24"/>
-                <w:szCs w:val="24"/>
-              </w:rPr>
-              <w:t xml:space="preserve"> – Current</w:t>
+              <w:t>Apr 26 – Current</w:t>
             </w:r>
           </w:p>
           <w:p>
@@ -1236,33 +1204,24 @@
                 <w:sz w:val="24"/>
                 <w:szCs w:val="24"/>
               </w:rPr>
-              <w:t>0.5</w:t>
-            </w:r>
-            <w:r>
-              <w:rPr>
-                <w:sz w:val="24"/>
-                <w:szCs w:val="24"/>
-              </w:rPr>
-              <w:t>–</w:t>
-            </w:r>
-            <w:r>
-              <w:rPr>
-                <w:color w:val="000000"/>
-                <w:sz w:val="24"/>
-                <w:szCs w:val="24"/>
-              </w:rPr>
-              <w:t> </w:t>
-            </w:r>
-            <w:proofErr w:type="spellStart"/>
-            <w:r>
-              <w:rPr>
-                <w:color w:val="000000"/>
-                <w:sz w:val="24"/>
-                <w:szCs w:val="24"/>
-              </w:rPr>
-              <w:t>yr</w:t>
-            </w:r>
-            <w:proofErr w:type="spellEnd"/>
+              <w:t>~</w:t>
+            </w:r>
+            <w:r>
+              <w:rPr>
+                <w:color w:val="000000"/>
+                <w:sz w:val="24"/>
+                <w:szCs w:val="24"/>
+              </w:rPr>
+              <w:t>0.5 yr</w:t>
+            </w:r>
+            <w:r>
+              <w:rPr>
+                <w:color w:val="000000"/>
+                <w:sz w:val="24"/>
+                <w:szCs w:val="24"/>
+              </w:rPr>
+              <w:t>s</w:t>
+            </w:r>
             <w:r>
               <w:rPr>
                 <w:color w:val="000000"/>
@@ -1378,16 +1337,10 @@
           <w:sz w:val="24"/>
           <w:szCs w:val="24"/>
         </w:rPr>
-        <w:t xml:space="preserve"> treating coding-agent CLIs (Claude Code, Codex) as bounded executors inside reproducible pipelines</w:t>
-      </w:r>
-      <w:r>
-        <w:rPr>
-          <w:color w:val="000000"/>
-          <w:sz w:val="24"/>
-          <w:szCs w:val="24"/>
-        </w:rPr>
-        <w:t>.</w:t>
-      </w:r>
+        <w:t xml:space="preserve"> treating coding-agent CLIs (Claude Code, Codex) as bounded executors inside reproducible pipelines.</w:t>
+      </w:r>
+      <w:bookmarkStart w:id="1" w:name="_GoBack"/>
+      <w:bookmarkEnd w:id="1"/>
     </w:p>
     <w:p>
       <w:pPr>
@@ -1444,8 +1397,6 @@
         </w:rPr>
         <w:t xml:space="preserve"> </w:t>
       </w:r>
-      <w:bookmarkStart w:id="1" w:name="_GoBack"/>
-      <w:bookmarkEnd w:id="1"/>
       <w:r>
         <w:rPr>
           <w:sz w:val="24"/>
@@ -1643,14 +1594,6 @@
                 <w:szCs w:val="24"/>
               </w:rPr>
               <w:t>2</w:t>
-            </w:r>
-            <w:r>
-              <w:rPr>
-                <w:color w:val="000000"/>
-                <w:sz w:val="24"/>
-                <w:szCs w:val="24"/>
-              </w:rPr>
-              <w:t>+</w:t>
             </w:r>
             <w:r>
               <w:rPr>

</xml_diff>

<commit_message>
chore: update years counters in files
</commit_message>
<xml_diff>
--- a/file/CV_Geser_Dugarov.docx
+++ b/file/CV_Geser_Dugarov.docx
@@ -869,15 +869,7 @@
                 <w:sz w:val="24"/>
                 <w:szCs w:val="24"/>
               </w:rPr>
-              <w:t>2</w:t>
-            </w:r>
-            <w:r>
-              <w:rPr>
-                <w:color w:val="000000"/>
-                <w:sz w:val="24"/>
-                <w:szCs w:val="24"/>
-              </w:rPr>
-              <w:t>.5</w:t>
+              <w:t>3</w:t>
             </w:r>
             <w:r>
               <w:rPr>
@@ -1177,31 +1169,7 @@
                 <w:sz w:val="24"/>
                 <w:szCs w:val="24"/>
               </w:rPr>
-              <w:t>Apr</w:t>
-            </w:r>
-            <w:r>
-              <w:rPr>
-                <w:color w:val="000000"/>
-                <w:sz w:val="24"/>
-                <w:szCs w:val="24"/>
-              </w:rPr>
-              <w:t xml:space="preserve"> 2</w:t>
-            </w:r>
-            <w:r>
-              <w:rPr>
-                <w:color w:val="000000"/>
-                <w:sz w:val="24"/>
-                <w:szCs w:val="24"/>
-              </w:rPr>
-              <w:t>6</w:t>
-            </w:r>
-            <w:r>
-              <w:rPr>
-                <w:color w:val="000000"/>
-                <w:sz w:val="24"/>
-                <w:szCs w:val="24"/>
-              </w:rPr>
-              <w:t xml:space="preserve"> – Current</w:t>
+              <w:t>Apr 26 – Current</w:t>
             </w:r>
           </w:p>
           <w:p>
@@ -1236,33 +1204,24 @@
                 <w:sz w:val="24"/>
                 <w:szCs w:val="24"/>
               </w:rPr>
-              <w:t>0.5</w:t>
-            </w:r>
-            <w:r>
-              <w:rPr>
-                <w:sz w:val="24"/>
-                <w:szCs w:val="24"/>
-              </w:rPr>
-              <w:t>–</w:t>
-            </w:r>
-            <w:r>
-              <w:rPr>
-                <w:color w:val="000000"/>
-                <w:sz w:val="24"/>
-                <w:szCs w:val="24"/>
-              </w:rPr>
-              <w:t> </w:t>
-            </w:r>
-            <w:proofErr w:type="spellStart"/>
-            <w:r>
-              <w:rPr>
-                <w:color w:val="000000"/>
-                <w:sz w:val="24"/>
-                <w:szCs w:val="24"/>
-              </w:rPr>
-              <w:t>yr</w:t>
-            </w:r>
-            <w:proofErr w:type="spellEnd"/>
+              <w:t>~</w:t>
+            </w:r>
+            <w:r>
+              <w:rPr>
+                <w:color w:val="000000"/>
+                <w:sz w:val="24"/>
+                <w:szCs w:val="24"/>
+              </w:rPr>
+              <w:t>0.5 yr</w:t>
+            </w:r>
+            <w:r>
+              <w:rPr>
+                <w:color w:val="000000"/>
+                <w:sz w:val="24"/>
+                <w:szCs w:val="24"/>
+              </w:rPr>
+              <w:t>s</w:t>
+            </w:r>
             <w:r>
               <w:rPr>
                 <w:color w:val="000000"/>
@@ -1378,16 +1337,10 @@
           <w:sz w:val="24"/>
           <w:szCs w:val="24"/>
         </w:rPr>
-        <w:t xml:space="preserve"> treating coding-agent CLIs (Claude Code, Codex) as bounded executors inside reproducible pipelines</w:t>
-      </w:r>
-      <w:r>
-        <w:rPr>
-          <w:color w:val="000000"/>
-          <w:sz w:val="24"/>
-          <w:szCs w:val="24"/>
-        </w:rPr>
-        <w:t>.</w:t>
-      </w:r>
+        <w:t xml:space="preserve"> treating coding-agent CLIs (Claude Code, Codex) as bounded executors inside reproducible pipelines.</w:t>
+      </w:r>
+      <w:bookmarkStart w:id="1" w:name="_GoBack"/>
+      <w:bookmarkEnd w:id="1"/>
     </w:p>
     <w:p>
       <w:pPr>
@@ -1444,8 +1397,6 @@
         </w:rPr>
         <w:t xml:space="preserve"> </w:t>
       </w:r>
-      <w:bookmarkStart w:id="1" w:name="_GoBack"/>
-      <w:bookmarkEnd w:id="1"/>
       <w:r>
         <w:rPr>
           <w:sz w:val="24"/>
@@ -1643,14 +1594,6 @@
                 <w:szCs w:val="24"/>
               </w:rPr>
               <w:t>2</w:t>
-            </w:r>
-            <w:r>
-              <w:rPr>
-                <w:color w:val="000000"/>
-                <w:sz w:val="24"/>
-                <w:szCs w:val="24"/>
-              </w:rPr>
-              <w:t>+</w:t>
             </w:r>
             <w:r>
               <w:rPr>

</xml_diff>

<commit_message>
files: move focus on Apache Hudi contribution
</commit_message>
<xml_diff>
--- a/file/CV_Geser_Dugarov.docx
+++ b/file/CV_Geser_Dugarov.docx
@@ -465,6 +465,14 @@
           <w:sz w:val="24"/>
           <w:szCs w:val="24"/>
         </w:rPr>
+        <w:t xml:space="preserve"> (50+ merged PRs)</w:t>
+      </w:r>
+      <w:r>
+        <w:rPr>
+          <w:color w:val="000000"/>
+          <w:sz w:val="24"/>
+          <w:szCs w:val="24"/>
+        </w:rPr>
         <w:t>.</w:t>
       </w:r>
     </w:p>
@@ -670,7 +678,7 @@
           <w:sz w:val="24"/>
           <w:szCs w:val="24"/>
         </w:rPr>
-        <w:t xml:space="preserve">Python, Maven, </w:t>
+        <w:t xml:space="preserve">Python, </w:t>
       </w:r>
       <w:r>
         <w:rPr>
@@ -690,7 +698,7 @@
           <w:sz w:val="24"/>
           <w:szCs w:val="24"/>
         </w:rPr>
-        <w:t>, Hadoop Ecosystem</w:t>
+        <w:t xml:space="preserve">, </w:t>
       </w:r>
       <w:r>
         <w:rPr>
@@ -700,7 +708,7 @@
           <w:sz w:val="24"/>
           <w:szCs w:val="24"/>
         </w:rPr>
-        <w:t xml:space="preserve">, </w:t>
+        <w:t xml:space="preserve">Data lakehouse, Distributed systems, </w:t>
       </w:r>
       <w:r>
         <w:rPr>
@@ -710,7 +718,7 @@
           <w:sz w:val="24"/>
           <w:szCs w:val="24"/>
         </w:rPr>
-        <w:t>Claude Code / Codex</w:t>
+        <w:t>Hadoop Ecosystem</w:t>
       </w:r>
       <w:r>
         <w:rPr>
@@ -731,6 +739,26 @@
           <w:szCs w:val="24"/>
         </w:rPr>
         <w:t>Agentic workflows</w:t>
+      </w:r>
+      <w:r>
+        <w:rPr>
+          <w:b/>
+          <w:i/>
+          <w:color w:val="000000"/>
+          <w:sz w:val="24"/>
+          <w:szCs w:val="24"/>
+        </w:rPr>
+        <w:t xml:space="preserve">, </w:t>
+      </w:r>
+      <w:r>
+        <w:rPr>
+          <w:b/>
+          <w:i/>
+          <w:color w:val="000000"/>
+          <w:sz w:val="24"/>
+          <w:szCs w:val="24"/>
+        </w:rPr>
+        <w:t>Claude Code / Codex</w:t>
       </w:r>
     </w:p>
     <w:p>
@@ -1169,7 +1197,31 @@
                 <w:sz w:val="24"/>
                 <w:szCs w:val="24"/>
               </w:rPr>
-              <w:t>Apr 26 – Current</w:t>
+              <w:t xml:space="preserve">Jan 24 </w:t>
+            </w:r>
+            <w:r>
+              <w:rPr>
+                <w:color w:val="000000"/>
+                <w:sz w:val="24"/>
+                <w:szCs w:val="24"/>
+              </w:rPr>
+              <w:t>–</w:t>
+            </w:r>
+            <w:r>
+              <w:rPr>
+                <w:color w:val="000000"/>
+                <w:sz w:val="24"/>
+                <w:szCs w:val="24"/>
+              </w:rPr>
+              <w:t xml:space="preserve"> </w:t>
+            </w:r>
+            <w:r>
+              <w:rPr>
+                <w:color w:val="000000"/>
+                <w:sz w:val="24"/>
+                <w:szCs w:val="24"/>
+              </w:rPr>
+              <w:t>Current</w:t>
             </w:r>
           </w:p>
           <w:p>
@@ -1204,15 +1256,23 @@
                 <w:sz w:val="24"/>
                 <w:szCs w:val="24"/>
               </w:rPr>
-              <w:t>~</w:t>
-            </w:r>
-            <w:r>
-              <w:rPr>
-                <w:color w:val="000000"/>
-                <w:sz w:val="24"/>
-                <w:szCs w:val="24"/>
-              </w:rPr>
-              <w:t>0.5 yr</w:t>
+              <w:t>2</w:t>
+            </w:r>
+            <w:r>
+              <w:rPr>
+                <w:color w:val="000000"/>
+                <w:sz w:val="24"/>
+                <w:szCs w:val="24"/>
+              </w:rPr>
+              <w:t>.5+</w:t>
+            </w:r>
+            <w:r>
+              <w:rPr>
+                <w:color w:val="000000"/>
+                <w:sz w:val="24"/>
+                <w:szCs w:val="24"/>
+              </w:rPr>
+              <w:t> yr</w:t>
             </w:r>
             <w:r>
               <w:rPr>
@@ -1259,7 +1319,16 @@
                 <w:sz w:val="24"/>
                 <w:szCs w:val="24"/>
               </w:rPr>
-              <w:t>Open-source: Agentic development tooling</w:t>
+              <w:t>Apache Hudi</w:t>
+            </w:r>
+            <w:r>
+              <w:rPr>
+                <w:b/>
+                <w:color w:val="000000"/>
+                <w:sz w:val="24"/>
+                <w:szCs w:val="24"/>
+              </w:rPr>
+              <w:t xml:space="preserve"> Contributor</w:t>
             </w:r>
             <w:r>
               <w:rPr>
@@ -1292,7 +1361,7 @@
                 <w:sz w:val="24"/>
                 <w:szCs w:val="24"/>
               </w:rPr>
-              <w:t>Personal projects</w:t>
+              <w:t>The Apache Software Foundation</w:t>
             </w:r>
           </w:p>
         </w:tc>
@@ -1310,37 +1379,153 @@
         <w:spacing w:before="120" w:after="60" w:line="264" w:lineRule="auto"/>
         <w:jc w:val="both"/>
         <w:rPr>
-          <w:color w:val="000000"/>
           <w:sz w:val="24"/>
           <w:szCs w:val="24"/>
         </w:rPr>
       </w:pPr>
-      <w:r>
-        <w:rPr>
-          <w:color w:val="000000"/>
-          <w:sz w:val="24"/>
-          <w:szCs w:val="24"/>
-        </w:rPr>
-        <w:t xml:space="preserve">Self-directed work on agent-augmented engineering workflows </w:t>
-      </w:r>
-      <w:r>
-        <w:rPr>
-          <w:color w:val="000000"/>
-          <w:sz w:val="24"/>
-          <w:szCs w:val="24"/>
-        </w:rPr>
-        <w:t>–</w:t>
-      </w:r>
-      <w:r>
-        <w:rPr>
-          <w:color w:val="000000"/>
-          <w:sz w:val="24"/>
-          <w:szCs w:val="24"/>
-        </w:rPr>
-        <w:t xml:space="preserve"> treating coding-agent CLIs (Claude Code, Codex) as bounded executors inside reproducible pipelines.</w:t>
-      </w:r>
-      <w:bookmarkStart w:id="1" w:name="_GoBack"/>
-      <w:bookmarkEnd w:id="1"/>
+      <w:hyperlink r:id="rId12" w:history="1">
+        <w:r>
+          <w:rPr>
+            <w:rStyle w:val="Hyperlink"/>
+            <w:sz w:val="24"/>
+            <w:szCs w:val="24"/>
+          </w:rPr>
+          <w:t>Apache Hudi</w:t>
+        </w:r>
+      </w:hyperlink>
+      <w:r>
+        <w:rPr>
+          <w:sz w:val="24"/>
+          <w:szCs w:val="24"/>
+        </w:rPr>
+        <w:t xml:space="preserve"> is</w:t>
+      </w:r>
+      <w:r>
+        <w:rPr>
+          <w:sz w:val="24"/>
+          <w:szCs w:val="24"/>
+        </w:rPr>
+        <w:t xml:space="preserve"> a</w:t>
+      </w:r>
+      <w:r>
+        <w:rPr>
+          <w:sz w:val="24"/>
+          <w:szCs w:val="24"/>
+        </w:rPr>
+        <w:t xml:space="preserve"> </w:t>
+      </w:r>
+      <w:r>
+        <w:rPr>
+          <w:sz w:val="24"/>
+          <w:szCs w:val="24"/>
+        </w:rPr>
+        <w:t>data l</w:t>
+      </w:r>
+      <w:r>
+        <w:rPr>
+          <w:sz w:val="24"/>
+          <w:szCs w:val="24"/>
+        </w:rPr>
+        <w:t>akehouse platform</w:t>
+      </w:r>
+      <w:r>
+        <w:rPr>
+          <w:sz w:val="24"/>
+          <w:szCs w:val="24"/>
+        </w:rPr>
+        <w:t xml:space="preserve"> that brings </w:t>
+      </w:r>
+      <w:r>
+        <w:rPr>
+          <w:sz w:val="24"/>
+          <w:szCs w:val="24"/>
+        </w:rPr>
+        <w:t xml:space="preserve">database functionality </w:t>
+      </w:r>
+      <w:r>
+        <w:rPr>
+          <w:sz w:val="24"/>
+          <w:szCs w:val="24"/>
+        </w:rPr>
+        <w:t>to d</w:t>
+      </w:r>
+      <w:r>
+        <w:rPr>
+          <w:sz w:val="24"/>
+          <w:szCs w:val="24"/>
+        </w:rPr>
+        <w:t xml:space="preserve">ata </w:t>
+      </w:r>
+      <w:r>
+        <w:rPr>
+          <w:sz w:val="24"/>
+          <w:szCs w:val="24"/>
+        </w:rPr>
+        <w:t>l</w:t>
+      </w:r>
+      <w:r>
+        <w:rPr>
+          <w:sz w:val="24"/>
+          <w:szCs w:val="24"/>
+        </w:rPr>
+        <w:t>ake</w:t>
+      </w:r>
+      <w:r>
+        <w:rPr>
+          <w:sz w:val="24"/>
+          <w:szCs w:val="24"/>
+        </w:rPr>
+        <w:t>s</w:t>
+      </w:r>
+      <w:r>
+        <w:rPr>
+          <w:sz w:val="24"/>
+          <w:szCs w:val="24"/>
+        </w:rPr>
+        <w:t xml:space="preserve"> </w:t>
+      </w:r>
+      <w:r>
+        <w:rPr>
+          <w:sz w:val="24"/>
+          <w:szCs w:val="24"/>
+        </w:rPr>
+        <w:t xml:space="preserve">and </w:t>
+      </w:r>
+      <w:r>
+        <w:rPr>
+          <w:sz w:val="24"/>
+          <w:szCs w:val="24"/>
+        </w:rPr>
+        <w:t xml:space="preserve">enables </w:t>
+      </w:r>
+      <w:r>
+        <w:rPr>
+          <w:sz w:val="24"/>
+          <w:szCs w:val="24"/>
+        </w:rPr>
+        <w:t>incremental processing for low</w:t>
+      </w:r>
+      <w:r>
+        <w:rPr>
+          <w:sz w:val="24"/>
+          <w:szCs w:val="24"/>
+        </w:rPr>
+        <w:t>-</w:t>
+      </w:r>
+      <w:r>
+        <w:rPr>
+          <w:sz w:val="24"/>
+          <w:szCs w:val="24"/>
+        </w:rPr>
+        <w:t>latency analytics</w:t>
+      </w:r>
+      <w:r>
+        <w:rPr>
+          <w:sz w:val="24"/>
+          <w:szCs w:val="24"/>
+        </w:rPr>
+        <w:t>.</w:t>
+      </w:r>
     </w:p>
     <w:p>
       <w:pPr>
@@ -1366,14 +1551,42 @@
         </w:rPr>
         <w:t>• </w:t>
       </w:r>
-      <w:hyperlink r:id="rId12" w:history="1">
+      <w:r>
+        <w:rPr>
+          <w:sz w:val="24"/>
+          <w:szCs w:val="24"/>
+        </w:rPr>
+        <w:t>Optimized serialization and deserialization of records in Flink stream writing</w:t>
+      </w:r>
+      <w:r>
+        <w:rPr>
+          <w:sz w:val="24"/>
+          <w:szCs w:val="24"/>
+        </w:rPr>
+        <w:t xml:space="preserve"> to Hudi table</w:t>
+      </w:r>
+      <w:r>
+        <w:rPr>
+          <w:sz w:val="24"/>
+          <w:szCs w:val="24"/>
+        </w:rPr>
+        <w:t>, resulting in a 30% increase in processing speed and 2x reduction in memory usage</w:t>
+      </w:r>
+      <w:r>
+        <w:rPr>
+          <w:sz w:val="24"/>
+          <w:szCs w:val="24"/>
+        </w:rPr>
+        <w:t xml:space="preserve"> (</w:t>
+      </w:r>
+      <w:hyperlink r:id="rId13" w:history="1">
         <w:r>
           <w:rPr>
             <w:rStyle w:val="Hyperlink"/>
             <w:sz w:val="24"/>
             <w:szCs w:val="24"/>
           </w:rPr>
-          <w:t>agent-orchestrator</w:t>
+          <w:t>design doc</w:t>
         </w:r>
       </w:hyperlink>
       <w:r>
@@ -1381,59 +1594,187 @@
           <w:sz w:val="24"/>
           <w:szCs w:val="24"/>
         </w:rPr>
-        <w:t xml:space="preserve"> – </w:t>
-      </w:r>
-      <w:r>
-        <w:rPr>
-          <w:sz w:val="24"/>
-          <w:szCs w:val="24"/>
-        </w:rPr>
-        <w:t>GitHub-Issue-driven workflow runner.</w:t>
-      </w:r>
-      <w:r>
-        <w:rPr>
-          <w:sz w:val="24"/>
-          <w:szCs w:val="24"/>
-        </w:rPr>
-        <w:t xml:space="preserve"> </w:t>
-      </w:r>
-      <w:r>
-        <w:rPr>
-          <w:sz w:val="24"/>
-          <w:szCs w:val="24"/>
-        </w:rPr>
-        <w:t xml:space="preserve">Decomposes an issue, runs an implementer agent in an isolated git </w:t>
-      </w:r>
-      <w:proofErr w:type="spellStart"/>
-      <w:r>
-        <w:rPr>
-          <w:sz w:val="24"/>
-          <w:szCs w:val="24"/>
-        </w:rPr>
-        <w:t>worktree</w:t>
-      </w:r>
-      <w:proofErr w:type="spellEnd"/>
-      <w:r>
-        <w:rPr>
-          <w:sz w:val="24"/>
-          <w:szCs w:val="24"/>
-        </w:rPr>
-        <w:t>, opens a PR, runs an independent reviewer agent, notifies a human when ready to merge.</w:t>
-      </w:r>
-      <w:r>
-        <w:rPr>
-          <w:sz w:val="24"/>
-          <w:szCs w:val="24"/>
-        </w:rPr>
-        <w:t xml:space="preserve"> </w:t>
-      </w:r>
-      <w:r>
-        <w:rPr>
-          <w:sz w:val="24"/>
-          <w:szCs w:val="24"/>
-        </w:rPr>
-        <w:t>State persists in the issue itself</w:t>
-      </w:r>
+        <w:t xml:space="preserve">, </w:t>
+      </w:r>
+      <w:hyperlink r:id="rId14" w:history="1">
+        <w:r>
+          <w:rPr>
+            <w:rStyle w:val="Hyperlink"/>
+            <w:sz w:val="24"/>
+            <w:szCs w:val="24"/>
+          </w:rPr>
+          <w:t>main changes</w:t>
+        </w:r>
+      </w:hyperlink>
+      <w:r>
+        <w:rPr>
+          <w:sz w:val="24"/>
+          <w:szCs w:val="24"/>
+        </w:rPr>
+        <w:t>).</w:t>
+      </w:r>
+      <w:r>
+        <w:rPr>
+          <w:sz w:val="24"/>
+          <w:szCs w:val="24"/>
+        </w:rPr>
+        <w:t xml:space="preserve"> Released in </w:t>
+      </w:r>
+      <w:hyperlink r:id="rId15" w:history="1">
+        <w:r>
+          <w:rPr>
+            <w:rStyle w:val="Hyperlink"/>
+            <w:sz w:val="24"/>
+            <w:szCs w:val="24"/>
+          </w:rPr>
+          <w:t>Hudi 1.0.2</w:t>
+        </w:r>
+      </w:hyperlink>
+      <w:r>
+        <w:rPr>
+          <w:sz w:val="24"/>
+          <w:szCs w:val="24"/>
+        </w:rPr>
+        <w:t>.</w:t>
+      </w:r>
+    </w:p>
+    <w:p>
+      <w:pPr>
+        <w:pBdr>
+          <w:top w:val="nil"/>
+          <w:left w:val="nil"/>
+          <w:bottom w:val="nil"/>
+          <w:right w:val="nil"/>
+          <w:between w:val="nil"/>
+        </w:pBdr>
+        <w:spacing w:before="60" w:after="60" w:line="264" w:lineRule="auto"/>
+        <w:ind w:left="170" w:hanging="170"/>
+        <w:jc w:val="both"/>
+        <w:rPr>
+          <w:sz w:val="24"/>
+          <w:szCs w:val="24"/>
+        </w:rPr>
+      </w:pPr>
+      <w:r>
+        <w:rPr>
+          <w:sz w:val="24"/>
+          <w:szCs w:val="24"/>
+        </w:rPr>
+        <w:t>• </w:t>
+      </w:r>
+      <w:r>
+        <w:rPr>
+          <w:sz w:val="24"/>
+          <w:szCs w:val="24"/>
+        </w:rPr>
+        <w:t xml:space="preserve">Implemented </w:t>
+      </w:r>
+      <w:r>
+        <w:rPr>
+          <w:sz w:val="24"/>
+          <w:szCs w:val="24"/>
+        </w:rPr>
+        <w:t>4 local optimizations (</w:t>
+      </w:r>
+      <w:hyperlink r:id="rId16" w:history="1">
+        <w:r>
+          <w:rPr>
+            <w:rStyle w:val="Hyperlink"/>
+            <w:sz w:val="24"/>
+            <w:szCs w:val="24"/>
+          </w:rPr>
+          <w:t>[1]</w:t>
+        </w:r>
+      </w:hyperlink>
+      <w:r>
+        <w:rPr>
+          <w:sz w:val="24"/>
+          <w:szCs w:val="24"/>
+        </w:rPr>
+        <w:t xml:space="preserve">, </w:t>
+      </w:r>
+      <w:hyperlink r:id="rId17" w:history="1">
+        <w:r>
+          <w:rPr>
+            <w:rStyle w:val="Hyperlink"/>
+            <w:sz w:val="24"/>
+            <w:szCs w:val="24"/>
+          </w:rPr>
+          <w:t>[2]</w:t>
+        </w:r>
+      </w:hyperlink>
+      <w:r>
+        <w:rPr>
+          <w:sz w:val="24"/>
+          <w:szCs w:val="24"/>
+        </w:rPr>
+        <w:t xml:space="preserve">, </w:t>
+      </w:r>
+      <w:hyperlink r:id="rId18" w:history="1">
+        <w:r>
+          <w:rPr>
+            <w:rStyle w:val="Hyperlink"/>
+            <w:sz w:val="24"/>
+            <w:szCs w:val="24"/>
+          </w:rPr>
+          <w:t>[3]</w:t>
+        </w:r>
+      </w:hyperlink>
+      <w:r>
+        <w:rPr>
+          <w:sz w:val="24"/>
+          <w:szCs w:val="24"/>
+        </w:rPr>
+        <w:t xml:space="preserve">, </w:t>
+      </w:r>
+      <w:hyperlink r:id="rId19" w:history="1">
+        <w:r>
+          <w:rPr>
+            <w:rStyle w:val="Hyperlink"/>
+            <w:sz w:val="24"/>
+            <w:szCs w:val="24"/>
+          </w:rPr>
+          <w:t>[4]</w:t>
+        </w:r>
+      </w:hyperlink>
+      <w:r>
+        <w:rPr>
+          <w:sz w:val="24"/>
+          <w:szCs w:val="24"/>
+        </w:rPr>
+        <w:t>) resulting in a 1</w:t>
+      </w:r>
+      <w:r>
+        <w:rPr>
+          <w:sz w:val="24"/>
+          <w:szCs w:val="24"/>
+        </w:rPr>
+        <w:t>0% increase in processing speed</w:t>
+      </w:r>
+      <w:r>
+        <w:rPr>
+          <w:sz w:val="24"/>
+          <w:szCs w:val="24"/>
+        </w:rPr>
+        <w:t xml:space="preserve"> and 30% reduction in garbage collection overhead.</w:t>
+      </w:r>
+      <w:r>
+        <w:rPr>
+          <w:sz w:val="24"/>
+          <w:szCs w:val="24"/>
+        </w:rPr>
+        <w:t xml:space="preserve"> Released in </w:t>
+      </w:r>
+      <w:hyperlink r:id="rId20" w:history="1">
+        <w:r>
+          <w:rPr>
+            <w:rStyle w:val="Hyperlink"/>
+            <w:sz w:val="24"/>
+            <w:szCs w:val="24"/>
+          </w:rPr>
+          <w:t>Hudi 1.0.1</w:t>
+        </w:r>
+      </w:hyperlink>
       <w:r>
         <w:rPr>
           <w:sz w:val="24"/>
@@ -1467,29 +1808,46 @@
         </w:rPr>
         <w:t>• </w:t>
       </w:r>
-      <w:hyperlink r:id="rId13" w:history="1">
+      <w:r>
+        <w:rPr>
+          <w:sz w:val="24"/>
+          <w:szCs w:val="24"/>
+        </w:rPr>
+        <w:t xml:space="preserve">Contributed </w:t>
+      </w:r>
+      <w:r>
+        <w:rPr>
+          <w:sz w:val="24"/>
+          <w:szCs w:val="24"/>
+        </w:rPr>
+        <w:t>5</w:t>
+      </w:r>
+      <w:bookmarkStart w:id="1" w:name="_GoBack"/>
+      <w:bookmarkEnd w:id="1"/>
+      <w:r>
+        <w:rPr>
+          <w:sz w:val="24"/>
+          <w:szCs w:val="24"/>
+        </w:rPr>
+        <w:t xml:space="preserve">0+ </w:t>
+      </w:r>
+      <w:hyperlink r:id="rId21" w:history="1">
         <w:r>
           <w:rPr>
             <w:rStyle w:val="Hyperlink"/>
             <w:sz w:val="24"/>
             <w:szCs w:val="24"/>
           </w:rPr>
-          <w:t>agent-develop-review-loop</w:t>
+          <w:t>merged pull requests</w:t>
         </w:r>
       </w:hyperlink>
       <w:r>
         <w:rPr>
-          <w:sz w:val="24"/>
-          <w:szCs w:val="24"/>
-        </w:rPr>
-        <w:t xml:space="preserve"> – </w:t>
-      </w:r>
-      <w:r>
-        <w:rPr>
-          <w:sz w:val="24"/>
-          <w:szCs w:val="24"/>
-        </w:rPr>
-        <w:t>shell-only develop-review loop with HITL handoff, resumable runs, and cost telemetry parsed from agent usage metadata.</w:t>
+          <w:color w:val="000000"/>
+          <w:sz w:val="24"/>
+          <w:szCs w:val="24"/>
+        </w:rPr>
+        <w:t>.</w:t>
       </w:r>
     </w:p>
     <w:tbl>
@@ -1534,31 +1892,7 @@
                 <w:sz w:val="24"/>
                 <w:szCs w:val="24"/>
               </w:rPr>
-              <w:t xml:space="preserve">Jan 24 </w:t>
-            </w:r>
-            <w:r>
-              <w:rPr>
-                <w:color w:val="000000"/>
-                <w:sz w:val="24"/>
-                <w:szCs w:val="24"/>
-              </w:rPr>
-              <w:t>–</w:t>
-            </w:r>
-            <w:r>
-              <w:rPr>
-                <w:color w:val="000000"/>
-                <w:sz w:val="24"/>
-                <w:szCs w:val="24"/>
-              </w:rPr>
-              <w:t xml:space="preserve"> </w:t>
-            </w:r>
-            <w:r>
-              <w:rPr>
-                <w:color w:val="000000"/>
-                <w:sz w:val="24"/>
-                <w:szCs w:val="24"/>
-              </w:rPr>
-              <w:t>Current</w:t>
+              <w:t>Apr 26 – Current</w:t>
             </w:r>
           </w:p>
           <w:p>
@@ -1585,39 +1919,7 @@
                 <w:sz w:val="24"/>
                 <w:szCs w:val="24"/>
               </w:rPr>
-              <w:t>(</w:t>
-            </w:r>
-            <w:r>
-              <w:rPr>
-                <w:color w:val="000000"/>
-                <w:sz w:val="24"/>
-                <w:szCs w:val="24"/>
-              </w:rPr>
-              <w:t>2</w:t>
-            </w:r>
-            <w:r>
-              <w:rPr>
-                <w:color w:val="000000"/>
-                <w:sz w:val="24"/>
-                <w:szCs w:val="24"/>
-              </w:rPr>
-              <w:t> yr</w:t>
-            </w:r>
-            <w:r>
-              <w:rPr>
-                <w:color w:val="000000"/>
-                <w:sz w:val="24"/>
-                <w:szCs w:val="24"/>
-              </w:rPr>
-              <w:t>s</w:t>
-            </w:r>
-            <w:r>
-              <w:rPr>
-                <w:color w:val="000000"/>
-                <w:sz w:val="24"/>
-                <w:szCs w:val="24"/>
-              </w:rPr>
-              <w:t>)</w:t>
+              <w:t>(~0.5 yrs)</w:t>
             </w:r>
           </w:p>
         </w:tc>
@@ -1648,16 +1950,7 @@
                 <w:sz w:val="24"/>
                 <w:szCs w:val="24"/>
               </w:rPr>
-              <w:t>Apache Hudi</w:t>
-            </w:r>
-            <w:r>
-              <w:rPr>
-                <w:b/>
-                <w:color w:val="000000"/>
-                <w:sz w:val="24"/>
-                <w:szCs w:val="24"/>
-              </w:rPr>
-              <w:t xml:space="preserve"> Contributor</w:t>
+              <w:t>Open-source: Agentic development tooling</w:t>
             </w:r>
             <w:r>
               <w:rPr>
@@ -1690,7 +1983,7 @@
                 <w:sz w:val="24"/>
                 <w:szCs w:val="24"/>
               </w:rPr>
-              <w:t>The Apache Software Foundation</w:t>
+              <w:t>Personal projects</w:t>
             </w:r>
           </w:p>
         </w:tc>
@@ -1708,152 +2001,34 @@
         <w:spacing w:before="120" w:after="60" w:line="264" w:lineRule="auto"/>
         <w:jc w:val="both"/>
         <w:rPr>
+          <w:color w:val="000000"/>
           <w:sz w:val="24"/>
           <w:szCs w:val="24"/>
         </w:rPr>
       </w:pPr>
-      <w:hyperlink r:id="rId14" w:history="1">
-        <w:r>
-          <w:rPr>
-            <w:rStyle w:val="Hyperlink"/>
-            <w:sz w:val="24"/>
-            <w:szCs w:val="24"/>
-          </w:rPr>
-          <w:t>Apache Hudi</w:t>
-        </w:r>
-      </w:hyperlink>
-      <w:r>
-        <w:rPr>
-          <w:sz w:val="24"/>
-          <w:szCs w:val="24"/>
-        </w:rPr>
-        <w:t xml:space="preserve"> is</w:t>
-      </w:r>
-      <w:r>
-        <w:rPr>
-          <w:sz w:val="24"/>
-          <w:szCs w:val="24"/>
-        </w:rPr>
-        <w:t xml:space="preserve"> a</w:t>
-      </w:r>
-      <w:r>
-        <w:rPr>
-          <w:sz w:val="24"/>
-          <w:szCs w:val="24"/>
-        </w:rPr>
-        <w:t xml:space="preserve"> </w:t>
-      </w:r>
-      <w:r>
-        <w:rPr>
-          <w:sz w:val="24"/>
-          <w:szCs w:val="24"/>
-        </w:rPr>
-        <w:t>data l</w:t>
-      </w:r>
-      <w:r>
-        <w:rPr>
-          <w:sz w:val="24"/>
-          <w:szCs w:val="24"/>
-        </w:rPr>
-        <w:t>akehouse platform</w:t>
-      </w:r>
-      <w:r>
-        <w:rPr>
-          <w:sz w:val="24"/>
-          <w:szCs w:val="24"/>
-        </w:rPr>
-        <w:t xml:space="preserve"> that brings </w:t>
-      </w:r>
-      <w:r>
-        <w:rPr>
-          <w:sz w:val="24"/>
-          <w:szCs w:val="24"/>
-        </w:rPr>
-        <w:t xml:space="preserve">database functionality </w:t>
-      </w:r>
-      <w:r>
-        <w:rPr>
-          <w:sz w:val="24"/>
-          <w:szCs w:val="24"/>
-        </w:rPr>
-        <w:t>to d</w:t>
-      </w:r>
-      <w:r>
-        <w:rPr>
-          <w:sz w:val="24"/>
-          <w:szCs w:val="24"/>
-        </w:rPr>
-        <w:t xml:space="preserve">ata </w:t>
-      </w:r>
-      <w:r>
-        <w:rPr>
-          <w:sz w:val="24"/>
-          <w:szCs w:val="24"/>
-        </w:rPr>
-        <w:t>l</w:t>
-      </w:r>
-      <w:r>
-        <w:rPr>
-          <w:sz w:val="24"/>
-          <w:szCs w:val="24"/>
-        </w:rPr>
-        <w:t>ake</w:t>
-      </w:r>
-      <w:r>
-        <w:rPr>
-          <w:sz w:val="24"/>
-          <w:szCs w:val="24"/>
-        </w:rPr>
-        <w:t>s</w:t>
-      </w:r>
-      <w:r>
-        <w:rPr>
-          <w:sz w:val="24"/>
-          <w:szCs w:val="24"/>
-        </w:rPr>
-        <w:t xml:space="preserve"> </w:t>
-      </w:r>
-      <w:r>
-        <w:rPr>
-          <w:sz w:val="24"/>
-          <w:szCs w:val="24"/>
-        </w:rPr>
-        <w:t xml:space="preserve">and </w:t>
-      </w:r>
-      <w:r>
-        <w:rPr>
-          <w:sz w:val="24"/>
-          <w:szCs w:val="24"/>
-        </w:rPr>
-        <w:t xml:space="preserve">enables </w:t>
-      </w:r>
-      <w:r>
-        <w:rPr>
-          <w:sz w:val="24"/>
-          <w:szCs w:val="24"/>
-        </w:rPr>
-        <w:t>incremental processing for low</w:t>
-      </w:r>
-      <w:r>
-        <w:rPr>
-          <w:sz w:val="24"/>
-          <w:szCs w:val="24"/>
-        </w:rPr>
-        <w:t>-</w:t>
-      </w:r>
-      <w:r>
-        <w:rPr>
-          <w:sz w:val="24"/>
-          <w:szCs w:val="24"/>
-        </w:rPr>
-        <w:t>latency analytics</w:t>
-      </w:r>
-      <w:r>
-        <w:rPr>
-          <w:sz w:val="24"/>
-          <w:szCs w:val="24"/>
-        </w:rPr>
-        <w:t>.</w:t>
+      <w:r>
+        <w:rPr>
+          <w:color w:val="000000"/>
+          <w:sz w:val="24"/>
+          <w:szCs w:val="24"/>
+        </w:rPr>
+        <w:t xml:space="preserve">Self-directed work on agent-augmented engineering workflows </w:t>
+      </w:r>
+      <w:r>
+        <w:rPr>
+          <w:color w:val="000000"/>
+          <w:sz w:val="24"/>
+          <w:szCs w:val="24"/>
+        </w:rPr>
+        <w:t>–</w:t>
+      </w:r>
+      <w:r>
+        <w:rPr>
+          <w:color w:val="000000"/>
+          <w:sz w:val="24"/>
+          <w:szCs w:val="24"/>
+        </w:rPr>
+        <w:t xml:space="preserve"> treating coding-agent CLIs (Claude Code, Codex) as bounded executors inside reproducible pipelines.</w:t>
       </w:r>
     </w:p>
     <w:p>
@@ -1878,222 +2053,8 @@
           <w:sz w:val="24"/>
           <w:szCs w:val="24"/>
         </w:rPr>
-        <w:t>• </w:t>
-      </w:r>
-      <w:r>
-        <w:rPr>
-          <w:sz w:val="24"/>
-          <w:szCs w:val="24"/>
-        </w:rPr>
-        <w:t>Optimized serialization and deserialization of records in Flink stream writing</w:t>
-      </w:r>
-      <w:r>
-        <w:rPr>
-          <w:sz w:val="24"/>
-          <w:szCs w:val="24"/>
-        </w:rPr>
-        <w:t xml:space="preserve"> to Hudi table</w:t>
-      </w:r>
-      <w:r>
-        <w:rPr>
-          <w:sz w:val="24"/>
-          <w:szCs w:val="24"/>
-        </w:rPr>
-        <w:t>, resulting in a 30% increase in processing speed and 2x reduction in memory usage</w:t>
-      </w:r>
-      <w:r>
-        <w:rPr>
-          <w:sz w:val="24"/>
-          <w:szCs w:val="24"/>
-        </w:rPr>
-        <w:t xml:space="preserve"> (</w:t>
-      </w:r>
-      <w:hyperlink r:id="rId15" w:history="1">
-        <w:r>
-          <w:rPr>
-            <w:rStyle w:val="Hyperlink"/>
-            <w:sz w:val="24"/>
-            <w:szCs w:val="24"/>
-          </w:rPr>
-          <w:t>design doc</w:t>
-        </w:r>
-      </w:hyperlink>
-      <w:r>
-        <w:rPr>
-          <w:sz w:val="24"/>
-          <w:szCs w:val="24"/>
-        </w:rPr>
-        <w:t xml:space="preserve">, </w:t>
-      </w:r>
-      <w:hyperlink r:id="rId16" w:history="1">
-        <w:r>
-          <w:rPr>
-            <w:rStyle w:val="Hyperlink"/>
-            <w:sz w:val="24"/>
-            <w:szCs w:val="24"/>
-          </w:rPr>
-          <w:t>main changes</w:t>
-        </w:r>
-      </w:hyperlink>
-      <w:r>
-        <w:rPr>
-          <w:sz w:val="24"/>
-          <w:szCs w:val="24"/>
-        </w:rPr>
-        <w:t>).</w:t>
-      </w:r>
-      <w:r>
-        <w:rPr>
-          <w:sz w:val="24"/>
-          <w:szCs w:val="24"/>
-        </w:rPr>
-        <w:t xml:space="preserve"> Released in </w:t>
-      </w:r>
-      <w:hyperlink r:id="rId17" w:history="1">
-        <w:r>
-          <w:rPr>
-            <w:rStyle w:val="Hyperlink"/>
-            <w:sz w:val="24"/>
-            <w:szCs w:val="24"/>
-          </w:rPr>
-          <w:t>Hudi 1.0.2</w:t>
-        </w:r>
-      </w:hyperlink>
-      <w:r>
-        <w:rPr>
-          <w:sz w:val="24"/>
-          <w:szCs w:val="24"/>
-        </w:rPr>
-        <w:t>.</w:t>
-      </w:r>
-    </w:p>
-    <w:p>
-      <w:pPr>
-        <w:pBdr>
-          <w:top w:val="nil"/>
-          <w:left w:val="nil"/>
-          <w:bottom w:val="nil"/>
-          <w:right w:val="nil"/>
-          <w:between w:val="nil"/>
-        </w:pBdr>
-        <w:spacing w:before="60" w:after="60" w:line="264" w:lineRule="auto"/>
-        <w:ind w:left="170" w:hanging="170"/>
-        <w:jc w:val="both"/>
-        <w:rPr>
-          <w:sz w:val="24"/>
-          <w:szCs w:val="24"/>
-        </w:rPr>
-      </w:pPr>
-      <w:r>
-        <w:rPr>
-          <w:sz w:val="24"/>
-          <w:szCs w:val="24"/>
-        </w:rPr>
         <w:lastRenderedPageBreak/>
         <w:t>• </w:t>
-      </w:r>
-      <w:r>
-        <w:rPr>
-          <w:sz w:val="24"/>
-          <w:szCs w:val="24"/>
-        </w:rPr>
-        <w:t xml:space="preserve">Implemented </w:t>
-      </w:r>
-      <w:r>
-        <w:rPr>
-          <w:sz w:val="24"/>
-          <w:szCs w:val="24"/>
-        </w:rPr>
-        <w:t>4 local optimizations (</w:t>
-      </w:r>
-      <w:hyperlink r:id="rId18" w:history="1">
-        <w:r>
-          <w:rPr>
-            <w:rStyle w:val="Hyperlink"/>
-            <w:sz w:val="24"/>
-            <w:szCs w:val="24"/>
-          </w:rPr>
-          <w:t>[1]</w:t>
-        </w:r>
-      </w:hyperlink>
-      <w:r>
-        <w:rPr>
-          <w:sz w:val="24"/>
-          <w:szCs w:val="24"/>
-        </w:rPr>
-        <w:t xml:space="preserve">, </w:t>
-      </w:r>
-      <w:hyperlink r:id="rId19" w:history="1">
-        <w:r>
-          <w:rPr>
-            <w:rStyle w:val="Hyperlink"/>
-            <w:sz w:val="24"/>
-            <w:szCs w:val="24"/>
-          </w:rPr>
-          <w:t>[2]</w:t>
-        </w:r>
-      </w:hyperlink>
-      <w:r>
-        <w:rPr>
-          <w:sz w:val="24"/>
-          <w:szCs w:val="24"/>
-        </w:rPr>
-        <w:t xml:space="preserve">, </w:t>
-      </w:r>
-      <w:hyperlink r:id="rId20" w:history="1">
-        <w:r>
-          <w:rPr>
-            <w:rStyle w:val="Hyperlink"/>
-            <w:sz w:val="24"/>
-            <w:szCs w:val="24"/>
-          </w:rPr>
-          <w:t>[3]</w:t>
-        </w:r>
-      </w:hyperlink>
-      <w:r>
-        <w:rPr>
-          <w:sz w:val="24"/>
-          <w:szCs w:val="24"/>
-        </w:rPr>
-        <w:t xml:space="preserve">, </w:t>
-      </w:r>
-      <w:hyperlink r:id="rId21" w:history="1">
-        <w:r>
-          <w:rPr>
-            <w:rStyle w:val="Hyperlink"/>
-            <w:sz w:val="24"/>
-            <w:szCs w:val="24"/>
-          </w:rPr>
-          <w:t>[4]</w:t>
-        </w:r>
-      </w:hyperlink>
-      <w:r>
-        <w:rPr>
-          <w:sz w:val="24"/>
-          <w:szCs w:val="24"/>
-        </w:rPr>
-        <w:t>) resulting in a 1</w:t>
-      </w:r>
-      <w:r>
-        <w:rPr>
-          <w:sz w:val="24"/>
-          <w:szCs w:val="24"/>
-        </w:rPr>
-        <w:t>0% increase in processing speed</w:t>
-      </w:r>
-      <w:r>
-        <w:rPr>
-          <w:sz w:val="24"/>
-          <w:szCs w:val="24"/>
-        </w:rPr>
-        <w:t xml:space="preserve"> and 30% reduction in garbage collection overhead.</w:t>
-      </w:r>
-      <w:r>
-        <w:rPr>
-          <w:sz w:val="24"/>
-          <w:szCs w:val="24"/>
-        </w:rPr>
-        <w:t xml:space="preserve"> Released in </w:t>
       </w:r>
       <w:hyperlink r:id="rId22" w:history="1">
         <w:r>
@@ -2102,9 +2063,67 @@
             <w:sz w:val="24"/>
             <w:szCs w:val="24"/>
           </w:rPr>
-          <w:t>Hudi 1.0.1</w:t>
+          <w:t>agent-orchestrator</w:t>
         </w:r>
       </w:hyperlink>
+      <w:r>
+        <w:rPr>
+          <w:sz w:val="24"/>
+          <w:szCs w:val="24"/>
+        </w:rPr>
+        <w:t xml:space="preserve"> – </w:t>
+      </w:r>
+      <w:r>
+        <w:rPr>
+          <w:sz w:val="24"/>
+          <w:szCs w:val="24"/>
+        </w:rPr>
+        <w:t>GitHub-Issue-driven workflow runner.</w:t>
+      </w:r>
+      <w:r>
+        <w:rPr>
+          <w:sz w:val="24"/>
+          <w:szCs w:val="24"/>
+        </w:rPr>
+        <w:t xml:space="preserve"> </w:t>
+      </w:r>
+      <w:r>
+        <w:rPr>
+          <w:sz w:val="24"/>
+          <w:szCs w:val="24"/>
+        </w:rPr>
+        <w:t xml:space="preserve">Decomposes an issue, runs an implementer agent in an isolated git </w:t>
+      </w:r>
+      <w:proofErr w:type="spellStart"/>
+      <w:r>
+        <w:rPr>
+          <w:sz w:val="24"/>
+          <w:szCs w:val="24"/>
+        </w:rPr>
+        <w:t>worktree</w:t>
+      </w:r>
+      <w:proofErr w:type="spellEnd"/>
+      <w:r>
+        <w:rPr>
+          <w:sz w:val="24"/>
+          <w:szCs w:val="24"/>
+        </w:rPr>
+        <w:t>, opens a PR, runs an independent reviewer agent, notifies a human when ready to merge.</w:t>
+      </w:r>
+      <w:r>
+        <w:rPr>
+          <w:sz w:val="24"/>
+          <w:szCs w:val="24"/>
+        </w:rPr>
+        <w:t xml:space="preserve"> </w:t>
+      </w:r>
+      <w:r>
+        <w:rPr>
+          <w:sz w:val="24"/>
+          <w:szCs w:val="24"/>
+        </w:rPr>
+        <w:t>State persists in the issue itself</w:t>
+      </w:r>
       <w:r>
         <w:rPr>
           <w:sz w:val="24"/>
@@ -2138,20 +2157,6 @@
         </w:rPr>
         <w:t>• </w:t>
       </w:r>
-      <w:r>
-        <w:rPr>
-          <w:sz w:val="24"/>
-          <w:szCs w:val="24"/>
-        </w:rPr>
-        <w:t xml:space="preserve">Contributed </w:t>
-      </w:r>
-      <w:r>
-        <w:rPr>
-          <w:sz w:val="24"/>
-          <w:szCs w:val="24"/>
-        </w:rPr>
-        <w:t xml:space="preserve">40+ </w:t>
-      </w:r>
       <w:hyperlink r:id="rId23" w:history="1">
         <w:r>
           <w:rPr>
@@ -2159,16 +2164,22 @@
             <w:sz w:val="24"/>
             <w:szCs w:val="24"/>
           </w:rPr>
-          <w:t>merged pull requests</w:t>
+          <w:t>agent-develop-review-loop</w:t>
         </w:r>
       </w:hyperlink>
       <w:r>
         <w:rPr>
-          <w:color w:val="000000"/>
-          <w:sz w:val="24"/>
-          <w:szCs w:val="24"/>
-        </w:rPr>
-        <w:t>.</w:t>
+          <w:sz w:val="24"/>
+          <w:szCs w:val="24"/>
+        </w:rPr>
+        <w:t xml:space="preserve"> – </w:t>
+      </w:r>
+      <w:r>
+        <w:rPr>
+          <w:sz w:val="24"/>
+          <w:szCs w:val="24"/>
+        </w:rPr>
+        <w:t>shell-only develop-review loop with HITL handoff, resumable runs, and cost telemetry parsed from agent usage metadata.</w:t>
       </w:r>
     </w:p>
     <w:tbl>

</xml_diff>

<commit_message>
data: move focus on Apache Hudi contribution in files
</commit_message>
<xml_diff>
--- a/file/CV_Geser_Dugarov.docx
+++ b/file/CV_Geser_Dugarov.docx
@@ -465,6 +465,14 @@
           <w:sz w:val="24"/>
           <w:szCs w:val="24"/>
         </w:rPr>
+        <w:t xml:space="preserve"> (50+ merged PRs)</w:t>
+      </w:r>
+      <w:r>
+        <w:rPr>
+          <w:color w:val="000000"/>
+          <w:sz w:val="24"/>
+          <w:szCs w:val="24"/>
+        </w:rPr>
         <w:t>.</w:t>
       </w:r>
     </w:p>
@@ -670,7 +678,7 @@
           <w:sz w:val="24"/>
           <w:szCs w:val="24"/>
         </w:rPr>
-        <w:t xml:space="preserve">Python, Maven, </w:t>
+        <w:t xml:space="preserve">Python, </w:t>
       </w:r>
       <w:r>
         <w:rPr>
@@ -690,7 +698,7 @@
           <w:sz w:val="24"/>
           <w:szCs w:val="24"/>
         </w:rPr>
-        <w:t>, Hadoop Ecosystem</w:t>
+        <w:t xml:space="preserve">, </w:t>
       </w:r>
       <w:r>
         <w:rPr>
@@ -700,7 +708,7 @@
           <w:sz w:val="24"/>
           <w:szCs w:val="24"/>
         </w:rPr>
-        <w:t xml:space="preserve">, </w:t>
+        <w:t xml:space="preserve">Data lakehouse, Distributed systems, </w:t>
       </w:r>
       <w:r>
         <w:rPr>
@@ -710,7 +718,7 @@
           <w:sz w:val="24"/>
           <w:szCs w:val="24"/>
         </w:rPr>
-        <w:t>Claude Code / Codex</w:t>
+        <w:t>Hadoop Ecosystem</w:t>
       </w:r>
       <w:r>
         <w:rPr>
@@ -731,6 +739,26 @@
           <w:szCs w:val="24"/>
         </w:rPr>
         <w:t>Agentic workflows</w:t>
+      </w:r>
+      <w:r>
+        <w:rPr>
+          <w:b/>
+          <w:i/>
+          <w:color w:val="000000"/>
+          <w:sz w:val="24"/>
+          <w:szCs w:val="24"/>
+        </w:rPr>
+        <w:t xml:space="preserve">, </w:t>
+      </w:r>
+      <w:r>
+        <w:rPr>
+          <w:b/>
+          <w:i/>
+          <w:color w:val="000000"/>
+          <w:sz w:val="24"/>
+          <w:szCs w:val="24"/>
+        </w:rPr>
+        <w:t>Claude Code / Codex</w:t>
       </w:r>
     </w:p>
     <w:p>
@@ -1169,7 +1197,31 @@
                 <w:sz w:val="24"/>
                 <w:szCs w:val="24"/>
               </w:rPr>
-              <w:t>Apr 26 – Current</w:t>
+              <w:t xml:space="preserve">Jan 24 </w:t>
+            </w:r>
+            <w:r>
+              <w:rPr>
+                <w:color w:val="000000"/>
+                <w:sz w:val="24"/>
+                <w:szCs w:val="24"/>
+              </w:rPr>
+              <w:t>–</w:t>
+            </w:r>
+            <w:r>
+              <w:rPr>
+                <w:color w:val="000000"/>
+                <w:sz w:val="24"/>
+                <w:szCs w:val="24"/>
+              </w:rPr>
+              <w:t xml:space="preserve"> </w:t>
+            </w:r>
+            <w:r>
+              <w:rPr>
+                <w:color w:val="000000"/>
+                <w:sz w:val="24"/>
+                <w:szCs w:val="24"/>
+              </w:rPr>
+              <w:t>Current</w:t>
             </w:r>
           </w:p>
           <w:p>
@@ -1204,15 +1256,23 @@
                 <w:sz w:val="24"/>
                 <w:szCs w:val="24"/>
               </w:rPr>
-              <w:t>~</w:t>
-            </w:r>
-            <w:r>
-              <w:rPr>
-                <w:color w:val="000000"/>
-                <w:sz w:val="24"/>
-                <w:szCs w:val="24"/>
-              </w:rPr>
-              <w:t>0.5 yr</w:t>
+              <w:t>2</w:t>
+            </w:r>
+            <w:r>
+              <w:rPr>
+                <w:color w:val="000000"/>
+                <w:sz w:val="24"/>
+                <w:szCs w:val="24"/>
+              </w:rPr>
+              <w:t>.5+</w:t>
+            </w:r>
+            <w:r>
+              <w:rPr>
+                <w:color w:val="000000"/>
+                <w:sz w:val="24"/>
+                <w:szCs w:val="24"/>
+              </w:rPr>
+              <w:t> yr</w:t>
             </w:r>
             <w:r>
               <w:rPr>
@@ -1259,7 +1319,16 @@
                 <w:sz w:val="24"/>
                 <w:szCs w:val="24"/>
               </w:rPr>
-              <w:t>Open-source: Agentic development tooling</w:t>
+              <w:t>Apache Hudi</w:t>
+            </w:r>
+            <w:r>
+              <w:rPr>
+                <w:b/>
+                <w:color w:val="000000"/>
+                <w:sz w:val="24"/>
+                <w:szCs w:val="24"/>
+              </w:rPr>
+              <w:t xml:space="preserve"> Contributor</w:t>
             </w:r>
             <w:r>
               <w:rPr>
@@ -1292,7 +1361,7 @@
                 <w:sz w:val="24"/>
                 <w:szCs w:val="24"/>
               </w:rPr>
-              <w:t>Personal projects</w:t>
+              <w:t>The Apache Software Foundation</w:t>
             </w:r>
           </w:p>
         </w:tc>
@@ -1310,37 +1379,153 @@
         <w:spacing w:before="120" w:after="60" w:line="264" w:lineRule="auto"/>
         <w:jc w:val="both"/>
         <w:rPr>
-          <w:color w:val="000000"/>
           <w:sz w:val="24"/>
           <w:szCs w:val="24"/>
         </w:rPr>
       </w:pPr>
-      <w:r>
-        <w:rPr>
-          <w:color w:val="000000"/>
-          <w:sz w:val="24"/>
-          <w:szCs w:val="24"/>
-        </w:rPr>
-        <w:t xml:space="preserve">Self-directed work on agent-augmented engineering workflows </w:t>
-      </w:r>
-      <w:r>
-        <w:rPr>
-          <w:color w:val="000000"/>
-          <w:sz w:val="24"/>
-          <w:szCs w:val="24"/>
-        </w:rPr>
-        <w:t>–</w:t>
-      </w:r>
-      <w:r>
-        <w:rPr>
-          <w:color w:val="000000"/>
-          <w:sz w:val="24"/>
-          <w:szCs w:val="24"/>
-        </w:rPr>
-        <w:t xml:space="preserve"> treating coding-agent CLIs (Claude Code, Codex) as bounded executors inside reproducible pipelines.</w:t>
-      </w:r>
-      <w:bookmarkStart w:id="1" w:name="_GoBack"/>
-      <w:bookmarkEnd w:id="1"/>
+      <w:hyperlink r:id="rId12" w:history="1">
+        <w:r>
+          <w:rPr>
+            <w:rStyle w:val="Hyperlink"/>
+            <w:sz w:val="24"/>
+            <w:szCs w:val="24"/>
+          </w:rPr>
+          <w:t>Apache Hudi</w:t>
+        </w:r>
+      </w:hyperlink>
+      <w:r>
+        <w:rPr>
+          <w:sz w:val="24"/>
+          <w:szCs w:val="24"/>
+        </w:rPr>
+        <w:t xml:space="preserve"> is</w:t>
+      </w:r>
+      <w:r>
+        <w:rPr>
+          <w:sz w:val="24"/>
+          <w:szCs w:val="24"/>
+        </w:rPr>
+        <w:t xml:space="preserve"> a</w:t>
+      </w:r>
+      <w:r>
+        <w:rPr>
+          <w:sz w:val="24"/>
+          <w:szCs w:val="24"/>
+        </w:rPr>
+        <w:t xml:space="preserve"> </w:t>
+      </w:r>
+      <w:r>
+        <w:rPr>
+          <w:sz w:val="24"/>
+          <w:szCs w:val="24"/>
+        </w:rPr>
+        <w:t>data l</w:t>
+      </w:r>
+      <w:r>
+        <w:rPr>
+          <w:sz w:val="24"/>
+          <w:szCs w:val="24"/>
+        </w:rPr>
+        <w:t>akehouse platform</w:t>
+      </w:r>
+      <w:r>
+        <w:rPr>
+          <w:sz w:val="24"/>
+          <w:szCs w:val="24"/>
+        </w:rPr>
+        <w:t xml:space="preserve"> that brings </w:t>
+      </w:r>
+      <w:r>
+        <w:rPr>
+          <w:sz w:val="24"/>
+          <w:szCs w:val="24"/>
+        </w:rPr>
+        <w:t xml:space="preserve">database functionality </w:t>
+      </w:r>
+      <w:r>
+        <w:rPr>
+          <w:sz w:val="24"/>
+          <w:szCs w:val="24"/>
+        </w:rPr>
+        <w:t>to d</w:t>
+      </w:r>
+      <w:r>
+        <w:rPr>
+          <w:sz w:val="24"/>
+          <w:szCs w:val="24"/>
+        </w:rPr>
+        <w:t xml:space="preserve">ata </w:t>
+      </w:r>
+      <w:r>
+        <w:rPr>
+          <w:sz w:val="24"/>
+          <w:szCs w:val="24"/>
+        </w:rPr>
+        <w:t>l</w:t>
+      </w:r>
+      <w:r>
+        <w:rPr>
+          <w:sz w:val="24"/>
+          <w:szCs w:val="24"/>
+        </w:rPr>
+        <w:t>ake</w:t>
+      </w:r>
+      <w:r>
+        <w:rPr>
+          <w:sz w:val="24"/>
+          <w:szCs w:val="24"/>
+        </w:rPr>
+        <w:t>s</w:t>
+      </w:r>
+      <w:r>
+        <w:rPr>
+          <w:sz w:val="24"/>
+          <w:szCs w:val="24"/>
+        </w:rPr>
+        <w:t xml:space="preserve"> </w:t>
+      </w:r>
+      <w:r>
+        <w:rPr>
+          <w:sz w:val="24"/>
+          <w:szCs w:val="24"/>
+        </w:rPr>
+        <w:t xml:space="preserve">and </w:t>
+      </w:r>
+      <w:r>
+        <w:rPr>
+          <w:sz w:val="24"/>
+          <w:szCs w:val="24"/>
+        </w:rPr>
+        <w:t xml:space="preserve">enables </w:t>
+      </w:r>
+      <w:r>
+        <w:rPr>
+          <w:sz w:val="24"/>
+          <w:szCs w:val="24"/>
+        </w:rPr>
+        <w:t>incremental processing for low</w:t>
+      </w:r>
+      <w:r>
+        <w:rPr>
+          <w:sz w:val="24"/>
+          <w:szCs w:val="24"/>
+        </w:rPr>
+        <w:t>-</w:t>
+      </w:r>
+      <w:r>
+        <w:rPr>
+          <w:sz w:val="24"/>
+          <w:szCs w:val="24"/>
+        </w:rPr>
+        <w:t>latency analytics</w:t>
+      </w:r>
+      <w:r>
+        <w:rPr>
+          <w:sz w:val="24"/>
+          <w:szCs w:val="24"/>
+        </w:rPr>
+        <w:t>.</w:t>
+      </w:r>
     </w:p>
     <w:p>
       <w:pPr>
@@ -1366,14 +1551,42 @@
         </w:rPr>
         <w:t>• </w:t>
       </w:r>
-      <w:hyperlink r:id="rId12" w:history="1">
+      <w:r>
+        <w:rPr>
+          <w:sz w:val="24"/>
+          <w:szCs w:val="24"/>
+        </w:rPr>
+        <w:t>Optimized serialization and deserialization of records in Flink stream writing</w:t>
+      </w:r>
+      <w:r>
+        <w:rPr>
+          <w:sz w:val="24"/>
+          <w:szCs w:val="24"/>
+        </w:rPr>
+        <w:t xml:space="preserve"> to Hudi table</w:t>
+      </w:r>
+      <w:r>
+        <w:rPr>
+          <w:sz w:val="24"/>
+          <w:szCs w:val="24"/>
+        </w:rPr>
+        <w:t>, resulting in a 30% increase in processing speed and 2x reduction in memory usage</w:t>
+      </w:r>
+      <w:r>
+        <w:rPr>
+          <w:sz w:val="24"/>
+          <w:szCs w:val="24"/>
+        </w:rPr>
+        <w:t xml:space="preserve"> (</w:t>
+      </w:r>
+      <w:hyperlink r:id="rId13" w:history="1">
         <w:r>
           <w:rPr>
             <w:rStyle w:val="Hyperlink"/>
             <w:sz w:val="24"/>
             <w:szCs w:val="24"/>
           </w:rPr>
-          <w:t>agent-orchestrator</w:t>
+          <w:t>design doc</w:t>
         </w:r>
       </w:hyperlink>
       <w:r>
@@ -1381,59 +1594,187 @@
           <w:sz w:val="24"/>
           <w:szCs w:val="24"/>
         </w:rPr>
-        <w:t xml:space="preserve"> – </w:t>
-      </w:r>
-      <w:r>
-        <w:rPr>
-          <w:sz w:val="24"/>
-          <w:szCs w:val="24"/>
-        </w:rPr>
-        <w:t>GitHub-Issue-driven workflow runner.</w:t>
-      </w:r>
-      <w:r>
-        <w:rPr>
-          <w:sz w:val="24"/>
-          <w:szCs w:val="24"/>
-        </w:rPr>
-        <w:t xml:space="preserve"> </w:t>
-      </w:r>
-      <w:r>
-        <w:rPr>
-          <w:sz w:val="24"/>
-          <w:szCs w:val="24"/>
-        </w:rPr>
-        <w:t xml:space="preserve">Decomposes an issue, runs an implementer agent in an isolated git </w:t>
-      </w:r>
-      <w:proofErr w:type="spellStart"/>
-      <w:r>
-        <w:rPr>
-          <w:sz w:val="24"/>
-          <w:szCs w:val="24"/>
-        </w:rPr>
-        <w:t>worktree</w:t>
-      </w:r>
-      <w:proofErr w:type="spellEnd"/>
-      <w:r>
-        <w:rPr>
-          <w:sz w:val="24"/>
-          <w:szCs w:val="24"/>
-        </w:rPr>
-        <w:t>, opens a PR, runs an independent reviewer agent, notifies a human when ready to merge.</w:t>
-      </w:r>
-      <w:r>
-        <w:rPr>
-          <w:sz w:val="24"/>
-          <w:szCs w:val="24"/>
-        </w:rPr>
-        <w:t xml:space="preserve"> </w:t>
-      </w:r>
-      <w:r>
-        <w:rPr>
-          <w:sz w:val="24"/>
-          <w:szCs w:val="24"/>
-        </w:rPr>
-        <w:t>State persists in the issue itself</w:t>
-      </w:r>
+        <w:t xml:space="preserve">, </w:t>
+      </w:r>
+      <w:hyperlink r:id="rId14" w:history="1">
+        <w:r>
+          <w:rPr>
+            <w:rStyle w:val="Hyperlink"/>
+            <w:sz w:val="24"/>
+            <w:szCs w:val="24"/>
+          </w:rPr>
+          <w:t>main changes</w:t>
+        </w:r>
+      </w:hyperlink>
+      <w:r>
+        <w:rPr>
+          <w:sz w:val="24"/>
+          <w:szCs w:val="24"/>
+        </w:rPr>
+        <w:t>).</w:t>
+      </w:r>
+      <w:r>
+        <w:rPr>
+          <w:sz w:val="24"/>
+          <w:szCs w:val="24"/>
+        </w:rPr>
+        <w:t xml:space="preserve"> Released in </w:t>
+      </w:r>
+      <w:hyperlink r:id="rId15" w:history="1">
+        <w:r>
+          <w:rPr>
+            <w:rStyle w:val="Hyperlink"/>
+            <w:sz w:val="24"/>
+            <w:szCs w:val="24"/>
+          </w:rPr>
+          <w:t>Hudi 1.0.2</w:t>
+        </w:r>
+      </w:hyperlink>
+      <w:r>
+        <w:rPr>
+          <w:sz w:val="24"/>
+          <w:szCs w:val="24"/>
+        </w:rPr>
+        <w:t>.</w:t>
+      </w:r>
+    </w:p>
+    <w:p>
+      <w:pPr>
+        <w:pBdr>
+          <w:top w:val="nil"/>
+          <w:left w:val="nil"/>
+          <w:bottom w:val="nil"/>
+          <w:right w:val="nil"/>
+          <w:between w:val="nil"/>
+        </w:pBdr>
+        <w:spacing w:before="60" w:after="60" w:line="264" w:lineRule="auto"/>
+        <w:ind w:left="170" w:hanging="170"/>
+        <w:jc w:val="both"/>
+        <w:rPr>
+          <w:sz w:val="24"/>
+          <w:szCs w:val="24"/>
+        </w:rPr>
+      </w:pPr>
+      <w:r>
+        <w:rPr>
+          <w:sz w:val="24"/>
+          <w:szCs w:val="24"/>
+        </w:rPr>
+        <w:t>• </w:t>
+      </w:r>
+      <w:r>
+        <w:rPr>
+          <w:sz w:val="24"/>
+          <w:szCs w:val="24"/>
+        </w:rPr>
+        <w:t xml:space="preserve">Implemented </w:t>
+      </w:r>
+      <w:r>
+        <w:rPr>
+          <w:sz w:val="24"/>
+          <w:szCs w:val="24"/>
+        </w:rPr>
+        <w:t>4 local optimizations (</w:t>
+      </w:r>
+      <w:hyperlink r:id="rId16" w:history="1">
+        <w:r>
+          <w:rPr>
+            <w:rStyle w:val="Hyperlink"/>
+            <w:sz w:val="24"/>
+            <w:szCs w:val="24"/>
+          </w:rPr>
+          <w:t>[1]</w:t>
+        </w:r>
+      </w:hyperlink>
+      <w:r>
+        <w:rPr>
+          <w:sz w:val="24"/>
+          <w:szCs w:val="24"/>
+        </w:rPr>
+        <w:t xml:space="preserve">, </w:t>
+      </w:r>
+      <w:hyperlink r:id="rId17" w:history="1">
+        <w:r>
+          <w:rPr>
+            <w:rStyle w:val="Hyperlink"/>
+            <w:sz w:val="24"/>
+            <w:szCs w:val="24"/>
+          </w:rPr>
+          <w:t>[2]</w:t>
+        </w:r>
+      </w:hyperlink>
+      <w:r>
+        <w:rPr>
+          <w:sz w:val="24"/>
+          <w:szCs w:val="24"/>
+        </w:rPr>
+        <w:t xml:space="preserve">, </w:t>
+      </w:r>
+      <w:hyperlink r:id="rId18" w:history="1">
+        <w:r>
+          <w:rPr>
+            <w:rStyle w:val="Hyperlink"/>
+            <w:sz w:val="24"/>
+            <w:szCs w:val="24"/>
+          </w:rPr>
+          <w:t>[3]</w:t>
+        </w:r>
+      </w:hyperlink>
+      <w:r>
+        <w:rPr>
+          <w:sz w:val="24"/>
+          <w:szCs w:val="24"/>
+        </w:rPr>
+        <w:t xml:space="preserve">, </w:t>
+      </w:r>
+      <w:hyperlink r:id="rId19" w:history="1">
+        <w:r>
+          <w:rPr>
+            <w:rStyle w:val="Hyperlink"/>
+            <w:sz w:val="24"/>
+            <w:szCs w:val="24"/>
+          </w:rPr>
+          <w:t>[4]</w:t>
+        </w:r>
+      </w:hyperlink>
+      <w:r>
+        <w:rPr>
+          <w:sz w:val="24"/>
+          <w:szCs w:val="24"/>
+        </w:rPr>
+        <w:t>) resulting in a 1</w:t>
+      </w:r>
+      <w:r>
+        <w:rPr>
+          <w:sz w:val="24"/>
+          <w:szCs w:val="24"/>
+        </w:rPr>
+        <w:t>0% increase in processing speed</w:t>
+      </w:r>
+      <w:r>
+        <w:rPr>
+          <w:sz w:val="24"/>
+          <w:szCs w:val="24"/>
+        </w:rPr>
+        <w:t xml:space="preserve"> and 30% reduction in garbage collection overhead.</w:t>
+      </w:r>
+      <w:r>
+        <w:rPr>
+          <w:sz w:val="24"/>
+          <w:szCs w:val="24"/>
+        </w:rPr>
+        <w:t xml:space="preserve"> Released in </w:t>
+      </w:r>
+      <w:hyperlink r:id="rId20" w:history="1">
+        <w:r>
+          <w:rPr>
+            <w:rStyle w:val="Hyperlink"/>
+            <w:sz w:val="24"/>
+            <w:szCs w:val="24"/>
+          </w:rPr>
+          <w:t>Hudi 1.0.1</w:t>
+        </w:r>
+      </w:hyperlink>
       <w:r>
         <w:rPr>
           <w:sz w:val="24"/>
@@ -1467,29 +1808,46 @@
         </w:rPr>
         <w:t>• </w:t>
       </w:r>
-      <w:hyperlink r:id="rId13" w:history="1">
+      <w:r>
+        <w:rPr>
+          <w:sz w:val="24"/>
+          <w:szCs w:val="24"/>
+        </w:rPr>
+        <w:t xml:space="preserve">Contributed </w:t>
+      </w:r>
+      <w:r>
+        <w:rPr>
+          <w:sz w:val="24"/>
+          <w:szCs w:val="24"/>
+        </w:rPr>
+        <w:t>5</w:t>
+      </w:r>
+      <w:bookmarkStart w:id="1" w:name="_GoBack"/>
+      <w:bookmarkEnd w:id="1"/>
+      <w:r>
+        <w:rPr>
+          <w:sz w:val="24"/>
+          <w:szCs w:val="24"/>
+        </w:rPr>
+        <w:t xml:space="preserve">0+ </w:t>
+      </w:r>
+      <w:hyperlink r:id="rId21" w:history="1">
         <w:r>
           <w:rPr>
             <w:rStyle w:val="Hyperlink"/>
             <w:sz w:val="24"/>
             <w:szCs w:val="24"/>
           </w:rPr>
-          <w:t>agent-develop-review-loop</w:t>
+          <w:t>merged pull requests</w:t>
         </w:r>
       </w:hyperlink>
       <w:r>
         <w:rPr>
-          <w:sz w:val="24"/>
-          <w:szCs w:val="24"/>
-        </w:rPr>
-        <w:t xml:space="preserve"> – </w:t>
-      </w:r>
-      <w:r>
-        <w:rPr>
-          <w:sz w:val="24"/>
-          <w:szCs w:val="24"/>
-        </w:rPr>
-        <w:t>shell-only develop-review loop with HITL handoff, resumable runs, and cost telemetry parsed from agent usage metadata.</w:t>
+          <w:color w:val="000000"/>
+          <w:sz w:val="24"/>
+          <w:szCs w:val="24"/>
+        </w:rPr>
+        <w:t>.</w:t>
       </w:r>
     </w:p>
     <w:tbl>
@@ -1534,31 +1892,7 @@
                 <w:sz w:val="24"/>
                 <w:szCs w:val="24"/>
               </w:rPr>
-              <w:t xml:space="preserve">Jan 24 </w:t>
-            </w:r>
-            <w:r>
-              <w:rPr>
-                <w:color w:val="000000"/>
-                <w:sz w:val="24"/>
-                <w:szCs w:val="24"/>
-              </w:rPr>
-              <w:t>–</w:t>
-            </w:r>
-            <w:r>
-              <w:rPr>
-                <w:color w:val="000000"/>
-                <w:sz w:val="24"/>
-                <w:szCs w:val="24"/>
-              </w:rPr>
-              <w:t xml:space="preserve"> </w:t>
-            </w:r>
-            <w:r>
-              <w:rPr>
-                <w:color w:val="000000"/>
-                <w:sz w:val="24"/>
-                <w:szCs w:val="24"/>
-              </w:rPr>
-              <w:t>Current</w:t>
+              <w:t>Apr 26 – Current</w:t>
             </w:r>
           </w:p>
           <w:p>
@@ -1585,39 +1919,7 @@
                 <w:sz w:val="24"/>
                 <w:szCs w:val="24"/>
               </w:rPr>
-              <w:t>(</w:t>
-            </w:r>
-            <w:r>
-              <w:rPr>
-                <w:color w:val="000000"/>
-                <w:sz w:val="24"/>
-                <w:szCs w:val="24"/>
-              </w:rPr>
-              <w:t>2</w:t>
-            </w:r>
-            <w:r>
-              <w:rPr>
-                <w:color w:val="000000"/>
-                <w:sz w:val="24"/>
-                <w:szCs w:val="24"/>
-              </w:rPr>
-              <w:t> yr</w:t>
-            </w:r>
-            <w:r>
-              <w:rPr>
-                <w:color w:val="000000"/>
-                <w:sz w:val="24"/>
-                <w:szCs w:val="24"/>
-              </w:rPr>
-              <w:t>s</w:t>
-            </w:r>
-            <w:r>
-              <w:rPr>
-                <w:color w:val="000000"/>
-                <w:sz w:val="24"/>
-                <w:szCs w:val="24"/>
-              </w:rPr>
-              <w:t>)</w:t>
+              <w:t>(~0.5 yrs)</w:t>
             </w:r>
           </w:p>
         </w:tc>
@@ -1648,16 +1950,7 @@
                 <w:sz w:val="24"/>
                 <w:szCs w:val="24"/>
               </w:rPr>
-              <w:t>Apache Hudi</w:t>
-            </w:r>
-            <w:r>
-              <w:rPr>
-                <w:b/>
-                <w:color w:val="000000"/>
-                <w:sz w:val="24"/>
-                <w:szCs w:val="24"/>
-              </w:rPr>
-              <w:t xml:space="preserve"> Contributor</w:t>
+              <w:t>Open-source: Agentic development tooling</w:t>
             </w:r>
             <w:r>
               <w:rPr>
@@ -1690,7 +1983,7 @@
                 <w:sz w:val="24"/>
                 <w:szCs w:val="24"/>
               </w:rPr>
-              <w:t>The Apache Software Foundation</w:t>
+              <w:t>Personal projects</w:t>
             </w:r>
           </w:p>
         </w:tc>
@@ -1708,152 +2001,34 @@
         <w:spacing w:before="120" w:after="60" w:line="264" w:lineRule="auto"/>
         <w:jc w:val="both"/>
         <w:rPr>
+          <w:color w:val="000000"/>
           <w:sz w:val="24"/>
           <w:szCs w:val="24"/>
         </w:rPr>
       </w:pPr>
-      <w:hyperlink r:id="rId14" w:history="1">
-        <w:r>
-          <w:rPr>
-            <w:rStyle w:val="Hyperlink"/>
-            <w:sz w:val="24"/>
-            <w:szCs w:val="24"/>
-          </w:rPr>
-          <w:t>Apache Hudi</w:t>
-        </w:r>
-      </w:hyperlink>
-      <w:r>
-        <w:rPr>
-          <w:sz w:val="24"/>
-          <w:szCs w:val="24"/>
-        </w:rPr>
-        <w:t xml:space="preserve"> is</w:t>
-      </w:r>
-      <w:r>
-        <w:rPr>
-          <w:sz w:val="24"/>
-          <w:szCs w:val="24"/>
-        </w:rPr>
-        <w:t xml:space="preserve"> a</w:t>
-      </w:r>
-      <w:r>
-        <w:rPr>
-          <w:sz w:val="24"/>
-          <w:szCs w:val="24"/>
-        </w:rPr>
-        <w:t xml:space="preserve"> </w:t>
-      </w:r>
-      <w:r>
-        <w:rPr>
-          <w:sz w:val="24"/>
-          <w:szCs w:val="24"/>
-        </w:rPr>
-        <w:t>data l</w:t>
-      </w:r>
-      <w:r>
-        <w:rPr>
-          <w:sz w:val="24"/>
-          <w:szCs w:val="24"/>
-        </w:rPr>
-        <w:t>akehouse platform</w:t>
-      </w:r>
-      <w:r>
-        <w:rPr>
-          <w:sz w:val="24"/>
-          <w:szCs w:val="24"/>
-        </w:rPr>
-        <w:t xml:space="preserve"> that brings </w:t>
-      </w:r>
-      <w:r>
-        <w:rPr>
-          <w:sz w:val="24"/>
-          <w:szCs w:val="24"/>
-        </w:rPr>
-        <w:t xml:space="preserve">database functionality </w:t>
-      </w:r>
-      <w:r>
-        <w:rPr>
-          <w:sz w:val="24"/>
-          <w:szCs w:val="24"/>
-        </w:rPr>
-        <w:t>to d</w:t>
-      </w:r>
-      <w:r>
-        <w:rPr>
-          <w:sz w:val="24"/>
-          <w:szCs w:val="24"/>
-        </w:rPr>
-        <w:t xml:space="preserve">ata </w:t>
-      </w:r>
-      <w:r>
-        <w:rPr>
-          <w:sz w:val="24"/>
-          <w:szCs w:val="24"/>
-        </w:rPr>
-        <w:t>l</w:t>
-      </w:r>
-      <w:r>
-        <w:rPr>
-          <w:sz w:val="24"/>
-          <w:szCs w:val="24"/>
-        </w:rPr>
-        <w:t>ake</w:t>
-      </w:r>
-      <w:r>
-        <w:rPr>
-          <w:sz w:val="24"/>
-          <w:szCs w:val="24"/>
-        </w:rPr>
-        <w:t>s</w:t>
-      </w:r>
-      <w:r>
-        <w:rPr>
-          <w:sz w:val="24"/>
-          <w:szCs w:val="24"/>
-        </w:rPr>
-        <w:t xml:space="preserve"> </w:t>
-      </w:r>
-      <w:r>
-        <w:rPr>
-          <w:sz w:val="24"/>
-          <w:szCs w:val="24"/>
-        </w:rPr>
-        <w:t xml:space="preserve">and </w:t>
-      </w:r>
-      <w:r>
-        <w:rPr>
-          <w:sz w:val="24"/>
-          <w:szCs w:val="24"/>
-        </w:rPr>
-        <w:t xml:space="preserve">enables </w:t>
-      </w:r>
-      <w:r>
-        <w:rPr>
-          <w:sz w:val="24"/>
-          <w:szCs w:val="24"/>
-        </w:rPr>
-        <w:t>incremental processing for low</w:t>
-      </w:r>
-      <w:r>
-        <w:rPr>
-          <w:sz w:val="24"/>
-          <w:szCs w:val="24"/>
-        </w:rPr>
-        <w:t>-</w:t>
-      </w:r>
-      <w:r>
-        <w:rPr>
-          <w:sz w:val="24"/>
-          <w:szCs w:val="24"/>
-        </w:rPr>
-        <w:t>latency analytics</w:t>
-      </w:r>
-      <w:r>
-        <w:rPr>
-          <w:sz w:val="24"/>
-          <w:szCs w:val="24"/>
-        </w:rPr>
-        <w:t>.</w:t>
+      <w:r>
+        <w:rPr>
+          <w:color w:val="000000"/>
+          <w:sz w:val="24"/>
+          <w:szCs w:val="24"/>
+        </w:rPr>
+        <w:t xml:space="preserve">Self-directed work on agent-augmented engineering workflows </w:t>
+      </w:r>
+      <w:r>
+        <w:rPr>
+          <w:color w:val="000000"/>
+          <w:sz w:val="24"/>
+          <w:szCs w:val="24"/>
+        </w:rPr>
+        <w:t>–</w:t>
+      </w:r>
+      <w:r>
+        <w:rPr>
+          <w:color w:val="000000"/>
+          <w:sz w:val="24"/>
+          <w:szCs w:val="24"/>
+        </w:rPr>
+        <w:t xml:space="preserve"> treating coding-agent CLIs (Claude Code, Codex) as bounded executors inside reproducible pipelines.</w:t>
       </w:r>
     </w:p>
     <w:p>
@@ -1878,222 +2053,8 @@
           <w:sz w:val="24"/>
           <w:szCs w:val="24"/>
         </w:rPr>
-        <w:t>• </w:t>
-      </w:r>
-      <w:r>
-        <w:rPr>
-          <w:sz w:val="24"/>
-          <w:szCs w:val="24"/>
-        </w:rPr>
-        <w:t>Optimized serialization and deserialization of records in Flink stream writing</w:t>
-      </w:r>
-      <w:r>
-        <w:rPr>
-          <w:sz w:val="24"/>
-          <w:szCs w:val="24"/>
-        </w:rPr>
-        <w:t xml:space="preserve"> to Hudi table</w:t>
-      </w:r>
-      <w:r>
-        <w:rPr>
-          <w:sz w:val="24"/>
-          <w:szCs w:val="24"/>
-        </w:rPr>
-        <w:t>, resulting in a 30% increase in processing speed and 2x reduction in memory usage</w:t>
-      </w:r>
-      <w:r>
-        <w:rPr>
-          <w:sz w:val="24"/>
-          <w:szCs w:val="24"/>
-        </w:rPr>
-        <w:t xml:space="preserve"> (</w:t>
-      </w:r>
-      <w:hyperlink r:id="rId15" w:history="1">
-        <w:r>
-          <w:rPr>
-            <w:rStyle w:val="Hyperlink"/>
-            <w:sz w:val="24"/>
-            <w:szCs w:val="24"/>
-          </w:rPr>
-          <w:t>design doc</w:t>
-        </w:r>
-      </w:hyperlink>
-      <w:r>
-        <w:rPr>
-          <w:sz w:val="24"/>
-          <w:szCs w:val="24"/>
-        </w:rPr>
-        <w:t xml:space="preserve">, </w:t>
-      </w:r>
-      <w:hyperlink r:id="rId16" w:history="1">
-        <w:r>
-          <w:rPr>
-            <w:rStyle w:val="Hyperlink"/>
-            <w:sz w:val="24"/>
-            <w:szCs w:val="24"/>
-          </w:rPr>
-          <w:t>main changes</w:t>
-        </w:r>
-      </w:hyperlink>
-      <w:r>
-        <w:rPr>
-          <w:sz w:val="24"/>
-          <w:szCs w:val="24"/>
-        </w:rPr>
-        <w:t>).</w:t>
-      </w:r>
-      <w:r>
-        <w:rPr>
-          <w:sz w:val="24"/>
-          <w:szCs w:val="24"/>
-        </w:rPr>
-        <w:t xml:space="preserve"> Released in </w:t>
-      </w:r>
-      <w:hyperlink r:id="rId17" w:history="1">
-        <w:r>
-          <w:rPr>
-            <w:rStyle w:val="Hyperlink"/>
-            <w:sz w:val="24"/>
-            <w:szCs w:val="24"/>
-          </w:rPr>
-          <w:t>Hudi 1.0.2</w:t>
-        </w:r>
-      </w:hyperlink>
-      <w:r>
-        <w:rPr>
-          <w:sz w:val="24"/>
-          <w:szCs w:val="24"/>
-        </w:rPr>
-        <w:t>.</w:t>
-      </w:r>
-    </w:p>
-    <w:p>
-      <w:pPr>
-        <w:pBdr>
-          <w:top w:val="nil"/>
-          <w:left w:val="nil"/>
-          <w:bottom w:val="nil"/>
-          <w:right w:val="nil"/>
-          <w:between w:val="nil"/>
-        </w:pBdr>
-        <w:spacing w:before="60" w:after="60" w:line="264" w:lineRule="auto"/>
-        <w:ind w:left="170" w:hanging="170"/>
-        <w:jc w:val="both"/>
-        <w:rPr>
-          <w:sz w:val="24"/>
-          <w:szCs w:val="24"/>
-        </w:rPr>
-      </w:pPr>
-      <w:r>
-        <w:rPr>
-          <w:sz w:val="24"/>
-          <w:szCs w:val="24"/>
-        </w:rPr>
         <w:lastRenderedPageBreak/>
         <w:t>• </w:t>
-      </w:r>
-      <w:r>
-        <w:rPr>
-          <w:sz w:val="24"/>
-          <w:szCs w:val="24"/>
-        </w:rPr>
-        <w:t xml:space="preserve">Implemented </w:t>
-      </w:r>
-      <w:r>
-        <w:rPr>
-          <w:sz w:val="24"/>
-          <w:szCs w:val="24"/>
-        </w:rPr>
-        <w:t>4 local optimizations (</w:t>
-      </w:r>
-      <w:hyperlink r:id="rId18" w:history="1">
-        <w:r>
-          <w:rPr>
-            <w:rStyle w:val="Hyperlink"/>
-            <w:sz w:val="24"/>
-            <w:szCs w:val="24"/>
-          </w:rPr>
-          <w:t>[1]</w:t>
-        </w:r>
-      </w:hyperlink>
-      <w:r>
-        <w:rPr>
-          <w:sz w:val="24"/>
-          <w:szCs w:val="24"/>
-        </w:rPr>
-        <w:t xml:space="preserve">, </w:t>
-      </w:r>
-      <w:hyperlink r:id="rId19" w:history="1">
-        <w:r>
-          <w:rPr>
-            <w:rStyle w:val="Hyperlink"/>
-            <w:sz w:val="24"/>
-            <w:szCs w:val="24"/>
-          </w:rPr>
-          <w:t>[2]</w:t>
-        </w:r>
-      </w:hyperlink>
-      <w:r>
-        <w:rPr>
-          <w:sz w:val="24"/>
-          <w:szCs w:val="24"/>
-        </w:rPr>
-        <w:t xml:space="preserve">, </w:t>
-      </w:r>
-      <w:hyperlink r:id="rId20" w:history="1">
-        <w:r>
-          <w:rPr>
-            <w:rStyle w:val="Hyperlink"/>
-            <w:sz w:val="24"/>
-            <w:szCs w:val="24"/>
-          </w:rPr>
-          <w:t>[3]</w:t>
-        </w:r>
-      </w:hyperlink>
-      <w:r>
-        <w:rPr>
-          <w:sz w:val="24"/>
-          <w:szCs w:val="24"/>
-        </w:rPr>
-        <w:t xml:space="preserve">, </w:t>
-      </w:r>
-      <w:hyperlink r:id="rId21" w:history="1">
-        <w:r>
-          <w:rPr>
-            <w:rStyle w:val="Hyperlink"/>
-            <w:sz w:val="24"/>
-            <w:szCs w:val="24"/>
-          </w:rPr>
-          <w:t>[4]</w:t>
-        </w:r>
-      </w:hyperlink>
-      <w:r>
-        <w:rPr>
-          <w:sz w:val="24"/>
-          <w:szCs w:val="24"/>
-        </w:rPr>
-        <w:t>) resulting in a 1</w:t>
-      </w:r>
-      <w:r>
-        <w:rPr>
-          <w:sz w:val="24"/>
-          <w:szCs w:val="24"/>
-        </w:rPr>
-        <w:t>0% increase in processing speed</w:t>
-      </w:r>
-      <w:r>
-        <w:rPr>
-          <w:sz w:val="24"/>
-          <w:szCs w:val="24"/>
-        </w:rPr>
-        <w:t xml:space="preserve"> and 30% reduction in garbage collection overhead.</w:t>
-      </w:r>
-      <w:r>
-        <w:rPr>
-          <w:sz w:val="24"/>
-          <w:szCs w:val="24"/>
-        </w:rPr>
-        <w:t xml:space="preserve"> Released in </w:t>
       </w:r>
       <w:hyperlink r:id="rId22" w:history="1">
         <w:r>
@@ -2102,9 +2063,67 @@
             <w:sz w:val="24"/>
             <w:szCs w:val="24"/>
           </w:rPr>
-          <w:t>Hudi 1.0.1</w:t>
+          <w:t>agent-orchestrator</w:t>
         </w:r>
       </w:hyperlink>
+      <w:r>
+        <w:rPr>
+          <w:sz w:val="24"/>
+          <w:szCs w:val="24"/>
+        </w:rPr>
+        <w:t xml:space="preserve"> – </w:t>
+      </w:r>
+      <w:r>
+        <w:rPr>
+          <w:sz w:val="24"/>
+          <w:szCs w:val="24"/>
+        </w:rPr>
+        <w:t>GitHub-Issue-driven workflow runner.</w:t>
+      </w:r>
+      <w:r>
+        <w:rPr>
+          <w:sz w:val="24"/>
+          <w:szCs w:val="24"/>
+        </w:rPr>
+        <w:t xml:space="preserve"> </w:t>
+      </w:r>
+      <w:r>
+        <w:rPr>
+          <w:sz w:val="24"/>
+          <w:szCs w:val="24"/>
+        </w:rPr>
+        <w:t xml:space="preserve">Decomposes an issue, runs an implementer agent in an isolated git </w:t>
+      </w:r>
+      <w:proofErr w:type="spellStart"/>
+      <w:r>
+        <w:rPr>
+          <w:sz w:val="24"/>
+          <w:szCs w:val="24"/>
+        </w:rPr>
+        <w:t>worktree</w:t>
+      </w:r>
+      <w:proofErr w:type="spellEnd"/>
+      <w:r>
+        <w:rPr>
+          <w:sz w:val="24"/>
+          <w:szCs w:val="24"/>
+        </w:rPr>
+        <w:t>, opens a PR, runs an independent reviewer agent, notifies a human when ready to merge.</w:t>
+      </w:r>
+      <w:r>
+        <w:rPr>
+          <w:sz w:val="24"/>
+          <w:szCs w:val="24"/>
+        </w:rPr>
+        <w:t xml:space="preserve"> </w:t>
+      </w:r>
+      <w:r>
+        <w:rPr>
+          <w:sz w:val="24"/>
+          <w:szCs w:val="24"/>
+        </w:rPr>
+        <w:t>State persists in the issue itself</w:t>
+      </w:r>
       <w:r>
         <w:rPr>
           <w:sz w:val="24"/>
@@ -2138,20 +2157,6 @@
         </w:rPr>
         <w:t>• </w:t>
       </w:r>
-      <w:r>
-        <w:rPr>
-          <w:sz w:val="24"/>
-          <w:szCs w:val="24"/>
-        </w:rPr>
-        <w:t xml:space="preserve">Contributed </w:t>
-      </w:r>
-      <w:r>
-        <w:rPr>
-          <w:sz w:val="24"/>
-          <w:szCs w:val="24"/>
-        </w:rPr>
-        <w:t xml:space="preserve">40+ </w:t>
-      </w:r>
       <w:hyperlink r:id="rId23" w:history="1">
         <w:r>
           <w:rPr>
@@ -2159,16 +2164,22 @@
             <w:sz w:val="24"/>
             <w:szCs w:val="24"/>
           </w:rPr>
-          <w:t>merged pull requests</w:t>
+          <w:t>agent-develop-review-loop</w:t>
         </w:r>
       </w:hyperlink>
       <w:r>
         <w:rPr>
-          <w:color w:val="000000"/>
-          <w:sz w:val="24"/>
-          <w:szCs w:val="24"/>
-        </w:rPr>
-        <w:t>.</w:t>
+          <w:sz w:val="24"/>
+          <w:szCs w:val="24"/>
+        </w:rPr>
+        <w:t xml:space="preserve"> – </w:t>
+      </w:r>
+      <w:r>
+        <w:rPr>
+          <w:sz w:val="24"/>
+          <w:szCs w:val="24"/>
+        </w:rPr>
+        <w:t>shell-only develop-review loop with HITL handoff, resumable runs, and cost telemetry parsed from agent usage metadata.</w:t>
       </w:r>
     </w:p>
     <w:tbl>

</xml_diff>

<commit_message>
files: add work on Lance, update
</commit_message>
<xml_diff>
--- a/file/CV_Geser_Dugarov.docx
+++ b/file/CV_Geser_Dugarov.docx
@@ -1,6 +1,6 @@
 
 <file path=word/document.xml><?xml version="1.0" encoding="utf-8"?>
-<w:document xmlns:wpc="http://schemas.microsoft.com/office/word/2010/wordprocessingCanvas" xmlns:cx="http://schemas.microsoft.com/office/drawing/2014/chartex" xmlns:cx1="http://schemas.microsoft.com/office/drawing/2015/9/8/chartex" xmlns:cx2="http://schemas.microsoft.com/office/drawing/2015/10/21/chartex" xmlns:cx3="http://schemas.microsoft.com/office/drawing/2016/5/9/chartex" xmlns:cx4="http://schemas.microsoft.com/office/drawing/2016/5/10/chartex" xmlns:cx5="http://schemas.microsoft.com/office/drawing/2016/5/11/chartex" xmlns:cx6="http://schemas.microsoft.com/office/drawing/2016/5/12/chartex" xmlns:cx7="http://schemas.microsoft.com/office/drawing/2016/5/13/chartex" xmlns:cx8="http://schemas.microsoft.com/office/drawing/2016/5/14/chartex" xmlns:mc="http://schemas.openxmlformats.org/markup-compatibility/2006" xmlns:aink="http://schemas.microsoft.com/office/drawing/2016/ink" xmlns:am3d="http://schemas.microsoft.com/office/drawing/2017/model3d" xmlns:o="urn:schemas-microsoft-com:office:office" xmlns:r="http://schemas.openxmlformats.org/officeDocument/2006/relationships" xmlns:m="http://schemas.openxmlformats.org/officeDocument/2006/math" xmlns:v="urn:schemas-microsoft-com:vml" xmlns:wp14="http://schemas.microsoft.com/office/word/2010/wordprocessingDrawing" xmlns:wp="http://schemas.openxmlformats.org/drawingml/2006/wordprocessingDrawing" xmlns:w10="urn:schemas-microsoft-com:office:word" xmlns:w="http://schemas.openxmlformats.org/wordprocessingml/2006/main" xmlns:w14="http://schemas.microsoft.com/office/word/2010/wordml" xmlns:w15="http://schemas.microsoft.com/office/word/2012/wordml" xmlns:w16cid="http://schemas.microsoft.com/office/word/2016/wordml/cid" xmlns:w16se="http://schemas.microsoft.com/office/word/2015/wordml/symex" xmlns:wpg="http://schemas.microsoft.com/office/word/2010/wordprocessingGroup" xmlns:wpi="http://schemas.microsoft.com/office/word/2010/wordprocessingInk" xmlns:wne="http://schemas.microsoft.com/office/word/2006/wordml" xmlns:wps="http://schemas.microsoft.com/office/word/2010/wordprocessingShape" mc:Ignorable="w14 w15 w16se w16cid wp14">
+<w:document xmlns:wpc="http://schemas.microsoft.com/office/word/2010/wordprocessingCanvas" xmlns:cx="http://schemas.microsoft.com/office/drawing/2014/chartex" xmlns:cx1="http://schemas.microsoft.com/office/drawing/2015/9/8/chartex" xmlns:cx2="http://schemas.microsoft.com/office/drawing/2015/10/21/chartex" xmlns:cx3="http://schemas.microsoft.com/office/drawing/2016/5/9/chartex" xmlns:cx4="http://schemas.microsoft.com/office/drawing/2016/5/10/chartex" xmlns:cx5="http://schemas.microsoft.com/office/drawing/2016/5/11/chartex" xmlns:cx6="http://schemas.microsoft.com/office/drawing/2016/5/12/chartex" xmlns:cx7="http://schemas.microsoft.com/office/drawing/2016/5/13/chartex" xmlns:cx8="http://schemas.microsoft.com/office/drawing/2016/5/14/chartex" xmlns:mc="http://schemas.openxmlformats.org/markup-compatibility/2006" xmlns:aink="http://schemas.microsoft.com/office/drawing/2016/ink" xmlns:am3d="http://schemas.microsoft.com/office/drawing/2017/model3d" xmlns:o="urn:schemas-microsoft-com:office:office" xmlns:r="http://schemas.openxmlformats.org/officeDocument/2006/relationships" xmlns:m="http://schemas.openxmlformats.org/officeDocument/2006/math" xmlns:v="urn:schemas-microsoft-com:vml" xmlns:wp14="http://schemas.microsoft.com/office/word/2010/wordprocessingDrawing" xmlns:wp="http://schemas.openxmlformats.org/drawingml/2006/wordprocessingDrawing" xmlns:w10="urn:schemas-microsoft-com:office:word" xmlns:w="http://schemas.openxmlformats.org/wordprocessingml/2006/main" xmlns:w14="http://schemas.microsoft.com/office/word/2010/wordml" xmlns:w15="http://schemas.microsoft.com/office/word/2012/wordml" xmlns:w16cex="http://schemas.microsoft.com/office/word/2018/wordml/cex" xmlns:w16cid="http://schemas.microsoft.com/office/word/2016/wordml/cid" xmlns:w16="http://schemas.microsoft.com/office/word/2018/wordml" xmlns:w16sdtdh="http://schemas.microsoft.com/office/word/2020/wordml/sdtdatahash" xmlns:w16se="http://schemas.microsoft.com/office/word/2015/wordml/symex" xmlns:wpg="http://schemas.microsoft.com/office/word/2010/wordprocessingGroup" xmlns:wpi="http://schemas.microsoft.com/office/word/2010/wordprocessingInk" xmlns:wne="http://schemas.microsoft.com/office/word/2006/wordml" xmlns:wps="http://schemas.microsoft.com/office/word/2010/wordprocessingShape" mc:Ignorable="w14 w15 w16se w16cid w16 w16cex w16sdtdh wp14">
   <w:body>
     <w:p>
       <w:pPr>
@@ -196,7 +196,7 @@
                 <w:szCs w:val="24"/>
               </w:rPr>
             </w:pPr>
-            <w:hyperlink r:id="rId7">
+            <w:hyperlink r:id="rId8">
               <w:r>
                 <w:rPr>
                   <w:color w:val="0000FF"/>
@@ -232,7 +232,7 @@
                 <w:szCs w:val="24"/>
               </w:rPr>
             </w:pPr>
-            <w:hyperlink r:id="rId8">
+            <w:hyperlink r:id="rId9">
               <w:r>
                 <w:rPr>
                   <w:color w:val="0000FF"/>
@@ -251,7 +251,7 @@
               </w:rPr>
               <w:t xml:space="preserve">, </w:t>
             </w:r>
-            <w:hyperlink r:id="rId9">
+            <w:hyperlink r:id="rId10">
               <w:r>
                 <w:rPr>
                   <w:color w:val="0000FF"/>
@@ -310,7 +310,7 @@
           <w:right w:val="nil"/>
           <w:between w:val="nil"/>
         </w:pBdr>
-        <w:spacing w:line="264" w:lineRule="auto"/>
+        <w:spacing w:after="60" w:line="264" w:lineRule="auto"/>
         <w:jc w:val="both"/>
         <w:rPr>
           <w:color w:val="000000"/>
@@ -326,154 +326,43 @@
           <w:sz w:val="24"/>
           <w:szCs w:val="24"/>
         </w:rPr>
-        <w:t xml:space="preserve">Software Engineer developing core functionality on a data lakehouse platform to extract value from </w:t>
-      </w:r>
-      <w:r>
-        <w:rPr>
-          <w:color w:val="000000"/>
-          <w:sz w:val="24"/>
-          <w:szCs w:val="24"/>
-        </w:rPr>
-        <w:t>petabyte</w:t>
-      </w:r>
-      <w:r>
-        <w:rPr>
-          <w:color w:val="000000"/>
-          <w:sz w:val="24"/>
-          <w:szCs w:val="24"/>
-        </w:rPr>
-        <w:t>-scale data</w:t>
-      </w:r>
-      <w:r>
-        <w:rPr>
-          <w:color w:val="000000"/>
-          <w:sz w:val="24"/>
-          <w:szCs w:val="24"/>
-        </w:rPr>
-        <w:t xml:space="preserve">. </w:t>
-      </w:r>
-      <w:r>
-        <w:rPr>
-          <w:color w:val="000000"/>
-          <w:sz w:val="24"/>
-          <w:szCs w:val="24"/>
-        </w:rPr>
-        <w:t>Hands-on experience with Apache Spark and Apache Flink, with a focus on Hudi-Spark and Hudi-Flink integrations.</w:t>
-      </w:r>
-      <w:r>
-        <w:rPr>
-          <w:color w:val="000000"/>
-          <w:sz w:val="24"/>
-          <w:szCs w:val="24"/>
-        </w:rPr>
-        <w:t xml:space="preserve"> </w:t>
-      </w:r>
-      <w:hyperlink r:id="rId10" w:history="1">
+        <w:t xml:space="preserve">Software Engineer building data lakehouse and AI data infrastructure for petabyte-scale data, currently a distributed cache and an incrementally updatable vector index targeting tens of billions of vectors. Open-source contributor to Apache Hudi (50 </w:t>
+      </w:r>
+      <w:hyperlink r:id="rId11" w:history="1">
         <w:r>
           <w:rPr>
             <w:rStyle w:val="Hyperlink"/>
             <w:sz w:val="24"/>
             <w:szCs w:val="24"/>
           </w:rPr>
-          <w:t>Open-source contributor</w:t>
+          <w:t>merged PRs</w:t>
         </w:r>
       </w:hyperlink>
       <w:r>
         <w:rPr>
-          <w:sz w:val="24"/>
-          <w:szCs w:val="24"/>
-        </w:rPr>
-        <w:t xml:space="preserve"> to </w:t>
-      </w:r>
-      <w:r>
-        <w:rPr>
-          <w:sz w:val="24"/>
-          <w:szCs w:val="24"/>
-        </w:rPr>
-        <w:t>Apache Hudi</w:t>
-      </w:r>
-      <w:r>
-        <w:rPr>
-          <w:color w:val="000000"/>
-          <w:sz w:val="24"/>
-          <w:szCs w:val="24"/>
-        </w:rPr>
-        <w:t>,</w:t>
-      </w:r>
-      <w:r>
-        <w:t xml:space="preserve"> </w:t>
-      </w:r>
-      <w:r>
-        <w:rPr>
-          <w:color w:val="000000"/>
-          <w:sz w:val="24"/>
-          <w:szCs w:val="24"/>
-        </w:rPr>
-        <w:t>focus</w:t>
-      </w:r>
-      <w:r>
-        <w:rPr>
-          <w:color w:val="000000"/>
-          <w:sz w:val="24"/>
-          <w:szCs w:val="24"/>
-        </w:rPr>
-        <w:t>ing</w:t>
-      </w:r>
-      <w:r>
-        <w:rPr>
-          <w:color w:val="000000"/>
-          <w:sz w:val="24"/>
-          <w:szCs w:val="24"/>
-        </w:rPr>
-        <w:t xml:space="preserve"> on </w:t>
-      </w:r>
-      <w:r>
-        <w:rPr>
-          <w:color w:val="000000"/>
-          <w:sz w:val="24"/>
-          <w:szCs w:val="24"/>
-        </w:rPr>
-        <w:t xml:space="preserve">streaming </w:t>
-      </w:r>
-      <w:r>
-        <w:rPr>
-          <w:color w:val="000000"/>
-          <w:sz w:val="24"/>
-          <w:szCs w:val="24"/>
-        </w:rPr>
-        <w:t>performance and solution</w:t>
-      </w:r>
-      <w:r>
-        <w:rPr>
-          <w:color w:val="000000"/>
-          <w:sz w:val="24"/>
-          <w:szCs w:val="24"/>
-        </w:rPr>
-        <w:t xml:space="preserve"> </w:t>
-      </w:r>
-      <w:r>
-        <w:rPr>
-          <w:color w:val="000000"/>
-          <w:sz w:val="24"/>
-          <w:szCs w:val="24"/>
-        </w:rPr>
-        <w:t>usability</w:t>
-      </w:r>
-      <w:r>
-        <w:rPr>
-          <w:color w:val="000000"/>
-          <w:sz w:val="24"/>
-          <w:szCs w:val="24"/>
-        </w:rPr>
-        <w:t xml:space="preserve"> (50+ merged PRs)</w:t>
-      </w:r>
-      <w:r>
-        <w:rPr>
-          <w:color w:val="000000"/>
-          <w:sz w:val="24"/>
-          <w:szCs w:val="24"/>
-        </w:rPr>
-        <w:t>.</w:t>
+          <w:color w:val="000000"/>
+          <w:sz w:val="24"/>
+          <w:szCs w:val="24"/>
+        </w:rPr>
+        <w:t xml:space="preserve">) and Lance (3 </w:t>
+      </w:r>
+      <w:hyperlink r:id="rId12" w:history="1">
+        <w:r>
+          <w:rPr>
+            <w:rStyle w:val="Hyperlink"/>
+            <w:sz w:val="24"/>
+            <w:szCs w:val="24"/>
+          </w:rPr>
+          <w:t>merged PRs</w:t>
+        </w:r>
+      </w:hyperlink>
+      <w:r>
+        <w:rPr>
+          <w:color w:val="000000"/>
+          <w:sz w:val="24"/>
+          <w:szCs w:val="24"/>
+        </w:rPr>
+        <w:t>).</w:t>
       </w:r>
     </w:p>
     <w:p>
@@ -515,95 +404,7 @@
           <w:sz w:val="24"/>
           <w:szCs w:val="24"/>
         </w:rPr>
-        <w:t>issue-driven orchestrators and develop-review loops that turn coding-agent CLIs into reproducible engineering pipelines.</w:t>
-      </w:r>
-      <w:r>
-        <w:rPr>
-          <w:color w:val="000000"/>
-          <w:sz w:val="24"/>
-          <w:szCs w:val="24"/>
-        </w:rPr>
-        <w:t xml:space="preserve"> </w:t>
-      </w:r>
-      <w:r>
-        <w:rPr>
-          <w:color w:val="000000"/>
-          <w:sz w:val="24"/>
-          <w:szCs w:val="24"/>
-        </w:rPr>
-        <w:t>Extensive</w:t>
-      </w:r>
-      <w:r>
-        <w:rPr>
-          <w:color w:val="000000"/>
-          <w:sz w:val="24"/>
-          <w:szCs w:val="24"/>
-        </w:rPr>
-        <w:t xml:space="preserve"> experience</w:t>
-      </w:r>
-      <w:r>
-        <w:rPr>
-          <w:color w:val="000000"/>
-          <w:sz w:val="24"/>
-          <w:szCs w:val="24"/>
-        </w:rPr>
-        <w:t xml:space="preserve"> in research and data analysis</w:t>
-      </w:r>
-      <w:r>
-        <w:rPr>
-          <w:color w:val="000000"/>
-          <w:sz w:val="24"/>
-          <w:szCs w:val="24"/>
-        </w:rPr>
-        <w:t>;</w:t>
-      </w:r>
-      <w:r>
-        <w:rPr>
-          <w:color w:val="000000"/>
-          <w:sz w:val="24"/>
-          <w:szCs w:val="24"/>
-        </w:rPr>
-        <w:t xml:space="preserve"> </w:t>
-      </w:r>
-      <w:r>
-        <w:rPr>
-          <w:color w:val="000000"/>
-          <w:sz w:val="24"/>
-          <w:szCs w:val="24"/>
-        </w:rPr>
-        <w:t>PhD</w:t>
-      </w:r>
-      <w:r>
-        <w:rPr>
-          <w:color w:val="000000"/>
-          <w:sz w:val="24"/>
-          <w:szCs w:val="24"/>
-        </w:rPr>
-        <w:t>.</w:t>
-      </w:r>
-      <w:r>
-        <w:rPr>
-          <w:color w:val="000000"/>
-          <w:sz w:val="24"/>
-          <w:szCs w:val="24"/>
-        </w:rPr>
-        <w:t xml:space="preserve"> Strong interest in big data and distributed s</w:t>
-      </w:r>
-      <w:r>
-        <w:rPr>
-          <w:color w:val="000000"/>
-          <w:sz w:val="24"/>
-          <w:szCs w:val="24"/>
-        </w:rPr>
-        <w:t>ystems</w:t>
-      </w:r>
-      <w:r>
-        <w:rPr>
-          <w:color w:val="000000"/>
-          <w:sz w:val="24"/>
-          <w:szCs w:val="24"/>
-        </w:rPr>
-        <w:t>.</w:t>
+        <w:t>issue-driven orchestrators and develop-review loops that turn coding-agent CLIs into reproducible engineering pipelines. Extensive experience in research and data analysis; PhD. Strong interest in big data, distributed systems, and agentic development.</w:t>
       </w:r>
     </w:p>
     <w:p>
@@ -688,7 +489,7 @@
           <w:sz w:val="24"/>
           <w:szCs w:val="24"/>
         </w:rPr>
-        <w:t>PostgreSQL, Docker</w:t>
+        <w:t>Rust</w:t>
       </w:r>
       <w:r>
         <w:rPr>
@@ -698,7 +499,7 @@
           <w:sz w:val="24"/>
           <w:szCs w:val="24"/>
         </w:rPr>
-        <w:t xml:space="preserve">, </w:t>
+        <w:t> </w:t>
       </w:r>
       <w:r>
         <w:rPr>
@@ -708,7 +509,7 @@
           <w:sz w:val="24"/>
           <w:szCs w:val="24"/>
         </w:rPr>
-        <w:t xml:space="preserve">Data lakehouse, Distributed systems, </w:t>
+        <w:t>(beginner)</w:t>
       </w:r>
       <w:r>
         <w:rPr>
@@ -718,7 +519,7 @@
           <w:sz w:val="24"/>
           <w:szCs w:val="24"/>
         </w:rPr>
-        <w:t>Hadoop Ecosystem</w:t>
+        <w:t xml:space="preserve">, </w:t>
       </w:r>
       <w:r>
         <w:rPr>
@@ -728,7 +529,7 @@
           <w:sz w:val="24"/>
           <w:szCs w:val="24"/>
         </w:rPr>
-        <w:t xml:space="preserve">, </w:t>
+        <w:t>Hudi / Lance</w:t>
       </w:r>
       <w:r>
         <w:rPr>
@@ -738,7 +539,7 @@
           <w:sz w:val="24"/>
           <w:szCs w:val="24"/>
         </w:rPr>
-        <w:t>Agentic workflows</w:t>
+        <w:t xml:space="preserve">, </w:t>
       </w:r>
       <w:r>
         <w:rPr>
@@ -748,7 +549,7 @@
           <w:sz w:val="24"/>
           <w:szCs w:val="24"/>
         </w:rPr>
-        <w:t xml:space="preserve">, </w:t>
+        <w:t>Spark / Flink / Ray</w:t>
       </w:r>
       <w:r>
         <w:rPr>
@@ -758,7 +559,117 @@
           <w:sz w:val="24"/>
           <w:szCs w:val="24"/>
         </w:rPr>
-        <w:t>Claude Code / Codex</w:t>
+        <w:t xml:space="preserve">, </w:t>
+      </w:r>
+      <w:r>
+        <w:rPr>
+          <w:b/>
+          <w:i/>
+          <w:color w:val="000000"/>
+          <w:sz w:val="24"/>
+          <w:szCs w:val="24"/>
+        </w:rPr>
+        <w:t xml:space="preserve">Vector search, </w:t>
+      </w:r>
+      <w:r>
+        <w:rPr>
+          <w:b/>
+          <w:i/>
+          <w:color w:val="000000"/>
+          <w:sz w:val="24"/>
+          <w:szCs w:val="24"/>
+        </w:rPr>
+        <w:t xml:space="preserve">Distributed systems, </w:t>
+      </w:r>
+      <w:r>
+        <w:rPr>
+          <w:b/>
+          <w:i/>
+          <w:color w:val="000000"/>
+          <w:sz w:val="24"/>
+          <w:szCs w:val="24"/>
+        </w:rPr>
+        <w:t>Agentic workflows</w:t>
+      </w:r>
+      <w:r>
+        <w:rPr>
+          <w:b/>
+          <w:i/>
+          <w:color w:val="000000"/>
+          <w:sz w:val="24"/>
+          <w:szCs w:val="24"/>
+        </w:rPr>
+        <w:t xml:space="preserve">, </w:t>
+      </w:r>
+      <w:r>
+        <w:rPr>
+          <w:b/>
+          <w:i/>
+          <w:color w:val="000000"/>
+          <w:sz w:val="24"/>
+          <w:szCs w:val="24"/>
+        </w:rPr>
+        <w:t>Claude</w:t>
+      </w:r>
+      <w:r>
+        <w:rPr>
+          <w:b/>
+          <w:i/>
+          <w:color w:val="000000"/>
+          <w:sz w:val="24"/>
+          <w:szCs w:val="24"/>
+        </w:rPr>
+        <w:t> </w:t>
+      </w:r>
+      <w:r>
+        <w:rPr>
+          <w:b/>
+          <w:i/>
+          <w:color w:val="000000"/>
+          <w:sz w:val="24"/>
+          <w:szCs w:val="24"/>
+        </w:rPr>
+        <w:t>Code</w:t>
+      </w:r>
+      <w:r>
+        <w:rPr>
+          <w:b/>
+          <w:i/>
+          <w:color w:val="000000"/>
+          <w:sz w:val="24"/>
+          <w:szCs w:val="24"/>
+        </w:rPr>
+        <w:t> </w:t>
+      </w:r>
+      <w:r>
+        <w:rPr>
+          <w:b/>
+          <w:i/>
+          <w:color w:val="000000"/>
+          <w:sz w:val="24"/>
+          <w:szCs w:val="24"/>
+        </w:rPr>
+        <w:t>/</w:t>
+      </w:r>
+      <w:r>
+        <w:rPr>
+          <w:b/>
+          <w:i/>
+          <w:color w:val="000000"/>
+          <w:sz w:val="24"/>
+          <w:szCs w:val="24"/>
+        </w:rPr>
+        <w:t> </w:t>
+      </w:r>
+      <w:r>
+        <w:rPr>
+          <w:b/>
+          <w:i/>
+          <w:color w:val="000000"/>
+          <w:sz w:val="24"/>
+          <w:szCs w:val="24"/>
+        </w:rPr>
+        <w:t>Codex</w:t>
       </w:r>
     </w:p>
     <w:p>
@@ -997,7 +908,7 @@
                 <w:szCs w:val="24"/>
               </w:rPr>
             </w:pPr>
-            <w:hyperlink r:id="rId11" w:history="1">
+            <w:hyperlink r:id="rId13" w:history="1">
               <w:r>
                 <w:rPr>
                   <w:rStyle w:val="Hyperlink"/>
@@ -1047,7 +958,7 @@
           <w:right w:val="nil"/>
           <w:between w:val="nil"/>
         </w:pBdr>
-        <w:spacing w:before="120" w:after="60" w:line="264" w:lineRule="auto"/>
+        <w:spacing w:before="60" w:after="60" w:line="264" w:lineRule="auto"/>
         <w:ind w:left="170" w:hanging="170"/>
         <w:jc w:val="both"/>
         <w:rPr>
@@ -1060,28 +971,37 @@
           <w:sz w:val="24"/>
           <w:szCs w:val="24"/>
         </w:rPr>
-        <w:t>• </w:t>
-      </w:r>
-      <w:r>
-        <w:rPr>
-          <w:sz w:val="24"/>
-          <w:szCs w:val="24"/>
-        </w:rPr>
-        <w:t>Provided a simplified configuration system utilizing commonly used presets</w:t>
-      </w:r>
-      <w:r>
-        <w:rPr>
-          <w:sz w:val="24"/>
-          <w:szCs w:val="24"/>
-        </w:rPr>
-        <w:t xml:space="preserve"> </w:t>
-      </w:r>
-      <w:r>
-        <w:rPr>
-          <w:sz w:val="24"/>
-          <w:szCs w:val="24"/>
-        </w:rPr>
-        <w:t>to overcome the complexity of managing hundreds of parameters.</w:t>
+        <w:t>•</w:t>
+      </w:r>
+      <w:r>
+        <w:rPr>
+          <w:sz w:val="24"/>
+          <w:szCs w:val="24"/>
+        </w:rPr>
+        <w:t> </w:t>
+      </w:r>
+      <w:r>
+        <w:rPr>
+          <w:sz w:val="24"/>
+          <w:szCs w:val="24"/>
+        </w:rPr>
+        <w:t xml:space="preserve">Designed and implemented a distributed cache for Lance, pairing an in-memory L1 with a persistent L2 on per-worker </w:t>
+      </w:r>
+      <w:proofErr w:type="spellStart"/>
+      <w:r>
+        <w:rPr>
+          <w:sz w:val="24"/>
+          <w:szCs w:val="24"/>
+        </w:rPr>
+        <w:t>NVMe</w:t>
+      </w:r>
+      <w:proofErr w:type="spellEnd"/>
+      <w:r>
+        <w:rPr>
+          <w:sz w:val="24"/>
+          <w:szCs w:val="24"/>
+        </w:rPr>
+        <w:t xml:space="preserve"> and prewarming IVF partitions to avoid repeated object-storage reads.</w:t>
       </w:r>
     </w:p>
     <w:p>
@@ -1106,6 +1026,79 @@
           <w:sz w:val="24"/>
           <w:szCs w:val="24"/>
         </w:rPr>
+        <w:t>•</w:t>
+      </w:r>
+      <w:r>
+        <w:rPr>
+          <w:sz w:val="24"/>
+          <w:szCs w:val="24"/>
+        </w:rPr>
+        <w:t> </w:t>
+      </w:r>
+      <w:r>
+        <w:rPr>
+          <w:sz w:val="24"/>
+          <w:szCs w:val="24"/>
+        </w:rPr>
+        <w:t xml:space="preserve">Building a distributed, incrementally updatable vector index for tens-of-billions-scale datasets, based on </w:t>
+      </w:r>
+      <w:hyperlink r:id="rId14" w:history="1">
+        <w:r>
+          <w:rPr>
+            <w:rStyle w:val="Hyperlink"/>
+            <w:sz w:val="24"/>
+            <w:szCs w:val="24"/>
+          </w:rPr>
+          <w:t>Quake</w:t>
+        </w:r>
+      </w:hyperlink>
+      <w:r>
+        <w:rPr>
+          <w:sz w:val="24"/>
+          <w:szCs w:val="24"/>
+        </w:rPr>
+        <w:t xml:space="preserve"> query-adaptive ANN search, and driving its </w:t>
+      </w:r>
+      <w:hyperlink r:id="rId15" w:history="1">
+        <w:r>
+          <w:rPr>
+            <w:rStyle w:val="Hyperlink"/>
+            <w:sz w:val="24"/>
+            <w:szCs w:val="24"/>
+          </w:rPr>
+          <w:t>rewrite in Rust</w:t>
+        </w:r>
+      </w:hyperlink>
+      <w:r>
+        <w:rPr>
+          <w:sz w:val="24"/>
+          <w:szCs w:val="24"/>
+        </w:rPr>
+        <w:t>.</w:t>
+      </w:r>
+    </w:p>
+    <w:p>
+      <w:pPr>
+        <w:pBdr>
+          <w:top w:val="nil"/>
+          <w:left w:val="nil"/>
+          <w:bottom w:val="nil"/>
+          <w:right w:val="nil"/>
+          <w:between w:val="nil"/>
+        </w:pBdr>
+        <w:spacing w:before="60" w:after="60" w:line="264" w:lineRule="auto"/>
+        <w:ind w:left="170" w:hanging="170"/>
+        <w:jc w:val="both"/>
+        <w:rPr>
+          <w:sz w:val="24"/>
+          <w:szCs w:val="24"/>
+        </w:rPr>
+      </w:pPr>
+      <w:r>
+        <w:rPr>
+          <w:sz w:val="24"/>
+          <w:szCs w:val="24"/>
+        </w:rPr>
         <w:t>• </w:t>
       </w:r>
       <w:r>
@@ -1121,6 +1114,45 @@
           <w:szCs w:val="24"/>
         </w:rPr>
         <w:t>.</w:t>
+      </w:r>
+    </w:p>
+    <w:p>
+      <w:pPr>
+        <w:pBdr>
+          <w:top w:val="nil"/>
+          <w:left w:val="nil"/>
+          <w:bottom w:val="nil"/>
+          <w:right w:val="nil"/>
+          <w:between w:val="nil"/>
+        </w:pBdr>
+        <w:spacing w:before="60" w:after="60" w:line="264" w:lineRule="auto"/>
+        <w:ind w:left="170" w:hanging="170"/>
+        <w:jc w:val="both"/>
+        <w:rPr>
+          <w:sz w:val="24"/>
+          <w:szCs w:val="24"/>
+        </w:rPr>
+      </w:pPr>
+      <w:r>
+        <w:rPr>
+          <w:sz w:val="24"/>
+          <w:szCs w:val="24"/>
+        </w:rPr>
+        <w:t>•</w:t>
+      </w:r>
+      <w:r>
+        <w:rPr>
+          <w:sz w:val="24"/>
+          <w:szCs w:val="24"/>
+        </w:rPr>
+        <w:t> </w:t>
+      </w:r>
+      <w:r>
+        <w:rPr>
+          <w:sz w:val="24"/>
+          <w:szCs w:val="24"/>
+        </w:rPr>
+        <w:t>Reduced the platform's configuration burden by making sane Hudi defaults automatic for common scenarios.</w:t>
       </w:r>
     </w:p>
     <w:p>
@@ -1383,7 +1415,7 @@
           <w:szCs w:val="24"/>
         </w:rPr>
       </w:pPr>
-      <w:hyperlink r:id="rId12" w:history="1">
+      <w:hyperlink r:id="rId16" w:history="1">
         <w:r>
           <w:rPr>
             <w:rStyle w:val="Hyperlink"/>
@@ -1579,7 +1611,7 @@
         </w:rPr>
         <w:t xml:space="preserve"> (</w:t>
       </w:r>
-      <w:hyperlink r:id="rId13" w:history="1">
+      <w:hyperlink r:id="rId17" w:history="1">
         <w:r>
           <w:rPr>
             <w:rStyle w:val="Hyperlink"/>
@@ -1596,7 +1628,7 @@
         </w:rPr>
         <w:t xml:space="preserve">, </w:t>
       </w:r>
-      <w:hyperlink r:id="rId14" w:history="1">
+      <w:hyperlink r:id="rId18" w:history="1">
         <w:r>
           <w:rPr>
             <w:rStyle w:val="Hyperlink"/>
@@ -1620,7 +1652,7 @@
         </w:rPr>
         <w:t xml:space="preserve"> Released in </w:t>
       </w:r>
-      <w:hyperlink r:id="rId15" w:history="1">
+      <w:hyperlink r:id="rId19" w:history="1">
         <w:r>
           <w:rPr>
             <w:rStyle w:val="Hyperlink"/>
@@ -1676,7 +1708,7 @@
         </w:rPr>
         <w:t>4 local optimizations (</w:t>
       </w:r>
-      <w:hyperlink r:id="rId16" w:history="1">
+      <w:hyperlink r:id="rId20" w:history="1">
         <w:r>
           <w:rPr>
             <w:rStyle w:val="Hyperlink"/>
@@ -1693,7 +1725,7 @@
         </w:rPr>
         <w:t xml:space="preserve">, </w:t>
       </w:r>
-      <w:hyperlink r:id="rId17" w:history="1">
+      <w:hyperlink r:id="rId21" w:history="1">
         <w:r>
           <w:rPr>
             <w:rStyle w:val="Hyperlink"/>
@@ -1710,7 +1742,7 @@
         </w:rPr>
         <w:t xml:space="preserve">, </w:t>
       </w:r>
-      <w:hyperlink r:id="rId18" w:history="1">
+      <w:hyperlink r:id="rId22" w:history="1">
         <w:r>
           <w:rPr>
             <w:rStyle w:val="Hyperlink"/>
@@ -1727,7 +1759,7 @@
         </w:rPr>
         <w:t xml:space="preserve">, </w:t>
       </w:r>
-      <w:hyperlink r:id="rId19" w:history="1">
+      <w:hyperlink r:id="rId23" w:history="1">
         <w:r>
           <w:rPr>
             <w:rStyle w:val="Hyperlink"/>
@@ -1765,7 +1797,7 @@
         </w:rPr>
         <w:t xml:space="preserve"> Released in </w:t>
       </w:r>
-      <w:hyperlink r:id="rId20" w:history="1">
+      <w:hyperlink r:id="rId24" w:history="1">
         <w:r>
           <w:rPr>
             <w:rStyle w:val="Hyperlink"/>
@@ -1781,6 +1813,126 @@
           <w:szCs w:val="24"/>
         </w:rPr>
         <w:t>.</w:t>
+      </w:r>
+    </w:p>
+    <w:p>
+      <w:pPr>
+        <w:pBdr>
+          <w:top w:val="nil"/>
+          <w:left w:val="nil"/>
+          <w:bottom w:val="nil"/>
+          <w:right w:val="nil"/>
+          <w:between w:val="nil"/>
+        </w:pBdr>
+        <w:spacing w:before="60" w:after="60" w:line="264" w:lineRule="auto"/>
+        <w:ind w:left="170" w:hanging="170"/>
+        <w:jc w:val="both"/>
+        <w:rPr>
+          <w:sz w:val="24"/>
+          <w:szCs w:val="24"/>
+        </w:rPr>
+      </w:pPr>
+      <w:r>
+        <w:rPr>
+          <w:sz w:val="24"/>
+          <w:szCs w:val="24"/>
+        </w:rPr>
+        <w:t>•</w:t>
+      </w:r>
+      <w:r>
+        <w:rPr>
+          <w:sz w:val="24"/>
+          <w:szCs w:val="24"/>
+        </w:rPr>
+        <w:t> </w:t>
+      </w:r>
+      <w:r>
+        <w:rPr>
+          <w:sz w:val="24"/>
+          <w:szCs w:val="24"/>
+        </w:rPr>
+        <w:t xml:space="preserve">Author of RFC-98, Spark </w:t>
+      </w:r>
+      <w:proofErr w:type="spellStart"/>
+      <w:r>
+        <w:rPr>
+          <w:sz w:val="24"/>
+          <w:szCs w:val="24"/>
+        </w:rPr>
+        <w:t>Datasource</w:t>
+      </w:r>
+      <w:proofErr w:type="spellEnd"/>
+      <w:r>
+        <w:rPr>
+          <w:sz w:val="24"/>
+          <w:szCs w:val="24"/>
+        </w:rPr>
+        <w:t xml:space="preserve"> V2 read (</w:t>
+      </w:r>
+      <w:hyperlink r:id="rId25" w:history="1">
+        <w:r>
+          <w:rPr>
+            <w:rStyle w:val="Hyperlink"/>
+            <w:sz w:val="24"/>
+            <w:szCs w:val="24"/>
+          </w:rPr>
+          <w:t>claim</w:t>
+        </w:r>
+      </w:hyperlink>
+      <w:r>
+        <w:rPr>
+          <w:sz w:val="24"/>
+          <w:szCs w:val="24"/>
+        </w:rPr>
+        <w:t xml:space="preserve">, </w:t>
+      </w:r>
+      <w:hyperlink r:id="rId26" w:history="1">
+        <w:r>
+          <w:rPr>
+            <w:rStyle w:val="Hyperlink"/>
+            <w:sz w:val="24"/>
+            <w:szCs w:val="24"/>
+          </w:rPr>
+          <w:t>design doc</w:t>
+        </w:r>
+      </w:hyperlink>
+      <w:r>
+        <w:rPr>
+          <w:sz w:val="24"/>
+          <w:szCs w:val="24"/>
+        </w:rPr>
+        <w:t xml:space="preserve">, </w:t>
+      </w:r>
+      <w:hyperlink r:id="rId27" w:history="1">
+        <w:r>
+          <w:rPr>
+            <w:rStyle w:val="Hyperlink"/>
+            <w:sz w:val="24"/>
+            <w:szCs w:val="24"/>
+          </w:rPr>
+          <w:t>COW implementation</w:t>
+        </w:r>
+      </w:hyperlink>
+      <w:r>
+        <w:rPr>
+          <w:sz w:val="24"/>
+          <w:szCs w:val="24"/>
+        </w:rPr>
+        <w:t xml:space="preserve">). The claim is </w:t>
+      </w:r>
+      <w:r>
+        <w:rPr>
+          <w:sz w:val="24"/>
+          <w:szCs w:val="24"/>
+        </w:rPr>
+        <w:t>merged,</w:t>
+      </w:r>
+      <w:r>
+        <w:rPr>
+          <w:sz w:val="24"/>
+          <w:szCs w:val="24"/>
+        </w:rPr>
+        <w:t xml:space="preserve"> and the design and implementation are in review.</w:t>
       </w:r>
     </w:p>
     <w:p>
@@ -1822,16 +1974,14 @@
         </w:rPr>
         <w:t>5</w:t>
       </w:r>
-      <w:bookmarkStart w:id="1" w:name="_GoBack"/>
-      <w:bookmarkEnd w:id="1"/>
-      <w:r>
-        <w:rPr>
-          <w:sz w:val="24"/>
-          <w:szCs w:val="24"/>
-        </w:rPr>
-        <w:t xml:space="preserve">0+ </w:t>
-      </w:r>
-      <w:hyperlink r:id="rId21" w:history="1">
+      <w:r>
+        <w:rPr>
+          <w:sz w:val="24"/>
+          <w:szCs w:val="24"/>
+        </w:rPr>
+        <w:t xml:space="preserve">0 </w:t>
+      </w:r>
+      <w:hyperlink r:id="rId28" w:history="1">
         <w:r>
           <w:rPr>
             <w:rStyle w:val="Hyperlink"/>
@@ -1848,6 +1998,247 @@
           <w:szCs w:val="24"/>
         </w:rPr>
         <w:t>.</w:t>
+      </w:r>
+    </w:p>
+    <w:tbl>
+      <w:tblPr>
+        <w:tblW w:w="9854" w:type="dxa"/>
+        <w:tblInd w:w="-108" w:type="dxa"/>
+        <w:tblLayout w:type="fixed"/>
+        <w:tblLook w:val="0000" w:firstRow="0" w:lastRow="0" w:firstColumn="0" w:lastColumn="0" w:noHBand="0" w:noVBand="0"/>
+      </w:tblPr>
+      <w:tblGrid>
+        <w:gridCol w:w="2235"/>
+        <w:gridCol w:w="7619"/>
+      </w:tblGrid>
+      <w:tr>
+        <w:tc>
+          <w:tcPr>
+            <w:tcW w:w="2235" w:type="dxa"/>
+            <w:vAlign w:val="center"/>
+          </w:tcPr>
+          <w:p>
+            <w:pPr>
+              <w:pBdr>
+                <w:top w:val="nil"/>
+                <w:left w:val="nil"/>
+                <w:bottom w:val="nil"/>
+                <w:right w:val="nil"/>
+                <w:between w:val="nil"/>
+              </w:pBdr>
+              <w:spacing w:line="264" w:lineRule="auto"/>
+              <w:ind w:left="284"/>
+              <w:jc w:val="center"/>
+              <w:rPr>
+                <w:color w:val="000000"/>
+                <w:sz w:val="24"/>
+                <w:szCs w:val="24"/>
+              </w:rPr>
+            </w:pPr>
+            <w:r>
+              <w:rPr>
+                <w:color w:val="000000"/>
+                <w:sz w:val="24"/>
+                <w:szCs w:val="24"/>
+              </w:rPr>
+              <w:lastRenderedPageBreak/>
+              <w:t>May</w:t>
+            </w:r>
+            <w:r>
+              <w:rPr>
+                <w:color w:val="000000"/>
+                <w:sz w:val="24"/>
+                <w:szCs w:val="24"/>
+              </w:rPr>
+              <w:t xml:space="preserve"> 26 – Current</w:t>
+            </w:r>
+          </w:p>
+        </w:tc>
+        <w:tc>
+          <w:tcPr>
+            <w:tcW w:w="7619" w:type="dxa"/>
+            <w:vAlign w:val="center"/>
+          </w:tcPr>
+          <w:p>
+            <w:pPr>
+              <w:pBdr>
+                <w:top w:val="nil"/>
+                <w:left w:val="nil"/>
+                <w:bottom w:val="nil"/>
+                <w:right w:val="nil"/>
+                <w:between w:val="nil"/>
+              </w:pBdr>
+              <w:spacing w:line="264" w:lineRule="auto"/>
+              <w:rPr>
+                <w:color w:val="000000"/>
+                <w:sz w:val="24"/>
+                <w:szCs w:val="24"/>
+              </w:rPr>
+            </w:pPr>
+            <w:r>
+              <w:rPr>
+                <w:b/>
+                <w:sz w:val="24"/>
+                <w:szCs w:val="24"/>
+              </w:rPr>
+              <w:t>Open-source</w:t>
+            </w:r>
+            <w:r>
+              <w:rPr>
+                <w:b/>
+                <w:sz w:val="24"/>
+                <w:szCs w:val="24"/>
+              </w:rPr>
+              <w:t xml:space="preserve"> </w:t>
+            </w:r>
+            <w:r>
+              <w:rPr>
+                <w:b/>
+                <w:sz w:val="24"/>
+                <w:szCs w:val="24"/>
+              </w:rPr>
+              <w:t>contributor</w:t>
+            </w:r>
+            <w:r>
+              <w:rPr>
+                <w:color w:val="000000"/>
+                <w:sz w:val="24"/>
+                <w:szCs w:val="24"/>
+              </w:rPr>
+              <w:t>,</w:t>
+            </w:r>
+          </w:p>
+          <w:p>
+            <w:pPr>
+              <w:pBdr>
+                <w:top w:val="nil"/>
+                <w:left w:val="nil"/>
+                <w:bottom w:val="nil"/>
+                <w:right w:val="nil"/>
+                <w:between w:val="nil"/>
+              </w:pBdr>
+              <w:spacing w:line="264" w:lineRule="auto"/>
+              <w:rPr>
+                <w:color w:val="000000"/>
+                <w:sz w:val="24"/>
+                <w:szCs w:val="24"/>
+              </w:rPr>
+            </w:pPr>
+            <w:r>
+              <w:rPr>
+                <w:b/>
+                <w:sz w:val="24"/>
+                <w:szCs w:val="24"/>
+              </w:rPr>
+              <w:t>Lance ecosystem</w:t>
+            </w:r>
+          </w:p>
+        </w:tc>
+      </w:tr>
+    </w:tbl>
+    <w:p>
+      <w:pPr>
+        <w:pBdr>
+          <w:top w:val="nil"/>
+          <w:left w:val="nil"/>
+          <w:bottom w:val="nil"/>
+          <w:right w:val="nil"/>
+          <w:between w:val="nil"/>
+        </w:pBdr>
+        <w:spacing w:before="120" w:after="60" w:line="264" w:lineRule="auto"/>
+        <w:jc w:val="both"/>
+        <w:rPr>
+          <w:color w:val="000000"/>
+          <w:sz w:val="24"/>
+          <w:szCs w:val="24"/>
+        </w:rPr>
+      </w:pPr>
+      <w:r>
+        <w:rPr>
+          <w:color w:val="000000"/>
+          <w:sz w:val="24"/>
+          <w:szCs w:val="24"/>
+        </w:rPr>
+        <w:t xml:space="preserve">Contributions to the </w:t>
+      </w:r>
+      <w:hyperlink r:id="rId29" w:history="1">
+        <w:r>
+          <w:rPr>
+            <w:rStyle w:val="Hyperlink"/>
+            <w:sz w:val="24"/>
+            <w:szCs w:val="24"/>
+          </w:rPr>
+          <w:t>Lance columnar format</w:t>
+        </w:r>
+      </w:hyperlink>
+      <w:r>
+        <w:rPr>
+          <w:color w:val="000000"/>
+          <w:sz w:val="24"/>
+          <w:szCs w:val="24"/>
+        </w:rPr>
+        <w:t xml:space="preserve"> and its distributed tooling. Lance is an </w:t>
+      </w:r>
+      <w:proofErr w:type="gramStart"/>
+      <w:r>
+        <w:rPr>
+          <w:color w:val="000000"/>
+          <w:sz w:val="24"/>
+          <w:szCs w:val="24"/>
+        </w:rPr>
+        <w:t>open-source</w:t>
+      </w:r>
+      <w:proofErr w:type="gramEnd"/>
+      <w:r>
+        <w:rPr>
+          <w:color w:val="000000"/>
+          <w:sz w:val="24"/>
+          <w:szCs w:val="24"/>
+        </w:rPr>
+        <w:t xml:space="preserve"> lakehouse format that unifies fast multimodal data access, indexing, and AI training.</w:t>
+      </w:r>
+    </w:p>
+    <w:p>
+      <w:pPr>
+        <w:pBdr>
+          <w:top w:val="nil"/>
+          <w:left w:val="nil"/>
+          <w:bottom w:val="nil"/>
+          <w:right w:val="nil"/>
+          <w:between w:val="nil"/>
+        </w:pBdr>
+        <w:spacing w:before="60" w:after="120" w:line="264" w:lineRule="auto"/>
+        <w:ind w:left="170" w:hanging="170"/>
+        <w:jc w:val="both"/>
+        <w:rPr>
+          <w:color w:val="000000"/>
+          <w:sz w:val="24"/>
+          <w:szCs w:val="24"/>
+        </w:rPr>
+      </w:pPr>
+      <w:r>
+        <w:rPr>
+          <w:sz w:val="24"/>
+          <w:szCs w:val="24"/>
+        </w:rPr>
+        <w:t xml:space="preserve">• 3 </w:t>
+      </w:r>
+      <w:hyperlink r:id="rId30" w:history="1">
+        <w:r>
+          <w:rPr>
+            <w:rStyle w:val="Hyperlink"/>
+            <w:sz w:val="24"/>
+            <w:szCs w:val="24"/>
+          </w:rPr>
+          <w:t>merged pull requests</w:t>
+        </w:r>
+      </w:hyperlink>
+      <w:r>
+        <w:rPr>
+          <w:sz w:val="24"/>
+          <w:szCs w:val="24"/>
+        </w:rPr>
+        <w:t xml:space="preserve"> in the vector-index build path, reducing memory use and cleaning up temporary resources in long-running index jobs.</w:t>
       </w:r>
     </w:p>
     <w:tbl>
@@ -1895,33 +2286,6 @@
               <w:t>Apr 26 – Current</w:t>
             </w:r>
           </w:p>
-          <w:p>
-            <w:pPr>
-              <w:pBdr>
-                <w:top w:val="nil"/>
-                <w:left w:val="nil"/>
-                <w:bottom w:val="nil"/>
-                <w:right w:val="nil"/>
-                <w:between w:val="nil"/>
-              </w:pBdr>
-              <w:spacing w:line="264" w:lineRule="auto"/>
-              <w:ind w:left="284"/>
-              <w:jc w:val="center"/>
-              <w:rPr>
-                <w:color w:val="000000"/>
-                <w:sz w:val="24"/>
-                <w:szCs w:val="24"/>
-              </w:rPr>
-            </w:pPr>
-            <w:r>
-              <w:rPr>
-                <w:color w:val="000000"/>
-                <w:sz w:val="24"/>
-                <w:szCs w:val="24"/>
-              </w:rPr>
-              <w:t>(~0.5 yrs)</w:t>
-            </w:r>
-          </w:p>
         </w:tc>
         <w:tc>
           <w:tcPr>
@@ -1950,7 +2314,23 @@
                 <w:sz w:val="24"/>
                 <w:szCs w:val="24"/>
               </w:rPr>
-              <w:t>Open-source: Agentic development tooling</w:t>
+              <w:t>Open</w:t>
+            </w:r>
+            <w:r>
+              <w:rPr>
+                <w:b/>
+                <w:sz w:val="24"/>
+                <w:szCs w:val="24"/>
+              </w:rPr>
+              <w:t xml:space="preserve"> </w:t>
+            </w:r>
+            <w:r>
+              <w:rPr>
+                <w:b/>
+                <w:sz w:val="24"/>
+                <w:szCs w:val="24"/>
+              </w:rPr>
+              <w:t>source: Agentic development tooling</w:t>
             </w:r>
             <w:r>
               <w:rPr>
@@ -2053,10 +2433,9 @@
           <w:sz w:val="24"/>
           <w:szCs w:val="24"/>
         </w:rPr>
-        <w:lastRenderedPageBreak/>
         <w:t>• </w:t>
       </w:r>
-      <w:hyperlink r:id="rId22" w:history="1">
+      <w:hyperlink r:id="rId31" w:history="1">
         <w:r>
           <w:rPr>
             <w:rStyle w:val="Hyperlink"/>
@@ -2078,21 +2457,7 @@
           <w:sz w:val="24"/>
           <w:szCs w:val="24"/>
         </w:rPr>
-        <w:t>GitHub-Issue-driven workflow runner.</w:t>
-      </w:r>
-      <w:r>
-        <w:rPr>
-          <w:sz w:val="24"/>
-          <w:szCs w:val="24"/>
-        </w:rPr>
-        <w:t xml:space="preserve"> </w:t>
-      </w:r>
-      <w:r>
-        <w:rPr>
-          <w:sz w:val="24"/>
-          <w:szCs w:val="24"/>
-        </w:rPr>
-        <w:t xml:space="preserve">Decomposes an issue, runs an implementer agent in an isolated git </w:t>
+        <w:t xml:space="preserve">GitHub-Issue-driven workflow runner. Decomposes an issue, runs an implementer agent in an isolated git </w:t>
       </w:r>
       <w:proofErr w:type="spellStart"/>
       <w:r>
@@ -2108,28 +2473,23 @@
           <w:sz w:val="24"/>
           <w:szCs w:val="24"/>
         </w:rPr>
-        <w:t>, opens a PR, runs an independent reviewer agent, notifies a human when ready to merge.</w:t>
-      </w:r>
-      <w:r>
-        <w:rPr>
-          <w:sz w:val="24"/>
-          <w:szCs w:val="24"/>
-        </w:rPr>
-        <w:t xml:space="preserve"> </w:t>
-      </w:r>
-      <w:r>
-        <w:rPr>
-          <w:sz w:val="24"/>
-          <w:szCs w:val="24"/>
-        </w:rPr>
-        <w:t>State persists in the issue itself</w:t>
-      </w:r>
-      <w:r>
-        <w:rPr>
-          <w:sz w:val="24"/>
-          <w:szCs w:val="24"/>
-        </w:rPr>
-        <w:t>.</w:t>
+        <w:t xml:space="preserve">, opens a PR, runs an independent reviewer agent, notifies a human when ready to merge. State persists in the issue itself. Eight releases from v0.1.0 (May 2026) to v0.8.0 (Jul 2026). </w:t>
+      </w:r>
+      <w:proofErr w:type="gramStart"/>
+      <w:r>
+        <w:rPr>
+          <w:sz w:val="24"/>
+          <w:szCs w:val="24"/>
+        </w:rPr>
+        <w:t>Operator</w:t>
+      </w:r>
+      <w:proofErr w:type="gramEnd"/>
+      <w:r>
+        <w:rPr>
+          <w:sz w:val="24"/>
+          <w:szCs w:val="24"/>
+        </w:rPr>
+        <w:t xml:space="preserve"> pause/continue controls, Postgres-backed usage and cost analytics, and an agent-trajectory viewer.</w:t>
       </w:r>
     </w:p>
     <w:p>
@@ -2157,7 +2517,7 @@
         </w:rPr>
         <w:t>• </w:t>
       </w:r>
-      <w:hyperlink r:id="rId23" w:history="1">
+      <w:hyperlink r:id="rId32" w:history="1">
         <w:r>
           <w:rPr>
             <w:rStyle w:val="Hyperlink"/>
@@ -2340,8 +2700,8 @@
                 <w:szCs w:val="24"/>
               </w:rPr>
             </w:pPr>
-            <w:bookmarkStart w:id="2" w:name="_heading=h.30j0zll" w:colFirst="0" w:colLast="0"/>
-            <w:bookmarkEnd w:id="2"/>
+            <w:bookmarkStart w:id="1" w:name="_heading=h.30j0zll" w:colFirst="0" w:colLast="0"/>
+            <w:bookmarkEnd w:id="1"/>
             <w:r>
               <w:rPr>
                 <w:b/>
@@ -2770,7 +3130,7 @@
           <w:szCs w:val="24"/>
         </w:rPr>
       </w:pPr>
-      <w:hyperlink r:id="rId24">
+      <w:hyperlink r:id="rId33">
         <w:r>
           <w:rPr>
             <w:color w:val="0000FF"/>
@@ -2781,7 +3141,7 @@
       </w:hyperlink>
     </w:p>
     <w:sectPr>
-      <w:footerReference w:type="default" r:id="rId25"/>
+      <w:footerReference w:type="default" r:id="rId34"/>
       <w:pgSz w:w="11906" w:h="16838"/>
       <w:pgMar w:top="851" w:right="1134" w:bottom="851" w:left="1134" w:header="113" w:footer="113" w:gutter="0"/>
       <w:pgNumType w:start="1"/>
@@ -2792,7 +3152,7 @@
 </file>
 
 <file path=word/endnotes.xml><?xml version="1.0" encoding="utf-8"?>
-<w:endnotes xmlns:wpc="http://schemas.microsoft.com/office/word/2010/wordprocessingCanvas" xmlns:cx="http://schemas.microsoft.com/office/drawing/2014/chartex" xmlns:cx1="http://schemas.microsoft.com/office/drawing/2015/9/8/chartex" xmlns:cx2="http://schemas.microsoft.com/office/drawing/2015/10/21/chartex" xmlns:cx3="http://schemas.microsoft.com/office/drawing/2016/5/9/chartex" xmlns:cx4="http://schemas.microsoft.com/office/drawing/2016/5/10/chartex" xmlns:cx5="http://schemas.microsoft.com/office/drawing/2016/5/11/chartex" xmlns:cx6="http://schemas.microsoft.com/office/drawing/2016/5/12/chartex" xmlns:cx7="http://schemas.microsoft.com/office/drawing/2016/5/13/chartex" xmlns:cx8="http://schemas.microsoft.com/office/drawing/2016/5/14/chartex" xmlns:mc="http://schemas.openxmlformats.org/markup-compatibility/2006" xmlns:aink="http://schemas.microsoft.com/office/drawing/2016/ink" xmlns:am3d="http://schemas.microsoft.com/office/drawing/2017/model3d" xmlns:o="urn:schemas-microsoft-com:office:office" xmlns:r="http://schemas.openxmlformats.org/officeDocument/2006/relationships" xmlns:m="http://schemas.openxmlformats.org/officeDocument/2006/math" xmlns:v="urn:schemas-microsoft-com:vml" xmlns:wp14="http://schemas.microsoft.com/office/word/2010/wordprocessingDrawing" xmlns:wp="http://schemas.openxmlformats.org/drawingml/2006/wordprocessingDrawing" xmlns:w10="urn:schemas-microsoft-com:office:word" xmlns:w="http://schemas.openxmlformats.org/wordprocessingml/2006/main" xmlns:w14="http://schemas.microsoft.com/office/word/2010/wordml" xmlns:w15="http://schemas.microsoft.com/office/word/2012/wordml" xmlns:w16cid="http://schemas.microsoft.com/office/word/2016/wordml/cid" xmlns:w16se="http://schemas.microsoft.com/office/word/2015/wordml/symex" xmlns:wpg="http://schemas.microsoft.com/office/word/2010/wordprocessingGroup" xmlns:wpi="http://schemas.microsoft.com/office/word/2010/wordprocessingInk" xmlns:wne="http://schemas.microsoft.com/office/word/2006/wordml" xmlns:wps="http://schemas.microsoft.com/office/word/2010/wordprocessingShape" mc:Ignorable="w14 w15 w16se w16cid wp14">
+<w:endnotes xmlns:wpc="http://schemas.microsoft.com/office/word/2010/wordprocessingCanvas" xmlns:cx="http://schemas.microsoft.com/office/drawing/2014/chartex" xmlns:cx1="http://schemas.microsoft.com/office/drawing/2015/9/8/chartex" xmlns:cx2="http://schemas.microsoft.com/office/drawing/2015/10/21/chartex" xmlns:cx3="http://schemas.microsoft.com/office/drawing/2016/5/9/chartex" xmlns:cx4="http://schemas.microsoft.com/office/drawing/2016/5/10/chartex" xmlns:cx5="http://schemas.microsoft.com/office/drawing/2016/5/11/chartex" xmlns:cx6="http://schemas.microsoft.com/office/drawing/2016/5/12/chartex" xmlns:cx7="http://schemas.microsoft.com/office/drawing/2016/5/13/chartex" xmlns:cx8="http://schemas.microsoft.com/office/drawing/2016/5/14/chartex" xmlns:mc="http://schemas.openxmlformats.org/markup-compatibility/2006" xmlns:aink="http://schemas.microsoft.com/office/drawing/2016/ink" xmlns:am3d="http://schemas.microsoft.com/office/drawing/2017/model3d" xmlns:o="urn:schemas-microsoft-com:office:office" xmlns:r="http://schemas.openxmlformats.org/officeDocument/2006/relationships" xmlns:m="http://schemas.openxmlformats.org/officeDocument/2006/math" xmlns:v="urn:schemas-microsoft-com:vml" xmlns:wp14="http://schemas.microsoft.com/office/word/2010/wordprocessingDrawing" xmlns:wp="http://schemas.openxmlformats.org/drawingml/2006/wordprocessingDrawing" xmlns:w10="urn:schemas-microsoft-com:office:word" xmlns:w="http://schemas.openxmlformats.org/wordprocessingml/2006/main" xmlns:w14="http://schemas.microsoft.com/office/word/2010/wordml" xmlns:w15="http://schemas.microsoft.com/office/word/2012/wordml" xmlns:w16cex="http://schemas.microsoft.com/office/word/2018/wordml/cex" xmlns:w16cid="http://schemas.microsoft.com/office/word/2016/wordml/cid" xmlns:w16="http://schemas.microsoft.com/office/word/2018/wordml" xmlns:w16sdtdh="http://schemas.microsoft.com/office/word/2020/wordml/sdtdatahash" xmlns:w16se="http://schemas.microsoft.com/office/word/2015/wordml/symex" xmlns:wpg="http://schemas.microsoft.com/office/word/2010/wordprocessingGroup" xmlns:wpi="http://schemas.microsoft.com/office/word/2010/wordprocessingInk" xmlns:wne="http://schemas.microsoft.com/office/word/2006/wordml" xmlns:wps="http://schemas.microsoft.com/office/word/2010/wordprocessingShape" mc:Ignorable="w14 w15 w16se w16cid w16 w16cex w16sdtdh wp14">
   <w:endnote w:type="separator" w:id="-1">
     <w:p>
       <w:r>
@@ -2811,7 +3171,7 @@
 </file>
 
 <file path=word/footer1.xml><?xml version="1.0" encoding="utf-8"?>
-<w:ftr xmlns:wpc="http://schemas.microsoft.com/office/word/2010/wordprocessingCanvas" xmlns:cx="http://schemas.microsoft.com/office/drawing/2014/chartex" xmlns:cx1="http://schemas.microsoft.com/office/drawing/2015/9/8/chartex" xmlns:cx2="http://schemas.microsoft.com/office/drawing/2015/10/21/chartex" xmlns:cx3="http://schemas.microsoft.com/office/drawing/2016/5/9/chartex" xmlns:cx4="http://schemas.microsoft.com/office/drawing/2016/5/10/chartex" xmlns:cx5="http://schemas.microsoft.com/office/drawing/2016/5/11/chartex" xmlns:cx6="http://schemas.microsoft.com/office/drawing/2016/5/12/chartex" xmlns:cx7="http://schemas.microsoft.com/office/drawing/2016/5/13/chartex" xmlns:cx8="http://schemas.microsoft.com/office/drawing/2016/5/14/chartex" xmlns:mc="http://schemas.openxmlformats.org/markup-compatibility/2006" xmlns:aink="http://schemas.microsoft.com/office/drawing/2016/ink" xmlns:am3d="http://schemas.microsoft.com/office/drawing/2017/model3d" xmlns:o="urn:schemas-microsoft-com:office:office" xmlns:r="http://schemas.openxmlformats.org/officeDocument/2006/relationships" xmlns:m="http://schemas.openxmlformats.org/officeDocument/2006/math" xmlns:v="urn:schemas-microsoft-com:vml" xmlns:wp14="http://schemas.microsoft.com/office/word/2010/wordprocessingDrawing" xmlns:wp="http://schemas.openxmlformats.org/drawingml/2006/wordprocessingDrawing" xmlns:w10="urn:schemas-microsoft-com:office:word" xmlns:w="http://schemas.openxmlformats.org/wordprocessingml/2006/main" xmlns:w14="http://schemas.microsoft.com/office/word/2010/wordml" xmlns:w15="http://schemas.microsoft.com/office/word/2012/wordml" xmlns:w16cid="http://schemas.microsoft.com/office/word/2016/wordml/cid" xmlns:w16se="http://schemas.microsoft.com/office/word/2015/wordml/symex" xmlns:wpg="http://schemas.microsoft.com/office/word/2010/wordprocessingGroup" xmlns:wpi="http://schemas.microsoft.com/office/word/2010/wordprocessingInk" xmlns:wne="http://schemas.microsoft.com/office/word/2006/wordml" xmlns:wps="http://schemas.microsoft.com/office/word/2010/wordprocessingShape" mc:Ignorable="w14 w15 w16se w16cid wp14">
+<w:ftr xmlns:wpc="http://schemas.microsoft.com/office/word/2010/wordprocessingCanvas" xmlns:cx="http://schemas.microsoft.com/office/drawing/2014/chartex" xmlns:cx1="http://schemas.microsoft.com/office/drawing/2015/9/8/chartex" xmlns:cx2="http://schemas.microsoft.com/office/drawing/2015/10/21/chartex" xmlns:cx3="http://schemas.microsoft.com/office/drawing/2016/5/9/chartex" xmlns:cx4="http://schemas.microsoft.com/office/drawing/2016/5/10/chartex" xmlns:cx5="http://schemas.microsoft.com/office/drawing/2016/5/11/chartex" xmlns:cx6="http://schemas.microsoft.com/office/drawing/2016/5/12/chartex" xmlns:cx7="http://schemas.microsoft.com/office/drawing/2016/5/13/chartex" xmlns:cx8="http://schemas.microsoft.com/office/drawing/2016/5/14/chartex" xmlns:mc="http://schemas.openxmlformats.org/markup-compatibility/2006" xmlns:aink="http://schemas.microsoft.com/office/drawing/2016/ink" xmlns:am3d="http://schemas.microsoft.com/office/drawing/2017/model3d" xmlns:o="urn:schemas-microsoft-com:office:office" xmlns:r="http://schemas.openxmlformats.org/officeDocument/2006/relationships" xmlns:m="http://schemas.openxmlformats.org/officeDocument/2006/math" xmlns:v="urn:schemas-microsoft-com:vml" xmlns:wp14="http://schemas.microsoft.com/office/word/2010/wordprocessingDrawing" xmlns:wp="http://schemas.openxmlformats.org/drawingml/2006/wordprocessingDrawing" xmlns:w10="urn:schemas-microsoft-com:office:word" xmlns:w="http://schemas.openxmlformats.org/wordprocessingml/2006/main" xmlns:w14="http://schemas.microsoft.com/office/word/2010/wordml" xmlns:w15="http://schemas.microsoft.com/office/word/2012/wordml" xmlns:w16cex="http://schemas.microsoft.com/office/word/2018/wordml/cex" xmlns:w16cid="http://schemas.microsoft.com/office/word/2016/wordml/cid" xmlns:w16="http://schemas.microsoft.com/office/word/2018/wordml" xmlns:w16sdtdh="http://schemas.microsoft.com/office/word/2020/wordml/sdtdatahash" xmlns:w16se="http://schemas.microsoft.com/office/word/2015/wordml/symex" xmlns:wpg="http://schemas.microsoft.com/office/word/2010/wordprocessingGroup" xmlns:wpi="http://schemas.microsoft.com/office/word/2010/wordprocessingInk" xmlns:wne="http://schemas.microsoft.com/office/word/2006/wordml" xmlns:wps="http://schemas.microsoft.com/office/word/2010/wordprocessingShape" mc:Ignorable="w14 w15 w16se w16cid w16 w16cex w16sdtdh wp14">
   <w:p>
     <w:pPr>
       <w:pBdr>
@@ -2857,7 +3217,7 @@
 </file>
 
 <file path=word/footnotes.xml><?xml version="1.0" encoding="utf-8"?>
-<w:footnotes xmlns:wpc="http://schemas.microsoft.com/office/word/2010/wordprocessingCanvas" xmlns:cx="http://schemas.microsoft.com/office/drawing/2014/chartex" xmlns:cx1="http://schemas.microsoft.com/office/drawing/2015/9/8/chartex" xmlns:cx2="http://schemas.microsoft.com/office/drawing/2015/10/21/chartex" xmlns:cx3="http://schemas.microsoft.com/office/drawing/2016/5/9/chartex" xmlns:cx4="http://schemas.microsoft.com/office/drawing/2016/5/10/chartex" xmlns:cx5="http://schemas.microsoft.com/office/drawing/2016/5/11/chartex" xmlns:cx6="http://schemas.microsoft.com/office/drawing/2016/5/12/chartex" xmlns:cx7="http://schemas.microsoft.com/office/drawing/2016/5/13/chartex" xmlns:cx8="http://schemas.microsoft.com/office/drawing/2016/5/14/chartex" xmlns:mc="http://schemas.openxmlformats.org/markup-compatibility/2006" xmlns:aink="http://schemas.microsoft.com/office/drawing/2016/ink" xmlns:am3d="http://schemas.microsoft.com/office/drawing/2017/model3d" xmlns:o="urn:schemas-microsoft-com:office:office" xmlns:r="http://schemas.openxmlformats.org/officeDocument/2006/relationships" xmlns:m="http://schemas.openxmlformats.org/officeDocument/2006/math" xmlns:v="urn:schemas-microsoft-com:vml" xmlns:wp14="http://schemas.microsoft.com/office/word/2010/wordprocessingDrawing" xmlns:wp="http://schemas.openxmlformats.org/drawingml/2006/wordprocessingDrawing" xmlns:w10="urn:schemas-microsoft-com:office:word" xmlns:w="http://schemas.openxmlformats.org/wordprocessingml/2006/main" xmlns:w14="http://schemas.microsoft.com/office/word/2010/wordml" xmlns:w15="http://schemas.microsoft.com/office/word/2012/wordml" xmlns:w16cid="http://schemas.microsoft.com/office/word/2016/wordml/cid" xmlns:w16se="http://schemas.microsoft.com/office/word/2015/wordml/symex" xmlns:wpg="http://schemas.microsoft.com/office/word/2010/wordprocessingGroup" xmlns:wpi="http://schemas.microsoft.com/office/word/2010/wordprocessingInk" xmlns:wne="http://schemas.microsoft.com/office/word/2006/wordml" xmlns:wps="http://schemas.microsoft.com/office/word/2010/wordprocessingShape" mc:Ignorable="w14 w15 w16se w16cid wp14">
+<w:footnotes xmlns:wpc="http://schemas.microsoft.com/office/word/2010/wordprocessingCanvas" xmlns:cx="http://schemas.microsoft.com/office/drawing/2014/chartex" xmlns:cx1="http://schemas.microsoft.com/office/drawing/2015/9/8/chartex" xmlns:cx2="http://schemas.microsoft.com/office/drawing/2015/10/21/chartex" xmlns:cx3="http://schemas.microsoft.com/office/drawing/2016/5/9/chartex" xmlns:cx4="http://schemas.microsoft.com/office/drawing/2016/5/10/chartex" xmlns:cx5="http://schemas.microsoft.com/office/drawing/2016/5/11/chartex" xmlns:cx6="http://schemas.microsoft.com/office/drawing/2016/5/12/chartex" xmlns:cx7="http://schemas.microsoft.com/office/drawing/2016/5/13/chartex" xmlns:cx8="http://schemas.microsoft.com/office/drawing/2016/5/14/chartex" xmlns:mc="http://schemas.openxmlformats.org/markup-compatibility/2006" xmlns:aink="http://schemas.microsoft.com/office/drawing/2016/ink" xmlns:am3d="http://schemas.microsoft.com/office/drawing/2017/model3d" xmlns:o="urn:schemas-microsoft-com:office:office" xmlns:r="http://schemas.openxmlformats.org/officeDocument/2006/relationships" xmlns:m="http://schemas.openxmlformats.org/officeDocument/2006/math" xmlns:v="urn:schemas-microsoft-com:vml" xmlns:wp14="http://schemas.microsoft.com/office/word/2010/wordprocessingDrawing" xmlns:wp="http://schemas.openxmlformats.org/drawingml/2006/wordprocessingDrawing" xmlns:w10="urn:schemas-microsoft-com:office:word" xmlns:w="http://schemas.openxmlformats.org/wordprocessingml/2006/main" xmlns:w14="http://schemas.microsoft.com/office/word/2010/wordml" xmlns:w15="http://schemas.microsoft.com/office/word/2012/wordml" xmlns:w16cex="http://schemas.microsoft.com/office/word/2018/wordml/cex" xmlns:w16cid="http://schemas.microsoft.com/office/word/2016/wordml/cid" xmlns:w16="http://schemas.microsoft.com/office/word/2018/wordml" xmlns:w16sdtdh="http://schemas.microsoft.com/office/word/2020/wordml/sdtdatahash" xmlns:w16se="http://schemas.microsoft.com/office/word/2015/wordml/symex" xmlns:wpg="http://schemas.microsoft.com/office/word/2010/wordprocessingGroup" xmlns:wpi="http://schemas.microsoft.com/office/word/2010/wordprocessingInk" xmlns:wne="http://schemas.microsoft.com/office/word/2006/wordml" xmlns:wps="http://schemas.microsoft.com/office/word/2010/wordprocessingShape" mc:Ignorable="w14 w15 w16se w16cid w16 w16cex w16sdtdh wp14">
   <w:footnote w:type="separator" w:id="-1">
     <w:p>
       <w:r>
@@ -2876,7 +3236,7 @@
 </file>
 
 <file path=word/styles.xml><?xml version="1.0" encoding="utf-8"?>
-<w:styles xmlns:mc="http://schemas.openxmlformats.org/markup-compatibility/2006" xmlns:r="http://schemas.openxmlformats.org/officeDocument/2006/relationships" xmlns:w="http://schemas.openxmlformats.org/wordprocessingml/2006/main" xmlns:w14="http://schemas.microsoft.com/office/word/2010/wordml" xmlns:w15="http://schemas.microsoft.com/office/word/2012/wordml" xmlns:w16cid="http://schemas.microsoft.com/office/word/2016/wordml/cid" xmlns:w16se="http://schemas.microsoft.com/office/word/2015/wordml/symex" mc:Ignorable="w14 w15 w16se w16cid">
+<w:styles xmlns:mc="http://schemas.openxmlformats.org/markup-compatibility/2006" xmlns:r="http://schemas.openxmlformats.org/officeDocument/2006/relationships" xmlns:w="http://schemas.openxmlformats.org/wordprocessingml/2006/main" xmlns:w14="http://schemas.microsoft.com/office/word/2010/wordml" xmlns:w15="http://schemas.microsoft.com/office/word/2012/wordml" xmlns:w16cex="http://schemas.microsoft.com/office/word/2018/wordml/cex" xmlns:w16cid="http://schemas.microsoft.com/office/word/2016/wordml/cid" xmlns:w16="http://schemas.microsoft.com/office/word/2018/wordml" xmlns:w16sdtdh="http://schemas.microsoft.com/office/word/2020/wordml/sdtdatahash" xmlns:w16se="http://schemas.microsoft.com/office/word/2015/wordml/symex" mc:Ignorable="w14 w15 w16se w16cid w16 w16cex w16sdtdh">
   <w:docDefaults>
     <w:rPrDefault>
       <w:rPr>
@@ -2886,7 +3246,7 @@
     </w:rPrDefault>
     <w:pPrDefault/>
   </w:docDefaults>
-  <w:latentStyles w:defLockedState="0" w:defUIPriority="99" w:defSemiHidden="0" w:defUnhideWhenUsed="0" w:defQFormat="0" w:count="375">
+  <w:latentStyles w:defLockedState="0" w:defUIPriority="99" w:defSemiHidden="0" w:defUnhideWhenUsed="0" w:defQFormat="0" w:count="376">
     <w:lsdException w:name="Normal" w:uiPriority="0" w:qFormat="1"/>
     <w:lsdException w:name="heading 1" w:uiPriority="9" w:qFormat="1"/>
     <w:lsdException w:name="heading 2" w:semiHidden="1" w:uiPriority="9" w:unhideWhenUsed="1" w:qFormat="1"/>
@@ -2992,7 +3352,6 @@
     <w:lsdException w:name="HTML Sample" w:semiHidden="1" w:unhideWhenUsed="1"/>
     <w:lsdException w:name="HTML Typewriter" w:semiHidden="1" w:unhideWhenUsed="1"/>
     <w:lsdException w:name="HTML Variable" w:semiHidden="1" w:unhideWhenUsed="1"/>
-    <w:lsdException w:name="Normal Table" w:semiHidden="1" w:unhideWhenUsed="1"/>
     <w:lsdException w:name="annotation subject" w:semiHidden="1" w:unhideWhenUsed="1"/>
     <w:lsdException w:name="No List" w:semiHidden="1" w:unhideWhenUsed="1"/>
     <w:lsdException w:name="Outline List 1" w:semiHidden="1" w:unhideWhenUsed="1"/>
@@ -3039,10 +3398,8 @@
     <w:lsdException w:name="Table Subtle 2" w:semiHidden="1" w:unhideWhenUsed="1"/>
     <w:lsdException w:name="Table Web 1" w:semiHidden="1" w:unhideWhenUsed="1"/>
     <w:lsdException w:name="Table Web 2" w:semiHidden="1" w:unhideWhenUsed="1"/>
-    <w:lsdException w:name="Table Web 3" w:semiHidden="1" w:unhideWhenUsed="1"/>
     <w:lsdException w:name="Balloon Text" w:semiHidden="1" w:unhideWhenUsed="1"/>
     <w:lsdException w:name="Table Grid" w:uiPriority="39"/>
-    <w:lsdException w:name="Table Theme" w:semiHidden="1" w:unhideWhenUsed="1"/>
     <w:lsdException w:name="Placeholder Text" w:semiHidden="1"/>
     <w:lsdException w:name="No Spacing" w:uiPriority="1" w:qFormat="1"/>
     <w:lsdException w:name="Light Shading" w:uiPriority="60"/>
@@ -3262,6 +3619,7 @@
     <w:lsdException w:name="Smart Hyperlink" w:semiHidden="1" w:unhideWhenUsed="1"/>
     <w:lsdException w:name="Hashtag" w:semiHidden="1" w:unhideWhenUsed="1"/>
     <w:lsdException w:name="Unresolved Mention" w:semiHidden="1" w:unhideWhenUsed="1"/>
+    <w:lsdException w:name="Smart Link" w:semiHidden="1" w:unhideWhenUsed="1"/>
   </w:latentStyles>
   <w:style w:type="paragraph" w:default="1" w:styleId="Normal">
     <w:name w:val="Normal"/>
@@ -3941,6 +4299,10 @@
 </go:gDocsCustomXmlDataStorage>
 </file>
 
+<file path=customXml/item2.xml><?xml version="1.0" encoding="utf-8"?>
+<b:Sources xmlns:b="http://schemas.openxmlformats.org/officeDocument/2006/bibliography" xmlns="http://schemas.openxmlformats.org/officeDocument/2006/bibliography" SelectedStyle="\APASixthEditionOfficeOnline.xsl" StyleName="APA" Version="6"/>
+</file>
+
 <file path=customXml/itemProps1.xml><?xml version="1.0" encoding="utf-8"?>
 <ds:datastoreItem xmlns:ds="http://schemas.openxmlformats.org/officeDocument/2006/customXml" ds:itemID="{11111111-1234-1234-1234-123412341234}">
   <ds:schemaRefs>
@@ -3948,4 +4310,12 @@
     <ds:schemaRef ds:uri="http://schemas.openxmlformats.org/officeDocument/2006/relationships"/>
   </ds:schemaRefs>
 </ds:datastoreItem>
+</file>
+
+<file path=customXml/itemProps2.xml><?xml version="1.0" encoding="utf-8"?>
+<ds:datastoreItem xmlns:ds="http://schemas.openxmlformats.org/officeDocument/2006/customXml" ds:itemID="{B62E987D-A5AE-4701-95DF-9145466AF8DB}">
+  <ds:schemaRefs>
+    <ds:schemaRef ds:uri="http://schemas.openxmlformats.org/officeDocument/2006/bibliography"/>
+  </ds:schemaRefs>
+</ds:datastoreItem>
 </file>
</xml_diff>

<commit_message>
files: update after customization
</commit_message>
<xml_diff>
--- a/file/CV_Geser_Dugarov.docx
+++ b/file/CV_Geser_Dugarov.docx
@@ -56,7 +56,7 @@
                 <w:between w:val="nil"/>
               </w:pBdr>
               <w:spacing w:line="264" w:lineRule="auto"/>
-              <w:jc w:val="center"/>
+              <w:jc w:val="right"/>
               <w:rPr>
                 <w:b/>
                 <w:color w:val="000000"/>
@@ -71,7 +71,7 @@
                 <w:sz w:val="28"/>
                 <w:szCs w:val="28"/>
               </w:rPr>
-              <w:t xml:space="preserve">GESER DUGAROV, Ph.D.  |  </w:t>
+              <w:t xml:space="preserve">GESER DUGAROV, Ph.D. | </w:t>
             </w:r>
             <w:r>
               <w:rPr>
@@ -107,7 +107,16 @@
                 <w:sz w:val="28"/>
                 <w:szCs w:val="28"/>
               </w:rPr>
-              <w:t>, Big Data Engineer</w:t>
+              <w:t xml:space="preserve"> |</w:t>
+            </w:r>
+            <w:r>
+              <w:rPr>
+                <w:b/>
+                <w:color w:val="000000"/>
+                <w:sz w:val="28"/>
+                <w:szCs w:val="28"/>
+              </w:rPr>
+              <w:t xml:space="preserve"> Distributed Data Systems &amp; AI Data Infrastructure</w:t>
             </w:r>
           </w:p>
         </w:tc>
@@ -404,7 +413,15 @@
           <w:sz w:val="24"/>
           <w:szCs w:val="24"/>
         </w:rPr>
-        <w:t>issue-driven orchestrators and develop-review loops that turn coding-agent CLIs into reproducible engineering pipelines. Extensive experience in research and data analysis; PhD. Strong interest in big data, distributed systems, and agentic development.</w:t>
+        <w:t xml:space="preserve">issue-driven orchestrators and develop-review loops that turn coding-agent CLIs into reproducible engineering pipelines. Extensive experience in research and data analysis; PhD. </w:t>
+      </w:r>
+      <w:r>
+        <w:rPr>
+          <w:color w:val="000000"/>
+          <w:sz w:val="24"/>
+          <w:szCs w:val="24"/>
+        </w:rPr>
+        <w:t>Strong interest in big data, distributed systems, performance engineering, and product-focused backend development.</w:t>
       </w:r>
     </w:p>
     <w:p>
@@ -509,7 +526,7 @@
           <w:sz w:val="24"/>
           <w:szCs w:val="24"/>
         </w:rPr>
-        <w:t>(beginner)</w:t>
+        <w:t>(</w:t>
       </w:r>
       <w:r>
         <w:rPr>
@@ -519,7 +536,7 @@
           <w:sz w:val="24"/>
           <w:szCs w:val="24"/>
         </w:rPr>
-        <w:t xml:space="preserve">, </w:t>
+        <w:t>some experience</w:t>
       </w:r>
       <w:r>
         <w:rPr>
@@ -529,7 +546,7 @@
           <w:sz w:val="24"/>
           <w:szCs w:val="24"/>
         </w:rPr>
-        <w:t>Hudi / Lance</w:t>
+        <w:t>)</w:t>
       </w:r>
       <w:r>
         <w:rPr>
@@ -549,7 +566,7 @@
           <w:sz w:val="24"/>
           <w:szCs w:val="24"/>
         </w:rPr>
-        <w:t>Spark / Flink / Ray</w:t>
+        <w:t>Hudi / Lance</w:t>
       </w:r>
       <w:r>
         <w:rPr>
@@ -569,7 +586,7 @@
           <w:sz w:val="24"/>
           <w:szCs w:val="24"/>
         </w:rPr>
-        <w:t xml:space="preserve">Vector search, </w:t>
+        <w:t>Spark / Flink / Ray</w:t>
       </w:r>
       <w:r>
         <w:rPr>
@@ -579,7 +596,7 @@
           <w:sz w:val="24"/>
           <w:szCs w:val="24"/>
         </w:rPr>
-        <w:t xml:space="preserve">Distributed systems, </w:t>
+        <w:t xml:space="preserve">, </w:t>
       </w:r>
       <w:r>
         <w:rPr>
@@ -589,7 +606,7 @@
           <w:sz w:val="24"/>
           <w:szCs w:val="24"/>
         </w:rPr>
-        <w:t>Agentic workflows</w:t>
+        <w:t>Vector search</w:t>
       </w:r>
       <w:r>
         <w:rPr>
@@ -599,7 +616,7 @@
           <w:sz w:val="24"/>
           <w:szCs w:val="24"/>
         </w:rPr>
-        <w:t xml:space="preserve">, </w:t>
+        <w:t> / </w:t>
       </w:r>
       <w:r>
         <w:rPr>
@@ -609,7 +626,7 @@
           <w:sz w:val="24"/>
           <w:szCs w:val="24"/>
         </w:rPr>
-        <w:t>Claude</w:t>
+        <w:t>ANN indexing</w:t>
       </w:r>
       <w:r>
         <w:rPr>
@@ -619,7 +636,7 @@
           <w:sz w:val="24"/>
           <w:szCs w:val="24"/>
         </w:rPr>
-        <w:t> </w:t>
+        <w:t xml:space="preserve">, </w:t>
       </w:r>
       <w:r>
         <w:rPr>
@@ -629,7 +646,7 @@
           <w:sz w:val="24"/>
           <w:szCs w:val="24"/>
         </w:rPr>
-        <w:t>Code</w:t>
+        <w:t xml:space="preserve">Distributed systems, </w:t>
       </w:r>
       <w:r>
         <w:rPr>
@@ -639,38 +656,26 @@
           <w:sz w:val="24"/>
           <w:szCs w:val="24"/>
         </w:rPr>
-        <w:t> </w:t>
-      </w:r>
-      <w:r>
-        <w:rPr>
-          <w:b/>
-          <w:i/>
-          <w:color w:val="000000"/>
-          <w:sz w:val="24"/>
-          <w:szCs w:val="24"/>
-        </w:rPr>
-        <w:t>/</w:t>
-      </w:r>
-      <w:r>
-        <w:rPr>
-          <w:b/>
-          <w:i/>
-          <w:color w:val="000000"/>
-          <w:sz w:val="24"/>
-          <w:szCs w:val="24"/>
-        </w:rPr>
-        <w:t> </w:t>
-      </w:r>
-      <w:r>
-        <w:rPr>
-          <w:b/>
-          <w:i/>
-          <w:color w:val="000000"/>
-          <w:sz w:val="24"/>
-          <w:szCs w:val="24"/>
-        </w:rPr>
-        <w:t>Codex</w:t>
-      </w:r>
+        <w:t>LLM agent orchestration, Multi-agent workflows</w:t>
+      </w:r>
+    </w:p>
+    <w:p>
+      <w:pPr>
+        <w:pBdr>
+          <w:top w:val="nil"/>
+          <w:left w:val="nil"/>
+          <w:bottom w:val="nil"/>
+          <w:right w:val="nil"/>
+          <w:between w:val="nil"/>
+        </w:pBdr>
+        <w:spacing w:line="264" w:lineRule="auto"/>
+        <w:jc w:val="both"/>
+        <w:rPr>
+          <w:color w:val="000000"/>
+          <w:sz w:val="24"/>
+          <w:szCs w:val="24"/>
+        </w:rPr>
+      </w:pPr>
     </w:p>
     <w:p>
       <w:pPr>
@@ -971,37 +976,7 @@
           <w:sz w:val="24"/>
           <w:szCs w:val="24"/>
         </w:rPr>
-        <w:t>•</w:t>
-      </w:r>
-      <w:r>
-        <w:rPr>
-          <w:sz w:val="24"/>
-          <w:szCs w:val="24"/>
-        </w:rPr>
-        <w:t> </w:t>
-      </w:r>
-      <w:r>
-        <w:rPr>
-          <w:sz w:val="24"/>
-          <w:szCs w:val="24"/>
-        </w:rPr>
-        <w:t xml:space="preserve">Designed and implemented a distributed cache for Lance, pairing an in-memory L1 with a persistent L2 on per-worker </w:t>
-      </w:r>
-      <w:proofErr w:type="spellStart"/>
-      <w:r>
-        <w:rPr>
-          <w:sz w:val="24"/>
-          <w:szCs w:val="24"/>
-        </w:rPr>
-        <w:t>NVMe</w:t>
-      </w:r>
-      <w:proofErr w:type="spellEnd"/>
-      <w:r>
-        <w:rPr>
-          <w:sz w:val="24"/>
-          <w:szCs w:val="24"/>
-        </w:rPr>
-        <w:t xml:space="preserve"> and prewarming IVF partitions to avoid repeated object-storage reads.</w:t>
+        <w:t>• Designed and implemented a distributed cache for Lance, pairing an in-memory L1 with a persistent L2 on per-worker NVMe and prewarming IVF partitions to avoid repeated object-storage reads.</w:t>
       </w:r>
     </w:p>
     <w:p>
@@ -1026,55 +1001,7 @@
           <w:sz w:val="24"/>
           <w:szCs w:val="24"/>
         </w:rPr>
-        <w:t>•</w:t>
-      </w:r>
-      <w:r>
-        <w:rPr>
-          <w:sz w:val="24"/>
-          <w:szCs w:val="24"/>
-        </w:rPr>
-        <w:t> </w:t>
-      </w:r>
-      <w:r>
-        <w:rPr>
-          <w:sz w:val="24"/>
-          <w:szCs w:val="24"/>
-        </w:rPr>
-        <w:t xml:space="preserve">Building a distributed, incrementally updatable vector index for tens-of-billions-scale datasets, based on </w:t>
-      </w:r>
-      <w:hyperlink r:id="rId14" w:history="1">
-        <w:r>
-          <w:rPr>
-            <w:rStyle w:val="Hyperlink"/>
-            <w:sz w:val="24"/>
-            <w:szCs w:val="24"/>
-          </w:rPr>
-          <w:t>Quake</w:t>
-        </w:r>
-      </w:hyperlink>
-      <w:r>
-        <w:rPr>
-          <w:sz w:val="24"/>
-          <w:szCs w:val="24"/>
-        </w:rPr>
-        <w:t xml:space="preserve"> query-adaptive ANN search, and driving its </w:t>
-      </w:r>
-      <w:hyperlink r:id="rId15" w:history="1">
-        <w:r>
-          <w:rPr>
-            <w:rStyle w:val="Hyperlink"/>
-            <w:sz w:val="24"/>
-            <w:szCs w:val="24"/>
-          </w:rPr>
-          <w:t>rewrite in Rust</w:t>
-        </w:r>
-      </w:hyperlink>
-      <w:r>
-        <w:rPr>
-          <w:sz w:val="24"/>
-          <w:szCs w:val="24"/>
-        </w:rPr>
-        <w:t>.</w:t>
+        <w:t>• Building a distributed, incrementally updatable vector index for tens-of-billions-scale datasets, based on query-adaptive ANN search.</w:t>
       </w:r>
     </w:p>
     <w:p>
@@ -1138,21 +1065,7 @@
           <w:sz w:val="24"/>
           <w:szCs w:val="24"/>
         </w:rPr>
-        <w:t>•</w:t>
-      </w:r>
-      <w:r>
-        <w:rPr>
-          <w:sz w:val="24"/>
-          <w:szCs w:val="24"/>
-        </w:rPr>
-        <w:t> </w:t>
-      </w:r>
-      <w:r>
-        <w:rPr>
-          <w:sz w:val="24"/>
-          <w:szCs w:val="24"/>
-        </w:rPr>
-        <w:t>Reduced the platform's configuration burden by making sane Hudi defaults automatic for common scenarios.</w:t>
+        <w:t>• Reduced the platform's configuration burden by making sane Hudi defaults automatic for common scenarios.</w:t>
       </w:r>
     </w:p>
     <w:p>
@@ -1415,7 +1328,7 @@
           <w:szCs w:val="24"/>
         </w:rPr>
       </w:pPr>
-      <w:hyperlink r:id="rId16" w:history="1">
+      <w:hyperlink r:id="rId14" w:history="1">
         <w:r>
           <w:rPr>
             <w:rStyle w:val="Hyperlink"/>
@@ -1611,7 +1524,7 @@
         </w:rPr>
         <w:t xml:space="preserve"> (</w:t>
       </w:r>
-      <w:hyperlink r:id="rId17" w:history="1">
+      <w:hyperlink r:id="rId15" w:history="1">
         <w:r>
           <w:rPr>
             <w:rStyle w:val="Hyperlink"/>
@@ -1628,7 +1541,7 @@
         </w:rPr>
         <w:t xml:space="preserve">, </w:t>
       </w:r>
-      <w:hyperlink r:id="rId18" w:history="1">
+      <w:hyperlink r:id="rId16" w:history="1">
         <w:r>
           <w:rPr>
             <w:rStyle w:val="Hyperlink"/>
@@ -1652,7 +1565,7 @@
         </w:rPr>
         <w:t xml:space="preserve"> Released in </w:t>
       </w:r>
-      <w:hyperlink r:id="rId19" w:history="1">
+      <w:hyperlink r:id="rId17" w:history="1">
         <w:r>
           <w:rPr>
             <w:rStyle w:val="Hyperlink"/>
@@ -1708,7 +1621,7 @@
         </w:rPr>
         <w:t>4 local optimizations (</w:t>
       </w:r>
-      <w:hyperlink r:id="rId20" w:history="1">
+      <w:hyperlink r:id="rId18" w:history="1">
         <w:r>
           <w:rPr>
             <w:rStyle w:val="Hyperlink"/>
@@ -1725,7 +1638,7 @@
         </w:rPr>
         <w:t xml:space="preserve">, </w:t>
       </w:r>
-      <w:hyperlink r:id="rId21" w:history="1">
+      <w:hyperlink r:id="rId19" w:history="1">
         <w:r>
           <w:rPr>
             <w:rStyle w:val="Hyperlink"/>
@@ -1742,7 +1655,7 @@
         </w:rPr>
         <w:t xml:space="preserve">, </w:t>
       </w:r>
-      <w:hyperlink r:id="rId22" w:history="1">
+      <w:hyperlink r:id="rId20" w:history="1">
         <w:r>
           <w:rPr>
             <w:rStyle w:val="Hyperlink"/>
@@ -1759,7 +1672,7 @@
         </w:rPr>
         <w:t xml:space="preserve">, </w:t>
       </w:r>
-      <w:hyperlink r:id="rId23" w:history="1">
+      <w:hyperlink r:id="rId21" w:history="1">
         <w:r>
           <w:rPr>
             <w:rStyle w:val="Hyperlink"/>
@@ -1797,7 +1710,7 @@
         </w:rPr>
         <w:t xml:space="preserve"> Released in </w:t>
       </w:r>
-      <w:hyperlink r:id="rId24" w:history="1">
+      <w:hyperlink r:id="rId22" w:history="1">
         <w:r>
           <w:rPr>
             <w:rStyle w:val="Hyperlink"/>
@@ -1837,39 +1750,10 @@
           <w:sz w:val="24"/>
           <w:szCs w:val="24"/>
         </w:rPr>
-        <w:t>•</w:t>
-      </w:r>
-      <w:r>
-        <w:rPr>
-          <w:sz w:val="24"/>
-          <w:szCs w:val="24"/>
-        </w:rPr>
-        <w:t> </w:t>
-      </w:r>
-      <w:r>
-        <w:rPr>
-          <w:sz w:val="24"/>
-          <w:szCs w:val="24"/>
-        </w:rPr>
-        <w:t xml:space="preserve">Author of RFC-98, Spark </w:t>
-      </w:r>
-      <w:proofErr w:type="spellStart"/>
-      <w:r>
-        <w:rPr>
-          <w:sz w:val="24"/>
-          <w:szCs w:val="24"/>
-        </w:rPr>
-        <w:t>Datasource</w:t>
-      </w:r>
-      <w:proofErr w:type="spellEnd"/>
-      <w:r>
-        <w:rPr>
-          <w:sz w:val="24"/>
-          <w:szCs w:val="24"/>
-        </w:rPr>
-        <w:t xml:space="preserve"> V2 read (</w:t>
-      </w:r>
-      <w:hyperlink r:id="rId25" w:history="1">
+        <w:lastRenderedPageBreak/>
+        <w:t>• Author of RFC-98, Spark Datasource V2 read (</w:t>
+      </w:r>
+      <w:hyperlink r:id="rId23" w:history="1">
         <w:r>
           <w:rPr>
             <w:rStyle w:val="Hyperlink"/>
@@ -1886,7 +1770,7 @@
         </w:rPr>
         <w:t xml:space="preserve">, </w:t>
       </w:r>
-      <w:hyperlink r:id="rId26" w:history="1">
+      <w:hyperlink r:id="rId24" w:history="1">
         <w:r>
           <w:rPr>
             <w:rStyle w:val="Hyperlink"/>
@@ -1903,7 +1787,7 @@
         </w:rPr>
         <w:t xml:space="preserve">, </w:t>
       </w:r>
-      <w:hyperlink r:id="rId27" w:history="1">
+      <w:hyperlink r:id="rId25" w:history="1">
         <w:r>
           <w:rPr>
             <w:rStyle w:val="Hyperlink"/>
@@ -1981,7 +1865,7 @@
         </w:rPr>
         <w:t xml:space="preserve">0 </w:t>
       </w:r>
-      <w:hyperlink r:id="rId28" w:history="1">
+      <w:hyperlink r:id="rId26" w:history="1">
         <w:r>
           <w:rPr>
             <w:rStyle w:val="Hyperlink"/>
@@ -2041,16 +1925,7 @@
                 <w:sz w:val="24"/>
                 <w:szCs w:val="24"/>
               </w:rPr>
-              <w:lastRenderedPageBreak/>
-              <w:t>May</w:t>
-            </w:r>
-            <w:r>
-              <w:rPr>
-                <w:color w:val="000000"/>
-                <w:sz w:val="24"/>
-                <w:szCs w:val="24"/>
-              </w:rPr>
-              <w:t xml:space="preserve"> 26 – Current</w:t>
+              <w:t>May 26 – Current</w:t>
             </w:r>
           </w:p>
         </w:tc>
@@ -2159,9 +2034,17 @@
           <w:sz w:val="24"/>
           <w:szCs w:val="24"/>
         </w:rPr>
-        <w:t xml:space="preserve">Contributions to the </w:t>
-      </w:r>
-      <w:hyperlink r:id="rId29" w:history="1">
+        <w:t>Rust c</w:t>
+      </w:r>
+      <w:r>
+        <w:rPr>
+          <w:color w:val="000000"/>
+          <w:sz w:val="24"/>
+          <w:szCs w:val="24"/>
+        </w:rPr>
+        <w:t xml:space="preserve">ontributions to the </w:t>
+      </w:r>
+      <w:hyperlink r:id="rId27" w:history="1">
         <w:r>
           <w:rPr>
             <w:rStyle w:val="Hyperlink"/>
@@ -2177,25 +2060,7 @@
           <w:sz w:val="24"/>
           <w:szCs w:val="24"/>
         </w:rPr>
-        <w:t xml:space="preserve"> and its distributed tooling. Lance is an </w:t>
-      </w:r>
-      <w:proofErr w:type="gramStart"/>
-      <w:r>
-        <w:rPr>
-          <w:color w:val="000000"/>
-          <w:sz w:val="24"/>
-          <w:szCs w:val="24"/>
-        </w:rPr>
-        <w:t>open-source</w:t>
-      </w:r>
-      <w:proofErr w:type="gramEnd"/>
-      <w:r>
-        <w:rPr>
-          <w:color w:val="000000"/>
-          <w:sz w:val="24"/>
-          <w:szCs w:val="24"/>
-        </w:rPr>
-        <w:t xml:space="preserve"> lakehouse format that unifies fast multimodal data access, indexing, and AI training.</w:t>
+        <w:t xml:space="preserve"> and its distributed tooling. Lance is an open-source lakehouse format that unifies fast multimodal data access, indexing, and AI training.</w:t>
       </w:r>
     </w:p>
     <w:p>
@@ -2223,7 +2088,7 @@
         </w:rPr>
         <w:t xml:space="preserve">• 3 </w:t>
       </w:r>
-      <w:hyperlink r:id="rId30" w:history="1">
+      <w:hyperlink r:id="rId28" w:history="1">
         <w:r>
           <w:rPr>
             <w:rStyle w:val="Hyperlink"/>
@@ -2392,23 +2257,7 @@
           <w:sz w:val="24"/>
           <w:szCs w:val="24"/>
         </w:rPr>
-        <w:t xml:space="preserve">Self-directed work on agent-augmented engineering workflows </w:t>
-      </w:r>
-      <w:r>
-        <w:rPr>
-          <w:color w:val="000000"/>
-          <w:sz w:val="24"/>
-          <w:szCs w:val="24"/>
-        </w:rPr>
-        <w:t>–</w:t>
-      </w:r>
-      <w:r>
-        <w:rPr>
-          <w:color w:val="000000"/>
-          <w:sz w:val="24"/>
-          <w:szCs w:val="24"/>
-        </w:rPr>
-        <w:t xml:space="preserve"> treating coding-agent CLIs (Claude Code, Codex) as bounded executors inside reproducible pipelines.</w:t>
+        <w:t>Self-directed work on AI-powered developer tooling: multi-agent implementation and review workflows with human-in-the-loop handoff, reproducible execution, monitoring, and cost tracking.</w:t>
       </w:r>
     </w:p>
     <w:p>
@@ -2435,7 +2284,7 @@
         </w:rPr>
         <w:t>• </w:t>
       </w:r>
-      <w:hyperlink r:id="rId31" w:history="1">
+      <w:hyperlink r:id="rId29" w:history="1">
         <w:r>
           <w:rPr>
             <w:rStyle w:val="Hyperlink"/>
@@ -2457,33 +2306,22 @@
           <w:sz w:val="24"/>
           <w:szCs w:val="24"/>
         </w:rPr>
-        <w:t xml:space="preserve">GitHub-Issue-driven workflow runner. Decomposes an issue, runs an implementer agent in an isolated git </w:t>
-      </w:r>
-      <w:proofErr w:type="spellStart"/>
-      <w:r>
-        <w:rPr>
-          <w:sz w:val="24"/>
-          <w:szCs w:val="24"/>
-        </w:rPr>
-        <w:t>worktree</w:t>
-      </w:r>
-      <w:proofErr w:type="spellEnd"/>
-      <w:r>
-        <w:rPr>
-          <w:sz w:val="24"/>
-          <w:szCs w:val="24"/>
-        </w:rPr>
-        <w:t xml:space="preserve">, opens a PR, runs an independent reviewer agent, notifies a human when ready to merge. State persists in the issue itself. Eight releases from v0.1.0 (May 2026) to v0.8.0 (Jul 2026). </w:t>
-      </w:r>
-      <w:proofErr w:type="gramStart"/>
-      <w:r>
-        <w:rPr>
-          <w:sz w:val="24"/>
-          <w:szCs w:val="24"/>
-        </w:rPr>
-        <w:t>Operator</w:t>
-      </w:r>
-      <w:proofErr w:type="gramEnd"/>
+        <w:t xml:space="preserve">Python-based, </w:t>
+      </w:r>
+      <w:r>
+        <w:rPr>
+          <w:sz w:val="24"/>
+          <w:szCs w:val="24"/>
+        </w:rPr>
+        <w:t>GitHub-Issue-driven workflow runner. Decomposes an issue, runs an implementer agent in an isolated git worktree, opens a PR, runs an independent reviewer agent, notifies a human when ready to merge. State persists in the issue itself. Eight releases from v0.1.0 (May 2026) to v0.8.0 (Jul 2026). Operator</w:t>
+      </w:r>
+      <w:r>
+        <w:rPr>
+          <w:sz w:val="24"/>
+          <w:szCs w:val="24"/>
+        </w:rPr>
+        <w:t>s</w:t>
+      </w:r>
       <w:r>
         <w:rPr>
           <w:sz w:val="24"/>
@@ -2517,7 +2355,7 @@
         </w:rPr>
         <w:t>• </w:t>
       </w:r>
-      <w:hyperlink r:id="rId32" w:history="1">
+      <w:hyperlink r:id="rId30" w:history="1">
         <w:r>
           <w:rPr>
             <w:rStyle w:val="Hyperlink"/>
@@ -3130,7 +2968,7 @@
           <w:szCs w:val="24"/>
         </w:rPr>
       </w:pPr>
-      <w:hyperlink r:id="rId33">
+      <w:hyperlink r:id="rId31">
         <w:r>
           <w:rPr>
             <w:color w:val="0000FF"/>
@@ -3141,7 +2979,7 @@
       </w:hyperlink>
     </w:p>
     <w:sectPr>
-      <w:footerReference w:type="default" r:id="rId34"/>
+      <w:footerReference w:type="default" r:id="rId32"/>
       <w:pgSz w:w="11906" w:h="16838"/>
       <w:pgMar w:top="851" w:right="1134" w:bottom="851" w:left="1134" w:header="113" w:footer="113" w:gutter="0"/>
       <w:pgNumType w:start="1"/>
@@ -3352,6 +3190,7 @@
     <w:lsdException w:name="HTML Sample" w:semiHidden="1" w:unhideWhenUsed="1"/>
     <w:lsdException w:name="HTML Typewriter" w:semiHidden="1" w:unhideWhenUsed="1"/>
     <w:lsdException w:name="HTML Variable" w:semiHidden="1" w:unhideWhenUsed="1"/>
+    <w:lsdException w:name="Normal Table" w:semiHidden="1" w:unhideWhenUsed="1"/>
     <w:lsdException w:name="annotation subject" w:semiHidden="1" w:unhideWhenUsed="1"/>
     <w:lsdException w:name="No List" w:semiHidden="1" w:unhideWhenUsed="1"/>
     <w:lsdException w:name="Outline List 1" w:semiHidden="1" w:unhideWhenUsed="1"/>
@@ -3398,8 +3237,10 @@
     <w:lsdException w:name="Table Subtle 2" w:semiHidden="1" w:unhideWhenUsed="1"/>
     <w:lsdException w:name="Table Web 1" w:semiHidden="1" w:unhideWhenUsed="1"/>
     <w:lsdException w:name="Table Web 2" w:semiHidden="1" w:unhideWhenUsed="1"/>
+    <w:lsdException w:name="Table Web 3" w:semiHidden="1" w:unhideWhenUsed="1"/>
     <w:lsdException w:name="Balloon Text" w:semiHidden="1" w:unhideWhenUsed="1"/>
     <w:lsdException w:name="Table Grid" w:uiPriority="39"/>
+    <w:lsdException w:name="Table Theme" w:semiHidden="1" w:unhideWhenUsed="1"/>
     <w:lsdException w:name="Placeholder Text" w:semiHidden="1"/>
     <w:lsdException w:name="No Spacing" w:uiPriority="1" w:qFormat="1"/>
     <w:lsdException w:name="Light Shading" w:uiPriority="60"/>
@@ -4294,28 +4135,28 @@
 </file>
 
 <file path=customXml/item1.xml><?xml version="1.0" encoding="utf-8"?>
+<b:Sources xmlns:b="http://schemas.openxmlformats.org/officeDocument/2006/bibliography" xmlns="http://schemas.openxmlformats.org/officeDocument/2006/bibliography" SelectedStyle="\APASixthEditionOfficeOnline.xsl" StyleName="APA" Version="6"/>
+</file>
+
+<file path=customXml/item2.xml><?xml version="1.0" encoding="utf-8"?>
 <go:gDocsCustomXmlDataStorage xmlns:go="http://customooxmlschemas.google.com/" xmlns:r="http://schemas.openxmlformats.org/officeDocument/2006/relationships" uri="GoogleDocsCustomDataVersion1">
   <go:docsCustomData xmlns:go="http://customooxmlschemas.google.com/" roundtripDataSignature="AMtx7mj2rTb+yMeO4ZMzCURrmQEoHUAEOg==">AMUW2mVUHfnkjsQ3g9IAbbKsWnHRkQbFRrKBhaW9S9FG3DIMUMKv0i3cW0JaRsTPTPJriXnXfyvKgstmRDvrMQswBojz39J0hEpr3EAYRRH90zg0/FIM9NIWInX1rDP895QgQlMDPN+Iq23pAtsgeLN0/u0hEWS4PQ==</go:docsCustomData>
 </go:gDocsCustomXmlDataStorage>
 </file>
 
-<file path=customXml/item2.xml><?xml version="1.0" encoding="utf-8"?>
-<b:Sources xmlns:b="http://schemas.openxmlformats.org/officeDocument/2006/bibliography" xmlns="http://schemas.openxmlformats.org/officeDocument/2006/bibliography" SelectedStyle="\APASixthEditionOfficeOnline.xsl" StyleName="APA" Version="6"/>
+<file path=customXml/itemProps1.xml><?xml version="1.0" encoding="utf-8"?>
+<ds:datastoreItem xmlns:ds="http://schemas.openxmlformats.org/officeDocument/2006/customXml" ds:itemID="{B62E987D-A5AE-4701-95DF-9145466AF8DB}">
+  <ds:schemaRefs>
+    <ds:schemaRef ds:uri="http://schemas.openxmlformats.org/officeDocument/2006/bibliography"/>
+  </ds:schemaRefs>
+</ds:datastoreItem>
 </file>
 
-<file path=customXml/itemProps1.xml><?xml version="1.0" encoding="utf-8"?>
+<file path=customXml/itemProps2.xml><?xml version="1.0" encoding="utf-8"?>
 <ds:datastoreItem xmlns:ds="http://schemas.openxmlformats.org/officeDocument/2006/customXml" ds:itemID="{11111111-1234-1234-1234-123412341234}">
   <ds:schemaRefs>
     <ds:schemaRef ds:uri="http://customooxmlschemas.google.com/"/>
     <ds:schemaRef ds:uri="http://schemas.openxmlformats.org/officeDocument/2006/relationships"/>
   </ds:schemaRefs>
 </ds:datastoreItem>
-</file>
-
-<file path=customXml/itemProps2.xml><?xml version="1.0" encoding="utf-8"?>
-<ds:datastoreItem xmlns:ds="http://schemas.openxmlformats.org/officeDocument/2006/customXml" ds:itemID="{B62E987D-A5AE-4701-95DF-9145466AF8DB}">
-  <ds:schemaRefs>
-    <ds:schemaRef ds:uri="http://schemas.openxmlformats.org/officeDocument/2006/bibliography"/>
-  </ds:schemaRefs>
-</ds:datastoreItem>
 </file>
</xml_diff>

<commit_message>
files: update agent-orchestrator release and usage metrics
</commit_message>
<xml_diff>
--- a/file/CV_Geser_Dugarov.docx
+++ b/file/CV_Geser_Dugarov.docx
@@ -986,7 +986,6 @@
           <w:sz w:val="24"/>
           <w:szCs w:val="24"/>
         </w:rPr>
-        <w:lastRenderedPageBreak/>
         <w:t>• </w:t>
       </w:r>
       <w:r>
@@ -1433,34 +1432,7 @@
           <w:sz w:val="24"/>
           <w:szCs w:val="24"/>
         </w:rPr>
-        <w:t xml:space="preserve"> </w:t>
-      </w:r>
-      <w:r>
-        <w:rPr>
-          <w:b/>
-          <w:color w:val="000000"/>
-          <w:sz w:val="24"/>
-          <w:szCs w:val="24"/>
-        </w:rPr>
-        <w:t xml:space="preserve">| </w:t>
-      </w:r>
-      <w:r>
-        <w:rPr>
-          <w:b/>
-          <w:color w:val="000000"/>
-          <w:sz w:val="24"/>
-          <w:szCs w:val="24"/>
-        </w:rPr>
-        <w:t>May 2026 – Present</w:t>
-      </w:r>
-      <w:r>
-        <w:rPr>
-          <w:b/>
-          <w:color w:val="000000"/>
-          <w:sz w:val="24"/>
-          <w:szCs w:val="24"/>
-        </w:rPr>
-        <w:t xml:space="preserve"> | </w:t>
+        <w:t xml:space="preserve"> | May 2026 – Present | </w:t>
       </w:r>
       <w:hyperlink r:id="rId25" w:history="1">
         <w:r>
@@ -1506,8 +1478,6 @@
         </w:rPr>
         <w:t>Authored three merged Rust PRs in Lance’s vector-index build path, improving memory bounds and temporary-resource lifecycle in long-running index jobs.</w:t>
       </w:r>
-      <w:bookmarkStart w:id="1" w:name="_GoBack"/>
-      <w:bookmarkEnd w:id="1"/>
     </w:p>
     <w:tbl>
       <w:tblPr>
@@ -1675,8 +1645,8 @@
                 <w:szCs w:val="24"/>
               </w:rPr>
             </w:pPr>
-            <w:bookmarkStart w:id="2" w:name="_heading=h.30j0zll" w:colFirst="0" w:colLast="0"/>
-            <w:bookmarkEnd w:id="2"/>
+            <w:bookmarkStart w:id="1" w:name="_heading=h.30j0zll" w:colFirst="0" w:colLast="0"/>
+            <w:bookmarkEnd w:id="1"/>
             <w:r>
               <w:rPr>
                 <w:b/>
@@ -2087,7 +2057,14 @@
           <w:sz w:val="24"/>
           <w:szCs w:val="24"/>
         </w:rPr>
-        <w:t>Shipped eight agent-orchestrator releases from v0.1.0 (May 2026) to v0.8.0 (Jul 2026), adding workflow-state persistence in GitHub issues, operator-controlled pause/resume, PostgreSQL-backed usage and cost analytics, and an agent-trajectory viewer</w:t>
+        <w:t>Shipped nine agent-orchestrator releases from v0.1.0 (May 2026) to v0.9.0 (Aug 2026), adding workflow-state persistence in GitHub issues</w:t>
+      </w:r>
+      <w:r>
+        <w:rPr>
+          <w:sz w:val="24"/>
+          <w:szCs w:val="24"/>
+        </w:rPr>
+        <w:t>, operator-controlled pause/resume, PostgreSQL-backed usage and cost analytics, and an agent-trajectory viewer</w:t>
       </w:r>
       <w:r>
         <w:rPr>
@@ -2126,49 +2103,30 @@
           <w:sz w:val="24"/>
           <w:szCs w:val="24"/>
         </w:rPr>
-        <w:t xml:space="preserve">Recorded </w:t>
-      </w:r>
-      <w:r>
-        <w:rPr>
-          <w:sz w:val="24"/>
-          <w:szCs w:val="24"/>
-        </w:rPr>
-        <w:t>5</w:t>
-      </w:r>
-      <w:r>
-        <w:rPr>
-          <w:sz w:val="24"/>
-          <w:szCs w:val="24"/>
-        </w:rPr>
-        <w:t>,</w:t>
-      </w:r>
-      <w:r>
-        <w:rPr>
-          <w:sz w:val="24"/>
-          <w:szCs w:val="24"/>
-        </w:rPr>
-        <w:t>100+ agent runs across 12 repositories since May 2026, including 1</w:t>
-      </w:r>
-      <w:r>
-        <w:rPr>
-          <w:sz w:val="24"/>
-          <w:szCs w:val="24"/>
-        </w:rPr>
-        <w:t>,</w:t>
-      </w:r>
-      <w:r>
-        <w:rPr>
-          <w:sz w:val="24"/>
-          <w:szCs w:val="24"/>
-        </w:rPr>
-        <w:t>500+ review-agent runs; usage was equivalent to $11K+ at API list prices.</w:t>
-      </w:r>
-      <w:r>
-        <w:rPr>
-          <w:sz w:val="24"/>
-          <w:szCs w:val="24"/>
-        </w:rPr>
-        <w:t xml:space="preserve"> </w:t>
+        <w:t>Recorded 5,900+ agent runs across 12 repositories since May 2026, including 1,700+ review-agent runs</w:t>
+      </w:r>
+      <w:r>
+        <w:rPr>
+          <w:sz w:val="24"/>
+          <w:szCs w:val="24"/>
+        </w:rPr>
+        <w:t xml:space="preserve">; </w:t>
+      </w:r>
+      <w:r>
+        <w:rPr>
+          <w:sz w:val="24"/>
+          <w:szCs w:val="24"/>
+        </w:rPr>
+        <w:t>usage was equivalent to $13K+ at API list prices</w:t>
+      </w:r>
+      <w:bookmarkStart w:id="2" w:name="_GoBack"/>
+      <w:bookmarkEnd w:id="2"/>
+      <w:r>
+        <w:rPr>
+          <w:sz w:val="24"/>
+          <w:szCs w:val="24"/>
+        </w:rPr>
+        <w:t xml:space="preserve">. </w:t>
       </w:r>
     </w:p>
     <w:p>
@@ -2979,6 +2937,7 @@
   <w:style w:type="character" w:default="1" w:styleId="DefaultParagraphFont">
     <w:name w:val="Default Paragraph Font"/>
     <w:uiPriority w:val="1"/>
+    <w:semiHidden/>
     <w:unhideWhenUsed/>
   </w:style>
   <w:style w:type="table" w:default="1" w:styleId="TableNormal">
@@ -3570,7 +3529,7 @@
 </file>
 
 <file path=customXml/itemProps2.xml><?xml version="1.0" encoding="utf-8"?>
-<ds:datastoreItem xmlns:ds="http://schemas.openxmlformats.org/officeDocument/2006/customXml" ds:itemID="{1AC397F5-2C9E-429E-BE9A-BBADC90C72F1}">
+<ds:datastoreItem xmlns:ds="http://schemas.openxmlformats.org/officeDocument/2006/customXml" ds:itemID="{C64B05CF-B518-47F3-B902-78DE0ADF0487}">
   <ds:schemaRefs>
     <ds:schemaRef ds:uri="http://schemas.openxmlformats.org/officeDocument/2006/bibliography"/>
   </ds:schemaRefs>

</xml_diff>

<commit_message>
files: clarify experience and refresh project metrics
</commit_message>
<xml_diff>
--- a/file/CV_Geser_Dugarov.docx
+++ b/file/CV_Geser_Dugarov.docx
@@ -1,6 +1,6 @@
 
 <file path=word/document.xml><?xml version="1.0" encoding="utf-8"?>
-<w:document xmlns:wpc="http://schemas.microsoft.com/office/word/2010/wordprocessingCanvas" xmlns:cx="http://schemas.microsoft.com/office/drawing/2014/chartex" xmlns:cx1="http://schemas.microsoft.com/office/drawing/2015/9/8/chartex" xmlns:cx2="http://schemas.microsoft.com/office/drawing/2015/10/21/chartex" xmlns:cx3="http://schemas.microsoft.com/office/drawing/2016/5/9/chartex" xmlns:cx4="http://schemas.microsoft.com/office/drawing/2016/5/10/chartex" xmlns:cx5="http://schemas.microsoft.com/office/drawing/2016/5/11/chartex" xmlns:cx6="http://schemas.microsoft.com/office/drawing/2016/5/12/chartex" xmlns:cx7="http://schemas.microsoft.com/office/drawing/2016/5/13/chartex" xmlns:cx8="http://schemas.microsoft.com/office/drawing/2016/5/14/chartex" xmlns:mc="http://schemas.openxmlformats.org/markup-compatibility/2006" xmlns:aink="http://schemas.microsoft.com/office/drawing/2016/ink" xmlns:am3d="http://schemas.microsoft.com/office/drawing/2017/model3d" xmlns:o="urn:schemas-microsoft-com:office:office" xmlns:r="http://schemas.openxmlformats.org/officeDocument/2006/relationships" xmlns:m="http://schemas.openxmlformats.org/officeDocument/2006/math" xmlns:v="urn:schemas-microsoft-com:vml" xmlns:wp14="http://schemas.microsoft.com/office/word/2010/wordprocessingDrawing" xmlns:wp="http://schemas.openxmlformats.org/drawingml/2006/wordprocessingDrawing" xmlns:w10="urn:schemas-microsoft-com:office:word" xmlns:w="http://schemas.openxmlformats.org/wordprocessingml/2006/main" xmlns:w14="http://schemas.microsoft.com/office/word/2010/wordml" xmlns:w15="http://schemas.microsoft.com/office/word/2012/wordml" xmlns:w16cid="http://schemas.microsoft.com/office/word/2016/wordml/cid" xmlns:w16se="http://schemas.microsoft.com/office/word/2015/wordml/symex" xmlns:wpg="http://schemas.microsoft.com/office/word/2010/wordprocessingGroup" xmlns:wpi="http://schemas.microsoft.com/office/word/2010/wordprocessingInk" xmlns:wne="http://schemas.microsoft.com/office/word/2006/wordml" xmlns:wps="http://schemas.microsoft.com/office/word/2010/wordprocessingShape" mc:Ignorable="w14 w15 w16se w16cid wp14">
+<w:document xmlns:wpc="http://schemas.microsoft.com/office/word/2010/wordprocessingCanvas" xmlns:cx="http://schemas.microsoft.com/office/drawing/2014/chartex" xmlns:cx1="http://schemas.microsoft.com/office/drawing/2015/9/8/chartex" xmlns:cx2="http://schemas.microsoft.com/office/drawing/2015/10/21/chartex" xmlns:cx3="http://schemas.microsoft.com/office/drawing/2016/5/9/chartex" xmlns:cx4="http://schemas.microsoft.com/office/drawing/2016/5/10/chartex" xmlns:cx5="http://schemas.microsoft.com/office/drawing/2016/5/11/chartex" xmlns:cx6="http://schemas.microsoft.com/office/drawing/2016/5/12/chartex" xmlns:cx7="http://schemas.microsoft.com/office/drawing/2016/5/13/chartex" xmlns:cx8="http://schemas.microsoft.com/office/drawing/2016/5/14/chartex" xmlns:mc="http://schemas.openxmlformats.org/markup-compatibility/2006" xmlns:aink="http://schemas.microsoft.com/office/drawing/2016/ink" xmlns:am3d="http://schemas.microsoft.com/office/drawing/2017/model3d" xmlns:o="urn:schemas-microsoft-com:office:office" xmlns:r="http://schemas.openxmlformats.org/officeDocument/2006/relationships" xmlns:m="http://schemas.openxmlformats.org/officeDocument/2006/math" xmlns:v="urn:schemas-microsoft-com:vml" xmlns:wp14="http://schemas.microsoft.com/office/word/2010/wordprocessingDrawing" xmlns:wp="http://schemas.openxmlformats.org/drawingml/2006/wordprocessingDrawing" xmlns:w10="urn:schemas-microsoft-com:office:word" xmlns:w="http://schemas.openxmlformats.org/wordprocessingml/2006/main" xmlns:w14="http://schemas.microsoft.com/office/word/2010/wordml" xmlns:w15="http://schemas.microsoft.com/office/word/2012/wordml" xmlns:w16cex="http://schemas.microsoft.com/office/word/2018/wordml/cex" xmlns:w16cid="http://schemas.microsoft.com/office/word/2016/wordml/cid" xmlns:w16="http://schemas.microsoft.com/office/word/2018/wordml" xmlns:w16sdtdh="http://schemas.microsoft.com/office/word/2020/wordml/sdtdatahash" xmlns:w16se="http://schemas.microsoft.com/office/word/2015/wordml/symex" xmlns:wpg="http://schemas.microsoft.com/office/word/2010/wordprocessingGroup" xmlns:wpi="http://schemas.microsoft.com/office/word/2010/wordprocessingInk" xmlns:wne="http://schemas.microsoft.com/office/word/2006/wordml" xmlns:wps="http://schemas.microsoft.com/office/word/2010/wordprocessingShape" mc:Ignorable="w14 w15 w16se w16cid w16 w16cex w16sdtdh wp14">
   <w:body>
     <w:p>
       <w:pPr>
@@ -335,7 +335,73 @@
           <w:sz w:val="24"/>
           <w:szCs w:val="24"/>
         </w:rPr>
-        <w:t xml:space="preserve">Software engineer building petabyte-scale lakehouse and AI data infrastructure at Huawei. Designed and implemented a two-tier distributed cache for Lance; currently developing a query-adaptive ANN index targeting tens of billions of vectors. As part of this role, authored 50 merged PRs to </w:t>
+        <w:t xml:space="preserve">Software engineer building petabyte-scale lakehouse and AI data infrastructure at Huawei. </w:t>
+      </w:r>
+      <w:r>
+        <w:rPr>
+          <w:color w:val="000000"/>
+          <w:sz w:val="24"/>
+          <w:szCs w:val="24"/>
+        </w:rPr>
+        <w:t xml:space="preserve">As part of my Huawei role, I designed and implemented a two-tier distributed cache for </w:t>
+      </w:r>
+      <w:proofErr w:type="gramStart"/>
+      <w:r>
+        <w:rPr>
+          <w:color w:val="000000"/>
+          <w:sz w:val="24"/>
+          <w:szCs w:val="24"/>
+        </w:rPr>
+        <w:t>Lance</w:t>
+      </w:r>
+      <w:proofErr w:type="gramEnd"/>
+      <w:r>
+        <w:rPr>
+          <w:color w:val="000000"/>
+          <w:sz w:val="24"/>
+          <w:szCs w:val="24"/>
+        </w:rPr>
+        <w:t xml:space="preserve"> and </w:t>
+      </w:r>
+      <w:r>
+        <w:rPr>
+          <w:color w:val="000000"/>
+          <w:sz w:val="24"/>
+          <w:szCs w:val="24"/>
+        </w:rPr>
+        <w:t xml:space="preserve">I </w:t>
+      </w:r>
+      <w:r>
+        <w:rPr>
+          <w:color w:val="000000"/>
+          <w:sz w:val="24"/>
+          <w:szCs w:val="24"/>
+        </w:rPr>
+        <w:t>am currently developing a query-adaptive ANN index targeting tens of billions of</w:t>
+      </w:r>
+      <w:r>
+        <w:rPr>
+          <w:color w:val="000000"/>
+          <w:sz w:val="24"/>
+          <w:szCs w:val="24"/>
+        </w:rPr>
+        <w:t xml:space="preserve"> </w:t>
+      </w:r>
+      <w:r>
+        <w:rPr>
+          <w:color w:val="000000"/>
+          <w:sz w:val="24"/>
+          <w:szCs w:val="24"/>
+        </w:rPr>
+        <w:t>vectors. I also authored</w:t>
+      </w:r>
+      <w:r>
+        <w:rPr>
+          <w:color w:val="000000"/>
+          <w:sz w:val="24"/>
+          <w:szCs w:val="24"/>
+        </w:rPr>
+        <w:t xml:space="preserve"> </w:t>
       </w:r>
       <w:hyperlink r:id="rId11" w:history="1">
         <w:r>
@@ -344,7 +410,7 @@
             <w:sz w:val="24"/>
             <w:szCs w:val="24"/>
           </w:rPr>
-          <w:t>Apache Hudi</w:t>
+          <w:t>50 merged PRs</w:t>
         </w:r>
       </w:hyperlink>
       <w:r>
@@ -353,7 +419,7 @@
           <w:sz w:val="24"/>
           <w:szCs w:val="24"/>
         </w:rPr>
-        <w:t xml:space="preserve"> and three to </w:t>
+        <w:t xml:space="preserve"> to Apache Hudi and </w:t>
       </w:r>
       <w:hyperlink r:id="rId12" w:history="1">
         <w:r>
@@ -362,7 +428,7 @@
             <w:sz w:val="24"/>
             <w:szCs w:val="24"/>
           </w:rPr>
-          <w:t>Lance</w:t>
+          <w:t>three</w:t>
         </w:r>
       </w:hyperlink>
       <w:r>
@@ -371,31 +437,119 @@
           <w:sz w:val="24"/>
           <w:szCs w:val="24"/>
         </w:rPr>
-        <w:t xml:space="preserve">. </w:t>
-      </w:r>
-      <w:r>
-        <w:rPr>
-          <w:color w:val="000000"/>
-          <w:sz w:val="24"/>
-          <w:szCs w:val="24"/>
-        </w:rPr>
-        <w:t>Research background informs a rigorous approach to system design, benchmarking, and performance validation</w:t>
-      </w:r>
-      <w:r>
-        <w:rPr>
-          <w:color w:val="000000"/>
-          <w:sz w:val="24"/>
-          <w:szCs w:val="24"/>
-        </w:rPr>
-        <w:t>. Creator of open-source agentic software-development tooling for reproducible issue-to-PR and develop–review workflows with human-in-the-loop</w:t>
-      </w:r>
-      <w:r>
-        <w:rPr>
-          <w:color w:val="000000"/>
-          <w:sz w:val="24"/>
-          <w:szCs w:val="24"/>
-        </w:rPr>
-        <w:t xml:space="preserve"> (HITL)</w:t>
+        <w:t xml:space="preserve"> to Lance.</w:t>
+      </w:r>
+      <w:r>
+        <w:rPr>
+          <w:color w:val="000000"/>
+          <w:sz w:val="24"/>
+          <w:szCs w:val="24"/>
+        </w:rPr>
+        <w:t xml:space="preserve"> </w:t>
+      </w:r>
+      <w:r>
+        <w:rPr>
+          <w:color w:val="000000"/>
+          <w:sz w:val="24"/>
+          <w:szCs w:val="24"/>
+        </w:rPr>
+        <w:t xml:space="preserve">Research background informs </w:t>
+      </w:r>
+      <w:r>
+        <w:rPr>
+          <w:color w:val="000000"/>
+          <w:sz w:val="24"/>
+          <w:szCs w:val="24"/>
+        </w:rPr>
+        <w:t>an evidence-</w:t>
+      </w:r>
+      <w:r>
+        <w:rPr>
+          <w:color w:val="000000"/>
+          <w:sz w:val="24"/>
+          <w:szCs w:val="24"/>
+        </w:rPr>
+        <w:t>d</w:t>
+      </w:r>
+      <w:r>
+        <w:rPr>
+          <w:color w:val="000000"/>
+          <w:sz w:val="24"/>
+          <w:szCs w:val="24"/>
+        </w:rPr>
+        <w:t>riven</w:t>
+      </w:r>
+      <w:r>
+        <w:rPr>
+          <w:color w:val="000000"/>
+          <w:sz w:val="24"/>
+          <w:szCs w:val="24"/>
+        </w:rPr>
+        <w:t xml:space="preserve"> </w:t>
+      </w:r>
+      <w:r>
+        <w:rPr>
+          <w:color w:val="000000"/>
+          <w:sz w:val="24"/>
+          <w:szCs w:val="24"/>
+        </w:rPr>
+        <w:t>approach to system design, benchmarking, and performance validation.</w:t>
+      </w:r>
+      <w:r>
+        <w:rPr>
+          <w:color w:val="000000"/>
+          <w:sz w:val="24"/>
+          <w:szCs w:val="24"/>
+        </w:rPr>
+        <w:t xml:space="preserve"> </w:t>
+      </w:r>
+      <w:r>
+        <w:rPr>
+          <w:color w:val="000000"/>
+          <w:sz w:val="24"/>
+          <w:szCs w:val="24"/>
+        </w:rPr>
+        <w:t xml:space="preserve">Separately, I create independent open-source agentic software-development tooling for reproducible issue-to-PR and develop–review workflows with </w:t>
+      </w:r>
+      <w:r>
+        <w:rPr>
+          <w:color w:val="000000"/>
+          <w:sz w:val="24"/>
+          <w:szCs w:val="24"/>
+        </w:rPr>
+        <w:t>human-in-the-loop</w:t>
+      </w:r>
+      <w:r>
+        <w:rPr>
+          <w:color w:val="000000"/>
+          <w:sz w:val="24"/>
+          <w:szCs w:val="24"/>
+        </w:rPr>
+        <w:t xml:space="preserve"> </w:t>
+      </w:r>
+      <w:r>
+        <w:rPr>
+          <w:color w:val="000000"/>
+          <w:sz w:val="24"/>
+          <w:szCs w:val="24"/>
+        </w:rPr>
+        <w:t>(</w:t>
+      </w:r>
+      <w:r>
+        <w:rPr>
+          <w:color w:val="000000"/>
+          <w:sz w:val="24"/>
+          <w:szCs w:val="24"/>
+        </w:rPr>
+        <w:t>HITL</w:t>
+      </w:r>
+      <w:r>
+        <w:rPr>
+          <w:color w:val="000000"/>
+          <w:sz w:val="24"/>
+          <w:szCs w:val="24"/>
+        </w:rPr>
+        <w:t>)</w:t>
       </w:r>
       <w:r>
         <w:rPr>
@@ -442,25 +596,243 @@
           <w:right w:val="nil"/>
           <w:between w:val="nil"/>
         </w:pBdr>
-        <w:spacing w:line="264" w:lineRule="auto"/>
-        <w:jc w:val="both"/>
+        <w:spacing w:before="60" w:after="60" w:line="264" w:lineRule="auto"/>
+        <w:ind w:left="170" w:hanging="170"/>
+        <w:rPr>
+          <w:sz w:val="24"/>
+          <w:szCs w:val="24"/>
+        </w:rPr>
+      </w:pPr>
+      <w:r>
+        <w:rPr>
+          <w:sz w:val="24"/>
+          <w:szCs w:val="24"/>
+        </w:rPr>
+        <w:t>•</w:t>
+      </w:r>
+      <w:r>
+        <w:rPr>
+          <w:sz w:val="24"/>
+          <w:szCs w:val="24"/>
+        </w:rPr>
+        <w:t> </w:t>
+      </w:r>
+      <w:r>
         <w:rPr>
           <w:b/>
-          <w:i/>
-          <w:color w:val="000000"/>
+          <w:bCs/>
+          <w:sz w:val="24"/>
+          <w:szCs w:val="24"/>
+        </w:rPr>
+        <w:t>Languages</w:t>
+      </w:r>
+      <w:r>
+        <w:rPr>
+          <w:sz w:val="24"/>
+          <w:szCs w:val="24"/>
+        </w:rPr>
+        <w:t>:</w:t>
+      </w:r>
+      <w:r>
+        <w:rPr>
+          <w:sz w:val="24"/>
+          <w:szCs w:val="24"/>
+        </w:rPr>
+        <w:t xml:space="preserve"> </w:t>
+      </w:r>
+      <w:r>
+        <w:rPr>
+          <w:sz w:val="24"/>
+          <w:szCs w:val="24"/>
+        </w:rPr>
+        <w:t xml:space="preserve">Java, </w:t>
+      </w:r>
+      <w:r>
+        <w:rPr>
+          <w:sz w:val="24"/>
+          <w:szCs w:val="24"/>
+        </w:rPr>
+        <w:t>Python</w:t>
+      </w:r>
+      <w:r>
+        <w:rPr>
+          <w:sz w:val="24"/>
+          <w:szCs w:val="24"/>
+        </w:rPr>
+        <w:t xml:space="preserve">, </w:t>
+      </w:r>
+      <w:r>
+        <w:rPr>
+          <w:sz w:val="24"/>
+          <w:szCs w:val="24"/>
+        </w:rPr>
+        <w:t>SQL</w:t>
+      </w:r>
+      <w:r>
+        <w:rPr>
+          <w:sz w:val="24"/>
+          <w:szCs w:val="24"/>
+        </w:rPr>
+        <w:t xml:space="preserve">; </w:t>
+      </w:r>
+      <w:r>
+        <w:rPr>
+          <w:sz w:val="24"/>
+          <w:szCs w:val="24"/>
+        </w:rPr>
+        <w:t>Rust (working knowledge)</w:t>
+      </w:r>
+    </w:p>
+    <w:p>
+      <w:pPr>
+        <w:pBdr>
+          <w:top w:val="nil"/>
+          <w:left w:val="nil"/>
+          <w:bottom w:val="nil"/>
+          <w:right w:val="nil"/>
+          <w:between w:val="nil"/>
+        </w:pBdr>
+        <w:spacing w:before="60" w:after="60" w:line="264" w:lineRule="auto"/>
+        <w:ind w:left="170" w:hanging="170"/>
+        <w:rPr>
           <w:sz w:val="24"/>
           <w:szCs w:val="24"/>
         </w:rPr>
       </w:pPr>
       <w:r>
         <w:rPr>
+          <w:sz w:val="24"/>
+          <w:szCs w:val="24"/>
+        </w:rPr>
+        <w:t>•</w:t>
+      </w:r>
+      <w:r>
+        <w:rPr>
+          <w:sz w:val="24"/>
+          <w:szCs w:val="24"/>
+        </w:rPr>
+        <w:t> </w:t>
+      </w:r>
+      <w:r>
+        <w:rPr>
           <w:b/>
-          <w:i/>
-          <w:color w:val="000000"/>
-          <w:sz w:val="24"/>
-          <w:szCs w:val="24"/>
-        </w:rPr>
-        <w:t>Java, Python, Rust (some experience), PostgreSQL, Apache Hudi, Lance, Apache Spark, Apache Flink, Ray, vector search and ANN indexing, distributed systems, performance engineering, LLM agent orchestration, multi-agent workflows</w:t>
+          <w:bCs/>
+          <w:sz w:val="24"/>
+          <w:szCs w:val="24"/>
+        </w:rPr>
+        <w:t>Data and retrieval</w:t>
+      </w:r>
+      <w:r>
+        <w:rPr>
+          <w:sz w:val="24"/>
+          <w:szCs w:val="24"/>
+        </w:rPr>
+        <w:t>:</w:t>
+      </w:r>
+      <w:r>
+        <w:rPr>
+          <w:sz w:val="24"/>
+          <w:szCs w:val="24"/>
+        </w:rPr>
+        <w:t xml:space="preserve"> </w:t>
+      </w:r>
+      <w:r>
+        <w:rPr>
+          <w:sz w:val="24"/>
+          <w:szCs w:val="24"/>
+        </w:rPr>
+        <w:t xml:space="preserve">Distributed systems, performance engineering, PostgreSQL, Apache Hudi, Lance, </w:t>
+      </w:r>
+      <w:r>
+        <w:rPr>
+          <w:sz w:val="24"/>
+          <w:szCs w:val="24"/>
+        </w:rPr>
+        <w:t xml:space="preserve">Apache </w:t>
+      </w:r>
+      <w:r>
+        <w:rPr>
+          <w:sz w:val="24"/>
+          <w:szCs w:val="24"/>
+        </w:rPr>
+        <w:t xml:space="preserve">Spark, </w:t>
+      </w:r>
+      <w:r>
+        <w:rPr>
+          <w:sz w:val="24"/>
+          <w:szCs w:val="24"/>
+        </w:rPr>
+        <w:t xml:space="preserve">Apache </w:t>
+      </w:r>
+      <w:r>
+        <w:rPr>
+          <w:sz w:val="24"/>
+          <w:szCs w:val="24"/>
+        </w:rPr>
+        <w:t>Flink, Ray, vector search and ANN indexing</w:t>
+      </w:r>
+    </w:p>
+    <w:p>
+      <w:pPr>
+        <w:pBdr>
+          <w:top w:val="nil"/>
+          <w:left w:val="nil"/>
+          <w:bottom w:val="nil"/>
+          <w:right w:val="nil"/>
+          <w:between w:val="nil"/>
+        </w:pBdr>
+        <w:spacing w:before="60" w:after="60" w:line="264" w:lineRule="auto"/>
+        <w:ind w:left="170" w:hanging="170"/>
+        <w:rPr>
+          <w:sz w:val="24"/>
+          <w:szCs w:val="24"/>
+        </w:rPr>
+      </w:pPr>
+      <w:r>
+        <w:rPr>
+          <w:sz w:val="24"/>
+          <w:szCs w:val="24"/>
+        </w:rPr>
+        <w:t>•</w:t>
+      </w:r>
+      <w:r>
+        <w:rPr>
+          <w:sz w:val="24"/>
+          <w:szCs w:val="24"/>
+        </w:rPr>
+        <w:t> </w:t>
+      </w:r>
+      <w:r>
+        <w:rPr>
+          <w:b/>
+          <w:bCs/>
+          <w:sz w:val="24"/>
+          <w:szCs w:val="24"/>
+        </w:rPr>
+        <w:t>Agent systems</w:t>
+      </w:r>
+      <w:r>
+        <w:rPr>
+          <w:sz w:val="24"/>
+          <w:szCs w:val="24"/>
+        </w:rPr>
+        <w:t xml:space="preserve">: </w:t>
+      </w:r>
+      <w:proofErr w:type="gramStart"/>
+      <w:r>
+        <w:rPr>
+          <w:sz w:val="24"/>
+          <w:szCs w:val="24"/>
+        </w:rPr>
+        <w:t>Multi-agent</w:t>
+      </w:r>
+      <w:proofErr w:type="gramEnd"/>
+      <w:r>
+        <w:rPr>
+          <w:sz w:val="24"/>
+          <w:szCs w:val="24"/>
+        </w:rPr>
+        <w:t xml:space="preserve"> orchestration, tool-use and HITL workflows, state and recovery management, trajectory tracing, token/cost analytics, credential isolation</w:t>
       </w:r>
     </w:p>
     <w:p>
@@ -510,6 +882,7 @@
           </w:tcPr>
           <w:p>
             <w:pPr>
+              <w:keepNext/>
               <w:pBdr>
                 <w:top w:val="nil"/>
                 <w:left w:val="nil"/>
@@ -711,23 +1084,45 @@
           <w:sz w:val="24"/>
           <w:szCs w:val="24"/>
         </w:rPr>
-        <w:t xml:space="preserve">• Designed and implemented a distributed cache for Lance, pairing an in-memory L1 with a persistent L2 on per-worker </w:t>
-      </w:r>
-      <w:proofErr w:type="spellStart"/>
-      <w:r>
-        <w:rPr>
-          <w:sz w:val="24"/>
-          <w:szCs w:val="24"/>
-        </w:rPr>
-        <w:t>NVMe</w:t>
-      </w:r>
-      <w:proofErr w:type="spellEnd"/>
-      <w:r>
-        <w:rPr>
-          <w:sz w:val="24"/>
-          <w:szCs w:val="24"/>
-        </w:rPr>
-        <w:t xml:space="preserve"> and prewarming IVF partitions to avoid repeated object-storage reads.</w:t>
+        <w:t>• </w:t>
+      </w:r>
+      <w:r>
+        <w:rPr>
+          <w:sz w:val="24"/>
+          <w:szCs w:val="24"/>
+        </w:rPr>
+        <w:t>Designed and implemented a two-tier distributed cache; currently developing a query-adaptive ANN index targeting tens of billions of vectors;</w:t>
+      </w:r>
+      <w:r>
+        <w:rPr>
+          <w:sz w:val="24"/>
+          <w:szCs w:val="24"/>
+        </w:rPr>
+        <w:t xml:space="preserve"> </w:t>
+      </w:r>
+      <w:r>
+        <w:rPr>
+          <w:sz w:val="24"/>
+          <w:szCs w:val="24"/>
+        </w:rPr>
+        <w:t xml:space="preserve">authored </w:t>
+      </w:r>
+      <w:hyperlink r:id="rId14" w:history="1">
+        <w:r>
+          <w:rPr>
+            <w:rStyle w:val="Hyperlink"/>
+            <w:sz w:val="24"/>
+            <w:szCs w:val="24"/>
+          </w:rPr>
+          <w:t>three merged Rust PRs</w:t>
+        </w:r>
+      </w:hyperlink>
+      <w:r>
+        <w:rPr>
+          <w:sz w:val="24"/>
+          <w:szCs w:val="24"/>
+        </w:rPr>
+        <w:t xml:space="preserve"> improving memory bounds and resource lifecycle in index-build jobs.</w:t>
       </w:r>
     </w:p>
     <w:p>
@@ -759,28 +1154,56 @@
           <w:sz w:val="24"/>
           <w:szCs w:val="24"/>
         </w:rPr>
-        <w:t xml:space="preserve">Building a distributed, incrementally updatable vector index </w:t>
-      </w:r>
-      <w:r>
-        <w:rPr>
-          <w:sz w:val="24"/>
-          <w:szCs w:val="24"/>
-        </w:rPr>
-        <w:t>targeting tens of billions of vectors</w:t>
-      </w:r>
-      <w:r>
-        <w:rPr>
-          <w:sz w:val="24"/>
-          <w:szCs w:val="24"/>
-        </w:rPr>
-        <w:t xml:space="preserve"> </w:t>
-      </w:r>
-      <w:r>
-        <w:rPr>
-          <w:sz w:val="24"/>
-          <w:szCs w:val="24"/>
-        </w:rPr>
-        <w:t>using query-adaptive ANN search.</w:t>
+        <w:t xml:space="preserve">Apache Hudi: </w:t>
+      </w:r>
+      <w:r>
+        <w:rPr>
+          <w:sz w:val="24"/>
+          <w:szCs w:val="24"/>
+        </w:rPr>
+        <w:t xml:space="preserve">Simplified setup </w:t>
+      </w:r>
+      <w:r>
+        <w:rPr>
+          <w:sz w:val="24"/>
+          <w:szCs w:val="24"/>
+        </w:rPr>
+        <w:t xml:space="preserve">of </w:t>
+      </w:r>
+      <w:r>
+        <w:rPr>
+          <w:sz w:val="24"/>
+          <w:szCs w:val="24"/>
+        </w:rPr>
+        <w:t>900+ configuration parameters</w:t>
+      </w:r>
+      <w:r>
+        <w:rPr>
+          <w:sz w:val="24"/>
+          <w:szCs w:val="24"/>
+        </w:rPr>
+        <w:t xml:space="preserve"> with</w:t>
+      </w:r>
+      <w:r>
+        <w:rPr>
+          <w:sz w:val="24"/>
+          <w:szCs w:val="24"/>
+        </w:rPr>
+        <w:t xml:space="preserve"> recommended defaults for common scenarios </w:t>
+      </w:r>
+      <w:r>
+        <w:rPr>
+          <w:sz w:val="24"/>
+          <w:szCs w:val="24"/>
+        </w:rPr>
+        <w:t>and implemented partition-level TTL</w:t>
+      </w:r>
+      <w:r>
+        <w:rPr>
+          <w:sz w:val="24"/>
+          <w:szCs w:val="24"/>
+        </w:rPr>
+        <w:t>.</w:t>
       </w:r>
     </w:p>
     <w:p>
@@ -796,12 +1219,105 @@
         <w:ind w:left="170" w:hanging="170"/>
         <w:jc w:val="both"/>
         <w:rPr>
+          <w:b/>
           <w:sz w:val="24"/>
           <w:szCs w:val="24"/>
         </w:rPr>
       </w:pPr>
       <w:r>
         <w:rPr>
+          <w:b/>
+          <w:sz w:val="24"/>
+          <w:szCs w:val="24"/>
+        </w:rPr>
+        <w:t>Huawei-sponsored upstream contributions</w:t>
+      </w:r>
+    </w:p>
+    <w:p>
+      <w:pPr>
+        <w:pBdr>
+          <w:top w:val="nil"/>
+          <w:left w:val="nil"/>
+          <w:bottom w:val="nil"/>
+          <w:right w:val="nil"/>
+          <w:between w:val="nil"/>
+        </w:pBdr>
+        <w:spacing w:before="60" w:after="60" w:line="264" w:lineRule="auto"/>
+        <w:ind w:left="170" w:hanging="170"/>
+        <w:jc w:val="both"/>
+        <w:rPr>
+          <w:sz w:val="24"/>
+          <w:szCs w:val="24"/>
+        </w:rPr>
+      </w:pPr>
+      <w:r>
+        <w:rPr>
+          <w:b/>
+          <w:bCs/>
+          <w:sz w:val="24"/>
+          <w:szCs w:val="24"/>
+        </w:rPr>
+        <w:t>Apache Hudi</w:t>
+      </w:r>
+      <w:r>
+        <w:rPr>
+          <w:sz w:val="24"/>
+          <w:szCs w:val="24"/>
+        </w:rPr>
+        <w:t xml:space="preserve"> </w:t>
+      </w:r>
+      <w:r>
+        <w:rPr>
+          <w:sz w:val="24"/>
+          <w:szCs w:val="24"/>
+        </w:rPr>
+        <w:t>–</w:t>
+      </w:r>
+      <w:r>
+        <w:rPr>
+          <w:sz w:val="24"/>
+          <w:szCs w:val="24"/>
+        </w:rPr>
+        <w:t xml:space="preserve"> </w:t>
+      </w:r>
+      <w:hyperlink r:id="rId15" w:history="1">
+        <w:r>
+          <w:rPr>
+            <w:rStyle w:val="Hyperlink"/>
+            <w:sz w:val="24"/>
+            <w:szCs w:val="24"/>
+          </w:rPr>
+          <w:t>50 merged PRs</w:t>
+        </w:r>
+      </w:hyperlink>
+      <w:r>
+        <w:rPr>
+          <w:bCs/>
+          <w:sz w:val="24"/>
+          <w:szCs w:val="24"/>
+        </w:rPr>
+        <w:t xml:space="preserve"> (delivered as part of the Huawei role)</w:t>
+      </w:r>
+    </w:p>
+    <w:p>
+      <w:pPr>
+        <w:pBdr>
+          <w:top w:val="nil"/>
+          <w:left w:val="nil"/>
+          <w:bottom w:val="nil"/>
+          <w:right w:val="nil"/>
+          <w:between w:val="nil"/>
+        </w:pBdr>
+        <w:spacing w:before="60" w:after="60" w:line="264" w:lineRule="auto"/>
+        <w:ind w:left="170" w:hanging="170"/>
+        <w:jc w:val="both"/>
+        <w:rPr>
+          <w:sz w:val="24"/>
+          <w:szCs w:val="24"/>
+        </w:rPr>
+      </w:pPr>
+      <w:r>
+        <w:rPr>
           <w:sz w:val="24"/>
           <w:szCs w:val="24"/>
         </w:rPr>
@@ -812,7 +1328,94 @@
           <w:sz w:val="24"/>
           <w:szCs w:val="24"/>
         </w:rPr>
-        <w:t>Simplified Hudi setup by automating recommended defaults for common scenarios in a system with 900+ configuration parameters.</w:t>
+        <w:t>Optimized serialization of Flink stream records in Hudi, cutting end-to-end write time by up to 26% and reducing data transferred between operators by 29</w:t>
+      </w:r>
+      <w:r>
+        <w:rPr>
+          <w:color w:val="000000"/>
+          <w:sz w:val="24"/>
+          <w:szCs w:val="24"/>
+        </w:rPr>
+        <w:t>–</w:t>
+      </w:r>
+      <w:r>
+        <w:rPr>
+          <w:sz w:val="24"/>
+          <w:szCs w:val="24"/>
+        </w:rPr>
+        <w:t>36% in TPC-H benchmarks</w:t>
+      </w:r>
+      <w:r>
+        <w:rPr>
+          <w:sz w:val="24"/>
+          <w:szCs w:val="24"/>
+        </w:rPr>
+        <w:t xml:space="preserve"> </w:t>
+      </w:r>
+      <w:r>
+        <w:rPr>
+          <w:sz w:val="24"/>
+          <w:szCs w:val="24"/>
+        </w:rPr>
+        <w:t>(</w:t>
+      </w:r>
+      <w:hyperlink r:id="rId16" w:history="1">
+        <w:r>
+          <w:rPr>
+            <w:rStyle w:val="Hyperlink"/>
+            <w:sz w:val="24"/>
+            <w:szCs w:val="24"/>
+          </w:rPr>
+          <w:t>design doc</w:t>
+        </w:r>
+      </w:hyperlink>
+      <w:r>
+        <w:rPr>
+          <w:sz w:val="24"/>
+          <w:szCs w:val="24"/>
+        </w:rPr>
+        <w:t xml:space="preserve">, </w:t>
+      </w:r>
+      <w:hyperlink r:id="rId17" w:history="1">
+        <w:r>
+          <w:rPr>
+            <w:rStyle w:val="Hyperlink"/>
+            <w:sz w:val="24"/>
+            <w:szCs w:val="24"/>
+          </w:rPr>
+          <w:t>main changes</w:t>
+        </w:r>
+      </w:hyperlink>
+      <w:r>
+        <w:rPr>
+          <w:sz w:val="24"/>
+          <w:szCs w:val="24"/>
+        </w:rPr>
+        <w:t>)</w:t>
+      </w:r>
+      <w:r>
+        <w:rPr>
+          <w:sz w:val="24"/>
+          <w:szCs w:val="24"/>
+        </w:rPr>
+        <w:t xml:space="preserve">; released in </w:t>
+      </w:r>
+      <w:hyperlink r:id="rId18" w:history="1">
+        <w:r>
+          <w:rPr>
+            <w:rStyle w:val="Hyperlink"/>
+            <w:sz w:val="24"/>
+            <w:szCs w:val="24"/>
+          </w:rPr>
+          <w:t>Hudi 1.0.2</w:t>
+        </w:r>
+      </w:hyperlink>
+      <w:r>
+        <w:rPr>
+          <w:sz w:val="24"/>
+          <w:szCs w:val="24"/>
+        </w:rPr>
+        <w:t>.</w:t>
       </w:r>
     </w:p>
     <w:p>
@@ -828,274 +1431,7 @@
         <w:ind w:left="170" w:hanging="170"/>
         <w:jc w:val="both"/>
         <w:rPr>
-          <w:sz w:val="24"/>
-          <w:szCs w:val="24"/>
-        </w:rPr>
-      </w:pPr>
-      <w:r>
-        <w:rPr>
-          <w:sz w:val="24"/>
-          <w:szCs w:val="24"/>
-        </w:rPr>
-        <w:t>• </w:t>
-      </w:r>
-      <w:r>
-        <w:rPr>
-          <w:sz w:val="24"/>
-          <w:szCs w:val="24"/>
-        </w:rPr>
-        <w:t>Implemented partition-level TTL, automating data retention and management of cloud storage costs</w:t>
-      </w:r>
-      <w:r>
-        <w:rPr>
-          <w:sz w:val="24"/>
-          <w:szCs w:val="24"/>
-        </w:rPr>
-        <w:t>.</w:t>
-      </w:r>
-    </w:p>
-    <w:p>
-      <w:pPr>
-        <w:pBdr>
-          <w:top w:val="nil"/>
-          <w:left w:val="nil"/>
-          <w:bottom w:val="nil"/>
-          <w:right w:val="nil"/>
-          <w:between w:val="nil"/>
-        </w:pBdr>
-        <w:spacing w:before="120" w:after="60" w:line="264" w:lineRule="auto"/>
-        <w:ind w:left="170" w:hanging="170"/>
-        <w:jc w:val="both"/>
-        <w:rPr>
-          <w:b/>
-          <w:sz w:val="24"/>
-          <w:szCs w:val="24"/>
-        </w:rPr>
-      </w:pPr>
-      <w:r>
-        <w:rPr>
-          <w:b/>
-          <w:sz w:val="24"/>
-          <w:szCs w:val="24"/>
-        </w:rPr>
-        <w:t>Selected upstream open-source contributions (delivered as part of the Huawei role)</w:t>
-      </w:r>
-    </w:p>
-    <w:p>
-      <w:pPr>
-        <w:pBdr>
-          <w:top w:val="nil"/>
-          <w:left w:val="nil"/>
-          <w:bottom w:val="nil"/>
-          <w:right w:val="nil"/>
-          <w:between w:val="nil"/>
-        </w:pBdr>
-        <w:spacing w:before="120" w:after="60" w:line="264" w:lineRule="auto"/>
-        <w:ind w:left="170" w:hanging="170"/>
-        <w:jc w:val="both"/>
-        <w:rPr>
-          <w:b/>
-          <w:sz w:val="24"/>
-          <w:szCs w:val="24"/>
-        </w:rPr>
-      </w:pPr>
-      <w:hyperlink r:id="rId14" w:history="1">
-        <w:r>
-          <w:rPr>
-            <w:rStyle w:val="Hyperlink"/>
-            <w:b/>
-            <w:sz w:val="24"/>
-            <w:szCs w:val="24"/>
-          </w:rPr>
-          <w:t>Apache Hudi</w:t>
-        </w:r>
-      </w:hyperlink>
-      <w:r>
-        <w:rPr>
-          <w:b/>
-          <w:sz w:val="24"/>
-          <w:szCs w:val="24"/>
-        </w:rPr>
-        <w:t xml:space="preserve"> </w:t>
-      </w:r>
-      <w:r>
-        <w:rPr>
-          <w:b/>
-          <w:sz w:val="24"/>
-          <w:szCs w:val="24"/>
-        </w:rPr>
-        <w:t xml:space="preserve">| </w:t>
-      </w:r>
-      <w:r>
-        <w:rPr>
-          <w:b/>
-          <w:color w:val="000000"/>
-          <w:sz w:val="24"/>
-          <w:szCs w:val="24"/>
-        </w:rPr>
-        <w:t>Jan 2024 – Present</w:t>
-      </w:r>
-      <w:r>
-        <w:rPr>
-          <w:b/>
-          <w:color w:val="000000"/>
-          <w:sz w:val="24"/>
-          <w:szCs w:val="24"/>
-        </w:rPr>
-        <w:t xml:space="preserve"> |</w:t>
-      </w:r>
-      <w:r>
-        <w:rPr>
-          <w:b/>
-          <w:sz w:val="24"/>
-          <w:szCs w:val="24"/>
-        </w:rPr>
-        <w:t xml:space="preserve"> </w:t>
-      </w:r>
-      <w:hyperlink r:id="rId15" w:history="1">
-        <w:r>
-          <w:rPr>
-            <w:rStyle w:val="Hyperlink"/>
-            <w:b/>
-            <w:sz w:val="24"/>
-            <w:szCs w:val="24"/>
-          </w:rPr>
-          <w:t>50 merged PRs</w:t>
-        </w:r>
-      </w:hyperlink>
-    </w:p>
-    <w:p>
-      <w:pPr>
-        <w:pBdr>
-          <w:top w:val="nil"/>
-          <w:left w:val="nil"/>
-          <w:bottom w:val="nil"/>
-          <w:right w:val="nil"/>
-          <w:between w:val="nil"/>
-        </w:pBdr>
-        <w:spacing w:before="120" w:after="60" w:line="264" w:lineRule="auto"/>
-        <w:ind w:left="170" w:hanging="170"/>
-        <w:jc w:val="both"/>
-        <w:rPr>
-          <w:sz w:val="24"/>
-          <w:szCs w:val="24"/>
-        </w:rPr>
-      </w:pPr>
-      <w:r>
-        <w:rPr>
-          <w:sz w:val="24"/>
-          <w:szCs w:val="24"/>
-        </w:rPr>
-        <w:t>• </w:t>
-      </w:r>
-      <w:r>
-        <w:rPr>
-          <w:sz w:val="24"/>
-          <w:szCs w:val="24"/>
-        </w:rPr>
-        <w:t>Optimized serialization of Flink stream records in Hudi, cutting end-to-end write time by up to 26% and reducing data transferred between operators by 29</w:t>
-      </w:r>
-      <w:r>
-        <w:rPr>
-          <w:color w:val="000000"/>
-          <w:sz w:val="24"/>
-          <w:szCs w:val="24"/>
-        </w:rPr>
-        <w:t>–</w:t>
-      </w:r>
-      <w:r>
-        <w:rPr>
-          <w:sz w:val="24"/>
-          <w:szCs w:val="24"/>
-        </w:rPr>
-        <w:t>36% in TPC-H benchmarks</w:t>
-      </w:r>
-      <w:r>
-        <w:rPr>
-          <w:sz w:val="24"/>
-          <w:szCs w:val="24"/>
-        </w:rPr>
-        <w:t xml:space="preserve"> </w:t>
-      </w:r>
-      <w:r>
-        <w:rPr>
-          <w:sz w:val="24"/>
-          <w:szCs w:val="24"/>
-        </w:rPr>
-        <w:t>(</w:t>
-      </w:r>
-      <w:hyperlink r:id="rId16" w:history="1">
-        <w:r>
-          <w:rPr>
-            <w:rStyle w:val="Hyperlink"/>
-            <w:sz w:val="24"/>
-            <w:szCs w:val="24"/>
-          </w:rPr>
-          <w:t>design doc</w:t>
-        </w:r>
-      </w:hyperlink>
-      <w:r>
-        <w:rPr>
-          <w:sz w:val="24"/>
-          <w:szCs w:val="24"/>
-        </w:rPr>
-        <w:t xml:space="preserve">, </w:t>
-      </w:r>
-      <w:hyperlink r:id="rId17" w:history="1">
-        <w:r>
-          <w:rPr>
-            <w:rStyle w:val="Hyperlink"/>
-            <w:sz w:val="24"/>
-            <w:szCs w:val="24"/>
-          </w:rPr>
-          <w:t>main changes</w:t>
-        </w:r>
-      </w:hyperlink>
-      <w:r>
-        <w:rPr>
-          <w:sz w:val="24"/>
-          <w:szCs w:val="24"/>
-        </w:rPr>
-        <w:t>)</w:t>
-      </w:r>
-      <w:r>
-        <w:rPr>
-          <w:sz w:val="24"/>
-          <w:szCs w:val="24"/>
-        </w:rPr>
-        <w:t xml:space="preserve">. Released in </w:t>
-      </w:r>
-      <w:hyperlink r:id="rId18" w:history="1">
-        <w:r>
-          <w:rPr>
-            <w:rStyle w:val="Hyperlink"/>
-            <w:sz w:val="24"/>
-            <w:szCs w:val="24"/>
-          </w:rPr>
-          <w:t>Hudi 1.0.2</w:t>
-        </w:r>
-      </w:hyperlink>
-      <w:r>
-        <w:rPr>
-          <w:sz w:val="24"/>
-          <w:szCs w:val="24"/>
-        </w:rPr>
-        <w:t>.</w:t>
-      </w:r>
-    </w:p>
-    <w:p>
-      <w:pPr>
-        <w:pBdr>
-          <w:top w:val="nil"/>
-          <w:left w:val="nil"/>
-          <w:bottom w:val="nil"/>
-          <w:right w:val="nil"/>
-          <w:between w:val="nil"/>
-        </w:pBdr>
-        <w:spacing w:before="60" w:after="60" w:line="264" w:lineRule="auto"/>
-        <w:ind w:left="170" w:hanging="170"/>
-        <w:jc w:val="both"/>
-        <w:rPr>
+          <w:color w:val="000000"/>
           <w:sz w:val="24"/>
           <w:szCs w:val="24"/>
         </w:rPr>
@@ -1222,14 +1558,7 @@
           <w:sz w:val="24"/>
           <w:szCs w:val="24"/>
         </w:rPr>
-        <w:t>.</w:t>
-      </w:r>
-      <w:r>
-        <w:rPr>
-          <w:sz w:val="24"/>
-          <w:szCs w:val="24"/>
-        </w:rPr>
-        <w:t xml:space="preserve"> Released in </w:t>
+        <w:t xml:space="preserve">; released in </w:t>
       </w:r>
       <w:hyperlink r:id="rId23" w:history="1">
         <w:r>
@@ -1238,7 +1567,7 @@
             <w:sz w:val="24"/>
             <w:szCs w:val="24"/>
           </w:rPr>
-          <w:t>Hudi 1.0.1</w:t>
+          <w:t>Hudi 1.0.1</w:t>
         </w:r>
       </w:hyperlink>
       <w:r>
@@ -1247,236 +1576,6 @@
           <w:szCs w:val="24"/>
         </w:rPr>
         <w:t>.</w:t>
-      </w:r>
-    </w:p>
-    <w:p>
-      <w:pPr>
-        <w:pBdr>
-          <w:top w:val="nil"/>
-          <w:left w:val="nil"/>
-          <w:bottom w:val="nil"/>
-          <w:right w:val="nil"/>
-          <w:between w:val="nil"/>
-        </w:pBdr>
-        <w:spacing w:before="60" w:after="60" w:line="264" w:lineRule="auto"/>
-        <w:ind w:left="170" w:hanging="170"/>
-        <w:jc w:val="both"/>
-        <w:rPr>
-          <w:sz w:val="24"/>
-          <w:szCs w:val="24"/>
-        </w:rPr>
-      </w:pPr>
-      <w:r>
-        <w:rPr>
-          <w:sz w:val="24"/>
-          <w:szCs w:val="24"/>
-        </w:rPr>
-        <w:t>• </w:t>
-      </w:r>
-      <w:r>
-        <w:rPr>
-          <w:sz w:val="24"/>
-          <w:szCs w:val="24"/>
-        </w:rPr>
-        <w:t>Leading</w:t>
-      </w:r>
-      <w:r>
-        <w:rPr>
-          <w:sz w:val="24"/>
-          <w:szCs w:val="24"/>
-        </w:rPr>
-        <w:t xml:space="preserve"> RFC-98</w:t>
-      </w:r>
-      <w:r>
-        <w:rPr>
-          <w:sz w:val="24"/>
-          <w:szCs w:val="24"/>
-        </w:rPr>
-        <w:t xml:space="preserve"> for</w:t>
-      </w:r>
-      <w:r>
-        <w:rPr>
-          <w:sz w:val="24"/>
-          <w:szCs w:val="24"/>
-        </w:rPr>
-        <w:t xml:space="preserve"> Spark </w:t>
-      </w:r>
-      <w:proofErr w:type="spellStart"/>
-      <w:r>
-        <w:rPr>
-          <w:sz w:val="24"/>
-          <w:szCs w:val="24"/>
-        </w:rPr>
-        <w:t>Data</w:t>
-      </w:r>
-      <w:r>
-        <w:rPr>
-          <w:sz w:val="24"/>
-          <w:szCs w:val="24"/>
-        </w:rPr>
-        <w:t>S</w:t>
-      </w:r>
-      <w:r>
-        <w:rPr>
-          <w:sz w:val="24"/>
-          <w:szCs w:val="24"/>
-        </w:rPr>
-        <w:t>ource</w:t>
-      </w:r>
-      <w:proofErr w:type="spellEnd"/>
-      <w:r>
-        <w:rPr>
-          <w:sz w:val="24"/>
-          <w:szCs w:val="24"/>
-        </w:rPr>
-        <w:t xml:space="preserve"> V2 read</w:t>
-      </w:r>
-      <w:r>
-        <w:rPr>
-          <w:sz w:val="24"/>
-          <w:szCs w:val="24"/>
-        </w:rPr>
-        <w:t xml:space="preserve"> support</w:t>
-      </w:r>
-      <w:r>
-        <w:rPr>
-          <w:sz w:val="24"/>
-          <w:szCs w:val="24"/>
-        </w:rPr>
-        <w:t xml:space="preserve">; </w:t>
-      </w:r>
-      <w:r>
-        <w:rPr>
-          <w:sz w:val="24"/>
-          <w:szCs w:val="24"/>
-        </w:rPr>
-        <w:t xml:space="preserve">the </w:t>
-      </w:r>
-      <w:r>
-        <w:rPr>
-          <w:sz w:val="24"/>
-          <w:szCs w:val="24"/>
-        </w:rPr>
-        <w:t xml:space="preserve">design and </w:t>
-      </w:r>
-      <w:r>
-        <w:rPr>
-          <w:sz w:val="24"/>
-          <w:szCs w:val="24"/>
-        </w:rPr>
-        <w:t>C</w:t>
-      </w:r>
-      <w:r>
-        <w:rPr>
-          <w:sz w:val="24"/>
-          <w:szCs w:val="24"/>
-        </w:rPr>
-        <w:t>opy-on-</w:t>
-      </w:r>
-      <w:r>
-        <w:rPr>
-          <w:sz w:val="24"/>
-          <w:szCs w:val="24"/>
-        </w:rPr>
-        <w:t>W</w:t>
-      </w:r>
-      <w:r>
-        <w:rPr>
-          <w:sz w:val="24"/>
-          <w:szCs w:val="24"/>
-        </w:rPr>
-        <w:t>rite implementation are under review</w:t>
-      </w:r>
-      <w:r>
-        <w:rPr>
-          <w:sz w:val="24"/>
-          <w:szCs w:val="24"/>
-        </w:rPr>
-        <w:t>.</w:t>
-      </w:r>
-    </w:p>
-    <w:p>
-      <w:pPr>
-        <w:keepNext/>
-        <w:pBdr>
-          <w:top w:val="nil"/>
-          <w:left w:val="nil"/>
-          <w:bottom w:val="nil"/>
-          <w:right w:val="nil"/>
-          <w:between w:val="nil"/>
-        </w:pBdr>
-        <w:spacing w:before="120" w:after="60" w:line="264" w:lineRule="auto"/>
-        <w:ind w:left="170" w:hanging="170"/>
-        <w:jc w:val="both"/>
-        <w:rPr>
-          <w:b/>
-          <w:sz w:val="24"/>
-          <w:szCs w:val="24"/>
-        </w:rPr>
-      </w:pPr>
-      <w:hyperlink r:id="rId24" w:history="1">
-        <w:r>
-          <w:rPr>
-            <w:rStyle w:val="Hyperlink"/>
-            <w:b/>
-            <w:sz w:val="24"/>
-            <w:szCs w:val="24"/>
-          </w:rPr>
-          <w:t>Lance</w:t>
-        </w:r>
-      </w:hyperlink>
-      <w:r>
-        <w:rPr>
-          <w:b/>
-          <w:color w:val="000000"/>
-          <w:sz w:val="24"/>
-          <w:szCs w:val="24"/>
-        </w:rPr>
-        <w:t xml:space="preserve"> | May 2026 – Present | </w:t>
-      </w:r>
-      <w:hyperlink r:id="rId25" w:history="1">
-        <w:r>
-          <w:rPr>
-            <w:rStyle w:val="Hyperlink"/>
-            <w:b/>
-            <w:sz w:val="24"/>
-            <w:szCs w:val="24"/>
-          </w:rPr>
-          <w:t>3 merged PRs</w:t>
-        </w:r>
-      </w:hyperlink>
-    </w:p>
-    <w:p>
-      <w:pPr>
-        <w:pBdr>
-          <w:top w:val="nil"/>
-          <w:left w:val="nil"/>
-          <w:bottom w:val="nil"/>
-          <w:right w:val="nil"/>
-          <w:between w:val="nil"/>
-        </w:pBdr>
-        <w:spacing w:before="60" w:after="120" w:line="264" w:lineRule="auto"/>
-        <w:ind w:left="170" w:hanging="170"/>
-        <w:jc w:val="both"/>
-        <w:rPr>
-          <w:color w:val="000000"/>
-          <w:sz w:val="24"/>
-          <w:szCs w:val="24"/>
-        </w:rPr>
-      </w:pPr>
-      <w:r>
-        <w:rPr>
-          <w:sz w:val="24"/>
-          <w:szCs w:val="24"/>
-        </w:rPr>
-        <w:t>• </w:t>
-      </w:r>
-      <w:r>
-        <w:rPr>
-          <w:sz w:val="24"/>
-          <w:szCs w:val="24"/>
-        </w:rPr>
-        <w:t>Authored three merged Rust PRs in Lance’s vector-index build path, improving memory bounds and temporary-resource lifecycle in long-running index jobs.</w:t>
       </w:r>
     </w:p>
     <w:tbl>
@@ -1499,6 +1598,7 @@
           </w:tcPr>
           <w:p>
             <w:pPr>
+              <w:keepNext/>
               <w:pBdr>
                 <w:top w:val="nil"/>
                 <w:left w:val="nil"/>
@@ -1791,6 +1891,15 @@
           <w:sz w:val="24"/>
           <w:szCs w:val="24"/>
         </w:rPr>
+        <w:lastRenderedPageBreak/>
+        <w:t xml:space="preserve">INDEPENDENT </w:t>
+      </w:r>
+      <w:r>
+        <w:rPr>
+          <w:color w:val="000000"/>
+          <w:sz w:val="24"/>
+          <w:szCs w:val="24"/>
+        </w:rPr>
         <w:t>P</w:t>
       </w:r>
       <w:r>
@@ -1810,133 +1919,67 @@
         <w:t>ROJECTS</w:t>
       </w:r>
     </w:p>
-    <w:tbl>
-      <w:tblPr>
-        <w:tblStyle w:val="a4"/>
-        <w:tblW w:w="9752" w:type="dxa"/>
-        <w:tblInd w:w="-108" w:type="dxa"/>
-        <w:tblLayout w:type="fixed"/>
-        <w:tblLook w:val="0000" w:firstRow="0" w:lastRow="0" w:firstColumn="0" w:lastColumn="0" w:noHBand="0" w:noVBand="0"/>
-      </w:tblPr>
-      <w:tblGrid>
-        <w:gridCol w:w="2665"/>
-        <w:gridCol w:w="7087"/>
-      </w:tblGrid>
-      <w:tr>
-        <w:tc>
-          <w:tcPr>
-            <w:tcW w:w="2665" w:type="dxa"/>
-            <w:vAlign w:val="center"/>
-          </w:tcPr>
-          <w:p>
-            <w:pPr>
-              <w:pBdr>
-                <w:top w:val="nil"/>
-                <w:left w:val="nil"/>
-                <w:bottom w:val="nil"/>
-                <w:right w:val="nil"/>
-                <w:between w:val="nil"/>
-              </w:pBdr>
-              <w:spacing w:line="264" w:lineRule="auto"/>
-              <w:ind w:left="284"/>
-              <w:jc w:val="center"/>
-              <w:rPr>
-                <w:color w:val="000000"/>
-                <w:sz w:val="24"/>
-                <w:szCs w:val="24"/>
-              </w:rPr>
-            </w:pPr>
-            <w:r>
-              <w:rPr>
-                <w:color w:val="000000"/>
-                <w:sz w:val="24"/>
-                <w:szCs w:val="24"/>
-              </w:rPr>
-              <w:t>Apr 2026 – Present</w:t>
-            </w:r>
-          </w:p>
-        </w:tc>
-        <w:tc>
-          <w:tcPr>
-            <w:tcW w:w="7087" w:type="dxa"/>
-            <w:vAlign w:val="center"/>
-          </w:tcPr>
-          <w:p>
-            <w:pPr>
-              <w:pBdr>
-                <w:top w:val="nil"/>
-                <w:left w:val="nil"/>
-                <w:bottom w:val="nil"/>
-                <w:right w:val="nil"/>
-                <w:between w:val="nil"/>
-              </w:pBdr>
-              <w:spacing w:line="264" w:lineRule="auto"/>
-              <w:rPr>
-                <w:color w:val="000000"/>
-                <w:sz w:val="24"/>
-                <w:szCs w:val="24"/>
-              </w:rPr>
-            </w:pPr>
-            <w:r>
-              <w:rPr>
-                <w:b/>
-                <w:sz w:val="24"/>
-                <w:szCs w:val="24"/>
-              </w:rPr>
-              <w:t>Open</w:t>
-            </w:r>
-            <w:r>
-              <w:rPr>
-                <w:b/>
-                <w:sz w:val="24"/>
-                <w:szCs w:val="24"/>
-              </w:rPr>
-              <w:t>-s</w:t>
-            </w:r>
-            <w:r>
-              <w:rPr>
-                <w:b/>
-                <w:sz w:val="24"/>
-                <w:szCs w:val="24"/>
-              </w:rPr>
-              <w:t xml:space="preserve">ource: Agentic </w:t>
-            </w:r>
-            <w:r>
-              <w:rPr>
-                <w:b/>
-                <w:sz w:val="24"/>
-                <w:szCs w:val="24"/>
-              </w:rPr>
-              <w:t>D</w:t>
-            </w:r>
-            <w:r>
-              <w:rPr>
-                <w:b/>
-                <w:sz w:val="24"/>
-                <w:szCs w:val="24"/>
-              </w:rPr>
-              <w:t xml:space="preserve">evelopment </w:t>
-            </w:r>
-            <w:r>
-              <w:rPr>
-                <w:b/>
-                <w:sz w:val="24"/>
-                <w:szCs w:val="24"/>
-              </w:rPr>
-              <w:t>T</w:t>
-            </w:r>
-            <w:r>
-              <w:rPr>
-                <w:b/>
-                <w:sz w:val="24"/>
-                <w:szCs w:val="24"/>
-              </w:rPr>
-              <w:t>ooling</w:t>
-            </w:r>
-          </w:p>
-        </w:tc>
-      </w:tr>
-    </w:tbl>
+    <w:p>
+      <w:pPr>
+        <w:keepNext/>
+        <w:pBdr>
+          <w:top w:val="nil"/>
+          <w:left w:val="nil"/>
+          <w:bottom w:val="nil"/>
+          <w:right w:val="nil"/>
+          <w:between w:val="nil"/>
+        </w:pBdr>
+        <w:spacing w:before="120" w:after="60" w:line="264" w:lineRule="auto"/>
+        <w:jc w:val="both"/>
+        <w:rPr>
+          <w:color w:val="000000"/>
+          <w:sz w:val="24"/>
+          <w:szCs w:val="24"/>
+        </w:rPr>
+      </w:pPr>
+      <w:r>
+        <w:rPr>
+          <w:b/>
+          <w:bCs/>
+          <w:color w:val="000000"/>
+          <w:sz w:val="24"/>
+          <w:szCs w:val="24"/>
+        </w:rPr>
+        <w:t>Agentic Development Tooling</w:t>
+      </w:r>
+      <w:r>
+        <w:rPr>
+          <w:color w:val="000000"/>
+          <w:sz w:val="24"/>
+          <w:szCs w:val="24"/>
+        </w:rPr>
+        <w:t xml:space="preserve"> </w:t>
+      </w:r>
+      <w:r>
+        <w:rPr>
+          <w:color w:val="000000"/>
+          <w:sz w:val="24"/>
+          <w:szCs w:val="24"/>
+        </w:rPr>
+        <w:t>–</w:t>
+      </w:r>
+      <w:r>
+        <w:rPr>
+          <w:color w:val="000000"/>
+          <w:sz w:val="24"/>
+          <w:szCs w:val="24"/>
+        </w:rPr>
+        <w:t xml:space="preserve"> </w:t>
+      </w:r>
+      <w:r>
+        <w:rPr>
+          <w:color w:val="000000"/>
+          <w:sz w:val="24"/>
+          <w:szCs w:val="24"/>
+        </w:rPr>
+        <w:t>Started Apr 2026</w:t>
+      </w:r>
+    </w:p>
     <w:p>
       <w:pPr>
         <w:pBdr>
@@ -1946,7 +1989,7 @@
           <w:right w:val="nil"/>
           <w:between w:val="nil"/>
         </w:pBdr>
-        <w:spacing w:before="120" w:after="60" w:line="264" w:lineRule="auto"/>
+        <w:spacing w:before="60" w:after="60" w:line="264" w:lineRule="auto"/>
         <w:jc w:val="both"/>
         <w:rPr>
           <w:color w:val="000000"/>
@@ -1960,7 +2003,7 @@
           <w:sz w:val="24"/>
           <w:szCs w:val="24"/>
         </w:rPr>
-        <w:t>Self-directed work on AI-powered developer tooling: multi-agent implementation and review workflows with human-in-the-loop handoff, reproducible execution, monitoring, and cost tracking.</w:t>
+        <w:t>Creator and maintainer of AI-powered developer tooling for reproducible multi-agent implementation and review, human-in-the-loop handoff, monitoring, and cost tracking.</w:t>
       </w:r>
     </w:p>
     <w:p>
@@ -1992,9 +2035,9 @@
           <w:sz w:val="24"/>
           <w:szCs w:val="24"/>
         </w:rPr>
-        <w:t xml:space="preserve">Built </w:t>
-      </w:r>
-      <w:hyperlink r:id="rId26" w:history="1">
+        <w:t xml:space="preserve">Workflow orchestration: Built </w:t>
+      </w:r>
+      <w:hyperlink r:id="rId24" w:history="1">
         <w:r>
           <w:rPr>
             <w:rStyle w:val="Hyperlink"/>
@@ -2009,23 +2052,21 @@
           <w:sz w:val="24"/>
           <w:szCs w:val="24"/>
         </w:rPr>
-        <w:t xml:space="preserve">, a Python-based, GitHub issue-driven workflow runner that decomposes an issue, runs an implementer agent in an isolated git </w:t>
-      </w:r>
-      <w:proofErr w:type="spellStart"/>
-      <w:r>
-        <w:rPr>
-          <w:sz w:val="24"/>
-          <w:szCs w:val="24"/>
-        </w:rPr>
-        <w:t>worktree</w:t>
-      </w:r>
-      <w:proofErr w:type="spellEnd"/>
-      <w:r>
-        <w:rPr>
-          <w:sz w:val="24"/>
-          <w:szCs w:val="24"/>
-        </w:rPr>
-        <w:t>, opens a PR, invokes a separate review agent, and notifies a human when the PR is ready to merge.</w:t>
+        <w:t>, a Python-based runner that turns a GitHub issue into an isolated implementation</w:t>
+      </w:r>
+      <w:r>
+        <w:rPr>
+          <w:sz w:val="24"/>
+          <w:szCs w:val="24"/>
+        </w:rPr>
+        <w:t xml:space="preserve"> </w:t>
+      </w:r>
+      <w:r>
+        <w:rPr>
+          <w:sz w:val="24"/>
+          <w:szCs w:val="24"/>
+        </w:rPr>
+        <w:t>workflow: it launches an implementer agent, opens a PR, invokes an independent review agent, and notifies a human when the PR is ready to merge.</w:t>
       </w:r>
     </w:p>
     <w:p>
@@ -2057,21 +2098,53 @@
           <w:sz w:val="24"/>
           <w:szCs w:val="24"/>
         </w:rPr>
-        <w:t>Shipped nine agent-orchestrator releases from v0.1.0 (May 2026) to v0.9.0 (Aug 2026), adding workflow-state persistence in GitHub issues</w:t>
-      </w:r>
-      <w:r>
-        <w:rPr>
-          <w:sz w:val="24"/>
-          <w:szCs w:val="24"/>
-        </w:rPr>
-        <w:t>, operator-controlled pause/resume, PostgreSQL-backed usage and cost analytics, and an agent-trajectory viewer</w:t>
-      </w:r>
-      <w:r>
-        <w:rPr>
-          <w:sz w:val="24"/>
-          <w:szCs w:val="24"/>
-        </w:rPr>
-        <w:t>.</w:t>
+        <w:t>Product delivery: Shipped eleven releases from v0.1.0 to v0.10.1 between May and August 2026, adding GitHub-persisted workflow state, pause/resume controls, PostgreSQL-backed usage and</w:t>
+      </w:r>
+      <w:r>
+        <w:rPr>
+          <w:sz w:val="24"/>
+          <w:szCs w:val="24"/>
+        </w:rPr>
+        <w:t xml:space="preserve"> </w:t>
+      </w:r>
+      <w:r>
+        <w:rPr>
+          <w:sz w:val="24"/>
+          <w:szCs w:val="24"/>
+        </w:rPr>
+        <w:t xml:space="preserve">cost analytics, </w:t>
+      </w:r>
+      <w:proofErr w:type="gramStart"/>
+      <w:r>
+        <w:rPr>
+          <w:sz w:val="24"/>
+          <w:szCs w:val="24"/>
+        </w:rPr>
+        <w:t>trajectory</w:t>
+      </w:r>
+      <w:proofErr w:type="gramEnd"/>
+      <w:r>
+        <w:rPr>
+          <w:sz w:val="24"/>
+          <w:szCs w:val="24"/>
+        </w:rPr>
+        <w:t xml:space="preserve"> and provenance observability, </w:t>
+      </w:r>
+      <w:proofErr w:type="spellStart"/>
+      <w:r>
+        <w:rPr>
+          <w:sz w:val="24"/>
+          <w:szCs w:val="24"/>
+        </w:rPr>
+        <w:t>namespaced</w:t>
+      </w:r>
+      <w:proofErr w:type="spellEnd"/>
+      <w:r>
+        <w:rPr>
+          <w:sz w:val="24"/>
+          <w:szCs w:val="24"/>
+        </w:rPr>
+        <w:t xml:space="preserve"> workflow labels, and hardened recovery.</w:t>
       </w:r>
     </w:p>
     <w:p>
@@ -2103,93 +2176,28 @@
           <w:sz w:val="24"/>
           <w:szCs w:val="24"/>
         </w:rPr>
-        <w:t>Recorded 5,900+ agent runs across 12 repositories since May 2026, including 1,700+ review-agent runs</w:t>
-      </w:r>
-      <w:r>
-        <w:rPr>
-          <w:sz w:val="24"/>
-          <w:szCs w:val="24"/>
-        </w:rPr>
-        <w:t xml:space="preserve">; </w:t>
-      </w:r>
-      <w:r>
-        <w:rPr>
-          <w:sz w:val="24"/>
-          <w:szCs w:val="24"/>
-        </w:rPr>
-        <w:t>usage was equivalent to $13K+ at API list prices</w:t>
-      </w:r>
-      <w:bookmarkStart w:id="2" w:name="_GoBack"/>
-      <w:bookmarkEnd w:id="2"/>
-      <w:r>
-        <w:rPr>
-          <w:sz w:val="24"/>
-          <w:szCs w:val="24"/>
-        </w:rPr>
-        <w:t xml:space="preserve">. </w:t>
-      </w:r>
-    </w:p>
-    <w:p>
-      <w:pPr>
-        <w:pBdr>
-          <w:top w:val="nil"/>
-          <w:left w:val="nil"/>
-          <w:bottom w:val="nil"/>
-          <w:right w:val="nil"/>
-          <w:between w:val="nil"/>
-        </w:pBdr>
-        <w:spacing w:before="60" w:after="60" w:line="264" w:lineRule="auto"/>
-        <w:ind w:left="170" w:hanging="170"/>
-        <w:jc w:val="both"/>
-        <w:rPr>
-          <w:sz w:val="24"/>
-          <w:szCs w:val="24"/>
-        </w:rPr>
-      </w:pPr>
-      <w:r>
-        <w:rPr>
-          <w:sz w:val="24"/>
-          <w:szCs w:val="24"/>
-        </w:rPr>
-        <w:t>• </w:t>
-      </w:r>
-      <w:r>
-        <w:rPr>
-          <w:sz w:val="24"/>
-          <w:szCs w:val="24"/>
-        </w:rPr>
-        <w:t xml:space="preserve">Built </w:t>
-      </w:r>
-      <w:hyperlink r:id="rId27" w:history="1">
-        <w:r>
-          <w:rPr>
-            <w:rStyle w:val="Hyperlink"/>
-            <w:sz w:val="24"/>
-            <w:szCs w:val="24"/>
-          </w:rPr>
-          <w:t>agent-develop-review-loop</w:t>
-        </w:r>
-      </w:hyperlink>
-      <w:r>
-        <w:rPr>
-          <w:sz w:val="24"/>
-          <w:szCs w:val="24"/>
-        </w:rPr>
-        <w:t>, a Bash-based develop–review loop with HITL</w:t>
-      </w:r>
-      <w:r>
-        <w:rPr>
-          <w:sz w:val="24"/>
-          <w:szCs w:val="24"/>
-        </w:rPr>
-        <w:t xml:space="preserve"> </w:t>
-      </w:r>
-      <w:r>
-        <w:rPr>
-          <w:sz w:val="24"/>
-          <w:szCs w:val="24"/>
-        </w:rPr>
-        <w:t>handoff, resumable runs, and cost telemetry parsed from agent usage metadata.</w:t>
+        <w:t>Operational scale: Recorded 6,700+ agent runs across 14 repositories since May 2026, including 2,000+ review-agent runs</w:t>
+      </w:r>
+      <w:r>
+        <w:rPr>
+          <w:sz w:val="24"/>
+          <w:szCs w:val="24"/>
+        </w:rPr>
+        <w:t xml:space="preserve"> – </w:t>
+      </w:r>
+      <w:r>
+        <w:rPr>
+          <w:sz w:val="24"/>
+          <w:szCs w:val="24"/>
+        </w:rPr>
+        <w:t>equivalent to $19K+ at API list prices</w:t>
+      </w:r>
+      <w:r>
+        <w:rPr>
+          <w:sz w:val="24"/>
+          <w:szCs w:val="24"/>
+        </w:rPr>
+        <w:t>.</w:t>
       </w:r>
     </w:p>
     <w:p>
@@ -2344,7 +2352,7 @@
           <w:szCs w:val="24"/>
         </w:rPr>
       </w:pPr>
-      <w:hyperlink r:id="rId28">
+      <w:hyperlink r:id="rId25">
         <w:r>
           <w:rPr>
             <w:color w:val="0000FF"/>
@@ -2355,7 +2363,7 @@
       </w:hyperlink>
     </w:p>
     <w:sectPr>
-      <w:footerReference w:type="default" r:id="rId29"/>
+      <w:footerReference w:type="default" r:id="rId26"/>
       <w:pgSz w:w="11906" w:h="16838"/>
       <w:pgMar w:top="851" w:right="1134" w:bottom="851" w:left="1134" w:header="113" w:footer="113" w:gutter="0"/>
       <w:pgNumType w:start="1"/>
@@ -2366,7 +2374,7 @@
 </file>
 
 <file path=word/endnotes.xml><?xml version="1.0" encoding="utf-8"?>
-<w:endnotes xmlns:wpc="http://schemas.microsoft.com/office/word/2010/wordprocessingCanvas" xmlns:cx="http://schemas.microsoft.com/office/drawing/2014/chartex" xmlns:cx1="http://schemas.microsoft.com/office/drawing/2015/9/8/chartex" xmlns:cx2="http://schemas.microsoft.com/office/drawing/2015/10/21/chartex" xmlns:cx3="http://schemas.microsoft.com/office/drawing/2016/5/9/chartex" xmlns:cx4="http://schemas.microsoft.com/office/drawing/2016/5/10/chartex" xmlns:cx5="http://schemas.microsoft.com/office/drawing/2016/5/11/chartex" xmlns:cx6="http://schemas.microsoft.com/office/drawing/2016/5/12/chartex" xmlns:cx7="http://schemas.microsoft.com/office/drawing/2016/5/13/chartex" xmlns:cx8="http://schemas.microsoft.com/office/drawing/2016/5/14/chartex" xmlns:mc="http://schemas.openxmlformats.org/markup-compatibility/2006" xmlns:aink="http://schemas.microsoft.com/office/drawing/2016/ink" xmlns:am3d="http://schemas.microsoft.com/office/drawing/2017/model3d" xmlns:o="urn:schemas-microsoft-com:office:office" xmlns:r="http://schemas.openxmlformats.org/officeDocument/2006/relationships" xmlns:m="http://schemas.openxmlformats.org/officeDocument/2006/math" xmlns:v="urn:schemas-microsoft-com:vml" xmlns:wp14="http://schemas.microsoft.com/office/word/2010/wordprocessingDrawing" xmlns:wp="http://schemas.openxmlformats.org/drawingml/2006/wordprocessingDrawing" xmlns:w10="urn:schemas-microsoft-com:office:word" xmlns:w="http://schemas.openxmlformats.org/wordprocessingml/2006/main" xmlns:w14="http://schemas.microsoft.com/office/word/2010/wordml" xmlns:w15="http://schemas.microsoft.com/office/word/2012/wordml" xmlns:w16cid="http://schemas.microsoft.com/office/word/2016/wordml/cid" xmlns:w16se="http://schemas.microsoft.com/office/word/2015/wordml/symex" xmlns:wpg="http://schemas.microsoft.com/office/word/2010/wordprocessingGroup" xmlns:wpi="http://schemas.microsoft.com/office/word/2010/wordprocessingInk" xmlns:wne="http://schemas.microsoft.com/office/word/2006/wordml" xmlns:wps="http://schemas.microsoft.com/office/word/2010/wordprocessingShape" mc:Ignorable="w14 w15 w16se w16cid wp14">
+<w:endnotes xmlns:wpc="http://schemas.microsoft.com/office/word/2010/wordprocessingCanvas" xmlns:cx="http://schemas.microsoft.com/office/drawing/2014/chartex" xmlns:cx1="http://schemas.microsoft.com/office/drawing/2015/9/8/chartex" xmlns:cx2="http://schemas.microsoft.com/office/drawing/2015/10/21/chartex" xmlns:cx3="http://schemas.microsoft.com/office/drawing/2016/5/9/chartex" xmlns:cx4="http://schemas.microsoft.com/office/drawing/2016/5/10/chartex" xmlns:cx5="http://schemas.microsoft.com/office/drawing/2016/5/11/chartex" xmlns:cx6="http://schemas.microsoft.com/office/drawing/2016/5/12/chartex" xmlns:cx7="http://schemas.microsoft.com/office/drawing/2016/5/13/chartex" xmlns:cx8="http://schemas.microsoft.com/office/drawing/2016/5/14/chartex" xmlns:mc="http://schemas.openxmlformats.org/markup-compatibility/2006" xmlns:aink="http://schemas.microsoft.com/office/drawing/2016/ink" xmlns:am3d="http://schemas.microsoft.com/office/drawing/2017/model3d" xmlns:o="urn:schemas-microsoft-com:office:office" xmlns:r="http://schemas.openxmlformats.org/officeDocument/2006/relationships" xmlns:m="http://schemas.openxmlformats.org/officeDocument/2006/math" xmlns:v="urn:schemas-microsoft-com:vml" xmlns:wp14="http://schemas.microsoft.com/office/word/2010/wordprocessingDrawing" xmlns:wp="http://schemas.openxmlformats.org/drawingml/2006/wordprocessingDrawing" xmlns:w10="urn:schemas-microsoft-com:office:word" xmlns:w="http://schemas.openxmlformats.org/wordprocessingml/2006/main" xmlns:w14="http://schemas.microsoft.com/office/word/2010/wordml" xmlns:w15="http://schemas.microsoft.com/office/word/2012/wordml" xmlns:w16cex="http://schemas.microsoft.com/office/word/2018/wordml/cex" xmlns:w16cid="http://schemas.microsoft.com/office/word/2016/wordml/cid" xmlns:w16="http://schemas.microsoft.com/office/word/2018/wordml" xmlns:w16sdtdh="http://schemas.microsoft.com/office/word/2020/wordml/sdtdatahash" xmlns:w16se="http://schemas.microsoft.com/office/word/2015/wordml/symex" xmlns:wpg="http://schemas.microsoft.com/office/word/2010/wordprocessingGroup" xmlns:wpi="http://schemas.microsoft.com/office/word/2010/wordprocessingInk" xmlns:wne="http://schemas.microsoft.com/office/word/2006/wordml" xmlns:wps="http://schemas.microsoft.com/office/word/2010/wordprocessingShape" mc:Ignorable="w14 w15 w16se w16cid w16 w16cex w16sdtdh wp14">
   <w:endnote w:type="separator" w:id="-1">
     <w:p>
       <w:r>
@@ -2385,7 +2393,7 @@
 </file>
 
 <file path=word/footer1.xml><?xml version="1.0" encoding="utf-8"?>
-<w:ftr xmlns:wpc="http://schemas.microsoft.com/office/word/2010/wordprocessingCanvas" xmlns:cx="http://schemas.microsoft.com/office/drawing/2014/chartex" xmlns:cx1="http://schemas.microsoft.com/office/drawing/2015/9/8/chartex" xmlns:cx2="http://schemas.microsoft.com/office/drawing/2015/10/21/chartex" xmlns:cx3="http://schemas.microsoft.com/office/drawing/2016/5/9/chartex" xmlns:cx4="http://schemas.microsoft.com/office/drawing/2016/5/10/chartex" xmlns:cx5="http://schemas.microsoft.com/office/drawing/2016/5/11/chartex" xmlns:cx6="http://schemas.microsoft.com/office/drawing/2016/5/12/chartex" xmlns:cx7="http://schemas.microsoft.com/office/drawing/2016/5/13/chartex" xmlns:cx8="http://schemas.microsoft.com/office/drawing/2016/5/14/chartex" xmlns:mc="http://schemas.openxmlformats.org/markup-compatibility/2006" xmlns:aink="http://schemas.microsoft.com/office/drawing/2016/ink" xmlns:am3d="http://schemas.microsoft.com/office/drawing/2017/model3d" xmlns:o="urn:schemas-microsoft-com:office:office" xmlns:r="http://schemas.openxmlformats.org/officeDocument/2006/relationships" xmlns:m="http://schemas.openxmlformats.org/officeDocument/2006/math" xmlns:v="urn:schemas-microsoft-com:vml" xmlns:wp14="http://schemas.microsoft.com/office/word/2010/wordprocessingDrawing" xmlns:wp="http://schemas.openxmlformats.org/drawingml/2006/wordprocessingDrawing" xmlns:w10="urn:schemas-microsoft-com:office:word" xmlns:w="http://schemas.openxmlformats.org/wordprocessingml/2006/main" xmlns:w14="http://schemas.microsoft.com/office/word/2010/wordml" xmlns:w15="http://schemas.microsoft.com/office/word/2012/wordml" xmlns:w16cid="http://schemas.microsoft.com/office/word/2016/wordml/cid" xmlns:w16se="http://schemas.microsoft.com/office/word/2015/wordml/symex" xmlns:wpg="http://schemas.microsoft.com/office/word/2010/wordprocessingGroup" xmlns:wpi="http://schemas.microsoft.com/office/word/2010/wordprocessingInk" xmlns:wne="http://schemas.microsoft.com/office/word/2006/wordml" xmlns:wps="http://schemas.microsoft.com/office/word/2010/wordprocessingShape" mc:Ignorable="w14 w15 w16se w16cid wp14">
+<w:ftr xmlns:wpc="http://schemas.microsoft.com/office/word/2010/wordprocessingCanvas" xmlns:cx="http://schemas.microsoft.com/office/drawing/2014/chartex" xmlns:cx1="http://schemas.microsoft.com/office/drawing/2015/9/8/chartex" xmlns:cx2="http://schemas.microsoft.com/office/drawing/2015/10/21/chartex" xmlns:cx3="http://schemas.microsoft.com/office/drawing/2016/5/9/chartex" xmlns:cx4="http://schemas.microsoft.com/office/drawing/2016/5/10/chartex" xmlns:cx5="http://schemas.microsoft.com/office/drawing/2016/5/11/chartex" xmlns:cx6="http://schemas.microsoft.com/office/drawing/2016/5/12/chartex" xmlns:cx7="http://schemas.microsoft.com/office/drawing/2016/5/13/chartex" xmlns:cx8="http://schemas.microsoft.com/office/drawing/2016/5/14/chartex" xmlns:mc="http://schemas.openxmlformats.org/markup-compatibility/2006" xmlns:aink="http://schemas.microsoft.com/office/drawing/2016/ink" xmlns:am3d="http://schemas.microsoft.com/office/drawing/2017/model3d" xmlns:o="urn:schemas-microsoft-com:office:office" xmlns:r="http://schemas.openxmlformats.org/officeDocument/2006/relationships" xmlns:m="http://schemas.openxmlformats.org/officeDocument/2006/math" xmlns:v="urn:schemas-microsoft-com:vml" xmlns:wp14="http://schemas.microsoft.com/office/word/2010/wordprocessingDrawing" xmlns:wp="http://schemas.openxmlformats.org/drawingml/2006/wordprocessingDrawing" xmlns:w10="urn:schemas-microsoft-com:office:word" xmlns:w="http://schemas.openxmlformats.org/wordprocessingml/2006/main" xmlns:w14="http://schemas.microsoft.com/office/word/2010/wordml" xmlns:w15="http://schemas.microsoft.com/office/word/2012/wordml" xmlns:w16cex="http://schemas.microsoft.com/office/word/2018/wordml/cex" xmlns:w16cid="http://schemas.microsoft.com/office/word/2016/wordml/cid" xmlns:w16="http://schemas.microsoft.com/office/word/2018/wordml" xmlns:w16sdtdh="http://schemas.microsoft.com/office/word/2020/wordml/sdtdatahash" xmlns:w16se="http://schemas.microsoft.com/office/word/2015/wordml/symex" xmlns:wpg="http://schemas.microsoft.com/office/word/2010/wordprocessingGroup" xmlns:wpi="http://schemas.microsoft.com/office/word/2010/wordprocessingInk" xmlns:wne="http://schemas.microsoft.com/office/word/2006/wordml" xmlns:wps="http://schemas.microsoft.com/office/word/2010/wordprocessingShape" mc:Ignorable="w14 w15 w16se w16cid w16 w16cex w16sdtdh wp14">
   <w:p>
     <w:pPr>
       <w:pBdr>
@@ -2431,7 +2439,7 @@
 </file>
 
 <file path=word/footnotes.xml><?xml version="1.0" encoding="utf-8"?>
-<w:footnotes xmlns:wpc="http://schemas.microsoft.com/office/word/2010/wordprocessingCanvas" xmlns:cx="http://schemas.microsoft.com/office/drawing/2014/chartex" xmlns:cx1="http://schemas.microsoft.com/office/drawing/2015/9/8/chartex" xmlns:cx2="http://schemas.microsoft.com/office/drawing/2015/10/21/chartex" xmlns:cx3="http://schemas.microsoft.com/office/drawing/2016/5/9/chartex" xmlns:cx4="http://schemas.microsoft.com/office/drawing/2016/5/10/chartex" xmlns:cx5="http://schemas.microsoft.com/office/drawing/2016/5/11/chartex" xmlns:cx6="http://schemas.microsoft.com/office/drawing/2016/5/12/chartex" xmlns:cx7="http://schemas.microsoft.com/office/drawing/2016/5/13/chartex" xmlns:cx8="http://schemas.microsoft.com/office/drawing/2016/5/14/chartex" xmlns:mc="http://schemas.openxmlformats.org/markup-compatibility/2006" xmlns:aink="http://schemas.microsoft.com/office/drawing/2016/ink" xmlns:am3d="http://schemas.microsoft.com/office/drawing/2017/model3d" xmlns:o="urn:schemas-microsoft-com:office:office" xmlns:r="http://schemas.openxmlformats.org/officeDocument/2006/relationships" xmlns:m="http://schemas.openxmlformats.org/officeDocument/2006/math" xmlns:v="urn:schemas-microsoft-com:vml" xmlns:wp14="http://schemas.microsoft.com/office/word/2010/wordprocessingDrawing" xmlns:wp="http://schemas.openxmlformats.org/drawingml/2006/wordprocessingDrawing" xmlns:w10="urn:schemas-microsoft-com:office:word" xmlns:w="http://schemas.openxmlformats.org/wordprocessingml/2006/main" xmlns:w14="http://schemas.microsoft.com/office/word/2010/wordml" xmlns:w15="http://schemas.microsoft.com/office/word/2012/wordml" xmlns:w16cid="http://schemas.microsoft.com/office/word/2016/wordml/cid" xmlns:w16se="http://schemas.microsoft.com/office/word/2015/wordml/symex" xmlns:wpg="http://schemas.microsoft.com/office/word/2010/wordprocessingGroup" xmlns:wpi="http://schemas.microsoft.com/office/word/2010/wordprocessingInk" xmlns:wne="http://schemas.microsoft.com/office/word/2006/wordml" xmlns:wps="http://schemas.microsoft.com/office/word/2010/wordprocessingShape" mc:Ignorable="w14 w15 w16se w16cid wp14">
+<w:footnotes xmlns:wpc="http://schemas.microsoft.com/office/word/2010/wordprocessingCanvas" xmlns:cx="http://schemas.microsoft.com/office/drawing/2014/chartex" xmlns:cx1="http://schemas.microsoft.com/office/drawing/2015/9/8/chartex" xmlns:cx2="http://schemas.microsoft.com/office/drawing/2015/10/21/chartex" xmlns:cx3="http://schemas.microsoft.com/office/drawing/2016/5/9/chartex" xmlns:cx4="http://schemas.microsoft.com/office/drawing/2016/5/10/chartex" xmlns:cx5="http://schemas.microsoft.com/office/drawing/2016/5/11/chartex" xmlns:cx6="http://schemas.microsoft.com/office/drawing/2016/5/12/chartex" xmlns:cx7="http://schemas.microsoft.com/office/drawing/2016/5/13/chartex" xmlns:cx8="http://schemas.microsoft.com/office/drawing/2016/5/14/chartex" xmlns:mc="http://schemas.openxmlformats.org/markup-compatibility/2006" xmlns:aink="http://schemas.microsoft.com/office/drawing/2016/ink" xmlns:am3d="http://schemas.microsoft.com/office/drawing/2017/model3d" xmlns:o="urn:schemas-microsoft-com:office:office" xmlns:r="http://schemas.openxmlformats.org/officeDocument/2006/relationships" xmlns:m="http://schemas.openxmlformats.org/officeDocument/2006/math" xmlns:v="urn:schemas-microsoft-com:vml" xmlns:wp14="http://schemas.microsoft.com/office/word/2010/wordprocessingDrawing" xmlns:wp="http://schemas.openxmlformats.org/drawingml/2006/wordprocessingDrawing" xmlns:w10="urn:schemas-microsoft-com:office:word" xmlns:w="http://schemas.openxmlformats.org/wordprocessingml/2006/main" xmlns:w14="http://schemas.microsoft.com/office/word/2010/wordml" xmlns:w15="http://schemas.microsoft.com/office/word/2012/wordml" xmlns:w16cex="http://schemas.microsoft.com/office/word/2018/wordml/cex" xmlns:w16cid="http://schemas.microsoft.com/office/word/2016/wordml/cid" xmlns:w16="http://schemas.microsoft.com/office/word/2018/wordml" xmlns:w16sdtdh="http://schemas.microsoft.com/office/word/2020/wordml/sdtdatahash" xmlns:w16se="http://schemas.microsoft.com/office/word/2015/wordml/symex" xmlns:wpg="http://schemas.microsoft.com/office/word/2010/wordprocessingGroup" xmlns:wpi="http://schemas.microsoft.com/office/word/2010/wordprocessingInk" xmlns:wne="http://schemas.microsoft.com/office/word/2006/wordml" xmlns:wps="http://schemas.microsoft.com/office/word/2010/wordprocessingShape" mc:Ignorable="w14 w15 w16se w16cid w16 w16cex w16sdtdh wp14">
   <w:footnote w:type="separator" w:id="-1">
     <w:p>
       <w:r>
@@ -2450,7 +2458,7 @@
 </file>
 
 <file path=word/styles.xml><?xml version="1.0" encoding="utf-8"?>
-<w:styles xmlns:mc="http://schemas.openxmlformats.org/markup-compatibility/2006" xmlns:r="http://schemas.openxmlformats.org/officeDocument/2006/relationships" xmlns:w="http://schemas.openxmlformats.org/wordprocessingml/2006/main" xmlns:w14="http://schemas.microsoft.com/office/word/2010/wordml" xmlns:w15="http://schemas.microsoft.com/office/word/2012/wordml" xmlns:w16cid="http://schemas.microsoft.com/office/word/2016/wordml/cid" xmlns:w16se="http://schemas.microsoft.com/office/word/2015/wordml/symex" mc:Ignorable="w14 w15 w16se w16cid">
+<w:styles xmlns:mc="http://schemas.openxmlformats.org/markup-compatibility/2006" xmlns:r="http://schemas.openxmlformats.org/officeDocument/2006/relationships" xmlns:w="http://schemas.openxmlformats.org/wordprocessingml/2006/main" xmlns:w14="http://schemas.microsoft.com/office/word/2010/wordml" xmlns:w15="http://schemas.microsoft.com/office/word/2012/wordml" xmlns:w16cex="http://schemas.microsoft.com/office/word/2018/wordml/cex" xmlns:w16cid="http://schemas.microsoft.com/office/word/2016/wordml/cid" xmlns:w16="http://schemas.microsoft.com/office/word/2018/wordml" xmlns:w16sdtdh="http://schemas.microsoft.com/office/word/2020/wordml/sdtdatahash" xmlns:w16se="http://schemas.microsoft.com/office/word/2015/wordml/symex" mc:Ignorable="w14 w15 w16se w16cid w16 w16cex w16sdtdh">
   <w:docDefaults>
     <w:rPrDefault>
       <w:rPr>
@@ -2460,7 +2468,7 @@
     </w:rPrDefault>
     <w:pPrDefault/>
   </w:docDefaults>
-  <w:latentStyles w:defLockedState="0" w:defUIPriority="99" w:defSemiHidden="0" w:defUnhideWhenUsed="0" w:defQFormat="0" w:count="375">
+  <w:latentStyles w:defLockedState="0" w:defUIPriority="99" w:defSemiHidden="0" w:defUnhideWhenUsed="0" w:defQFormat="0" w:count="376">
     <w:lsdException w:name="Normal" w:uiPriority="0" w:qFormat="1"/>
     <w:lsdException w:name="heading 1" w:uiPriority="9" w:qFormat="1"/>
     <w:lsdException w:name="heading 2" w:semiHidden="1" w:uiPriority="9" w:unhideWhenUsed="1" w:qFormat="1"/>
@@ -2836,6 +2844,7 @@
     <w:lsdException w:name="Smart Hyperlink" w:semiHidden="1" w:unhideWhenUsed="1"/>
     <w:lsdException w:name="Hashtag" w:semiHidden="1" w:unhideWhenUsed="1"/>
     <w:lsdException w:name="Unresolved Mention" w:semiHidden="1" w:unhideWhenUsed="1"/>
+    <w:lsdException w:name="Smart Link" w:semiHidden="1" w:unhideWhenUsed="1"/>
   </w:latentStyles>
   <w:style w:type="paragraph" w:default="1" w:styleId="Normal">
     <w:name w:val="Normal"/>

</xml_diff>

<commit_message>
files: refresh homepage profile and experience content
</commit_message>
<xml_diff>
--- a/file/CV_Geser_Dugarov.docx
+++ b/file/CV_Geser_Dugarov.docx
@@ -21,271 +21,8 @@
         </w:rPr>
       </w:pPr>
     </w:p>
-    <w:tbl>
-      <w:tblPr>
-        <w:tblStyle w:val="a3"/>
-        <w:tblW w:w="8614" w:type="dxa"/>
-        <w:jc w:val="center"/>
-        <w:tblInd w:w="0" w:type="dxa"/>
-        <w:tblLayout w:type="fixed"/>
-        <w:tblLook w:val="0000" w:firstRow="0" w:lastRow="0" w:firstColumn="0" w:lastColumn="0" w:noHBand="0" w:noVBand="0"/>
-      </w:tblPr>
-      <w:tblGrid>
-        <w:gridCol w:w="2410"/>
-        <w:gridCol w:w="6204"/>
-      </w:tblGrid>
-      <w:tr>
-        <w:trPr>
-          <w:trHeight w:val="454"/>
-          <w:jc w:val="center"/>
-        </w:trPr>
-        <w:tc>
-          <w:tcPr>
-            <w:tcW w:w="8614" w:type="dxa"/>
-            <w:gridSpan w:val="2"/>
-            <w:vAlign w:val="center"/>
-          </w:tcPr>
-          <w:p>
-            <w:pPr>
-              <w:keepNext/>
-              <w:pBdr>
-                <w:top w:val="nil"/>
-                <w:left w:val="nil"/>
-                <w:bottom w:val="nil"/>
-                <w:right w:val="nil"/>
-                <w:between w:val="nil"/>
-              </w:pBdr>
-              <w:spacing w:line="264" w:lineRule="auto"/>
-              <w:jc w:val="right"/>
-              <w:rPr>
-                <w:b/>
-                <w:color w:val="000000"/>
-                <w:sz w:val="24"/>
-                <w:szCs w:val="24"/>
-              </w:rPr>
-            </w:pPr>
-            <w:r>
-              <w:rPr>
-                <w:b/>
-                <w:color w:val="000000"/>
-                <w:sz w:val="28"/>
-                <w:szCs w:val="28"/>
-              </w:rPr>
-              <w:t xml:space="preserve">GESER DUGAROV, PhD | </w:t>
-            </w:r>
-            <w:r>
-              <w:rPr>
-                <w:b/>
-                <w:color w:val="000000"/>
-                <w:sz w:val="28"/>
-                <w:szCs w:val="28"/>
-              </w:rPr>
-              <w:t>Software</w:t>
-            </w:r>
-            <w:r>
-              <w:rPr>
-                <w:b/>
-                <w:color w:val="000000"/>
-                <w:sz w:val="28"/>
-                <w:szCs w:val="28"/>
-              </w:rPr>
-              <w:t xml:space="preserve"> </w:t>
-            </w:r>
-            <w:r>
-              <w:rPr>
-                <w:b/>
-                <w:color w:val="000000"/>
-                <w:sz w:val="28"/>
-                <w:szCs w:val="28"/>
-              </w:rPr>
-              <w:t>Engineer</w:t>
-            </w:r>
-            <w:r>
-              <w:rPr>
-                <w:b/>
-                <w:color w:val="000000"/>
-                <w:sz w:val="28"/>
-                <w:szCs w:val="28"/>
-              </w:rPr>
-              <w:t xml:space="preserve"> |</w:t>
-            </w:r>
-            <w:r>
-              <w:rPr>
-                <w:b/>
-                <w:color w:val="000000"/>
-                <w:sz w:val="28"/>
-                <w:szCs w:val="28"/>
-              </w:rPr>
-              <w:t xml:space="preserve"> Distributed Data Systems &amp; AI Data Infrastructure</w:t>
-            </w:r>
-          </w:p>
-        </w:tc>
-      </w:tr>
-      <w:tr>
-        <w:trPr>
-          <w:trHeight w:val="850"/>
-          <w:jc w:val="center"/>
-        </w:trPr>
-        <w:tc>
-          <w:tcPr>
-            <w:tcW w:w="2410" w:type="dxa"/>
-            <w:vAlign w:val="center"/>
-          </w:tcPr>
-          <w:p>
-            <w:pPr>
-              <w:pBdr>
-                <w:top w:val="nil"/>
-                <w:left w:val="nil"/>
-                <w:bottom w:val="nil"/>
-                <w:right w:val="nil"/>
-                <w:between w:val="nil"/>
-              </w:pBdr>
-              <w:spacing w:after="60" w:line="264" w:lineRule="auto"/>
-              <w:ind w:left="1134"/>
-              <w:rPr>
-                <w:color w:val="000000"/>
-                <w:sz w:val="24"/>
-                <w:szCs w:val="24"/>
-              </w:rPr>
-            </w:pPr>
-            <w:r>
-              <w:rPr>
-                <w:color w:val="000000"/>
-                <w:sz w:val="24"/>
-                <w:szCs w:val="24"/>
-              </w:rPr>
-              <w:t xml:space="preserve">email: </w:t>
-            </w:r>
-          </w:p>
-          <w:p>
-            <w:pPr>
-              <w:pBdr>
-                <w:top w:val="nil"/>
-                <w:left w:val="nil"/>
-                <w:bottom w:val="nil"/>
-                <w:right w:val="nil"/>
-                <w:between w:val="nil"/>
-              </w:pBdr>
-              <w:spacing w:line="264" w:lineRule="auto"/>
-              <w:ind w:left="1134"/>
-              <w:rPr>
-                <w:color w:val="000000"/>
-                <w:sz w:val="24"/>
-                <w:szCs w:val="24"/>
-              </w:rPr>
-            </w:pPr>
-            <w:r>
-              <w:rPr>
-                <w:color w:val="000000"/>
-                <w:sz w:val="24"/>
-                <w:szCs w:val="24"/>
-              </w:rPr>
-              <w:t>profiles:</w:t>
-            </w:r>
-          </w:p>
-        </w:tc>
-        <w:tc>
-          <w:tcPr>
-            <w:tcW w:w="6204" w:type="dxa"/>
-            <w:vAlign w:val="center"/>
-          </w:tcPr>
-          <w:p>
-            <w:pPr>
-              <w:pBdr>
-                <w:top w:val="nil"/>
-                <w:left w:val="nil"/>
-                <w:bottom w:val="nil"/>
-                <w:right w:val="nil"/>
-                <w:between w:val="nil"/>
-              </w:pBdr>
-              <w:spacing w:after="60" w:line="264" w:lineRule="auto"/>
-              <w:rPr>
-                <w:color w:val="000000"/>
-                <w:sz w:val="24"/>
-                <w:szCs w:val="24"/>
-              </w:rPr>
-            </w:pPr>
-            <w:hyperlink r:id="rId8">
-              <w:r>
-                <w:rPr>
-                  <w:color w:val="0000FF"/>
-                  <w:sz w:val="24"/>
-                  <w:szCs w:val="24"/>
-                  <w:u w:val="single"/>
-                </w:rPr>
-                <w:t>geserdugarov@gmail.com</w:t>
-              </w:r>
-            </w:hyperlink>
-            <w:r>
-              <w:rPr>
-                <w:color w:val="000000"/>
-                <w:sz w:val="24"/>
-                <w:szCs w:val="24"/>
-              </w:rPr>
-              <w:t xml:space="preserve"> </w:t>
-            </w:r>
-          </w:p>
-          <w:p>
-            <w:pPr>
-              <w:pBdr>
-                <w:top w:val="nil"/>
-                <w:left w:val="nil"/>
-                <w:bottom w:val="nil"/>
-                <w:right w:val="nil"/>
-                <w:between w:val="nil"/>
-              </w:pBdr>
-              <w:spacing w:line="264" w:lineRule="auto"/>
-              <w:rPr>
-                <w:color w:val="000000"/>
-                <w:sz w:val="24"/>
-                <w:szCs w:val="24"/>
-              </w:rPr>
-            </w:pPr>
-            <w:hyperlink r:id="rId9">
-              <w:r>
-                <w:rPr>
-                  <w:color w:val="0000FF"/>
-                  <w:sz w:val="24"/>
-                  <w:szCs w:val="24"/>
-                  <w:u w:val="single"/>
-                </w:rPr>
-                <w:t>LinkedIn</w:t>
-              </w:r>
-            </w:hyperlink>
-            <w:r>
-              <w:rPr>
-                <w:color w:val="000000"/>
-                <w:sz w:val="24"/>
-                <w:szCs w:val="24"/>
-              </w:rPr>
-              <w:t xml:space="preserve">, </w:t>
-            </w:r>
-            <w:hyperlink r:id="rId10">
-              <w:r>
-                <w:rPr>
-                  <w:color w:val="0000FF"/>
-                  <w:sz w:val="24"/>
-                  <w:szCs w:val="24"/>
-                  <w:u w:val="single"/>
-                </w:rPr>
-                <w:t>GitHub</w:t>
-              </w:r>
-            </w:hyperlink>
-            <w:r>
-              <w:rPr>
-                <w:color w:val="000000"/>
-                <w:sz w:val="24"/>
-                <w:szCs w:val="24"/>
-              </w:rPr>
-              <w:t xml:space="preserve"> </w:t>
-            </w:r>
-          </w:p>
-        </w:tc>
-      </w:tr>
-    </w:tbl>
     <w:p>
       <w:pPr>
-        <w:keepNext/>
         <w:pBdr>
           <w:top w:val="nil"/>
           <w:left w:val="nil"/>
@@ -293,21 +30,107 @@
           <w:right w:val="nil"/>
           <w:between w:val="nil"/>
         </w:pBdr>
-        <w:spacing w:before="60" w:after="60" w:line="264" w:lineRule="auto"/>
+        <w:spacing w:after="60" w:line="264" w:lineRule="auto"/>
         <w:jc w:val="center"/>
         <w:rPr>
-          <w:color w:val="000000"/>
-          <w:sz w:val="24"/>
-          <w:szCs w:val="24"/>
+          <w:b/>
+          <w:bCs/>
+          <w:color w:val="000000"/>
+          <w:sz w:val="28"/>
+          <w:szCs w:val="28"/>
         </w:rPr>
       </w:pPr>
-      <w:r>
-        <w:rPr>
-          <w:color w:val="000000"/>
-          <w:sz w:val="24"/>
-          <w:szCs w:val="24"/>
-        </w:rPr>
-        <w:t>SUMMARY</w:t>
+      <w:bookmarkStart w:id="0" w:name="_heading=h.gjdgxs" w:colFirst="0" w:colLast="0"/>
+      <w:bookmarkEnd w:id="0"/>
+      <w:r>
+        <w:rPr>
+          <w:b/>
+          <w:bCs/>
+          <w:color w:val="000000"/>
+          <w:sz w:val="28"/>
+          <w:szCs w:val="28"/>
+        </w:rPr>
+        <w:t>GESER DUGAROV, PhD</w:t>
+      </w:r>
+    </w:p>
+    <w:p>
+      <w:pPr>
+        <w:pBdr>
+          <w:top w:val="nil"/>
+          <w:left w:val="nil"/>
+          <w:bottom w:val="nil"/>
+          <w:right w:val="nil"/>
+          <w:between w:val="nil"/>
+        </w:pBdr>
+        <w:spacing w:after="120" w:line="264" w:lineRule="auto"/>
+        <w:jc w:val="center"/>
+        <w:rPr>
+          <w:b/>
+          <w:bCs/>
+          <w:color w:val="000000"/>
+          <w:sz w:val="28"/>
+          <w:szCs w:val="28"/>
+        </w:rPr>
+      </w:pPr>
+      <w:r>
+        <w:rPr>
+          <w:b/>
+          <w:bCs/>
+          <w:color w:val="000000"/>
+          <w:sz w:val="28"/>
+          <w:szCs w:val="28"/>
+        </w:rPr>
+        <w:t>Software Engineer | Distributed</w:t>
+      </w:r>
+      <w:r>
+        <w:rPr>
+          <w:b/>
+          <w:bCs/>
+          <w:color w:val="000000"/>
+          <w:sz w:val="28"/>
+          <w:szCs w:val="28"/>
+        </w:rPr>
+        <w:t xml:space="preserve"> Data</w:t>
+      </w:r>
+      <w:r>
+        <w:rPr>
+          <w:b/>
+          <w:bCs/>
+          <w:color w:val="000000"/>
+          <w:sz w:val="28"/>
+          <w:szCs w:val="28"/>
+        </w:rPr>
+        <w:t xml:space="preserve"> Systems &amp; </w:t>
+      </w:r>
+      <w:r>
+        <w:rPr>
+          <w:b/>
+          <w:bCs/>
+          <w:color w:val="000000"/>
+          <w:sz w:val="28"/>
+          <w:szCs w:val="28"/>
+        </w:rPr>
+        <w:t xml:space="preserve">AI </w:t>
+      </w:r>
+      <w:r>
+        <w:rPr>
+          <w:b/>
+          <w:bCs/>
+          <w:color w:val="000000"/>
+          <w:sz w:val="28"/>
+          <w:szCs w:val="28"/>
+        </w:rPr>
+        <w:t xml:space="preserve">Data </w:t>
+      </w:r>
+      <w:r>
+        <w:rPr>
+          <w:b/>
+          <w:bCs/>
+          <w:color w:val="000000"/>
+          <w:sz w:val="28"/>
+          <w:szCs w:val="28"/>
+        </w:rPr>
+        <w:t>Infrastructure</w:t>
       </w:r>
     </w:p>
     <w:p>
@@ -327,108 +150,100 @@
           <w:szCs w:val="24"/>
         </w:rPr>
       </w:pPr>
-      <w:bookmarkStart w:id="0" w:name="_heading=h.gjdgxs" w:colFirst="0" w:colLast="0"/>
-      <w:bookmarkEnd w:id="0"/>
-      <w:r>
-        <w:rPr>
-          <w:color w:val="000000"/>
-          <w:sz w:val="24"/>
-          <w:szCs w:val="24"/>
-        </w:rPr>
-        <w:t xml:space="preserve">Software engineer building petabyte-scale lakehouse and AI data infrastructure at Huawei. </w:t>
-      </w:r>
-      <w:r>
-        <w:rPr>
-          <w:color w:val="000000"/>
-          <w:sz w:val="24"/>
-          <w:szCs w:val="24"/>
-        </w:rPr>
-        <w:t xml:space="preserve">As part of my Huawei role, I designed and implemented a two-tier distributed cache for </w:t>
-      </w:r>
-      <w:proofErr w:type="gramStart"/>
-      <w:r>
-        <w:rPr>
-          <w:color w:val="000000"/>
-          <w:sz w:val="24"/>
-          <w:szCs w:val="24"/>
-        </w:rPr>
-        <w:t>Lance</w:t>
-      </w:r>
-      <w:proofErr w:type="gramEnd"/>
-      <w:r>
-        <w:rPr>
-          <w:color w:val="000000"/>
-          <w:sz w:val="24"/>
-          <w:szCs w:val="24"/>
-        </w:rPr>
-        <w:t xml:space="preserve"> and </w:t>
-      </w:r>
-      <w:r>
-        <w:rPr>
-          <w:color w:val="000000"/>
-          <w:sz w:val="24"/>
-          <w:szCs w:val="24"/>
-        </w:rPr>
-        <w:t xml:space="preserve">I </w:t>
-      </w:r>
-      <w:r>
-        <w:rPr>
-          <w:color w:val="000000"/>
-          <w:sz w:val="24"/>
-          <w:szCs w:val="24"/>
-        </w:rPr>
-        <w:t>am currently developing a query-adaptive ANN index targeting tens of billions of</w:t>
-      </w:r>
-      <w:r>
-        <w:rPr>
-          <w:color w:val="000000"/>
-          <w:sz w:val="24"/>
-          <w:szCs w:val="24"/>
-        </w:rPr>
-        <w:t xml:space="preserve"> </w:t>
-      </w:r>
-      <w:r>
-        <w:rPr>
-          <w:color w:val="000000"/>
-          <w:sz w:val="24"/>
-          <w:szCs w:val="24"/>
-        </w:rPr>
-        <w:t>vectors. I also authored</w:t>
-      </w:r>
-      <w:r>
-        <w:rPr>
-          <w:color w:val="000000"/>
-          <w:sz w:val="24"/>
-          <w:szCs w:val="24"/>
-        </w:rPr>
-        <w:t xml:space="preserve"> </w:t>
-      </w:r>
-      <w:hyperlink r:id="rId11" w:history="1">
+      <w:r>
+        <w:rPr>
+          <w:color w:val="000000"/>
+          <w:sz w:val="24"/>
+          <w:szCs w:val="24"/>
+        </w:rPr>
+        <w:t>e</w:t>
+      </w:r>
+      <w:r>
+        <w:rPr>
+          <w:color w:val="000000"/>
+          <w:sz w:val="24"/>
+          <w:szCs w:val="24"/>
+        </w:rPr>
+        <w:t>-</w:t>
+      </w:r>
+      <w:r>
+        <w:rPr>
+          <w:color w:val="000000"/>
+          <w:sz w:val="24"/>
+          <w:szCs w:val="24"/>
+        </w:rPr>
+        <w:t>mail:</w:t>
+      </w:r>
+      <w:r>
+        <w:rPr>
+          <w:color w:val="000000"/>
+          <w:sz w:val="24"/>
+          <w:szCs w:val="24"/>
+        </w:rPr>
+        <w:tab/>
+      </w:r>
+      <w:r>
+        <w:rPr>
+          <w:color w:val="000000"/>
+          <w:sz w:val="24"/>
+          <w:szCs w:val="24"/>
+        </w:rPr>
+        <w:tab/>
+      </w:r>
+      <w:hyperlink r:id="rId8">
         <w:r>
           <w:rPr>
-            <w:rStyle w:val="Hyperlink"/>
+            <w:color w:val="0000FF"/>
             <w:sz w:val="24"/>
             <w:szCs w:val="24"/>
+            <w:u w:val="single"/>
           </w:rPr>
-          <w:t>50 merged PRs</w:t>
+          <w:t>geserdugarov@gmail.com</w:t>
         </w:r>
       </w:hyperlink>
-      <w:r>
-        <w:rPr>
-          <w:color w:val="000000"/>
-          <w:sz w:val="24"/>
-          <w:szCs w:val="24"/>
-        </w:rPr>
-        <w:t xml:space="preserve"> to Apache Hudi and </w:t>
-      </w:r>
-      <w:hyperlink r:id="rId12" w:history="1">
+    </w:p>
+    <w:p>
+      <w:pPr>
+        <w:pBdr>
+          <w:top w:val="nil"/>
+          <w:left w:val="nil"/>
+          <w:bottom w:val="nil"/>
+          <w:right w:val="nil"/>
+          <w:between w:val="nil"/>
+        </w:pBdr>
+        <w:spacing w:after="60" w:line="264" w:lineRule="auto"/>
+        <w:jc w:val="both"/>
+        <w:rPr>
+          <w:color w:val="000000"/>
+          <w:sz w:val="24"/>
+          <w:szCs w:val="24"/>
+        </w:rPr>
+      </w:pPr>
+      <w:r>
+        <w:rPr>
+          <w:color w:val="000000"/>
+          <w:sz w:val="24"/>
+          <w:szCs w:val="24"/>
+        </w:rPr>
+        <w:t>profiles:</w:t>
+      </w:r>
+      <w:r>
+        <w:rPr>
+          <w:color w:val="000000"/>
+          <w:sz w:val="24"/>
+          <w:szCs w:val="24"/>
+        </w:rPr>
+        <w:tab/>
+      </w:r>
+      <w:hyperlink r:id="rId9">
         <w:r>
           <w:rPr>
-            <w:rStyle w:val="Hyperlink"/>
+            <w:color w:val="0000FF"/>
             <w:sz w:val="24"/>
             <w:szCs w:val="24"/>
+            <w:u w:val="single"/>
           </w:rPr>
-          <w:t>three</w:t>
+          <w:t>LinkedIn</w:t>
         </w:r>
       </w:hyperlink>
       <w:r>
@@ -437,95 +252,126 @@
           <w:sz w:val="24"/>
           <w:szCs w:val="24"/>
         </w:rPr>
-        <w:t xml:space="preserve"> to Lance.</w:t>
-      </w:r>
-      <w:r>
-        <w:rPr>
-          <w:color w:val="000000"/>
-          <w:sz w:val="24"/>
-          <w:szCs w:val="24"/>
-        </w:rPr>
-        <w:t xml:space="preserve"> </w:t>
-      </w:r>
-      <w:r>
-        <w:rPr>
-          <w:color w:val="000000"/>
-          <w:sz w:val="24"/>
-          <w:szCs w:val="24"/>
-        </w:rPr>
-        <w:t xml:space="preserve">Research background informs </w:t>
-      </w:r>
-      <w:r>
-        <w:rPr>
-          <w:color w:val="000000"/>
-          <w:sz w:val="24"/>
-          <w:szCs w:val="24"/>
-        </w:rPr>
-        <w:t>an evidence-</w:t>
-      </w:r>
-      <w:r>
-        <w:rPr>
-          <w:color w:val="000000"/>
-          <w:sz w:val="24"/>
-          <w:szCs w:val="24"/>
-        </w:rPr>
-        <w:t>d</w:t>
-      </w:r>
-      <w:r>
-        <w:rPr>
-          <w:color w:val="000000"/>
-          <w:sz w:val="24"/>
-          <w:szCs w:val="24"/>
-        </w:rPr>
-        <w:t>riven</w:t>
-      </w:r>
-      <w:r>
-        <w:rPr>
-          <w:color w:val="000000"/>
-          <w:sz w:val="24"/>
-          <w:szCs w:val="24"/>
-        </w:rPr>
-        <w:t xml:space="preserve"> </w:t>
-      </w:r>
-      <w:r>
-        <w:rPr>
-          <w:color w:val="000000"/>
-          <w:sz w:val="24"/>
-          <w:szCs w:val="24"/>
-        </w:rPr>
-        <w:t>approach to system design, benchmarking, and performance validation.</w:t>
-      </w:r>
-      <w:r>
-        <w:rPr>
-          <w:color w:val="000000"/>
-          <w:sz w:val="24"/>
-          <w:szCs w:val="24"/>
-        </w:rPr>
-        <w:t xml:space="preserve"> </w:t>
-      </w:r>
-      <w:r>
-        <w:rPr>
-          <w:color w:val="000000"/>
-          <w:sz w:val="24"/>
-          <w:szCs w:val="24"/>
-        </w:rPr>
-        <w:t xml:space="preserve">Separately, I create independent open-source agentic software-development tooling for reproducible issue-to-PR and develop–review workflows with </w:t>
-      </w:r>
-      <w:r>
-        <w:rPr>
-          <w:color w:val="000000"/>
-          <w:sz w:val="24"/>
-          <w:szCs w:val="24"/>
-        </w:rPr>
-        <w:t>human-in-the-loop</w:t>
-      </w:r>
-      <w:r>
-        <w:rPr>
-          <w:color w:val="000000"/>
-          <w:sz w:val="24"/>
-          <w:szCs w:val="24"/>
-        </w:rPr>
-        <w:t xml:space="preserve"> </w:t>
+        <w:t xml:space="preserve">, </w:t>
+      </w:r>
+      <w:hyperlink r:id="rId10">
+        <w:r>
+          <w:rPr>
+            <w:color w:val="0000FF"/>
+            <w:sz w:val="24"/>
+            <w:szCs w:val="24"/>
+            <w:u w:val="single"/>
+          </w:rPr>
+          <w:t>GitHub</w:t>
+        </w:r>
+      </w:hyperlink>
+    </w:p>
+    <w:p>
+      <w:pPr>
+        <w:pBdr>
+          <w:top w:val="nil"/>
+          <w:left w:val="nil"/>
+          <w:bottom w:val="nil"/>
+          <w:right w:val="nil"/>
+          <w:between w:val="nil"/>
+        </w:pBdr>
+        <w:spacing w:after="60" w:line="264" w:lineRule="auto"/>
+        <w:jc w:val="both"/>
+        <w:rPr>
+          <w:color w:val="000000"/>
+          <w:sz w:val="24"/>
+          <w:szCs w:val="24"/>
+        </w:rPr>
+      </w:pPr>
+      <w:r>
+        <w:rPr>
+          <w:color w:val="000000"/>
+          <w:sz w:val="24"/>
+          <w:szCs w:val="24"/>
+        </w:rPr>
+        <w:t>location:</w:t>
+      </w:r>
+      <w:r>
+        <w:rPr>
+          <w:color w:val="000000"/>
+          <w:sz w:val="24"/>
+          <w:szCs w:val="24"/>
+        </w:rPr>
+        <w:tab/>
+      </w:r>
+      <w:r>
+        <w:rPr>
+          <w:color w:val="000000"/>
+          <w:sz w:val="24"/>
+          <w:szCs w:val="24"/>
+        </w:rPr>
+        <w:t>Novosibirsk, Russia | Open to relocat</w:t>
+      </w:r>
+      <w:r>
+        <w:rPr>
+          <w:color w:val="000000"/>
+          <w:sz w:val="24"/>
+          <w:szCs w:val="24"/>
+        </w:rPr>
+        <w:t>ion</w:t>
+      </w:r>
+    </w:p>
+    <w:p>
+      <w:pPr>
+        <w:pBdr>
+          <w:top w:val="nil"/>
+          <w:left w:val="nil"/>
+          <w:bottom w:val="nil"/>
+          <w:right w:val="nil"/>
+          <w:between w:val="nil"/>
+        </w:pBdr>
+        <w:spacing w:after="60" w:line="264" w:lineRule="auto"/>
+        <w:jc w:val="both"/>
+        <w:rPr>
+          <w:color w:val="000000"/>
+          <w:sz w:val="24"/>
+          <w:szCs w:val="24"/>
+        </w:rPr>
+      </w:pPr>
+      <w:r>
+        <w:rPr>
+          <w:color w:val="000000"/>
+          <w:sz w:val="24"/>
+          <w:szCs w:val="24"/>
+        </w:rPr>
+        <w:t>languages:</w:t>
+      </w:r>
+      <w:r>
+        <w:rPr>
+          <w:color w:val="000000"/>
+          <w:sz w:val="24"/>
+          <w:szCs w:val="24"/>
+        </w:rPr>
+        <w:tab/>
+      </w:r>
+      <w:r>
+        <w:rPr>
+          <w:color w:val="000000"/>
+          <w:sz w:val="24"/>
+          <w:szCs w:val="24"/>
+        </w:rPr>
+        <w:t xml:space="preserve">English </w:t>
+      </w:r>
+      <w:r>
+        <w:rPr>
+          <w:color w:val="000000"/>
+          <w:sz w:val="24"/>
+          <w:szCs w:val="24"/>
+        </w:rPr>
+        <w:t>(advanced),</w:t>
+      </w:r>
+      <w:r>
+        <w:rPr>
+          <w:color w:val="000000"/>
+          <w:sz w:val="24"/>
+          <w:szCs w:val="24"/>
+        </w:rPr>
+        <w:t xml:space="preserve"> Russian </w:t>
       </w:r>
       <w:r>
         <w:rPr>
@@ -541,7 +387,7 @@
           <w:sz w:val="24"/>
           <w:szCs w:val="24"/>
         </w:rPr>
-        <w:t>HITL</w:t>
+        <w:t>native</w:t>
       </w:r>
       <w:r>
         <w:rPr>
@@ -550,14 +396,6 @@
           <w:szCs w:val="24"/>
         </w:rPr>
         <w:t>)</w:t>
-      </w:r>
-      <w:r>
-        <w:rPr>
-          <w:color w:val="000000"/>
-          <w:sz w:val="24"/>
-          <w:szCs w:val="24"/>
-        </w:rPr>
-        <w:t xml:space="preserve"> handoff, monitoring, and cost telemetry.</w:t>
       </w:r>
     </w:p>
     <w:p>
@@ -584,6 +422,137 @@
           <w:sz w:val="24"/>
           <w:szCs w:val="24"/>
         </w:rPr>
+        <w:t>SUMMARY</w:t>
+      </w:r>
+    </w:p>
+    <w:p>
+      <w:pPr>
+        <w:pBdr>
+          <w:top w:val="nil"/>
+          <w:left w:val="nil"/>
+          <w:bottom w:val="nil"/>
+          <w:right w:val="nil"/>
+          <w:between w:val="nil"/>
+        </w:pBdr>
+        <w:spacing w:after="60" w:line="264" w:lineRule="auto"/>
+        <w:jc w:val="both"/>
+        <w:rPr>
+          <w:color w:val="000000"/>
+          <w:sz w:val="24"/>
+          <w:szCs w:val="24"/>
+        </w:rPr>
+      </w:pPr>
+      <w:r>
+        <w:rPr>
+          <w:color w:val="000000"/>
+          <w:sz w:val="24"/>
+          <w:szCs w:val="24"/>
+        </w:rPr>
+        <w:t xml:space="preserve">Software engineer building petabyte-scale lakehouse and AI data infrastructure at Huawei Cloud, with ownership from technical design through implementation, benchmarking, and production hardening. </w:t>
+      </w:r>
+      <w:r>
+        <w:rPr>
+          <w:color w:val="000000"/>
+          <w:sz w:val="24"/>
+          <w:szCs w:val="24"/>
+        </w:rPr>
+        <w:t xml:space="preserve">Author of </w:t>
+      </w:r>
+      <w:hyperlink r:id="rId11" w:history="1">
+        <w:r>
+          <w:rPr>
+            <w:rStyle w:val="Hyperlink"/>
+            <w:sz w:val="24"/>
+            <w:szCs w:val="24"/>
+          </w:rPr>
+          <w:t>50 merged</w:t>
+        </w:r>
+      </w:hyperlink>
+      <w:r>
+        <w:rPr>
+          <w:color w:val="000000"/>
+          <w:sz w:val="24"/>
+          <w:szCs w:val="24"/>
+        </w:rPr>
+        <w:t xml:space="preserve"> Apache Hudi PRs and </w:t>
+      </w:r>
+      <w:hyperlink r:id="rId12" w:history="1">
+        <w:r>
+          <w:rPr>
+            <w:rStyle w:val="Hyperlink"/>
+            <w:sz w:val="24"/>
+            <w:szCs w:val="24"/>
+          </w:rPr>
+          <w:t>three merged</w:t>
+        </w:r>
+      </w:hyperlink>
+      <w:r>
+        <w:rPr>
+          <w:color w:val="000000"/>
+          <w:sz w:val="24"/>
+          <w:szCs w:val="24"/>
+        </w:rPr>
+        <w:t xml:space="preserve"> Lance PRs; the Flink work reduced end-to-end TPC-H write time by up to 26% and inter-operator data transfer by 29–36%.</w:t>
+      </w:r>
+      <w:r>
+        <w:rPr>
+          <w:color w:val="000000"/>
+          <w:sz w:val="24"/>
+          <w:szCs w:val="24"/>
+        </w:rPr>
+        <w:t xml:space="preserve"> Current work includes a two-tier distributed cache for Lance/Ray and a query-adaptive, incrementally updatable ANN index targeting tens of billions of vectors. </w:t>
+      </w:r>
+      <w:r>
+        <w:rPr>
+          <w:color w:val="000000"/>
+          <w:sz w:val="24"/>
+          <w:szCs w:val="24"/>
+        </w:rPr>
+        <w:t xml:space="preserve">Creator and operator of open-source </w:t>
+      </w:r>
+      <w:hyperlink r:id="rId13" w:history="1">
+        <w:r>
+          <w:rPr>
+            <w:rStyle w:val="Hyperlink"/>
+            <w:sz w:val="24"/>
+            <w:szCs w:val="24"/>
+          </w:rPr>
+          <w:t>AI developer tooling</w:t>
+        </w:r>
+      </w:hyperlink>
+      <w:r>
+        <w:rPr>
+          <w:color w:val="000000"/>
+          <w:sz w:val="24"/>
+          <w:szCs w:val="24"/>
+        </w:rPr>
+        <w:t>, with 6,700+ agent runs recorded across 14 repositories.</w:t>
+      </w:r>
+    </w:p>
+    <w:p>
+      <w:pPr>
+        <w:keepNext/>
+        <w:pBdr>
+          <w:top w:val="nil"/>
+          <w:left w:val="nil"/>
+          <w:bottom w:val="nil"/>
+          <w:right w:val="nil"/>
+          <w:between w:val="nil"/>
+        </w:pBdr>
+        <w:spacing w:before="120" w:after="120" w:line="264" w:lineRule="auto"/>
+        <w:jc w:val="center"/>
+        <w:rPr>
+          <w:color w:val="000000"/>
+          <w:sz w:val="24"/>
+          <w:szCs w:val="24"/>
+        </w:rPr>
+      </w:pPr>
+      <w:r>
+        <w:rPr>
+          <w:color w:val="000000"/>
+          <w:sz w:val="24"/>
+          <w:szCs w:val="24"/>
+        </w:rPr>
         <w:t>TECHNICAL SKILLS</w:t>
       </w:r>
     </w:p>
@@ -680,7 +649,7 @@
           <w:sz w:val="24"/>
           <w:szCs w:val="24"/>
         </w:rPr>
-        <w:t>Rust (working knowledge)</w:t>
+        <w:t>Scala (working knowledge)</w:t>
       </w:r>
     </w:p>
     <w:p>
@@ -720,28 +689,32 @@
           <w:sz w:val="24"/>
           <w:szCs w:val="24"/>
         </w:rPr>
-        <w:t>Data and retrieval</w:t>
-      </w:r>
-      <w:r>
-        <w:rPr>
-          <w:sz w:val="24"/>
-          <w:szCs w:val="24"/>
-        </w:rPr>
-        <w:t>:</w:t>
-      </w:r>
-      <w:r>
-        <w:rPr>
-          <w:sz w:val="24"/>
-          <w:szCs w:val="24"/>
-        </w:rPr>
-        <w:t xml:space="preserve"> </w:t>
-      </w:r>
-      <w:r>
-        <w:rPr>
-          <w:sz w:val="24"/>
-          <w:szCs w:val="24"/>
-        </w:rPr>
-        <w:t xml:space="preserve">Distributed systems, performance engineering, PostgreSQL, Apache Hudi, Lance, </w:t>
+        <w:t>Distributed data</w:t>
+      </w:r>
+      <w:r>
+        <w:rPr>
+          <w:b/>
+          <w:bCs/>
+          <w:sz w:val="24"/>
+          <w:szCs w:val="24"/>
+        </w:rPr>
+        <w:t xml:space="preserve"> and </w:t>
+      </w:r>
+      <w:r>
+        <w:rPr>
+          <w:b/>
+          <w:bCs/>
+          <w:sz w:val="24"/>
+          <w:szCs w:val="24"/>
+        </w:rPr>
+        <w:t>retrieval</w:t>
+      </w:r>
+      <w:r>
+        <w:rPr>
+          <w:sz w:val="24"/>
+          <w:szCs w:val="24"/>
+        </w:rPr>
+        <w:t xml:space="preserve">: Apache Hudi, </w:t>
       </w:r>
       <w:r>
         <w:rPr>
@@ -769,7 +742,14 @@
           <w:sz w:val="24"/>
           <w:szCs w:val="24"/>
         </w:rPr>
-        <w:t>Flink, Ray, vector search and ANN indexing</w:t>
+        <w:t xml:space="preserve">Flink, Lance, Ray, PostgreSQL, Parquet; lakehouse internals, </w:t>
+      </w:r>
+      <w:r>
+        <w:rPr>
+          <w:sz w:val="24"/>
+          <w:szCs w:val="24"/>
+        </w:rPr>
+        <w:t>distributed caching, vector search and ANN</w:t>
       </w:r>
     </w:p>
     <w:p>
@@ -809,30 +789,171 @@
           <w:sz w:val="24"/>
           <w:szCs w:val="24"/>
         </w:rPr>
-        <w:t>Agent systems</w:t>
-      </w:r>
-      <w:r>
-        <w:rPr>
-          <w:sz w:val="24"/>
-          <w:szCs w:val="24"/>
-        </w:rPr>
-        <w:t xml:space="preserve">: </w:t>
-      </w:r>
-      <w:proofErr w:type="gramStart"/>
-      <w:r>
-        <w:rPr>
-          <w:sz w:val="24"/>
-          <w:szCs w:val="24"/>
-        </w:rPr>
-        <w:t>Multi-agent</w:t>
-      </w:r>
-      <w:proofErr w:type="gramEnd"/>
-      <w:r>
-        <w:rPr>
-          <w:sz w:val="24"/>
-          <w:szCs w:val="24"/>
-        </w:rPr>
-        <w:t xml:space="preserve"> orchestration, tool-use and HITL workflows, state and recovery management, trajectory tracing, token/cost analytics, credential isolation</w:t>
+        <w:t>Performance and reliability</w:t>
+      </w:r>
+      <w:r>
+        <w:rPr>
+          <w:sz w:val="24"/>
+          <w:szCs w:val="24"/>
+        </w:rPr>
+        <w:t>: Serialization, checkpointing, partitioning/load balancing, profiling, memory/GC optimization, TPC-H benchmarking, monitoring</w:t>
+      </w:r>
+    </w:p>
+    <w:p>
+      <w:pPr>
+        <w:pBdr>
+          <w:top w:val="nil"/>
+          <w:left w:val="nil"/>
+          <w:bottom w:val="nil"/>
+          <w:right w:val="nil"/>
+          <w:between w:val="nil"/>
+        </w:pBdr>
+        <w:spacing w:before="60" w:after="60" w:line="264" w:lineRule="auto"/>
+        <w:ind w:left="170" w:hanging="170"/>
+        <w:rPr>
+          <w:sz w:val="24"/>
+          <w:szCs w:val="24"/>
+        </w:rPr>
+      </w:pPr>
+      <w:r>
+        <w:rPr>
+          <w:sz w:val="24"/>
+          <w:szCs w:val="24"/>
+        </w:rPr>
+        <w:t>•</w:t>
+      </w:r>
+      <w:r>
+        <w:rPr>
+          <w:sz w:val="24"/>
+          <w:szCs w:val="24"/>
+        </w:rPr>
+        <w:t> </w:t>
+      </w:r>
+      <w:r>
+        <w:rPr>
+          <w:b/>
+          <w:bCs/>
+          <w:sz w:val="24"/>
+          <w:szCs w:val="24"/>
+        </w:rPr>
+        <w:t>AI developer tooling</w:t>
+      </w:r>
+      <w:r>
+        <w:rPr>
+          <w:sz w:val="24"/>
+          <w:szCs w:val="24"/>
+        </w:rPr>
+        <w:t xml:space="preserve">: Codex, Claude Code, multi-agent orchestration, </w:t>
+      </w:r>
+      <w:r>
+        <w:rPr>
+          <w:sz w:val="24"/>
+          <w:szCs w:val="24"/>
+        </w:rPr>
+        <w:t>human-in-the-loop (</w:t>
+      </w:r>
+      <w:r>
+        <w:rPr>
+          <w:sz w:val="24"/>
+          <w:szCs w:val="24"/>
+        </w:rPr>
+        <w:t>HITL</w:t>
+      </w:r>
+      <w:r>
+        <w:rPr>
+          <w:sz w:val="24"/>
+          <w:szCs w:val="24"/>
+        </w:rPr>
+        <w:t>)</w:t>
+      </w:r>
+      <w:r>
+        <w:rPr>
+          <w:sz w:val="24"/>
+          <w:szCs w:val="24"/>
+        </w:rPr>
+        <w:t xml:space="preserve"> workflows, </w:t>
+      </w:r>
+      <w:r>
+        <w:rPr>
+          <w:sz w:val="24"/>
+          <w:szCs w:val="24"/>
+        </w:rPr>
+        <w:t>durable state/recovery, trajectory tracing, cost analytics</w:t>
+      </w:r>
+    </w:p>
+    <w:p>
+      <w:pPr>
+        <w:pBdr>
+          <w:top w:val="nil"/>
+          <w:left w:val="nil"/>
+          <w:bottom w:val="nil"/>
+          <w:right w:val="nil"/>
+          <w:between w:val="nil"/>
+        </w:pBdr>
+        <w:spacing w:before="60" w:after="60" w:line="264" w:lineRule="auto"/>
+        <w:ind w:left="170" w:hanging="170"/>
+        <w:rPr>
+          <w:sz w:val="24"/>
+          <w:szCs w:val="24"/>
+        </w:rPr>
+      </w:pPr>
+      <w:r>
+        <w:rPr>
+          <w:sz w:val="24"/>
+          <w:szCs w:val="24"/>
+        </w:rPr>
+        <w:t>•</w:t>
+      </w:r>
+      <w:r>
+        <w:rPr>
+          <w:sz w:val="24"/>
+          <w:szCs w:val="24"/>
+        </w:rPr>
+        <w:t> </w:t>
+      </w:r>
+      <w:r>
+        <w:rPr>
+          <w:b/>
+          <w:bCs/>
+          <w:sz w:val="24"/>
+          <w:szCs w:val="24"/>
+        </w:rPr>
+        <w:t>Engineering delivery</w:t>
+      </w:r>
+      <w:r>
+        <w:rPr>
+          <w:sz w:val="24"/>
+          <w:szCs w:val="24"/>
+        </w:rPr>
+        <w:t>: Technical design</w:t>
+      </w:r>
+      <w:r>
+        <w:rPr>
+          <w:sz w:val="24"/>
+          <w:szCs w:val="24"/>
+        </w:rPr>
+        <w:t>s/</w:t>
+      </w:r>
+      <w:r>
+        <w:rPr>
+          <w:sz w:val="24"/>
+          <w:szCs w:val="24"/>
+        </w:rPr>
+        <w:t>RFCs, automated testing, CI</w:t>
+      </w:r>
+      <w:r>
+        <w:rPr>
+          <w:sz w:val="24"/>
+          <w:szCs w:val="24"/>
+        </w:rPr>
+        <w:t>/</w:t>
+      </w:r>
+      <w:r>
+        <w:rPr>
+          <w:sz w:val="24"/>
+          <w:szCs w:val="24"/>
+        </w:rPr>
+        <w:t>release engineering, Maven, Docker, Linux</w:t>
       </w:r>
     </w:p>
     <w:p>
@@ -963,7 +1084,7 @@
                 <w:right w:val="nil"/>
                 <w:between w:val="nil"/>
               </w:pBdr>
-              <w:spacing w:line="264" w:lineRule="auto"/>
+              <w:spacing w:before="60" w:line="264" w:lineRule="auto"/>
               <w:rPr>
                 <w:color w:val="000000"/>
                 <w:sz w:val="24"/>
@@ -1006,14 +1127,14 @@
                 <w:right w:val="nil"/>
                 <w:between w:val="nil"/>
               </w:pBdr>
-              <w:spacing w:line="264" w:lineRule="auto"/>
+              <w:spacing w:after="60" w:line="264" w:lineRule="auto"/>
               <w:rPr>
                 <w:color w:val="000000"/>
                 <w:sz w:val="24"/>
                 <w:szCs w:val="24"/>
               </w:rPr>
             </w:pPr>
-            <w:hyperlink r:id="rId13" w:history="1">
+            <w:hyperlink r:id="rId14" w:history="1">
               <w:r>
                 <w:rPr>
                   <w:rStyle w:val="Hyperlink"/>
@@ -1037,7 +1158,7 @@
           <w:right w:val="nil"/>
           <w:between w:val="nil"/>
         </w:pBdr>
-        <w:spacing w:before="120" w:after="60" w:line="264" w:lineRule="auto"/>
+        <w:spacing w:before="60" w:after="60" w:line="264" w:lineRule="auto"/>
         <w:jc w:val="both"/>
         <w:rPr>
           <w:color w:val="000000"/>
@@ -1051,15 +1172,7 @@
           <w:sz w:val="24"/>
           <w:szCs w:val="24"/>
         </w:rPr>
-        <w:t>Develop</w:t>
-      </w:r>
-      <w:r>
-        <w:rPr>
-          <w:color w:val="000000"/>
-          <w:sz w:val="24"/>
-          <w:szCs w:val="24"/>
-        </w:rPr>
-        <w:t xml:space="preserve"> core lakehouse and AI data infrastructure for Huawei Cloud.</w:t>
+        <w:t>Develop core lakehouse, distributed data, and AI retrieval infrastructure for Huawei Cloud; support teammates through code and RFC reviews and technical tutorials.</w:t>
       </w:r>
     </w:p>
     <w:p>
@@ -1091,38 +1204,7 @@
           <w:sz w:val="24"/>
           <w:szCs w:val="24"/>
         </w:rPr>
-        <w:t>Designed and implemented a two-tier distributed cache; currently developing a query-adaptive ANN index targeting tens of billions of vectors;</w:t>
-      </w:r>
-      <w:r>
-        <w:rPr>
-          <w:sz w:val="24"/>
-          <w:szCs w:val="24"/>
-        </w:rPr>
-        <w:t xml:space="preserve"> </w:t>
-      </w:r>
-      <w:r>
-        <w:rPr>
-          <w:sz w:val="24"/>
-          <w:szCs w:val="24"/>
-        </w:rPr>
-        <w:t xml:space="preserve">authored </w:t>
-      </w:r>
-      <w:hyperlink r:id="rId14" w:history="1">
-        <w:r>
-          <w:rPr>
-            <w:rStyle w:val="Hyperlink"/>
-            <w:sz w:val="24"/>
-            <w:szCs w:val="24"/>
-          </w:rPr>
-          <w:t>three merged Rust PRs</w:t>
-        </w:r>
-      </w:hyperlink>
-      <w:r>
-        <w:rPr>
-          <w:sz w:val="24"/>
-          <w:szCs w:val="24"/>
-        </w:rPr>
-        <w:t xml:space="preserve"> improving memory bounds and resource lifecycle in index-build jobs.</w:t>
+        <w:t>Designed and implemented a two-tier distributed cache for Lance vector indices with an in-memory L1, persistent per-worker NVMe L2, and IVF-partition prewarming and routing; integrated it with Ray and benchmarked it on a real cluster.</w:t>
       </w:r>
     </w:p>
     <w:p>
@@ -1154,56 +1236,24 @@
           <w:sz w:val="24"/>
           <w:szCs w:val="24"/>
         </w:rPr>
-        <w:t xml:space="preserve">Apache Hudi: </w:t>
-      </w:r>
-      <w:r>
-        <w:rPr>
-          <w:sz w:val="24"/>
-          <w:szCs w:val="24"/>
-        </w:rPr>
-        <w:t xml:space="preserve">Simplified setup </w:t>
-      </w:r>
-      <w:r>
-        <w:rPr>
-          <w:sz w:val="24"/>
-          <w:szCs w:val="24"/>
-        </w:rPr>
-        <w:t xml:space="preserve">of </w:t>
-      </w:r>
-      <w:r>
-        <w:rPr>
-          <w:sz w:val="24"/>
-          <w:szCs w:val="24"/>
-        </w:rPr>
-        <w:t>900+ configuration parameters</w:t>
-      </w:r>
-      <w:r>
-        <w:rPr>
-          <w:sz w:val="24"/>
-          <w:szCs w:val="24"/>
-        </w:rPr>
-        <w:t xml:space="preserve"> with</w:t>
-      </w:r>
-      <w:r>
-        <w:rPr>
-          <w:sz w:val="24"/>
-          <w:szCs w:val="24"/>
-        </w:rPr>
-        <w:t xml:space="preserve"> recommended defaults for common scenarios </w:t>
-      </w:r>
-      <w:r>
-        <w:rPr>
-          <w:sz w:val="24"/>
-          <w:szCs w:val="24"/>
-        </w:rPr>
-        <w:t>and implemented partition-level TTL</w:t>
-      </w:r>
-      <w:r>
-        <w:rPr>
-          <w:sz w:val="24"/>
-          <w:szCs w:val="24"/>
-        </w:rPr>
-        <w:t>.</w:t>
+        <w:t xml:space="preserve">Developing a distributed, incrementally updatable, query-adaptive ANN index targeting tens of billions of vectors; authored </w:t>
+      </w:r>
+      <w:hyperlink r:id="rId15" w:history="1">
+        <w:r>
+          <w:rPr>
+            <w:rStyle w:val="Hyperlink"/>
+            <w:sz w:val="24"/>
+            <w:szCs w:val="24"/>
+          </w:rPr>
+          <w:t>three merged</w:t>
+        </w:r>
+      </w:hyperlink>
+      <w:r>
+        <w:rPr>
+          <w:sz w:val="24"/>
+          <w:szCs w:val="24"/>
+        </w:rPr>
+        <w:t xml:space="preserve"> upstream Lance PRs that bounded IVF-training memory and fixed temporary-resource lifecycle issues, and helped resolve an out-of-memory problem in a three-billion-vector workload.</w:t>
       </w:r>
     </w:p>
     <w:p>
@@ -1219,18 +1269,112 @@
         <w:ind w:left="170" w:hanging="170"/>
         <w:jc w:val="both"/>
         <w:rPr>
-          <w:b/>
           <w:sz w:val="24"/>
           <w:szCs w:val="24"/>
         </w:rPr>
       </w:pPr>
       <w:r>
         <w:rPr>
-          <w:b/>
-          <w:sz w:val="24"/>
-          <w:szCs w:val="24"/>
-        </w:rPr>
-        <w:t>Huawei-sponsored upstream contributions</w:t>
+          <w:sz w:val="24"/>
+          <w:szCs w:val="24"/>
+        </w:rPr>
+        <w:t>• </w:t>
+      </w:r>
+      <w:r>
+        <w:rPr>
+          <w:sz w:val="24"/>
+          <w:szCs w:val="24"/>
+        </w:rPr>
+        <w:t xml:space="preserve">Across </w:t>
+      </w:r>
+      <w:hyperlink r:id="rId16" w:history="1">
+        <w:r>
+          <w:rPr>
+            <w:rStyle w:val="Hyperlink"/>
+            <w:sz w:val="24"/>
+            <w:szCs w:val="24"/>
+          </w:rPr>
+          <w:t>50 merged</w:t>
+        </w:r>
+      </w:hyperlink>
+      <w:r>
+        <w:rPr>
+          <w:sz w:val="24"/>
+          <w:szCs w:val="24"/>
+        </w:rPr>
+        <w:t xml:space="preserve"> </w:t>
+      </w:r>
+      <w:r>
+        <w:rPr>
+          <w:sz w:val="24"/>
+          <w:szCs w:val="24"/>
+        </w:rPr>
+        <w:t>Apache Hudi PRs</w:t>
+      </w:r>
+      <w:r>
+        <w:rPr>
+          <w:sz w:val="24"/>
+          <w:szCs w:val="24"/>
+        </w:rPr>
+        <w:t>,</w:t>
+      </w:r>
+      <w:r>
+        <w:rPr>
+          <w:sz w:val="24"/>
+          <w:szCs w:val="24"/>
+        </w:rPr>
+        <w:t xml:space="preserve"> authored </w:t>
+      </w:r>
+      <w:hyperlink r:id="rId17" w:history="1">
+        <w:r>
+          <w:rPr>
+            <w:rStyle w:val="Hyperlink"/>
+            <w:sz w:val="24"/>
+            <w:szCs w:val="24"/>
+          </w:rPr>
+          <w:t>RFC-84</w:t>
+        </w:r>
+      </w:hyperlink>
+      <w:r>
+        <w:rPr>
+          <w:sz w:val="24"/>
+          <w:szCs w:val="24"/>
+        </w:rPr>
+        <w:t xml:space="preserve"> and implemented its </w:t>
+      </w:r>
+      <w:hyperlink r:id="rId18" w:history="1">
+        <w:r>
+          <w:rPr>
+            <w:rStyle w:val="Hyperlink"/>
+            <w:sz w:val="24"/>
+            <w:szCs w:val="24"/>
+          </w:rPr>
+          <w:t>Flink serialization redesign</w:t>
+        </w:r>
+      </w:hyperlink>
+      <w:r>
+        <w:rPr>
+          <w:sz w:val="24"/>
+          <w:szCs w:val="24"/>
+        </w:rPr>
+        <w:t xml:space="preserve">, cutting TPC-H write time by up to 26% and inter-operator data transfer by 29–36%; released in </w:t>
+      </w:r>
+      <w:hyperlink r:id="rId19" w:history="1">
+        <w:r>
+          <w:rPr>
+            <w:rStyle w:val="Hyperlink"/>
+            <w:sz w:val="24"/>
+            <w:szCs w:val="24"/>
+          </w:rPr>
+          <w:t>Hudi 1.0.2</w:t>
+        </w:r>
+      </w:hyperlink>
+      <w:r>
+        <w:rPr>
+          <w:sz w:val="24"/>
+          <w:szCs w:val="24"/>
+        </w:rPr>
+        <w:t>.</w:t>
       </w:r>
     </w:p>
     <w:p>
@@ -1252,51 +1396,168 @@
       </w:pPr>
       <w:r>
         <w:rPr>
-          <w:b/>
-          <w:bCs/>
-          <w:sz w:val="24"/>
-          <w:szCs w:val="24"/>
-        </w:rPr>
-        <w:t>Apache Hudi</w:t>
-      </w:r>
-      <w:r>
-        <w:rPr>
-          <w:sz w:val="24"/>
-          <w:szCs w:val="24"/>
-        </w:rPr>
-        <w:t xml:space="preserve"> </w:t>
-      </w:r>
-      <w:r>
-        <w:rPr>
-          <w:sz w:val="24"/>
-          <w:szCs w:val="24"/>
-        </w:rPr>
-        <w:t>–</w:t>
-      </w:r>
-      <w:r>
-        <w:rPr>
-          <w:sz w:val="24"/>
-          <w:szCs w:val="24"/>
-        </w:rPr>
-        <w:t xml:space="preserve"> </w:t>
-      </w:r>
-      <w:hyperlink r:id="rId15" w:history="1">
+          <w:sz w:val="24"/>
+          <w:szCs w:val="24"/>
+        </w:rPr>
+        <w:t>• </w:t>
+      </w:r>
+      <w:r>
+        <w:rPr>
+          <w:sz w:val="24"/>
+          <w:szCs w:val="24"/>
+        </w:rPr>
+        <w:t xml:space="preserve">Four additional Flink optimizations </w:t>
+      </w:r>
+      <w:r>
+        <w:rPr>
+          <w:sz w:val="24"/>
+          <w:szCs w:val="24"/>
+        </w:rPr>
+        <w:t>(</w:t>
+      </w:r>
+      <w:hyperlink r:id="rId20" w:history="1">
         <w:r>
           <w:rPr>
             <w:rStyle w:val="Hyperlink"/>
             <w:sz w:val="24"/>
             <w:szCs w:val="24"/>
           </w:rPr>
-          <w:t>50 merged PRs</w:t>
+          <w:t>[1]</w:t>
         </w:r>
       </w:hyperlink>
       <w:r>
         <w:rPr>
+          <w:sz w:val="24"/>
+          <w:szCs w:val="24"/>
+        </w:rPr>
+        <w:t xml:space="preserve">, </w:t>
+      </w:r>
+      <w:hyperlink r:id="rId21" w:history="1">
+        <w:r>
+          <w:rPr>
+            <w:rStyle w:val="Hyperlink"/>
+            <w:sz w:val="24"/>
+            <w:szCs w:val="24"/>
+          </w:rPr>
+          <w:t>[2]</w:t>
+        </w:r>
+      </w:hyperlink>
+      <w:r>
+        <w:rPr>
+          <w:sz w:val="24"/>
+          <w:szCs w:val="24"/>
+        </w:rPr>
+        <w:t xml:space="preserve">, </w:t>
+      </w:r>
+      <w:hyperlink r:id="rId22" w:history="1">
+        <w:r>
+          <w:rPr>
+            <w:rStyle w:val="Hyperlink"/>
+            <w:sz w:val="24"/>
+            <w:szCs w:val="24"/>
+          </w:rPr>
+          <w:t>[3]</w:t>
+        </w:r>
+      </w:hyperlink>
+      <w:r>
+        <w:rPr>
+          <w:sz w:val="24"/>
+          <w:szCs w:val="24"/>
+        </w:rPr>
+        <w:t>,</w:t>
+      </w:r>
+      <w:r>
+        <w:rPr>
+          <w:sz w:val="24"/>
+          <w:szCs w:val="24"/>
+        </w:rPr>
+        <w:t xml:space="preserve"> and</w:t>
+      </w:r>
+      <w:r>
+        <w:rPr>
+          <w:sz w:val="24"/>
+          <w:szCs w:val="24"/>
+        </w:rPr>
+        <w:t xml:space="preserve"> </w:t>
+      </w:r>
+      <w:hyperlink r:id="rId23" w:history="1">
+        <w:r>
+          <w:rPr>
+            <w:rStyle w:val="Hyperlink"/>
+            <w:sz w:val="24"/>
+            <w:szCs w:val="24"/>
+          </w:rPr>
+          <w:t>[4]</w:t>
+        </w:r>
+      </w:hyperlink>
+      <w:r>
+        <w:rPr>
+          <w:sz w:val="24"/>
+          <w:szCs w:val="24"/>
+        </w:rPr>
+        <w:t>)</w:t>
+      </w:r>
+      <w:r>
+        <w:rPr>
+          <w:sz w:val="24"/>
+          <w:szCs w:val="24"/>
+        </w:rPr>
+        <w:t xml:space="preserve"> </w:t>
+      </w:r>
+      <w:r>
+        <w:rPr>
+          <w:sz w:val="24"/>
+          <w:szCs w:val="24"/>
+        </w:rPr>
+        <w:t xml:space="preserve">improved throughput by 10% and reduced GC overhead by 30%; released in </w:t>
+      </w:r>
+      <w:hyperlink r:id="rId24" w:history="1">
+        <w:r>
+          <w:rPr>
+            <w:rStyle w:val="Hyperlink"/>
+            <w:sz w:val="24"/>
+            <w:szCs w:val="24"/>
+          </w:rPr>
+          <w:t>Hudi 1.0.1</w:t>
+        </w:r>
+      </w:hyperlink>
+      <w:r>
+        <w:rPr>
+          <w:sz w:val="24"/>
+          <w:szCs w:val="24"/>
+        </w:rPr>
+        <w:t>.</w:t>
+      </w:r>
+    </w:p>
+    <w:p>
+      <w:pPr>
+        <w:keepNext/>
+        <w:pBdr>
+          <w:top w:val="nil"/>
+          <w:left w:val="nil"/>
+          <w:bottom w:val="nil"/>
+          <w:right w:val="nil"/>
+          <w:between w:val="nil"/>
+        </w:pBdr>
+        <w:spacing w:before="60" w:after="60" w:line="264" w:lineRule="auto"/>
+        <w:ind w:left="170" w:hanging="170"/>
+        <w:jc w:val="both"/>
+        <w:rPr>
+          <w:b/>
           <w:bCs/>
           <w:sz w:val="24"/>
           <w:szCs w:val="24"/>
         </w:rPr>
-        <w:t xml:space="preserve"> (delivered as part of the Huawei role)</w:t>
+      </w:pPr>
+      <w:r>
+        <w:rPr>
+          <w:b/>
+          <w:bCs/>
+          <w:sz w:val="24"/>
+          <w:szCs w:val="24"/>
+        </w:rPr>
+        <w:lastRenderedPageBreak/>
+        <w:t>Huawei — continued</w:t>
       </w:r>
     </w:p>
     <w:p>
@@ -1328,94 +1589,7 @@
           <w:sz w:val="24"/>
           <w:szCs w:val="24"/>
         </w:rPr>
-        <w:t>Optimized serialization of Flink stream records in Hudi, cutting end-to-end write time by up to 26% and reducing data transferred between operators by 29</w:t>
-      </w:r>
-      <w:r>
-        <w:rPr>
-          <w:color w:val="000000"/>
-          <w:sz w:val="24"/>
-          <w:szCs w:val="24"/>
-        </w:rPr>
-        <w:t>–</w:t>
-      </w:r>
-      <w:r>
-        <w:rPr>
-          <w:sz w:val="24"/>
-          <w:szCs w:val="24"/>
-        </w:rPr>
-        <w:t>36% in TPC-H benchmarks</w:t>
-      </w:r>
-      <w:r>
-        <w:rPr>
-          <w:sz w:val="24"/>
-          <w:szCs w:val="24"/>
-        </w:rPr>
-        <w:t xml:space="preserve"> </w:t>
-      </w:r>
-      <w:r>
-        <w:rPr>
-          <w:sz w:val="24"/>
-          <w:szCs w:val="24"/>
-        </w:rPr>
-        <w:t>(</w:t>
-      </w:r>
-      <w:hyperlink r:id="rId16" w:history="1">
-        <w:r>
-          <w:rPr>
-            <w:rStyle w:val="Hyperlink"/>
-            <w:sz w:val="24"/>
-            <w:szCs w:val="24"/>
-          </w:rPr>
-          <w:t>design doc</w:t>
-        </w:r>
-      </w:hyperlink>
-      <w:r>
-        <w:rPr>
-          <w:sz w:val="24"/>
-          <w:szCs w:val="24"/>
-        </w:rPr>
-        <w:t xml:space="preserve">, </w:t>
-      </w:r>
-      <w:hyperlink r:id="rId17" w:history="1">
-        <w:r>
-          <w:rPr>
-            <w:rStyle w:val="Hyperlink"/>
-            <w:sz w:val="24"/>
-            <w:szCs w:val="24"/>
-          </w:rPr>
-          <w:t>main changes</w:t>
-        </w:r>
-      </w:hyperlink>
-      <w:r>
-        <w:rPr>
-          <w:sz w:val="24"/>
-          <w:szCs w:val="24"/>
-        </w:rPr>
-        <w:t>)</w:t>
-      </w:r>
-      <w:r>
-        <w:rPr>
-          <w:sz w:val="24"/>
-          <w:szCs w:val="24"/>
-        </w:rPr>
-        <w:t xml:space="preserve">; released in </w:t>
-      </w:r>
-      <w:hyperlink r:id="rId18" w:history="1">
-        <w:r>
-          <w:rPr>
-            <w:rStyle w:val="Hyperlink"/>
-            <w:sz w:val="24"/>
-            <w:szCs w:val="24"/>
-          </w:rPr>
-          <w:t>Hudi 1.0.2</w:t>
-        </w:r>
-      </w:hyperlink>
-      <w:r>
-        <w:rPr>
-          <w:sz w:val="24"/>
-          <w:szCs w:val="24"/>
-        </w:rPr>
-        <w:t>.</w:t>
+        <w:t>Diagnosed serial buffer flushing during Flink checkpoints, contributing to a fix that improved checkpoint performance 7×; corrected writer load balancing and timestamp, CDC-merge, and cross-engine record-key defects.</w:t>
       </w:r>
     </w:p>
     <w:p>
@@ -1427,11 +1601,10 @@
           <w:right w:val="nil"/>
           <w:between w:val="nil"/>
         </w:pBdr>
-        <w:spacing w:before="60" w:after="120" w:line="264" w:lineRule="auto"/>
+        <w:spacing w:before="60" w:after="60" w:line="264" w:lineRule="auto"/>
         <w:ind w:left="170" w:hanging="170"/>
         <w:jc w:val="both"/>
         <w:rPr>
-          <w:color w:val="000000"/>
           <w:sz w:val="24"/>
           <w:szCs w:val="24"/>
         </w:rPr>
@@ -1448,30 +1621,49 @@
           <w:sz w:val="24"/>
           <w:szCs w:val="24"/>
         </w:rPr>
-        <w:t xml:space="preserve">Implemented </w:t>
-      </w:r>
-      <w:r>
-        <w:rPr>
-          <w:sz w:val="24"/>
-          <w:szCs w:val="24"/>
-        </w:rPr>
-        <w:t>four targeted op</w:t>
-      </w:r>
-      <w:r>
-        <w:rPr>
-          <w:sz w:val="24"/>
-          <w:szCs w:val="24"/>
-        </w:rPr>
-        <w:t>timizations (</w:t>
-      </w:r>
-      <w:hyperlink r:id="rId19" w:history="1">
+        <w:t>Simplified setup across 900+ Hudi configuration parameters; designed and implemented partition-level TTL for automated retention and storage-cost control, supported by automated tests and a 100,000-partition load test.</w:t>
+      </w:r>
+    </w:p>
+    <w:p>
+      <w:pPr>
+        <w:pBdr>
+          <w:top w:val="nil"/>
+          <w:left w:val="nil"/>
+          <w:bottom w:val="nil"/>
+          <w:right w:val="nil"/>
+          <w:between w:val="nil"/>
+        </w:pBdr>
+        <w:spacing w:before="60" w:after="60" w:line="264" w:lineRule="auto"/>
+        <w:ind w:left="170" w:hanging="170"/>
+        <w:jc w:val="both"/>
+        <w:rPr>
+          <w:color w:val="000000"/>
+          <w:sz w:val="24"/>
+          <w:szCs w:val="24"/>
+        </w:rPr>
+      </w:pPr>
+      <w:r>
+        <w:rPr>
+          <w:sz w:val="24"/>
+          <w:szCs w:val="24"/>
+        </w:rPr>
+        <w:t>• </w:t>
+      </w:r>
+      <w:r>
+        <w:rPr>
+          <w:sz w:val="24"/>
+          <w:szCs w:val="24"/>
+        </w:rPr>
+        <w:t xml:space="preserve">Drove Hudi’s Spark DataSource V2 migration; authored </w:t>
+      </w:r>
+      <w:hyperlink r:id="rId25" w:history="1">
         <w:r>
           <w:rPr>
             <w:rStyle w:val="Hyperlink"/>
             <w:sz w:val="24"/>
             <w:szCs w:val="24"/>
           </w:rPr>
-          <w:t>#12054</w:t>
+          <w:t>RFC-98</w:t>
         </w:r>
       </w:hyperlink>
       <w:r>
@@ -1479,16 +1671,16 @@
           <w:sz w:val="24"/>
           <w:szCs w:val="24"/>
         </w:rPr>
-        <w:t xml:space="preserve">, </w:t>
-      </w:r>
-      <w:hyperlink r:id="rId20" w:history="1">
+        <w:t xml:space="preserve"> and an initial Copy-on-Write </w:t>
+      </w:r>
+      <w:hyperlink r:id="rId26" w:history="1">
         <w:r>
           <w:rPr>
             <w:rStyle w:val="Hyperlink"/>
             <w:sz w:val="24"/>
             <w:szCs w:val="24"/>
           </w:rPr>
-          <w:t>#12104</w:t>
+          <w:t>read path</w:t>
         </w:r>
       </w:hyperlink>
       <w:r>
@@ -1496,86 +1688,7 @@
           <w:sz w:val="24"/>
           <w:szCs w:val="24"/>
         </w:rPr>
-        <w:t xml:space="preserve">, </w:t>
-      </w:r>
-      <w:hyperlink r:id="rId21" w:history="1">
-        <w:r>
-          <w:rPr>
-            <w:rStyle w:val="Hyperlink"/>
-            <w:sz w:val="24"/>
-            <w:szCs w:val="24"/>
-          </w:rPr>
-          <w:t>#12113</w:t>
-        </w:r>
-      </w:hyperlink>
-      <w:r>
-        <w:rPr>
-          <w:sz w:val="24"/>
-          <w:szCs w:val="24"/>
-        </w:rPr>
-        <w:t xml:space="preserve">, </w:t>
-      </w:r>
-      <w:hyperlink r:id="rId22" w:history="1">
-        <w:r>
-          <w:rPr>
-            <w:rStyle w:val="Hyperlink"/>
-            <w:sz w:val="24"/>
-            <w:szCs w:val="24"/>
-          </w:rPr>
-          <w:t>#12120</w:t>
-        </w:r>
-      </w:hyperlink>
-      <w:r>
-        <w:rPr>
-          <w:sz w:val="24"/>
-          <w:szCs w:val="24"/>
-        </w:rPr>
-        <w:t>)</w:t>
-      </w:r>
-      <w:r>
-        <w:rPr>
-          <w:sz w:val="24"/>
-          <w:szCs w:val="24"/>
-        </w:rPr>
-        <w:t>,</w:t>
-      </w:r>
-      <w:r>
-        <w:rPr>
-          <w:sz w:val="24"/>
-          <w:szCs w:val="24"/>
-        </w:rPr>
-        <w:t xml:space="preserve"> </w:t>
-      </w:r>
-      <w:r>
-        <w:rPr>
-          <w:sz w:val="24"/>
-          <w:szCs w:val="24"/>
-        </w:rPr>
-        <w:t>improving Flink stream-write throughput by 10% and reducing garbage-collection overhead by 30% in internal benchmarks</w:t>
-      </w:r>
-      <w:r>
-        <w:rPr>
-          <w:sz w:val="24"/>
-          <w:szCs w:val="24"/>
-        </w:rPr>
-        <w:t xml:space="preserve">; released in </w:t>
-      </w:r>
-      <w:hyperlink r:id="rId23" w:history="1">
-        <w:r>
-          <w:rPr>
-            <w:rStyle w:val="Hyperlink"/>
-            <w:sz w:val="24"/>
-            <w:szCs w:val="24"/>
-          </w:rPr>
-          <w:t>Hudi 1.0.1</w:t>
-        </w:r>
-      </w:hyperlink>
-      <w:r>
-        <w:rPr>
-          <w:sz w:val="24"/>
-          <w:szCs w:val="24"/>
-        </w:rPr>
-        <w:t>.</w:t>
+        <w:t xml:space="preserve"> to enable additional query pushdowns.</w:t>
       </w:r>
     </w:p>
     <w:tbl>
@@ -1695,7 +1808,7 @@
                 <w:right w:val="nil"/>
                 <w:between w:val="nil"/>
               </w:pBdr>
-              <w:spacing w:line="264" w:lineRule="auto"/>
+              <w:spacing w:before="60" w:line="264" w:lineRule="auto"/>
               <w:rPr>
                 <w:color w:val="000000"/>
                 <w:sz w:val="24"/>
@@ -1738,7 +1851,7 @@
                 <w:right w:val="nil"/>
                 <w:between w:val="nil"/>
               </w:pBdr>
-              <w:spacing w:line="264" w:lineRule="auto"/>
+              <w:spacing w:after="60" w:line="264" w:lineRule="auto"/>
               <w:rPr>
                 <w:color w:val="000000"/>
                 <w:sz w:val="24"/>
@@ -1777,7 +1890,7 @@
           <w:right w:val="nil"/>
           <w:between w:val="nil"/>
         </w:pBdr>
-        <w:spacing w:before="120" w:after="60" w:line="264" w:lineRule="auto"/>
+        <w:spacing w:before="60" w:after="60" w:line="264" w:lineRule="auto"/>
         <w:ind w:left="170" w:hanging="170"/>
         <w:jc w:val="both"/>
         <w:rPr>
@@ -1797,74 +1910,21 @@
           <w:sz w:val="24"/>
           <w:szCs w:val="24"/>
         </w:rPr>
-        <w:t>Designed an event-driven architecture and implemented the image-processing backend in Python for a truck-monitoring system handling ~2</w:t>
-      </w:r>
-      <w:r>
-        <w:rPr>
-          <w:sz w:val="24"/>
-          <w:szCs w:val="24"/>
-        </w:rPr>
-        <w:t>0</w:t>
-      </w:r>
-      <w:r>
-        <w:rPr>
-          <w:sz w:val="24"/>
-          <w:szCs w:val="24"/>
-        </w:rPr>
-        <w:t>,</w:t>
-      </w:r>
-      <w:r>
-        <w:rPr>
-          <w:sz w:val="24"/>
-          <w:szCs w:val="24"/>
-        </w:rPr>
-        <w:t>000 images/day; in production, the system reduced fleet idle time by 12%</w:t>
-      </w:r>
-      <w:r>
-        <w:rPr>
-          <w:sz w:val="24"/>
-          <w:szCs w:val="24"/>
-        </w:rPr>
-        <w:t>.</w:t>
-      </w:r>
-    </w:p>
-    <w:p>
-      <w:pPr>
-        <w:pBdr>
-          <w:top w:val="nil"/>
-          <w:left w:val="nil"/>
-          <w:bottom w:val="nil"/>
-          <w:right w:val="nil"/>
-          <w:between w:val="nil"/>
-        </w:pBdr>
-        <w:spacing w:before="60" w:after="120" w:line="264" w:lineRule="auto"/>
-        <w:ind w:left="170" w:hanging="170"/>
-        <w:jc w:val="both"/>
-        <w:rPr>
-          <w:sz w:val="24"/>
-          <w:szCs w:val="24"/>
-        </w:rPr>
-      </w:pPr>
-      <w:r>
-        <w:rPr>
-          <w:sz w:val="24"/>
-          <w:szCs w:val="24"/>
-        </w:rPr>
-        <w:t>• </w:t>
-      </w:r>
-      <w:r>
-        <w:rPr>
-          <w:sz w:val="24"/>
-          <w:szCs w:val="24"/>
-        </w:rPr>
-        <w:t>Built a customer-facing reporting and data-visualization UI and an internal monitoring UI</w:t>
-      </w:r>
-      <w:r>
-        <w:rPr>
-          <w:sz w:val="24"/>
-          <w:szCs w:val="24"/>
-        </w:rPr>
-        <w:t>.</w:t>
+        <w:t xml:space="preserve">Designed the event-driven Python backend for a production truck-monitoring system processing </w:t>
+      </w:r>
+      <w:r>
+        <w:rPr>
+          <w:sz w:val="24"/>
+          <w:szCs w:val="24"/>
+        </w:rPr>
+        <w:t>~</w:t>
+      </w:r>
+      <w:r>
+        <w:rPr>
+          <w:sz w:val="24"/>
+          <w:szCs w:val="24"/>
+        </w:rPr>
+        <w:t>20,000 images per day; the deployed system reduced fleet idle time by 12%. Also delivered customer reporting/data-visualization and internal monitoring interfaces.</w:t>
       </w:r>
     </w:p>
     <w:p>
@@ -1891,32 +1951,7 @@
           <w:sz w:val="24"/>
           <w:szCs w:val="24"/>
         </w:rPr>
-        <w:lastRenderedPageBreak/>
-        <w:t xml:space="preserve">INDEPENDENT </w:t>
-      </w:r>
-      <w:r>
-        <w:rPr>
-          <w:color w:val="000000"/>
-          <w:sz w:val="24"/>
-          <w:szCs w:val="24"/>
-        </w:rPr>
-        <w:t>P</w:t>
-      </w:r>
-      <w:r>
-        <w:rPr>
-          <w:color w:val="000000"/>
-          <w:sz w:val="24"/>
-          <w:szCs w:val="24"/>
-        </w:rPr>
-        <w:t>ERSONAL P</w:t>
-      </w:r>
-      <w:r>
-        <w:rPr>
-          <w:color w:val="000000"/>
-          <w:sz w:val="24"/>
-          <w:szCs w:val="24"/>
-        </w:rPr>
-        <w:t>ROJECTS</w:t>
+        <w:t>OPEN-SOURCE ENGINEERING</w:t>
       </w:r>
     </w:p>
     <w:p>
@@ -1929,7 +1964,7 @@
           <w:right w:val="nil"/>
           <w:between w:val="nil"/>
         </w:pBdr>
-        <w:spacing w:before="120" w:after="60" w:line="264" w:lineRule="auto"/>
+        <w:spacing w:before="60" w:after="60" w:line="264" w:lineRule="auto"/>
         <w:jc w:val="both"/>
         <w:rPr>
           <w:color w:val="000000"/>
@@ -1937,6 +1972,18 @@
           <w:szCs w:val="24"/>
         </w:rPr>
       </w:pPr>
+      <w:hyperlink r:id="rId27" w:history="1">
+        <w:r>
+          <w:rPr>
+            <w:rStyle w:val="Hyperlink"/>
+            <w:b/>
+            <w:bCs/>
+            <w:sz w:val="24"/>
+            <w:szCs w:val="24"/>
+          </w:rPr>
+          <w:t>Agent Orchestrator</w:t>
+        </w:r>
+      </w:hyperlink>
       <w:r>
         <w:rPr>
           <w:b/>
@@ -1945,18 +1992,12 @@
           <w:sz w:val="24"/>
           <w:szCs w:val="24"/>
         </w:rPr>
-        <w:t>Agentic Development Tooling</w:t>
-      </w:r>
-      <w:r>
-        <w:rPr>
-          <w:color w:val="000000"/>
-          <w:sz w:val="24"/>
-          <w:szCs w:val="24"/>
-        </w:rPr>
         <w:t xml:space="preserve"> </w:t>
       </w:r>
       <w:r>
         <w:rPr>
+          <w:b/>
+          <w:bCs/>
           <w:color w:val="000000"/>
           <w:sz w:val="24"/>
           <w:szCs w:val="24"/>
@@ -1965,45 +2006,13 @@
       </w:r>
       <w:r>
         <w:rPr>
-          <w:color w:val="000000"/>
-          <w:sz w:val="24"/>
-          <w:szCs w:val="24"/>
-        </w:rPr>
-        <w:t xml:space="preserve"> </w:t>
-      </w:r>
-      <w:r>
-        <w:rPr>
-          <w:color w:val="000000"/>
-          <w:sz w:val="24"/>
-          <w:szCs w:val="24"/>
-        </w:rPr>
-        <w:t>Started Apr 2026</w:t>
-      </w:r>
-    </w:p>
-    <w:p>
-      <w:pPr>
-        <w:pBdr>
-          <w:top w:val="nil"/>
-          <w:left w:val="nil"/>
-          <w:bottom w:val="nil"/>
-          <w:right w:val="nil"/>
-          <w:between w:val="nil"/>
-        </w:pBdr>
-        <w:spacing w:before="60" w:after="60" w:line="264" w:lineRule="auto"/>
-        <w:jc w:val="both"/>
-        <w:rPr>
-          <w:color w:val="000000"/>
-          <w:sz w:val="24"/>
-          <w:szCs w:val="24"/>
-        </w:rPr>
-      </w:pPr>
-      <w:r>
-        <w:rPr>
-          <w:color w:val="000000"/>
-          <w:sz w:val="24"/>
-          <w:szCs w:val="24"/>
-        </w:rPr>
-        <w:t>Creator and maintainer of AI-powered developer tooling for reproducible multi-agent implementation and review, human-in-the-loop handoff, monitoring, and cost tracking.</w:t>
+          <w:b/>
+          <w:bCs/>
+          <w:color w:val="000000"/>
+          <w:sz w:val="24"/>
+          <w:szCs w:val="24"/>
+        </w:rPr>
+        <w:t xml:space="preserve"> Creator &amp; Maintainer | Apr 2026 – Present</w:t>
       </w:r>
     </w:p>
     <w:p>
@@ -2019,6 +2028,7 @@
         <w:ind w:left="170" w:hanging="170"/>
         <w:jc w:val="both"/>
         <w:rPr>
+          <w:color w:val="000000"/>
           <w:sz w:val="24"/>
           <w:szCs w:val="24"/>
         </w:rPr>
@@ -2032,41 +2042,11 @@
       </w:r>
       <w:r>
         <w:rPr>
-          <w:sz w:val="24"/>
-          <w:szCs w:val="24"/>
-        </w:rPr>
-        <w:t xml:space="preserve">Workflow orchestration: Built </w:t>
-      </w:r>
-      <w:hyperlink r:id="rId24" w:history="1">
-        <w:r>
-          <w:rPr>
-            <w:rStyle w:val="Hyperlink"/>
-            <w:sz w:val="24"/>
-            <w:szCs w:val="24"/>
-          </w:rPr>
-          <w:t>agent-orchestrator</w:t>
-        </w:r>
-      </w:hyperlink>
-      <w:r>
-        <w:rPr>
-          <w:sz w:val="24"/>
-          <w:szCs w:val="24"/>
-        </w:rPr>
-        <w:t>, a Python-based runner that turns a GitHub issue into an isolated implementation</w:t>
-      </w:r>
-      <w:r>
-        <w:rPr>
-          <w:sz w:val="24"/>
-          <w:szCs w:val="24"/>
-        </w:rPr>
-        <w:t xml:space="preserve"> </w:t>
-      </w:r>
-      <w:r>
-        <w:rPr>
-          <w:sz w:val="24"/>
-          <w:szCs w:val="24"/>
-        </w:rPr>
-        <w:t>workflow: it launches an implementer agent, opens a PR, invokes an independent review agent, and notifies a human when the PR is ready to merge.</w:t>
+          <w:color w:val="000000"/>
+          <w:sz w:val="24"/>
+          <w:szCs w:val="24"/>
+        </w:rPr>
+        <w:t>Designed and shipped a Python issue-to-PR platform that orchestrates isolated implementation, automated validation, independent review, and human-controlled merge using Codex and Claude Code.</w:t>
       </w:r>
     </w:p>
     <w:p>
@@ -2082,6 +2062,7 @@
         <w:ind w:left="170" w:hanging="170"/>
         <w:jc w:val="both"/>
         <w:rPr>
+          <w:color w:val="000000"/>
           <w:sz w:val="24"/>
           <w:szCs w:val="24"/>
         </w:rPr>
@@ -2095,13 +2076,15 @@
       </w:r>
       <w:r>
         <w:rPr>
-          <w:sz w:val="24"/>
-          <w:szCs w:val="24"/>
-        </w:rPr>
-        <w:t>Product delivery: Shipped eleven releases from v0.1.0 to v0.10.1 between May and August 2026, adding GitHub-persisted workflow state, pause/resume controls, PostgreSQL-backed usage and</w:t>
-      </w:r>
-      <w:r>
-        <w:rPr>
+          <w:color w:val="000000"/>
+          <w:sz w:val="24"/>
+          <w:szCs w:val="24"/>
+        </w:rPr>
+        <w:t>Built durable GitHub-persisted workflow state, pause/resume and recovery, credential isolation, audit/trajectory logging, and PostgreSQL cost analytics.</w:t>
+      </w:r>
+      <w:r>
+        <w:rPr>
+          <w:color w:val="000000"/>
           <w:sz w:val="24"/>
           <w:szCs w:val="24"/>
         </w:rPr>
@@ -2109,88 +2092,11 @@
       </w:r>
       <w:r>
         <w:rPr>
-          <w:sz w:val="24"/>
-          <w:szCs w:val="24"/>
-        </w:rPr>
-        <w:t xml:space="preserve">cost analytics, </w:t>
-      </w:r>
-      <w:proofErr w:type="gramStart"/>
-      <w:r>
-        <w:rPr>
-          <w:sz w:val="24"/>
-          <w:szCs w:val="24"/>
-        </w:rPr>
-        <w:t>trajectory</w:t>
-      </w:r>
-      <w:proofErr w:type="gramEnd"/>
-      <w:r>
-        <w:rPr>
-          <w:sz w:val="24"/>
-          <w:szCs w:val="24"/>
-        </w:rPr>
-        <w:t xml:space="preserve"> and provenance observability, </w:t>
-      </w:r>
-      <w:proofErr w:type="spellStart"/>
-      <w:r>
-        <w:rPr>
-          <w:sz w:val="24"/>
-          <w:szCs w:val="24"/>
-        </w:rPr>
-        <w:t>namespaced</w:t>
-      </w:r>
-      <w:proofErr w:type="spellEnd"/>
-      <w:r>
-        <w:rPr>
-          <w:sz w:val="24"/>
-          <w:szCs w:val="24"/>
-        </w:rPr>
-        <w:t xml:space="preserve"> workflow labels, and hardened recovery.</w:t>
-      </w:r>
-    </w:p>
-    <w:p>
-      <w:pPr>
-        <w:pBdr>
-          <w:top w:val="nil"/>
-          <w:left w:val="nil"/>
-          <w:bottom w:val="nil"/>
-          <w:right w:val="nil"/>
-          <w:between w:val="nil"/>
-        </w:pBdr>
-        <w:spacing w:before="60" w:after="60" w:line="264" w:lineRule="auto"/>
-        <w:ind w:left="170" w:hanging="170"/>
-        <w:jc w:val="both"/>
-        <w:rPr>
-          <w:sz w:val="24"/>
-          <w:szCs w:val="24"/>
-        </w:rPr>
-      </w:pPr>
-      <w:r>
-        <w:rPr>
-          <w:sz w:val="24"/>
-          <w:szCs w:val="24"/>
-        </w:rPr>
-        <w:t>• </w:t>
-      </w:r>
-      <w:r>
-        <w:rPr>
-          <w:sz w:val="24"/>
-          <w:szCs w:val="24"/>
-        </w:rPr>
-        <w:t>Operational scale: Recorded 6,700+ agent runs across 14 repositories since May 2026, including 2,000+ review-agent runs</w:t>
-      </w:r>
-      <w:r>
-        <w:rPr>
-          <w:sz w:val="24"/>
-          <w:szCs w:val="24"/>
-        </w:rPr>
-        <w:t xml:space="preserve"> – </w:t>
-      </w:r>
-      <w:r>
-        <w:rPr>
-          <w:sz w:val="24"/>
-          <w:szCs w:val="24"/>
-        </w:rPr>
-        <w:t>equivalent to $19K+ at API list prices</w:t>
+          <w:color w:val="000000"/>
+          <w:sz w:val="24"/>
+          <w:szCs w:val="24"/>
+        </w:rPr>
+        <w:t>Shipped 12 releases through v0.11.0 and recorded 6,700+ agent runs across 14 repositories, including 2,000+ independent review-agent runs</w:t>
       </w:r>
       <w:r>
         <w:rPr>
@@ -2352,18 +2258,9 @@
           <w:szCs w:val="24"/>
         </w:rPr>
       </w:pPr>
-      <w:hyperlink r:id="rId25">
-        <w:r>
-          <w:rPr>
-            <w:color w:val="0000FF"/>
-            <w:u w:val="single"/>
-          </w:rPr>
-          <w:t>Recent version of CV</w:t>
-        </w:r>
-      </w:hyperlink>
     </w:p>
     <w:sectPr>
-      <w:footerReference w:type="default" r:id="rId26"/>
+      <w:footerReference w:type="default" r:id="rId28"/>
       <w:pgSz w:w="11906" w:h="16838"/>
       <w:pgMar w:top="851" w:right="1134" w:bottom="851" w:left="1134" w:header="113" w:footer="113" w:gutter="0"/>
       <w:pgNumType w:start="1"/>
@@ -3195,6 +3092,61 @@
       <w:shd w:val="clear" w:color="auto" w:fill="E1DFDD"/>
     </w:rPr>
   </w:style>
+  <w:style w:type="character" w:styleId="CommentReference">
+    <w:name w:val="annotation reference"/>
+    <w:basedOn w:val="DefaultParagraphFont"/>
+    <w:uiPriority w:val="99"/>
+    <w:semiHidden/>
+    <w:unhideWhenUsed/>
+    <w:rsid w:val="00483614"/>
+    <w:rPr>
+      <w:sz w:val="16"/>
+      <w:szCs w:val="16"/>
+    </w:rPr>
+  </w:style>
+  <w:style w:type="paragraph" w:styleId="CommentText">
+    <w:name w:val="annotation text"/>
+    <w:basedOn w:val="Normal"/>
+    <w:link w:val="CommentTextChar"/>
+    <w:uiPriority w:val="99"/>
+    <w:semiHidden/>
+    <w:unhideWhenUsed/>
+    <w:rsid w:val="00483614"/>
+  </w:style>
+  <w:style w:type="character" w:customStyle="1" w:styleId="CommentTextChar">
+    <w:name w:val="Comment Text Char"/>
+    <w:basedOn w:val="DefaultParagraphFont"/>
+    <w:link w:val="CommentText"/>
+    <w:uiPriority w:val="99"/>
+    <w:semiHidden/>
+    <w:rsid w:val="00483614"/>
+  </w:style>
+  <w:style w:type="paragraph" w:styleId="CommentSubject">
+    <w:name w:val="annotation subject"/>
+    <w:basedOn w:val="CommentText"/>
+    <w:next w:val="CommentText"/>
+    <w:link w:val="CommentSubjectChar"/>
+    <w:uiPriority w:val="99"/>
+    <w:semiHidden/>
+    <w:unhideWhenUsed/>
+    <w:rsid w:val="00483614"/>
+    <w:rPr>
+      <w:b/>
+      <w:bCs/>
+    </w:rPr>
+  </w:style>
+  <w:style w:type="character" w:customStyle="1" w:styleId="CommentSubjectChar">
+    <w:name w:val="Comment Subject Char"/>
+    <w:basedOn w:val="CommentTextChar"/>
+    <w:link w:val="CommentSubject"/>
+    <w:uiPriority w:val="99"/>
+    <w:semiHidden/>
+    <w:rsid w:val="00483614"/>
+    <w:rPr>
+      <w:b/>
+      <w:bCs/>
+    </w:rPr>
+  </w:style>
 </w:styles>
 </file>
 

</xml_diff>